<commit_message>
add table, edit text
</commit_message>
<xml_diff>
--- a/analysis/paper/paper.docx
+++ b/analysis/paper/paper.docx
@@ -87,7 +87,7 @@
         <w:t xml:space="preserve"> </w:t>
       </w:r>
       <w:r>
-        <w:t xml:space="preserve">18,</w:t>
+        <w:t xml:space="preserve">19,</w:t>
       </w:r>
       <w:r>
         <w:t xml:space="preserve"> </w:t>
@@ -2361,7 +2361,7 @@
         </w:r>
       </w:hyperlink>
       <w:r>
-        <w:t xml:space="preserve">, it is relatively simple to configure an AI agent so that it can efficiently see all the files in our project and work on them. The key tool here is a local harness, this is software you install on your computer that turns a LLM into an agent. The LLM by itself can only generate text. The harness connects that model to tools, such as reading and editing project files, running shell and R commands, calling MCP servers, and managing the exchange between the model, the tools, and you. The harness enforces permissions (decides which actions run automatically and which require your approval, according to your configuration of the harness, e.g. which files they can and cannot edit), and manages context (assembles what the model sees each turn in the conversation, e.g project instructions such as AGENTS.md, conversation history, file contents, and tool outputs). It also runs the loop (sends your prompt to the model, sends the model’s action requests to the tools, feeds results back to the model, and repeats until the task finishes or you stop it), and presents the interface (the space where you type prompts, watch the agent work, and read its output). At the time of writing widely used harnesses include Claude Code, GitHub Copilot, OpenAI Codex and OpenCode. We use and recommend OpenCode (running in the terminal pane of RStudio) because it is free and open source and not tied to any model vendor.</w:t>
+        <w:t xml:space="preserve">, it is relatively simple to configure an AI agent so that it can efficiently see all the files in our project and work on them. The key tool here is a local harness, this is software you install on your computer that turns a LLM into an agent. The LLM by itself can only generate text. The harness connects that model to tools, such as reading and editing project files, running shell and R commands, calling MCP servers, and managing the exchange between the model, the tools, and you. The harness enforces permissions (decides which actions run automatically and which require your approval, according to your configuration of the harness, e.g. which files they can and cannot edit), and manages context (assembles what the model sees each turn in the conversation, e.g project instructions such as AGENTS.md, conversation history, file contents, and tool outputs). It also runs the loop (sends your prompt to the model, sends the model’s action requests to the tools, feeds results back to the model, and repeats until the task finishes or you stop it), and presents the interface (the space where you type prompts, watch the agent work, and read its output). At the time of writing widely used harnesses include Claude Code, GitHub Copilot, OpenAI Codex and OpenCode. We use and recommend the OpenCode or Hermes terminal user interface (running in the terminal pane of RStudio or VS Code) because they are free and open source and not tied to any model vendor.</w:t>
       </w:r>
     </w:p>
     <w:p>
@@ -2663,10 +2663,10 @@
               <w:tblLayout w:type="fixed"/>
             </w:tblPr>
             <w:tblGrid>
-              <w:gridCol w:w="715"/>
-              <w:gridCol w:w="2147"/>
-              <w:gridCol w:w="1029"/>
-              <w:gridCol w:w="4027"/>
+              <w:gridCol w:w="411"/>
+              <w:gridCol w:w="855"/>
+              <w:gridCol w:w="2977"/>
+              <w:gridCol w:w="3674"/>
             </w:tblGrid>
             <w:tr>
               <w:trPr>
@@ -2707,20 +2707,20 @@
                     <w:jc w:val="center"/>
                   </w:pPr>
                   <w:r>
+                    <w:t xml:space="preserve">Purpose</w:t>
+                  </w:r>
+                </w:p>
+              </w:tc>
+              <w:tc>
+                <w:tcPr/>
+                <w:p>
+                  <w:pPr>
+                    <w:pStyle w:val="Compact"/>
+                    <w:jc w:val="left"/>
+                    <w:jc w:val="center"/>
+                  </w:pPr>
+                  <w:r>
                     <w:t xml:space="preserve">Source</w:t>
-                  </w:r>
-                </w:p>
-              </w:tc>
-              <w:tc>
-                <w:tcPr/>
-                <w:p>
-                  <w:pPr>
-                    <w:pStyle w:val="Compact"/>
-                    <w:jc w:val="left"/>
-                    <w:jc w:val="center"/>
-                  </w:pPr>
-                  <w:r>
-                    <w:t xml:space="preserve">Purpose</w:t>
                   </w:r>
                 </w:p>
               </w:tc>
@@ -2735,46 +2735,46 @@
                     <w:jc w:val="center"/>
                   </w:pPr>
                   <w:r>
-                    <w:t xml:space="preserve">MCP</w:t>
-                  </w:r>
-                </w:p>
-              </w:tc>
-              <w:tc>
-                <w:tcPr/>
-                <w:p>
-                  <w:pPr>
-                    <w:pStyle w:val="Compact"/>
-                    <w:jc w:val="left"/>
-                    <w:jc w:val="center"/>
-                  </w:pPr>
-                  <w:r>
-                    <w:t xml:space="preserve">r-mcptools</w:t>
-                  </w:r>
-                </w:p>
-              </w:tc>
-              <w:tc>
-                <w:tcPr/>
-                <w:p>
-                  <w:pPr>
-                    <w:pStyle w:val="Compact"/>
-                    <w:jc w:val="left"/>
-                    <w:jc w:val="center"/>
-                  </w:pPr>
-                  <w:r>
-                    <w:t xml:space="preserve">(Anthropic 2024)</w:t>
-                  </w:r>
-                </w:p>
-              </w:tc>
-              <w:tc>
-                <w:tcPr/>
-                <w:p>
-                  <w:pPr>
-                    <w:pStyle w:val="Compact"/>
-                    <w:jc w:val="left"/>
-                    <w:jc w:val="center"/>
-                  </w:pPr>
-                  <w:r>
-                    <w:t xml:space="preserve">Exposes a running R session so the agent can execute code and read results</w:t>
+                    <w:t xml:space="preserve">Instructions</w:t>
+                  </w:r>
+                </w:p>
+              </w:tc>
+              <w:tc>
+                <w:tcPr/>
+                <w:p>
+                  <w:pPr>
+                    <w:pStyle w:val="Compact"/>
+                    <w:jc w:val="left"/>
+                    <w:jc w:val="center"/>
+                  </w:pPr>
+                  <w:r>
+                    <w:t xml:space="preserve">global AGENTS.md</w:t>
+                  </w:r>
+                </w:p>
+              </w:tc>
+              <w:tc>
+                <w:tcPr/>
+                <w:p>
+                  <w:pPr>
+                    <w:pStyle w:val="Compact"/>
+                    <w:jc w:val="left"/>
+                    <w:jc w:val="center"/>
+                  </w:pPr>
+                  <w:r>
+                    <w:t xml:space="preserve">Global style verification</w:t>
+                  </w:r>
+                </w:p>
+              </w:tc>
+              <w:tc>
+                <w:tcPr/>
+                <w:p>
+                  <w:pPr>
+                    <w:pStyle w:val="Compact"/>
+                    <w:jc w:val="left"/>
+                    <w:jc w:val="center"/>
+                  </w:pPr>
+                  <w:r>
+                    <w:t xml:space="preserve">local</w:t>
                   </w:r>
                 </w:p>
               </w:tc>
@@ -2789,46 +2789,46 @@
                     <w:jc w:val="center"/>
                   </w:pPr>
                   <w:r>
-                    <w:t xml:space="preserve">MCP</w:t>
-                  </w:r>
-                </w:p>
-              </w:tc>
-              <w:tc>
-                <w:tcPr/>
-                <w:p>
-                  <w:pPr>
-                    <w:pStyle w:val="Compact"/>
-                    <w:jc w:val="left"/>
-                    <w:jc w:val="center"/>
-                  </w:pPr>
-                  <w:r>
-                    <w:t xml:space="preserve">refcheck</w:t>
-                  </w:r>
-                </w:p>
-              </w:tc>
-              <w:tc>
-                <w:tcPr/>
-                <w:p>
-                  <w:pPr>
-                    <w:pStyle w:val="Compact"/>
-                    <w:jc w:val="left"/>
-                    <w:jc w:val="center"/>
-                  </w:pPr>
-                  <w:r>
-                    <w:t xml:space="preserve">(Anthropic 2024)</w:t>
-                  </w:r>
-                </w:p>
-              </w:tc>
-              <w:tc>
-                <w:tcPr/>
-                <w:p>
-                  <w:pPr>
-                    <w:pStyle w:val="Compact"/>
-                    <w:jc w:val="left"/>
-                    <w:jc w:val="center"/>
-                  </w:pPr>
-                  <w:r>
-                    <w:t xml:space="preserve">Searches publication databases and returns verified references with BibTeX</w:t>
+                    <w:t xml:space="preserve">Instructions</w:t>
+                  </w:r>
+                </w:p>
+              </w:tc>
+              <w:tc>
+                <w:tcPr/>
+                <w:p>
+                  <w:pPr>
+                    <w:pStyle w:val="Compact"/>
+                    <w:jc w:val="left"/>
+                    <w:jc w:val="center"/>
+                  </w:pPr>
+                  <w:r>
+                    <w:t xml:space="preserve">project-specific AGENTS.md</w:t>
+                  </w:r>
+                </w:p>
+              </w:tc>
+              <w:tc>
+                <w:tcPr/>
+                <w:p>
+                  <w:pPr>
+                    <w:pStyle w:val="Compact"/>
+                    <w:jc w:val="left"/>
+                    <w:jc w:val="center"/>
+                  </w:pPr>
+                  <w:r>
+                    <w:t xml:space="preserve">Specific custom project context and instructions auto-loaded at the start of each session</w:t>
+                  </w:r>
+                </w:p>
+              </w:tc>
+              <w:tc>
+                <w:tcPr/>
+                <w:p>
+                  <w:pPr>
+                    <w:pStyle w:val="Compact"/>
+                    <w:jc w:val="left"/>
+                    <w:jc w:val="center"/>
+                  </w:pPr>
+                  <w:r>
+                    <w:t xml:space="preserve">local</w:t>
                   </w:r>
                 </w:p>
               </w:tc>
@@ -2843,46 +2843,46 @@
                     <w:jc w:val="center"/>
                   </w:pPr>
                   <w:r>
-                    <w:t xml:space="preserve">MCP</w:t>
-                  </w:r>
-                </w:p>
-              </w:tc>
-              <w:tc>
-                <w:tcPr/>
-                <w:p>
-                  <w:pPr>
-                    <w:pStyle w:val="Compact"/>
-                    <w:jc w:val="left"/>
-                    <w:jc w:val="center"/>
-                  </w:pPr>
-                  <w:r>
-                    <w:t xml:space="preserve">scholar_mcp</w:t>
-                  </w:r>
-                </w:p>
-              </w:tc>
-              <w:tc>
-                <w:tcPr/>
-                <w:p>
-                  <w:pPr>
-                    <w:pStyle w:val="Compact"/>
-                    <w:jc w:val="left"/>
-                    <w:jc w:val="center"/>
-                  </w:pPr>
-                  <w:r>
-                    <w:t xml:space="preserve">(Anthropic 2024)</w:t>
-                  </w:r>
-                </w:p>
-              </w:tc>
-              <w:tc>
-                <w:tcPr/>
-                <w:p>
-                  <w:pPr>
-                    <w:pStyle w:val="Compact"/>
-                    <w:jc w:val="left"/>
-                    <w:jc w:val="center"/>
-                  </w:pPr>
-                  <w:r>
-                    <w:t xml:space="preserve">Retrieves paper metadata and references and validates manuscript citations</w:t>
+                    <w:t xml:space="preserve">Skill</w:t>
+                  </w:r>
+                </w:p>
+              </w:tc>
+              <w:tc>
+                <w:tcPr/>
+                <w:p>
+                  <w:pPr>
+                    <w:pStyle w:val="Compact"/>
+                    <w:jc w:val="left"/>
+                    <w:jc w:val="center"/>
+                  </w:pPr>
+                  <w:r>
+                    <w:t xml:space="preserve">academic-paper-reviewer</w:t>
+                  </w:r>
+                </w:p>
+              </w:tc>
+              <w:tc>
+                <w:tcPr/>
+                <w:p>
+                  <w:pPr>
+                    <w:pStyle w:val="Compact"/>
+                    <w:jc w:val="left"/>
+                    <w:jc w:val="center"/>
+                  </w:pPr>
+                  <w:r>
+                    <w:t xml:space="preserve">Simulates independent reviewers plus a devil’s advocate for manuscripts</w:t>
+                  </w:r>
+                </w:p>
+              </w:tc>
+              <w:tc>
+                <w:tcPr/>
+                <w:p>
+                  <w:pPr>
+                    <w:pStyle w:val="Compact"/>
+                    <w:jc w:val="left"/>
+                    <w:jc w:val="center"/>
+                  </w:pPr>
+                  <w:r>
+                    <w:t xml:space="preserve">https://github.com/izillionways/academic-research-skills-hermes/blob/main/research/academic-paper-reviewer/SKILL.md</w:t>
                   </w:r>
                 </w:p>
               </w:tc>
@@ -2897,46 +2897,46 @@
                     <w:jc w:val="center"/>
                   </w:pPr>
                   <w:r>
-                    <w:t xml:space="preserve">MCP</w:t>
-                  </w:r>
-                </w:p>
-              </w:tc>
-              <w:tc>
-                <w:tcPr/>
-                <w:p>
-                  <w:pPr>
-                    <w:pStyle w:val="Compact"/>
-                    <w:jc w:val="left"/>
-                    <w:jc w:val="center"/>
-                  </w:pPr>
-                  <w:r>
-                    <w:t xml:space="preserve">markitdown</w:t>
-                  </w:r>
-                </w:p>
-              </w:tc>
-              <w:tc>
-                <w:tcPr/>
-                <w:p>
-                  <w:pPr>
-                    <w:pStyle w:val="Compact"/>
-                    <w:jc w:val="left"/>
-                    <w:jc w:val="center"/>
-                  </w:pPr>
-                  <w:r>
-                    <w:t xml:space="preserve">(Anthropic 2024)</w:t>
-                  </w:r>
-                </w:p>
-              </w:tc>
-              <w:tc>
-                <w:tcPr/>
-                <w:p>
-                  <w:pPr>
-                    <w:pStyle w:val="Compact"/>
-                    <w:jc w:val="left"/>
-                    <w:jc w:val="center"/>
-                  </w:pPr>
-                  <w:r>
-                    <w:t xml:space="preserve">Converts DOCX files, PDFs and web pages to plain text the agent can read</w:t>
+                    <w:t xml:space="preserve">Skill</w:t>
+                  </w:r>
+                </w:p>
+              </w:tc>
+              <w:tc>
+                <w:tcPr/>
+                <w:p>
+                  <w:pPr>
+                    <w:pStyle w:val="Compact"/>
+                    <w:jc w:val="left"/>
+                    <w:jc w:val="center"/>
+                  </w:pPr>
+                  <w:r>
+                    <w:t xml:space="preserve">deep-research</w:t>
+                  </w:r>
+                </w:p>
+              </w:tc>
+              <w:tc>
+                <w:tcPr/>
+                <w:p>
+                  <w:pPr>
+                    <w:pStyle w:val="Compact"/>
+                    <w:jc w:val="left"/>
+                    <w:jc w:val="center"/>
+                  </w:pPr>
+                  <w:r>
+                    <w:t xml:space="preserve">Agent team for literature search verification synthesis and systematic review</w:t>
+                  </w:r>
+                </w:p>
+              </w:tc>
+              <w:tc>
+                <w:tcPr/>
+                <w:p>
+                  <w:pPr>
+                    <w:pStyle w:val="Compact"/>
+                    <w:jc w:val="left"/>
+                    <w:jc w:val="center"/>
+                  </w:pPr>
+                  <w:r>
+                    <w:t xml:space="preserve">https://github.com/pafozz/hermes-deep-research</w:t>
                   </w:r>
                 </w:p>
               </w:tc>
@@ -2951,46 +2951,46 @@
                     <w:jc w:val="center"/>
                   </w:pPr>
                   <w:r>
-                    <w:t xml:space="preserve">MCP</w:t>
-                  </w:r>
-                </w:p>
-              </w:tc>
-              <w:tc>
-                <w:tcPr/>
-                <w:p>
-                  <w:pPr>
-                    <w:pStyle w:val="Compact"/>
-                    <w:jc w:val="left"/>
-                    <w:jc w:val="center"/>
-                  </w:pPr>
-                  <w:r>
-                    <w:t xml:space="preserve">open-scholar-peer</w:t>
-                  </w:r>
-                </w:p>
-              </w:tc>
-              <w:tc>
-                <w:tcPr/>
-                <w:p>
-                  <w:pPr>
-                    <w:pStyle w:val="Compact"/>
-                    <w:jc w:val="left"/>
-                    <w:jc w:val="center"/>
-                  </w:pPr>
-                  <w:r>
-                    <w:t xml:space="preserve">(Anthropic 2024)</w:t>
-                  </w:r>
-                </w:p>
-              </w:tc>
-              <w:tc>
-                <w:tcPr/>
-                <w:p>
-                  <w:pPr>
-                    <w:pStyle w:val="Compact"/>
-                    <w:jc w:val="left"/>
-                    <w:jc w:val="center"/>
-                  </w:pPr>
-                  <w:r>
-                    <w:t xml:space="preserve">Queries Semantic Scholar arXiv and Scholar author records</w:t>
+                    <w:t xml:space="preserve">Skill</w:t>
+                  </w:r>
+                </w:p>
+              </w:tc>
+              <w:tc>
+                <w:tcPr/>
+                <w:p>
+                  <w:pPr>
+                    <w:pStyle w:val="Compact"/>
+                    <w:jc w:val="left"/>
+                    <w:jc w:val="center"/>
+                  </w:pPr>
+                  <w:r>
+                    <w:t xml:space="preserve">r-style-guide</w:t>
+                  </w:r>
+                </w:p>
+              </w:tc>
+              <w:tc>
+                <w:tcPr/>
+                <w:p>
+                  <w:pPr>
+                    <w:pStyle w:val="Compact"/>
+                    <w:jc w:val="left"/>
+                    <w:jc w:val="center"/>
+                  </w:pPr>
+                  <w:r>
+                    <w:t xml:space="preserve">Conventions for writing R, e.g. naming, spacing, layout, function design</w:t>
+                  </w:r>
+                </w:p>
+              </w:tc>
+              <w:tc>
+                <w:tcPr/>
+                <w:p>
+                  <w:pPr>
+                    <w:pStyle w:val="Compact"/>
+                    <w:jc w:val="left"/>
+                    <w:jc w:val="center"/>
+                  </w:pPr>
+                  <w:r>
+                    <w:t xml:space="preserve">https://style.tidyverse.org/</w:t>
                   </w:r>
                 </w:p>
               </w:tc>
@@ -3018,33 +3018,33 @@
                     <w:jc w:val="center"/>
                   </w:pPr>
                   <w:r>
-                    <w:t xml:space="preserve">academic-paper-reviewer</w:t>
-                  </w:r>
-                </w:p>
-              </w:tc>
-              <w:tc>
-                <w:tcPr/>
-                <w:p>
-                  <w:pPr>
-                    <w:pStyle w:val="Compact"/>
-                    <w:jc w:val="left"/>
-                    <w:jc w:val="center"/>
-                  </w:pPr>
-                  <w:r>
-                    <w:t xml:space="preserve">(Anthropic 2025)</w:t>
-                  </w:r>
-                </w:p>
-              </w:tc>
-              <w:tc>
-                <w:tcPr/>
-                <w:p>
-                  <w:pPr>
-                    <w:pStyle w:val="Compact"/>
-                    <w:jc w:val="left"/>
-                    <w:jc w:val="center"/>
-                  </w:pPr>
-                  <w:r>
-                    <w:t xml:space="preserve">Simulates independent reviewers plus a devil’s advocate for manuscripts</w:t>
+                    <w:t xml:space="preserve">tidyverse-patterns</w:t>
+                  </w:r>
+                </w:p>
+              </w:tc>
+              <w:tc>
+                <w:tcPr/>
+                <w:p>
+                  <w:pPr>
+                    <w:pStyle w:val="Compact"/>
+                    <w:jc w:val="left"/>
+                    <w:jc w:val="center"/>
+                  </w:pPr>
+                  <w:r>
+                    <w:t xml:space="preserve">Conventions for using tidyverse packages, e.g. modern pipes, joins, grouping, string handling</w:t>
+                  </w:r>
+                </w:p>
+              </w:tc>
+              <w:tc>
+                <w:tcPr/>
+                <w:p>
+                  <w:pPr>
+                    <w:pStyle w:val="Compact"/>
+                    <w:jc w:val="left"/>
+                    <w:jc w:val="center"/>
+                  </w:pPr>
+                  <w:r>
+                    <w:t xml:space="preserve">https://style.tidyverse.org/</w:t>
                   </w:r>
                 </w:p>
               </w:tc>
@@ -3072,33 +3072,33 @@
                     <w:jc w:val="center"/>
                   </w:pPr>
                   <w:r>
-                    <w:t xml:space="preserve">deep-research</w:t>
-                  </w:r>
-                </w:p>
-              </w:tc>
-              <w:tc>
-                <w:tcPr/>
-                <w:p>
-                  <w:pPr>
-                    <w:pStyle w:val="Compact"/>
-                    <w:jc w:val="left"/>
-                    <w:jc w:val="center"/>
-                  </w:pPr>
-                  <w:r>
-                    <w:t xml:space="preserve">(Anthropic 2025)</w:t>
-                  </w:r>
-                </w:p>
-              </w:tc>
-              <w:tc>
-                <w:tcPr/>
-                <w:p>
-                  <w:pPr>
-                    <w:pStyle w:val="Compact"/>
-                    <w:jc w:val="left"/>
-                    <w:jc w:val="center"/>
-                  </w:pPr>
-                  <w:r>
-                    <w:t xml:space="preserve">Agent team for literature search verification synthesis and systematic review</w:t>
+                    <w:t xml:space="preserve">quarto-authoring</w:t>
+                  </w:r>
+                </w:p>
+              </w:tc>
+              <w:tc>
+                <w:tcPr/>
+                <w:p>
+                  <w:pPr>
+                    <w:pStyle w:val="Compact"/>
+                    <w:jc w:val="left"/>
+                    <w:jc w:val="center"/>
+                  </w:pPr>
+                  <w:r>
+                    <w:t xml:space="preserve">Authoring with Quarto documents, e.g. cross-references, citations, and extensions</w:t>
+                  </w:r>
+                </w:p>
+              </w:tc>
+              <w:tc>
+                <w:tcPr/>
+                <w:p>
+                  <w:pPr>
+                    <w:pStyle w:val="Compact"/>
+                    <w:jc w:val="left"/>
+                    <w:jc w:val="center"/>
+                  </w:pPr>
+                  <w:r>
+                    <w:t xml:space="preserve">https://github.com/NousResearch/hermes-agent/blob/main/skills/writing/quarto-authoring</w:t>
                   </w:r>
                 </w:p>
               </w:tc>
@@ -3126,33 +3126,33 @@
                     <w:jc w:val="center"/>
                   </w:pPr>
                   <w:r>
-                    <w:t xml:space="preserve">r-style-guide</w:t>
-                  </w:r>
-                </w:p>
-              </w:tc>
-              <w:tc>
-                <w:tcPr/>
-                <w:p>
-                  <w:pPr>
-                    <w:pStyle w:val="Compact"/>
-                    <w:jc w:val="left"/>
-                    <w:jc w:val="center"/>
-                  </w:pPr>
-                  <w:r>
-                    <w:t xml:space="preserve">(Anthropic 2025)</w:t>
-                  </w:r>
-                </w:p>
-              </w:tc>
-              <w:tc>
-                <w:tcPr/>
-                <w:p>
-                  <w:pPr>
-                    <w:pStyle w:val="Compact"/>
-                    <w:jc w:val="left"/>
-                    <w:jc w:val="center"/>
-                  </w:pPr>
-                  <w:r>
-                    <w:t xml:space="preserve">Naming spacing layout and function design conventions for R</w:t>
+                    <w:t xml:space="preserve">zotero-cli</w:t>
+                  </w:r>
+                </w:p>
+              </w:tc>
+              <w:tc>
+                <w:tcPr/>
+                <w:p>
+                  <w:pPr>
+                    <w:pStyle w:val="Compact"/>
+                    <w:jc w:val="left"/>
+                    <w:jc w:val="center"/>
+                  </w:pPr>
+                  <w:r>
+                    <w:t xml:space="preserve">Searches, reads, and annotates the author’s Zotero library from the shell</w:t>
+                  </w:r>
+                </w:p>
+              </w:tc>
+              <w:tc>
+                <w:tcPr/>
+                <w:p>
+                  <w:pPr>
+                    <w:pStyle w:val="Compact"/>
+                    <w:jc w:val="left"/>
+                    <w:jc w:val="center"/>
+                  </w:pPr>
+                  <w:r>
+                    <w:t xml:space="preserve">https://github.com/Agents365-ai/zotero-cli-ai</w:t>
                   </w:r>
                 </w:p>
               </w:tc>
@@ -3167,46 +3167,46 @@
                     <w:jc w:val="center"/>
                   </w:pPr>
                   <w:r>
-                    <w:t xml:space="preserve">Skill</w:t>
-                  </w:r>
-                </w:p>
-              </w:tc>
-              <w:tc>
-                <w:tcPr/>
-                <w:p>
-                  <w:pPr>
-                    <w:pStyle w:val="Compact"/>
-                    <w:jc w:val="left"/>
-                    <w:jc w:val="center"/>
-                  </w:pPr>
-                  <w:r>
-                    <w:t xml:space="preserve">tidyverse-patterns</w:t>
-                  </w:r>
-                </w:p>
-              </w:tc>
-              <w:tc>
-                <w:tcPr/>
-                <w:p>
-                  <w:pPr>
-                    <w:pStyle w:val="Compact"/>
-                    <w:jc w:val="left"/>
-                    <w:jc w:val="center"/>
-                  </w:pPr>
-                  <w:r>
-                    <w:t xml:space="preserve">(Anthropic 2025)</w:t>
-                  </w:r>
-                </w:p>
-              </w:tc>
-              <w:tc>
-                <w:tcPr/>
-                <w:p>
-                  <w:pPr>
-                    <w:pStyle w:val="Compact"/>
-                    <w:jc w:val="left"/>
-                    <w:jc w:val="center"/>
-                  </w:pPr>
-                  <w:r>
-                    <w:t xml:space="preserve">Modern pipes joins grouping and string handling across the tidyverse</w:t>
+                    <w:t xml:space="preserve">MCP</w:t>
+                  </w:r>
+                </w:p>
+              </w:tc>
+              <w:tc>
+                <w:tcPr/>
+                <w:p>
+                  <w:pPr>
+                    <w:pStyle w:val="Compact"/>
+                    <w:jc w:val="left"/>
+                    <w:jc w:val="center"/>
+                  </w:pPr>
+                  <w:r>
+                    <w:t xml:space="preserve">r-mcptools</w:t>
+                  </w:r>
+                </w:p>
+              </w:tc>
+              <w:tc>
+                <w:tcPr/>
+                <w:p>
+                  <w:pPr>
+                    <w:pStyle w:val="Compact"/>
+                    <w:jc w:val="left"/>
+                    <w:jc w:val="center"/>
+                  </w:pPr>
+                  <w:r>
+                    <w:t xml:space="preserve">Exposes a running R session so the agent can execute code and read results</w:t>
+                  </w:r>
+                </w:p>
+              </w:tc>
+              <w:tc>
+                <w:tcPr/>
+                <w:p>
+                  <w:pPr>
+                    <w:pStyle w:val="Compact"/>
+                    <w:jc w:val="left"/>
+                    <w:jc w:val="center"/>
+                  </w:pPr>
+                  <w:r>
+                    <w:t xml:space="preserve">https://github.com/posit-dev/mcptools</w:t>
                   </w:r>
                 </w:p>
               </w:tc>
@@ -3221,46 +3221,46 @@
                     <w:jc w:val="center"/>
                   </w:pPr>
                   <w:r>
-                    <w:t xml:space="preserve">Skill</w:t>
-                  </w:r>
-                </w:p>
-              </w:tc>
-              <w:tc>
-                <w:tcPr/>
-                <w:p>
-                  <w:pPr>
-                    <w:pStyle w:val="Compact"/>
-                    <w:jc w:val="left"/>
-                    <w:jc w:val="center"/>
-                  </w:pPr>
-                  <w:r>
-                    <w:t xml:space="preserve">quarto-authoring</w:t>
-                  </w:r>
-                </w:p>
-              </w:tc>
-              <w:tc>
-                <w:tcPr/>
-                <w:p>
-                  <w:pPr>
-                    <w:pStyle w:val="Compact"/>
-                    <w:jc w:val="left"/>
-                    <w:jc w:val="center"/>
-                  </w:pPr>
-                  <w:r>
-                    <w:t xml:space="preserve">(Anthropic 2025)</w:t>
-                  </w:r>
-                </w:p>
-              </w:tc>
-              <w:tc>
-                <w:tcPr/>
-                <w:p>
-                  <w:pPr>
-                    <w:pStyle w:val="Compact"/>
-                    <w:jc w:val="left"/>
-                    <w:jc w:val="center"/>
-                  </w:pPr>
-                  <w:r>
-                    <w:t xml:space="preserve">Authoring with Quarto documents cross-references citations and extensions</w:t>
+                    <w:t xml:space="preserve">MCP</w:t>
+                  </w:r>
+                </w:p>
+              </w:tc>
+              <w:tc>
+                <w:tcPr/>
+                <w:p>
+                  <w:pPr>
+                    <w:pStyle w:val="Compact"/>
+                    <w:jc w:val="left"/>
+                    <w:jc w:val="center"/>
+                  </w:pPr>
+                  <w:r>
+                    <w:t xml:space="preserve">refcheck</w:t>
+                  </w:r>
+                </w:p>
+              </w:tc>
+              <w:tc>
+                <w:tcPr/>
+                <w:p>
+                  <w:pPr>
+                    <w:pStyle w:val="Compact"/>
+                    <w:jc w:val="left"/>
+                    <w:jc w:val="center"/>
+                  </w:pPr>
+                  <w:r>
+                    <w:t xml:space="preserve">Searches publication databases and returns verified references with BibTeX</w:t>
+                  </w:r>
+                </w:p>
+              </w:tc>
+              <w:tc>
+                <w:tcPr/>
+                <w:p>
+                  <w:pPr>
+                    <w:pStyle w:val="Compact"/>
+                    <w:jc w:val="left"/>
+                    <w:jc w:val="center"/>
+                  </w:pPr>
+                  <w:r>
+                    <w:t xml:space="preserve">https://github.com/UMN-Choi-Lab/refcheck</w:t>
                   </w:r>
                 </w:p>
               </w:tc>
@@ -3275,46 +3275,46 @@
                     <w:jc w:val="center"/>
                   </w:pPr>
                   <w:r>
-                    <w:t xml:space="preserve">Skill</w:t>
-                  </w:r>
-                </w:p>
-              </w:tc>
-              <w:tc>
-                <w:tcPr/>
-                <w:p>
-                  <w:pPr>
-                    <w:pStyle w:val="Compact"/>
-                    <w:jc w:val="left"/>
-                    <w:jc w:val="center"/>
-                  </w:pPr>
-                  <w:r>
-                    <w:t xml:space="preserve">zotero-cli</w:t>
-                  </w:r>
-                </w:p>
-              </w:tc>
-              <w:tc>
-                <w:tcPr/>
-                <w:p>
-                  <w:pPr>
-                    <w:pStyle w:val="Compact"/>
-                    <w:jc w:val="left"/>
-                    <w:jc w:val="center"/>
-                  </w:pPr>
-                  <w:r>
-                    <w:t xml:space="preserve">(54yyyu)</w:t>
-                  </w:r>
-                </w:p>
-              </w:tc>
-              <w:tc>
-                <w:tcPr/>
-                <w:p>
-                  <w:pPr>
-                    <w:pStyle w:val="Compact"/>
-                    <w:jc w:val="left"/>
-                    <w:jc w:val="center"/>
-                  </w:pPr>
-                  <w:r>
-                    <w:t xml:space="preserve">Searches reads and annotates the author’s Zotero library from the shell</w:t>
+                    <w:t xml:space="preserve">MCP</w:t>
+                  </w:r>
+                </w:p>
+              </w:tc>
+              <w:tc>
+                <w:tcPr/>
+                <w:p>
+                  <w:pPr>
+                    <w:pStyle w:val="Compact"/>
+                    <w:jc w:val="left"/>
+                    <w:jc w:val="center"/>
+                  </w:pPr>
+                  <w:r>
+                    <w:t xml:space="preserve">scholar_mcp</w:t>
+                  </w:r>
+                </w:p>
+              </w:tc>
+              <w:tc>
+                <w:tcPr/>
+                <w:p>
+                  <w:pPr>
+                    <w:pStyle w:val="Compact"/>
+                    <w:jc w:val="left"/>
+                    <w:jc w:val="center"/>
+                  </w:pPr>
+                  <w:r>
+                    <w:t xml:space="preserve">Retrieves paper metadata and references and validates manuscript citations</w:t>
+                  </w:r>
+                </w:p>
+              </w:tc>
+              <w:tc>
+                <w:tcPr/>
+                <w:p>
+                  <w:pPr>
+                    <w:pStyle w:val="Compact"/>
+                    <w:jc w:val="left"/>
+                    <w:jc w:val="center"/>
+                  </w:pPr>
+                  <w:r>
+                    <w:t xml:space="preserve">https://github.com/Liyux3/scholar-mcp</w:t>
                   </w:r>
                 </w:p>
               </w:tc>
@@ -3329,46 +3329,46 @@
                     <w:jc w:val="center"/>
                   </w:pPr>
                   <w:r>
-                    <w:t xml:space="preserve">Instructions</w:t>
-                  </w:r>
-                </w:p>
-              </w:tc>
-              <w:tc>
-                <w:tcPr/>
-                <w:p>
-                  <w:pPr>
-                    <w:pStyle w:val="Compact"/>
-                    <w:jc w:val="left"/>
-                    <w:jc w:val="center"/>
-                  </w:pPr>
-                  <w:r>
-                    <w:t xml:space="preserve">global AGENTS.md</w:t>
-                  </w:r>
-                </w:p>
-              </w:tc>
-              <w:tc>
-                <w:tcPr/>
-                <w:p>
-                  <w:pPr>
-                    <w:pStyle w:val="Compact"/>
-                    <w:jc w:val="left"/>
-                    <w:jc w:val="center"/>
-                  </w:pPr>
-                  <w:r>
-                    <w:t xml:space="preserve">(OpenCode)</w:t>
-                  </w:r>
-                </w:p>
-              </w:tc>
-              <w:tc>
-                <w:tcPr/>
-                <w:p>
-                  <w:pPr>
-                    <w:pStyle w:val="Compact"/>
-                    <w:jc w:val="left"/>
-                    <w:jc w:val="center"/>
-                  </w:pPr>
-                  <w:r>
-                    <w:t xml:space="preserve">Global style verification</w:t>
+                    <w:t xml:space="preserve">MCP</w:t>
+                  </w:r>
+                </w:p>
+              </w:tc>
+              <w:tc>
+                <w:tcPr/>
+                <w:p>
+                  <w:pPr>
+                    <w:pStyle w:val="Compact"/>
+                    <w:jc w:val="left"/>
+                    <w:jc w:val="center"/>
+                  </w:pPr>
+                  <w:r>
+                    <w:t xml:space="preserve">markitdown</w:t>
+                  </w:r>
+                </w:p>
+              </w:tc>
+              <w:tc>
+                <w:tcPr/>
+                <w:p>
+                  <w:pPr>
+                    <w:pStyle w:val="Compact"/>
+                    <w:jc w:val="left"/>
+                    <w:jc w:val="center"/>
+                  </w:pPr>
+                  <w:r>
+                    <w:t xml:space="preserve">Converts DOCX files, PDFs and web pages to markdown the agent can read</w:t>
+                  </w:r>
+                </w:p>
+              </w:tc>
+              <w:tc>
+                <w:tcPr/>
+                <w:p>
+                  <w:pPr>
+                    <w:pStyle w:val="Compact"/>
+                    <w:jc w:val="left"/>
+                    <w:jc w:val="center"/>
+                  </w:pPr>
+                  <w:r>
+                    <w:t xml:space="preserve">https://github.com/microsoft/markitdown/tree/main/packages/markitdown-mcp</w:t>
                   </w:r>
                 </w:p>
               </w:tc>
@@ -3383,100 +3383,46 @@
                     <w:jc w:val="center"/>
                   </w:pPr>
                   <w:r>
-                    <w:t xml:space="preserve">operating rules</w:t>
-                  </w:r>
-                </w:p>
-              </w:tc>
-              <w:tc>
-                <w:tcPr/>
-                <w:p>
-                  <w:pPr>
-                    <w:pStyle w:val="Compact"/>
-                    <w:jc w:val="left"/>
-                    <w:jc w:val="center"/>
-                  </w:pPr>
-                  <w:r>
-                    <w:t xml:space="preserve">model persona and response rules (no sycophancy</w:t>
-                  </w:r>
-                </w:p>
-              </w:tc>
-              <w:tc>
-                <w:tcPr/>
-                <w:p>
-                  <w:pPr>
-                    <w:pStyle w:val="Compact"/>
-                    <w:jc w:val="left"/>
-                    <w:jc w:val="center"/>
-                  </w:pPr>
-                  <w:r>
-                    <w:t xml:space="preserve">list of banned words</w:t>
-                  </w:r>
-                </w:p>
-              </w:tc>
-              <w:tc>
-                <w:tcPr/>
-                <w:p>
-                  <w:pPr>
-                    <w:pStyle w:val="Compact"/>
-                    <w:jc w:val="left"/>
-                    <w:jc w:val="center"/>
-                  </w:pPr>
-                  <w:r>
-                    <w:t xml:space="preserve">etc.) for every session</w:t>
-                  </w:r>
-                </w:p>
-              </w:tc>
-            </w:tr>
-            <w:tr>
-              <w:tc>
-                <w:tcPr/>
-                <w:p>
-                  <w:pPr>
-                    <w:pStyle w:val="Compact"/>
-                    <w:jc w:val="left"/>
-                    <w:jc w:val="center"/>
-                  </w:pPr>
-                  <w:r>
-                    <w:t xml:space="preserve">Instructions</w:t>
-                  </w:r>
-                </w:p>
-              </w:tc>
-              <w:tc>
-                <w:tcPr/>
-                <w:p>
-                  <w:pPr>
-                    <w:pStyle w:val="Compact"/>
-                    <w:jc w:val="left"/>
-                    <w:jc w:val="center"/>
-                  </w:pPr>
-                  <w:r>
-                    <w:t xml:space="preserve">project-specific AGENTS.md</w:t>
-                  </w:r>
-                </w:p>
-              </w:tc>
-              <w:tc>
-                <w:tcPr/>
-                <w:p>
-                  <w:pPr>
-                    <w:pStyle w:val="Compact"/>
-                    <w:jc w:val="left"/>
-                    <w:jc w:val="center"/>
-                  </w:pPr>
-                  <w:r>
-                    <w:t xml:space="preserve">(OpenCode)</w:t>
-                  </w:r>
-                </w:p>
-              </w:tc>
-              <w:tc>
-                <w:tcPr/>
-                <w:p>
-                  <w:pPr>
-                    <w:pStyle w:val="Compact"/>
-                    <w:jc w:val="left"/>
-                    <w:jc w:val="center"/>
-                  </w:pPr>
-                  <w:r>
-                    <w:t xml:space="preserve">Specific custom project context and instructions auto-loaded at the start of each session</w:t>
+                    <w:t xml:space="preserve">MCP</w:t>
+                  </w:r>
+                </w:p>
+              </w:tc>
+              <w:tc>
+                <w:tcPr/>
+                <w:p>
+                  <w:pPr>
+                    <w:pStyle w:val="Compact"/>
+                    <w:jc w:val="left"/>
+                    <w:jc w:val="center"/>
+                  </w:pPr>
+                  <w:r>
+                    <w:t xml:space="preserve">open-scholar-peer</w:t>
+                  </w:r>
+                </w:p>
+              </w:tc>
+              <w:tc>
+                <w:tcPr/>
+                <w:p>
+                  <w:pPr>
+                    <w:pStyle w:val="Compact"/>
+                    <w:jc w:val="left"/>
+                    <w:jc w:val="center"/>
+                  </w:pPr>
+                  <w:r>
+                    <w:t xml:space="preserve">Queries Semantic Scholar arXiv and Scholar author records</w:t>
+                  </w:r>
+                </w:p>
+              </w:tc>
+              <w:tc>
+                <w:tcPr/>
+                <w:p>
+                  <w:pPr>
+                    <w:pStyle w:val="Compact"/>
+                    <w:jc w:val="left"/>
+                    <w:jc w:val="center"/>
+                  </w:pPr>
+                  <w:r>
+                    <w:t xml:space="preserve">https://github.com/amirkiarafiei/open-scholar-peer</w:t>
                   </w:r>
                 </w:p>
               </w:tc>
@@ -3689,16 +3635,7 @@
         <w:t xml:space="preserve">(Zheng et al. 2024)</w:t>
       </w:r>
       <w:r>
-        <w:t xml:space="preserve">, generating high-quality, real-world code for research still requires your understanding of context, debugging skills, and integration with the overall goals of your research project. When using an AI agent to plan and write code for data analysis, we recommend</w:t>
-      </w:r>
-      <w:r>
-        <w:t xml:space="preserve"> </w:t>
-      </w:r>
-      <w:r>
-        <w:t xml:space="preserve">Brown and Spillias (2026)</w:t>
-      </w:r>
-      <w:r>
-        <w:t xml:space="preserve">’s guidance:</w:t>
+        <w:t xml:space="preserve">, generating high-quality, real-world code for research still requires your understanding of context, debugging skills, and integration with the overall goals of your research project. When using an AI agent to plan and write code for data analysis, we recommend you:</w:t>
       </w:r>
     </w:p>
     <w:p>
@@ -3709,17 +3646,17 @@
         </w:numPr>
         <w:pStyle w:val="Compact"/>
       </w:pPr>
-    </w:p>
-    <w:p>
-      <w:pPr>
-        <w:numPr>
-          <w:ilvl w:val="1"/>
-          <w:numId w:val="1002"/>
-        </w:numPr>
-        <w:pStyle w:val="Compact"/>
-      </w:pPr>
-      <w:r>
-        <w:t xml:space="preserve">write a prompt that is detailed and specific about the study’s context, research question, types of variables and data collection methods. The archaeological expertise you bring to writing this prompt can make a big difference to the quality and consistency of responses to this prompt</w:t>
+      <w:r>
+        <w:t xml:space="preserve">write a prompt that is detailed and specific about the study’s context, research question, types of variables and data collection methods</w:t>
+      </w:r>
+      <w:r>
+        <w:t xml:space="preserve"> </w:t>
+      </w:r>
+      <w:r>
+        <w:t xml:space="preserve">(Brown and Spillias 2026)</w:t>
+      </w:r>
+      <w:r>
+        <w:t xml:space="preserve">. The archaeological expertise you bring to writing this prompt can make a big difference to the quality and consistency of responses to this prompt</w:t>
       </w:r>
       <w:r>
         <w:t xml:space="preserve"> </w:t>
@@ -3739,15 +3676,6 @@
         </w:numPr>
         <w:pStyle w:val="Compact"/>
       </w:pPr>
-    </w:p>
-    <w:p>
-      <w:pPr>
-        <w:numPr>
-          <w:ilvl w:val="1"/>
-          <w:numId w:val="1003"/>
-        </w:numPr>
-        <w:pStyle w:val="Compact"/>
-      </w:pPr>
       <w:r>
         <w:t xml:space="preserve">include with the prompt the dataset, a narrative summary of the data or a synthetic version of the data generated by a local LLM. This is another form of context and will improve the quality of the model’s output</w:t>
       </w:r>
@@ -3769,17 +3697,17 @@
         </w:numPr>
         <w:pStyle w:val="Compact"/>
       </w:pPr>
-    </w:p>
-    <w:p>
-      <w:pPr>
-        <w:numPr>
-          <w:ilvl w:val="1"/>
-          <w:numId w:val="1004"/>
-        </w:numPr>
-        <w:pStyle w:val="Compact"/>
-      </w:pPr>
-      <w:r>
-        <w:t xml:space="preserve">include high-quality trustworthy reference materials, such as DOIs to exemplary studies similar to what you want to do, or technical methodological literature that describes relevant methods in detail. Use the agent to help you deeply search for this literature.</w:t>
+      <w:r>
+        <w:t xml:space="preserve">include high-quality trustworthy reference materials, such as DOIs to exemplary studies similar to what you want to do, or technical methodological literature that describes relevant methods in detail</w:t>
+      </w:r>
+      <w:r>
+        <w:t xml:space="preserve"> </w:t>
+      </w:r>
+      <w:r>
+        <w:t xml:space="preserve">(Brown and Spillias 2026)</w:t>
+      </w:r>
+      <w:r>
+        <w:t xml:space="preserve">. Use the agent to help you deeply search for this literature.</w:t>
       </w:r>
     </w:p>
     <w:p>
@@ -3790,15 +3718,6 @@
         </w:numPr>
         <w:pStyle w:val="Compact"/>
       </w:pPr>
-    </w:p>
-    <w:p>
-      <w:pPr>
-        <w:numPr>
-          <w:ilvl w:val="1"/>
-          <w:numId w:val="1005"/>
-        </w:numPr>
-        <w:pStyle w:val="Compact"/>
-      </w:pPr>
       <w:r>
         <w:t xml:space="preserve">include instructions for the model evaluate its code for correctness and completeness before stopping. This sets the agent to work in a loop: generate code -&gt; run it -&gt; test it -&gt; fix any errors -&gt; run it again -&gt; test it, etc. until your evaluation criteria have been satisfied. Specifying evaluation criteria and instructing the model to debug itself improves the accuracy of output</w:t>
       </w:r>
@@ -3976,15 +3895,7 @@
         <w:pStyle w:val="BodyText"/>
       </w:pPr>
       <w:r>
-        <w:t xml:space="preserve">We recommend three practices for responsible agentic AI use in archaeological data analysis: learn the research tools and standards, configure a harness with explicit permissions, and use tested skills and tools to research, plan, and analyze. Quarto makes the relationship between code and report inspectable, while Git records reviewed changes. Planning and verification remain part of the researcher’s work throughout.</w:t>
-      </w:r>
-    </w:p>
-    <w:p>
-      <w:pPr>
-        <w:pStyle w:val="BodyText"/>
-      </w:pPr>
-      <w:r>
-        <w:t xml:space="preserve">The practical result should be a documented analysis whose inputs, decisions, code, and outputs another researcher can examine. The agent may assist with each task, but the researcher must explain the methods, assess the evidence, and authorize release. These responsibilities define when the work is ready to share.</w:t>
+        <w:t xml:space="preserve">limitations from Brown… national academies report</w:t>
       </w:r>
     </w:p>
     <w:bookmarkEnd w:id="28"/>
@@ -4060,7 +3971,7 @@
       </w:r>
     </w:p>
     <w:bookmarkEnd w:id="32"/>
-    <w:bookmarkStart w:id="161" w:name="references"/>
+    <w:bookmarkStart w:id="157" w:name="references"/>
     <w:p>
       <w:pPr>
         <w:pStyle w:val="Heading1"/>
@@ -4069,41 +3980,8 @@
         <w:t xml:space="preserve">References</w:t>
       </w:r>
     </w:p>
-    <w:bookmarkStart w:id="159" w:name="refs"/>
-    <w:bookmarkStart w:id="34" w:name="ref-ZoteroMCP2026"/>
-    <w:p>
-      <w:pPr>
-        <w:pStyle w:val="Bibliography"/>
-      </w:pPr>
-      <w:r>
-        <w:t xml:space="preserve">54yyyu. Zotero</w:t>
-      </w:r>
-      <w:r>
-        <w:t xml:space="preserve"> </w:t>
-      </w:r>
-      <w:r>
-        <w:t xml:space="preserve">MCP</w:t>
-      </w:r>
-      <w:r>
-        <w:t xml:space="preserve">: Chat with Your Research Library.</w:t>
-      </w:r>
-      <w:r>
-        <w:t xml:space="preserve"> </w:t>
-      </w:r>
-      <w:hyperlink r:id="rId33">
-        <w:r>
-          <w:rPr>
-            <w:rStyle w:val="Hyperlink"/>
-          </w:rPr>
-          <w:t xml:space="preserve">https://github.com/54yyyu/zotero-mcp</w:t>
-        </w:r>
-      </w:hyperlink>
-      <w:r>
-        <w:t xml:space="preserve">, accessed September 18, 2026.</w:t>
-      </w:r>
-    </w:p>
-    <w:bookmarkEnd w:id="34"/>
-    <w:bookmarkStart w:id="36" w:name="ref-Abdurahman2025"/>
+    <w:bookmarkStart w:id="155" w:name="refs"/>
+    <w:bookmarkStart w:id="34" w:name="ref-Abdurahman2025"/>
     <w:p>
       <w:pPr>
         <w:pStyle w:val="Bibliography"/>
@@ -4142,7 +4020,7 @@
       <w:r>
         <w:t xml:space="preserve"> </w:t>
       </w:r>
-      <w:hyperlink r:id="rId35">
+      <w:hyperlink r:id="rId33">
         <w:r>
           <w:rPr>
             <w:rStyle w:val="Hyperlink"/>
@@ -4154,8 +4032,8 @@
         <w:t xml:space="preserve">.</w:t>
       </w:r>
     </w:p>
-    <w:bookmarkEnd w:id="36"/>
-    <w:bookmarkStart w:id="38" w:name="ref-Abramson2026"/>
+    <w:bookmarkEnd w:id="34"/>
+    <w:bookmarkStart w:id="36" w:name="ref-Abramson2026"/>
     <w:p>
       <w:pPr>
         <w:pStyle w:val="Bibliography"/>
@@ -4182,7 +4060,7 @@
       <w:r>
         <w:t xml:space="preserve"> </w:t>
       </w:r>
-      <w:hyperlink r:id="rId37">
+      <w:hyperlink r:id="rId35">
         <w:r>
           <w:rPr>
             <w:rStyle w:val="Hyperlink"/>
@@ -4194,8 +4072,8 @@
         <w:t xml:space="preserve">.</w:t>
       </w:r>
     </w:p>
-    <w:bookmarkEnd w:id="38"/>
-    <w:bookmarkStart w:id="40" w:name="ref-Anthropic2024"/>
+    <w:bookmarkEnd w:id="36"/>
+    <w:bookmarkStart w:id="38" w:name="ref-Anthropic2024"/>
     <w:p>
       <w:pPr>
         <w:pStyle w:val="Bibliography"/>
@@ -4215,7 +4093,7 @@
       <w:r>
         <w:t xml:space="preserve"> </w:t>
       </w:r>
-      <w:hyperlink r:id="rId39">
+      <w:hyperlink r:id="rId37">
         <w:r>
           <w:rPr>
             <w:rStyle w:val="Hyperlink"/>
@@ -4227,8 +4105,8 @@
         <w:t xml:space="preserve">, accessed September 16, 2026.</w:t>
       </w:r>
     </w:p>
-    <w:bookmarkEnd w:id="40"/>
-    <w:bookmarkStart w:id="42" w:name="ref-Anthropic2025Skills"/>
+    <w:bookmarkEnd w:id="38"/>
+    <w:bookmarkStart w:id="40" w:name="ref-Anthropic2025Skills"/>
     <w:p>
       <w:pPr>
         <w:pStyle w:val="Bibliography"/>
@@ -4248,7 +4126,7 @@
       <w:r>
         <w:t xml:space="preserve"> </w:t>
       </w:r>
-      <w:hyperlink r:id="rId41">
+      <w:hyperlink r:id="rId39">
         <w:r>
           <w:rPr>
             <w:rStyle w:val="Hyperlink"/>
@@ -4260,8 +4138,8 @@
         <w:t xml:space="preserve">, accessed September 16, 2026.</w:t>
       </w:r>
     </w:p>
-    <w:bookmarkEnd w:id="42"/>
-    <w:bookmarkStart w:id="44" w:name="ref-BeckBurri2024"/>
+    <w:bookmarkEnd w:id="40"/>
+    <w:bookmarkStart w:id="42" w:name="ref-BeckBurri2024"/>
     <w:p>
       <w:pPr>
         <w:pStyle w:val="Bibliography"/>
@@ -4272,7 +4150,7 @@
       <w:r>
         <w:t xml:space="preserve"> </w:t>
       </w:r>
-      <w:hyperlink r:id="rId43">
+      <w:hyperlink r:id="rId41">
         <w:r>
           <w:rPr>
             <w:rStyle w:val="Hyperlink"/>
@@ -4369,8 +4247,8 @@
         <w:t xml:space="preserve">, pp. 104–130. Edward Elgar Publishing.</w:t>
       </w:r>
     </w:p>
-    <w:bookmarkEnd w:id="44"/>
-    <w:bookmarkStart w:id="46" w:name="ref-Bertran2026"/>
+    <w:bookmarkEnd w:id="42"/>
+    <w:bookmarkStart w:id="44" w:name="ref-Bertran2026"/>
     <w:p>
       <w:pPr>
         <w:pStyle w:val="Bibliography"/>
@@ -4397,7 +4275,7 @@
       <w:r>
         <w:t xml:space="preserve"> </w:t>
       </w:r>
-      <w:hyperlink r:id="rId45">
+      <w:hyperlink r:id="rId43">
         <w:r>
           <w:rPr>
             <w:rStyle w:val="Hyperlink"/>
@@ -4409,8 +4287,8 @@
         <w:t xml:space="preserve">.</w:t>
       </w:r>
     </w:p>
-    <w:bookmarkEnd w:id="46"/>
-    <w:bookmarkStart w:id="48" w:name="ref-Blischak2016"/>
+    <w:bookmarkEnd w:id="44"/>
+    <w:bookmarkStart w:id="46" w:name="ref-Blischak2016"/>
     <w:p>
       <w:pPr>
         <w:pStyle w:val="Bibliography"/>
@@ -4458,7 +4336,7 @@
       <w:r>
         <w:t xml:space="preserve"> </w:t>
       </w:r>
-      <w:hyperlink r:id="rId47">
+      <w:hyperlink r:id="rId45">
         <w:r>
           <w:rPr>
             <w:rStyle w:val="Hyperlink"/>
@@ -4470,8 +4348,8 @@
         <w:t xml:space="preserve">.</w:t>
       </w:r>
     </w:p>
-    <w:bookmarkEnd w:id="48"/>
-    <w:bookmarkStart w:id="50" w:name="ref-Bridgeford2026"/>
+    <w:bookmarkEnd w:id="46"/>
+    <w:bookmarkStart w:id="48" w:name="ref-Bridgeford2026"/>
     <w:p>
       <w:pPr>
         <w:pStyle w:val="Bibliography"/>
@@ -4498,7 +4376,7 @@
       <w:r>
         <w:t xml:space="preserve"> </w:t>
       </w:r>
-      <w:hyperlink r:id="rId49">
+      <w:hyperlink r:id="rId47">
         <w:r>
           <w:rPr>
             <w:rStyle w:val="Hyperlink"/>
@@ -4510,8 +4388,8 @@
         <w:t xml:space="preserve">.</w:t>
       </w:r>
     </w:p>
-    <w:bookmarkEnd w:id="50"/>
-    <w:bookmarkStart w:id="52" w:name="ref-Brown2026local"/>
+    <w:bookmarkEnd w:id="48"/>
+    <w:bookmarkStart w:id="50" w:name="ref-Brown2026local"/>
     <w:p>
       <w:pPr>
         <w:pStyle w:val="Bibliography"/>
@@ -4531,7 +4409,7 @@
       <w:r>
         <w:t xml:space="preserve"> </w:t>
       </w:r>
-      <w:hyperlink r:id="rId51">
+      <w:hyperlink r:id="rId49">
         <w:r>
           <w:rPr>
             <w:rStyle w:val="Hyperlink"/>
@@ -4543,8 +4421,8 @@
         <w:t xml:space="preserve">, accessed September 18, 2026.</w:t>
       </w:r>
     </w:p>
-    <w:bookmarkEnd w:id="52"/>
-    <w:bookmarkStart w:id="54" w:name="ref-Brown2026book"/>
+    <w:bookmarkEnd w:id="50"/>
+    <w:bookmarkStart w:id="52" w:name="ref-Brown2026book"/>
     <w:p>
       <w:pPr>
         <w:pStyle w:val="Bibliography"/>
@@ -4567,7 +4445,7 @@
       <w:r>
         <w:t xml:space="preserve"> </w:t>
       </w:r>
-      <w:hyperlink r:id="rId53">
+      <w:hyperlink r:id="rId51">
         <w:r>
           <w:rPr>
             <w:rStyle w:val="Hyperlink"/>
@@ -4579,8 +4457,8 @@
         <w:t xml:space="preserve">, accessed September 18, 2026.</w:t>
       </w:r>
     </w:p>
-    <w:bookmarkEnd w:id="54"/>
-    <w:bookmarkStart w:id="56" w:name="ref-Brown2026a"/>
+    <w:bookmarkEnd w:id="52"/>
+    <w:bookmarkStart w:id="54" w:name="ref-Brown2026a"/>
     <w:p>
       <w:pPr>
         <w:pStyle w:val="Bibliography"/>
@@ -4607,7 +4485,7 @@
       <w:r>
         <w:t xml:space="preserve"> </w:t>
       </w:r>
-      <w:hyperlink r:id="rId55">
+      <w:hyperlink r:id="rId53">
         <w:r>
           <w:rPr>
             <w:rStyle w:val="Hyperlink"/>
@@ -4619,8 +4497,8 @@
         <w:t xml:space="preserve">.</w:t>
       </w:r>
     </w:p>
-    <w:bookmarkEnd w:id="56"/>
-    <w:bookmarkStart w:id="58" w:name="ref-Brown2026b"/>
+    <w:bookmarkEnd w:id="54"/>
+    <w:bookmarkStart w:id="56" w:name="ref-Brown2026b"/>
     <w:p>
       <w:pPr>
         <w:pStyle w:val="Bibliography"/>
@@ -4647,7 +4525,7 @@
       <w:r>
         <w:t xml:space="preserve"> </w:t>
       </w:r>
-      <w:hyperlink r:id="rId57">
+      <w:hyperlink r:id="rId55">
         <w:r>
           <w:rPr>
             <w:rStyle w:val="Hyperlink"/>
@@ -4659,8 +4537,8 @@
         <w:t xml:space="preserve">.</w:t>
       </w:r>
     </w:p>
-    <w:bookmarkEnd w:id="58"/>
-    <w:bookmarkStart w:id="60" w:name="ref-Campbell2024"/>
+    <w:bookmarkEnd w:id="56"/>
+    <w:bookmarkStart w:id="58" w:name="ref-Campbell2024"/>
     <w:p>
       <w:pPr>
         <w:pStyle w:val="Bibliography"/>
@@ -4687,7 +4565,7 @@
       <w:r>
         <w:t xml:space="preserve"> </w:t>
       </w:r>
-      <w:hyperlink r:id="rId59">
+      <w:hyperlink r:id="rId57">
         <w:r>
           <w:rPr>
             <w:rStyle w:val="Hyperlink"/>
@@ -4699,8 +4577,8 @@
         <w:t xml:space="preserve">.</w:t>
       </w:r>
     </w:p>
-    <w:bookmarkEnd w:id="60"/>
-    <w:bookmarkStart w:id="62" w:name="ref-Chen2023"/>
+    <w:bookmarkEnd w:id="58"/>
+    <w:bookmarkStart w:id="60" w:name="ref-Chen2023"/>
     <w:p>
       <w:pPr>
         <w:pStyle w:val="Bibliography"/>
@@ -4724,7 +4602,7 @@
       <w:r>
         <w:t xml:space="preserve"> </w:t>
       </w:r>
-      <w:hyperlink r:id="rId61">
+      <w:hyperlink r:id="rId59">
         <w:r>
           <w:rPr>
             <w:rStyle w:val="Hyperlink"/>
@@ -4736,8 +4614,8 @@
         <w:t xml:space="preserve">.</w:t>
       </w:r>
     </w:p>
-    <w:bookmarkEnd w:id="62"/>
-    <w:bookmarkStart w:id="64" w:name="ref-Cooper2024"/>
+    <w:bookmarkEnd w:id="60"/>
+    <w:bookmarkStart w:id="62" w:name="ref-Cooper2024"/>
     <w:p>
       <w:pPr>
         <w:pStyle w:val="Bibliography"/>
@@ -4764,7 +4642,7 @@
       <w:r>
         <w:t xml:space="preserve"> </w:t>
       </w:r>
-      <w:hyperlink r:id="rId63">
+      <w:hyperlink r:id="rId61">
         <w:r>
           <w:rPr>
             <w:rStyle w:val="Hyperlink"/>
@@ -4776,8 +4654,8 @@
         <w:t xml:space="preserve">.</w:t>
       </w:r>
     </w:p>
-    <w:bookmarkEnd w:id="64"/>
-    <w:bookmarkStart w:id="66" w:name="ref-DellAcqua2026"/>
+    <w:bookmarkEnd w:id="62"/>
+    <w:bookmarkStart w:id="64" w:name="ref-DellAcqua2026"/>
     <w:p>
       <w:pPr>
         <w:pStyle w:val="Bibliography"/>
@@ -4804,7 +4682,7 @@
       <w:r>
         <w:t xml:space="preserve"> </w:t>
       </w:r>
-      <w:hyperlink r:id="rId65">
+      <w:hyperlink r:id="rId63">
         <w:r>
           <w:rPr>
             <w:rStyle w:val="Hyperlink"/>
@@ -4816,8 +4694,8 @@
         <w:t xml:space="preserve">.</w:t>
       </w:r>
     </w:p>
-    <w:bookmarkEnd w:id="66"/>
-    <w:bookmarkStart w:id="68" w:name="ref-Dyck2026"/>
+    <w:bookmarkEnd w:id="64"/>
+    <w:bookmarkStart w:id="66" w:name="ref-Dyck2026"/>
     <w:p>
       <w:pPr>
         <w:pStyle w:val="Bibliography"/>
@@ -4844,7 +4722,7 @@
       <w:r>
         <w:t xml:space="preserve"> </w:t>
       </w:r>
-      <w:hyperlink r:id="rId67">
+      <w:hyperlink r:id="rId65">
         <w:r>
           <w:rPr>
             <w:rStyle w:val="Hyperlink"/>
@@ -4856,8 +4734,8 @@
         <w:t xml:space="preserve">.</w:t>
       </w:r>
     </w:p>
-    <w:bookmarkEnd w:id="68"/>
-    <w:bookmarkStart w:id="70" w:name="ref-Feuerriegel2024"/>
+    <w:bookmarkEnd w:id="66"/>
+    <w:bookmarkStart w:id="68" w:name="ref-Feuerriegel2024"/>
     <w:p>
       <w:pPr>
         <w:pStyle w:val="Bibliography"/>
@@ -4893,7 +4771,7 @@
       <w:r>
         <w:t xml:space="preserve"> </w:t>
       </w:r>
-      <w:hyperlink r:id="rId69">
+      <w:hyperlink r:id="rId67">
         <w:r>
           <w:rPr>
             <w:rStyle w:val="Hyperlink"/>
@@ -4905,8 +4783,8 @@
         <w:t xml:space="preserve">.</w:t>
       </w:r>
     </w:p>
-    <w:bookmarkEnd w:id="70"/>
-    <w:bookmarkStart w:id="72" w:name="ref-GildeZuniga2024"/>
+    <w:bookmarkEnd w:id="68"/>
+    <w:bookmarkStart w:id="70" w:name="ref-GildeZuniga2024"/>
     <w:p>
       <w:pPr>
         <w:pStyle w:val="Bibliography"/>
@@ -4942,7 +4820,7 @@
       <w:r>
         <w:t xml:space="preserve"> </w:t>
       </w:r>
-      <w:hyperlink r:id="rId71">
+      <w:hyperlink r:id="rId69">
         <w:r>
           <w:rPr>
             <w:rStyle w:val="Hyperlink"/>
@@ -4954,8 +4832,8 @@
         <w:t xml:space="preserve">.</w:t>
       </w:r>
     </w:p>
-    <w:bookmarkEnd w:id="72"/>
-    <w:bookmarkStart w:id="74" w:name="ref-Gilardi2023"/>
+    <w:bookmarkEnd w:id="70"/>
+    <w:bookmarkStart w:id="72" w:name="ref-Gilardi2023"/>
     <w:p>
       <w:pPr>
         <w:pStyle w:val="Bibliography"/>
@@ -4994,7 +4872,7 @@
       <w:r>
         <w:t xml:space="preserve"> </w:t>
       </w:r>
-      <w:hyperlink r:id="rId73">
+      <w:hyperlink r:id="rId71">
         <w:r>
           <w:rPr>
             <w:rStyle w:val="Hyperlink"/>
@@ -5006,8 +4884,8 @@
         <w:t xml:space="preserve">.</w:t>
       </w:r>
     </w:p>
-    <w:bookmarkEnd w:id="74"/>
-    <w:bookmarkStart w:id="76" w:name="ref-Gougherty2024"/>
+    <w:bookmarkEnd w:id="72"/>
+    <w:bookmarkStart w:id="74" w:name="ref-Gougherty2024"/>
     <w:p>
       <w:pPr>
         <w:pStyle w:val="Bibliography"/>
@@ -5055,7 +4933,7 @@
       <w:r>
         <w:t xml:space="preserve"> </w:t>
       </w:r>
-      <w:hyperlink r:id="rId75">
+      <w:hyperlink r:id="rId73">
         <w:r>
           <w:rPr>
             <w:rStyle w:val="Hyperlink"/>
@@ -5067,8 +4945,8 @@
         <w:t xml:space="preserve">.</w:t>
       </w:r>
     </w:p>
-    <w:bookmarkEnd w:id="76"/>
-    <w:bookmarkStart w:id="78" w:name="ref-Haase2026"/>
+    <w:bookmarkEnd w:id="74"/>
+    <w:bookmarkStart w:id="76" w:name="ref-Haase2026"/>
     <w:p>
       <w:pPr>
         <w:pStyle w:val="Bibliography"/>
@@ -5095,7 +4973,7 @@
       <w:r>
         <w:t xml:space="preserve"> </w:t>
       </w:r>
-      <w:hyperlink r:id="rId77">
+      <w:hyperlink r:id="rId75">
         <w:r>
           <w:rPr>
             <w:rStyle w:val="Hyperlink"/>
@@ -5107,8 +4985,8 @@
         <w:t xml:space="preserve">.</w:t>
       </w:r>
     </w:p>
-    <w:bookmarkEnd w:id="78"/>
-    <w:bookmarkStart w:id="80" w:name="ref-Hao2025"/>
+    <w:bookmarkEnd w:id="76"/>
+    <w:bookmarkStart w:id="78" w:name="ref-Hao2025"/>
     <w:p>
       <w:pPr>
         <w:pStyle w:val="Bibliography"/>
@@ -5144,7 +5022,7 @@
       <w:r>
         <w:t xml:space="preserve"> </w:t>
       </w:r>
-      <w:hyperlink r:id="rId79">
+      <w:hyperlink r:id="rId77">
         <w:r>
           <w:rPr>
             <w:rStyle w:val="Hyperlink"/>
@@ -5156,8 +5034,8 @@
         <w:t xml:space="preserve">.</w:t>
       </w:r>
     </w:p>
-    <w:bookmarkEnd w:id="80"/>
-    <w:bookmarkStart w:id="82" w:name="ref-Hariri2025"/>
+    <w:bookmarkEnd w:id="78"/>
+    <w:bookmarkStart w:id="80" w:name="ref-Hariri2025"/>
     <w:p>
       <w:pPr>
         <w:pStyle w:val="Bibliography"/>
@@ -5168,7 +5046,7 @@
       <w:r>
         <w:t xml:space="preserve"> </w:t>
       </w:r>
-      <w:hyperlink r:id="rId81">
+      <w:hyperlink r:id="rId79">
         <w:r>
           <w:rPr>
             <w:rStyle w:val="Hyperlink"/>
@@ -5193,8 +5071,8 @@
         <w:t xml:space="preserve">, pp. 83–97. Lecture Notes in Computer Science. Springer Nature Switzerland.</w:t>
       </w:r>
     </w:p>
-    <w:bookmarkEnd w:id="82"/>
-    <w:bookmarkStart w:id="84" w:name="ref-Hou2025"/>
+    <w:bookmarkEnd w:id="80"/>
+    <w:bookmarkStart w:id="82" w:name="ref-Hou2025"/>
     <w:p>
       <w:pPr>
         <w:pStyle w:val="Bibliography"/>
@@ -5230,7 +5108,7 @@
       <w:r>
         <w:t xml:space="preserve"> </w:t>
       </w:r>
-      <w:hyperlink r:id="rId83">
+      <w:hyperlink r:id="rId81">
         <w:r>
           <w:rPr>
             <w:rStyle w:val="Hyperlink"/>
@@ -5242,8 +5120,8 @@
         <w:t xml:space="preserve">.</w:t>
       </w:r>
     </w:p>
-    <w:bookmarkEnd w:id="84"/>
-    <w:bookmarkStart w:id="86" w:name="ref-Jansen2025"/>
+    <w:bookmarkEnd w:id="82"/>
+    <w:bookmarkStart w:id="84" w:name="ref-Jansen2025"/>
     <w:p>
       <w:pPr>
         <w:pStyle w:val="Bibliography"/>
@@ -5270,7 +5148,7 @@
       <w:r>
         <w:t xml:space="preserve"> </w:t>
       </w:r>
-      <w:hyperlink r:id="rId85">
+      <w:hyperlink r:id="rId83">
         <w:r>
           <w:rPr>
             <w:rStyle w:val="Hyperlink"/>
@@ -5282,8 +5160,8 @@
         <w:t xml:space="preserve">.</w:t>
       </w:r>
     </w:p>
-    <w:bookmarkEnd w:id="86"/>
-    <w:bookmarkStart w:id="88" w:name="ref-JohnsonEberl2026"/>
+    <w:bookmarkEnd w:id="84"/>
+    <w:bookmarkStart w:id="86" w:name="ref-JohnsonEberl2026"/>
     <w:p>
       <w:pPr>
         <w:pStyle w:val="Bibliography"/>
@@ -5310,7 +5188,7 @@
       <w:r>
         <w:t xml:space="preserve"> </w:t>
       </w:r>
-      <w:hyperlink r:id="rId87">
+      <w:hyperlink r:id="rId85">
         <w:r>
           <w:rPr>
             <w:rStyle w:val="Hyperlink"/>
@@ -5322,8 +5200,8 @@
         <w:t xml:space="preserve">.</w:t>
       </w:r>
     </w:p>
-    <w:bookmarkEnd w:id="88"/>
-    <w:bookmarkStart w:id="90" w:name="ref-Johnson2024"/>
+    <w:bookmarkEnd w:id="86"/>
+    <w:bookmarkStart w:id="88" w:name="ref-Johnson2024"/>
     <w:p>
       <w:pPr>
         <w:pStyle w:val="Bibliography"/>
@@ -5362,7 +5240,7 @@
       <w:r>
         <w:t xml:space="preserve"> </w:t>
       </w:r>
-      <w:hyperlink r:id="rId89">
+      <w:hyperlink r:id="rId87">
         <w:r>
           <w:rPr>
             <w:rStyle w:val="Hyperlink"/>
@@ -5374,8 +5252,8 @@
         <w:t xml:space="preserve">.</w:t>
       </w:r>
     </w:p>
-    <w:bookmarkEnd w:id="90"/>
-    <w:bookmarkStart w:id="92" w:name="ref-Jonker2024"/>
+    <w:bookmarkEnd w:id="88"/>
+    <w:bookmarkStart w:id="90" w:name="ref-Jonker2024"/>
     <w:p>
       <w:pPr>
         <w:pStyle w:val="Bibliography"/>
@@ -5386,7 +5264,7 @@
       <w:r>
         <w:t xml:space="preserve"> </w:t>
       </w:r>
-      <w:hyperlink r:id="rId91">
+      <w:hyperlink r:id="rId89">
         <w:r>
           <w:rPr>
             <w:rStyle w:val="Hyperlink"/>
@@ -5435,8 +5313,8 @@
         <w:t xml:space="preserve">, pp. 188–204. Edward Elgar Publishing.</w:t>
       </w:r>
     </w:p>
-    <w:bookmarkEnd w:id="92"/>
-    <w:bookmarkStart w:id="94" w:name="ref-Kansa2026"/>
+    <w:bookmarkEnd w:id="90"/>
+    <w:bookmarkStart w:id="92" w:name="ref-Kansa2026"/>
     <w:p>
       <w:pPr>
         <w:pStyle w:val="Bibliography"/>
@@ -5472,7 +5350,7 @@
       <w:r>
         <w:t xml:space="preserve"> </w:t>
       </w:r>
-      <w:hyperlink r:id="rId93">
+      <w:hyperlink r:id="rId91">
         <w:r>
           <w:rPr>
             <w:rStyle w:val="Hyperlink"/>
@@ -5484,8 +5362,8 @@
         <w:t xml:space="preserve">.</w:t>
       </w:r>
     </w:p>
-    <w:bookmarkEnd w:id="94"/>
-    <w:bookmarkStart w:id="96" w:name="ref-Korinek2023"/>
+    <w:bookmarkEnd w:id="92"/>
+    <w:bookmarkStart w:id="94" w:name="ref-Korinek2023"/>
     <w:p>
       <w:pPr>
         <w:pStyle w:val="Bibliography"/>
@@ -5512,7 +5390,7 @@
       <w:r>
         <w:t xml:space="preserve"> </w:t>
       </w:r>
-      <w:hyperlink r:id="rId95">
+      <w:hyperlink r:id="rId93">
         <w:r>
           <w:rPr>
             <w:rStyle w:val="Hyperlink"/>
@@ -5524,8 +5402,8 @@
         <w:t xml:space="preserve">.</w:t>
       </w:r>
     </w:p>
-    <w:bookmarkEnd w:id="96"/>
-    <w:bookmarkStart w:id="98" w:name="ref-Korinek2025"/>
+    <w:bookmarkEnd w:id="94"/>
+    <w:bookmarkStart w:id="96" w:name="ref-Korinek2025"/>
     <w:p>
       <w:pPr>
         <w:pStyle w:val="Bibliography"/>
@@ -5536,7 +5414,7 @@
       <w:r>
         <w:t xml:space="preserve"> </w:t>
       </w:r>
-      <w:hyperlink r:id="rId97">
+      <w:hyperlink r:id="rId95">
         <w:r>
           <w:rPr>
             <w:rStyle w:val="Hyperlink"/>
@@ -5566,8 +5444,8 @@
         <w:t xml:space="preserve">. National Bureau of Economic Research.</w:t>
       </w:r>
     </w:p>
-    <w:bookmarkEnd w:id="98"/>
-    <w:bookmarkStart w:id="100" w:name="ref-Moorthy2026"/>
+    <w:bookmarkEnd w:id="96"/>
+    <w:bookmarkStart w:id="98" w:name="ref-Moorthy2026"/>
     <w:p>
       <w:pPr>
         <w:pStyle w:val="Bibliography"/>
@@ -5612,7 +5490,7 @@
       <w:r>
         <w:t xml:space="preserve"> </w:t>
       </w:r>
-      <w:hyperlink r:id="rId99">
+      <w:hyperlink r:id="rId97">
         <w:r>
           <w:rPr>
             <w:rStyle w:val="Hyperlink"/>
@@ -5624,8 +5502,8 @@
         <w:t xml:space="preserve">.</w:t>
       </w:r>
     </w:p>
-    <w:bookmarkEnd w:id="100"/>
-    <w:bookmarkStart w:id="102" w:name="ref-Laban2025"/>
+    <w:bookmarkEnd w:id="98"/>
+    <w:bookmarkStart w:id="100" w:name="ref-Laban2025"/>
     <w:p>
       <w:pPr>
         <w:pStyle w:val="Bibliography"/>
@@ -5661,7 +5539,7 @@
       <w:r>
         <w:t xml:space="preserve"> </w:t>
       </w:r>
-      <w:hyperlink r:id="rId101">
+      <w:hyperlink r:id="rId99">
         <w:r>
           <w:rPr>
             <w:rStyle w:val="Hyperlink"/>
@@ -5673,8 +5551,8 @@
         <w:t xml:space="preserve">.</w:t>
       </w:r>
     </w:p>
-    <w:bookmarkEnd w:id="102"/>
-    <w:bookmarkStart w:id="104" w:name="ref-Leung2023"/>
+    <w:bookmarkEnd w:id="100"/>
+    <w:bookmarkStart w:id="102" w:name="ref-Leung2023"/>
     <w:p>
       <w:pPr>
         <w:pStyle w:val="Bibliography"/>
@@ -5701,7 +5579,7 @@
       <w:r>
         <w:t xml:space="preserve"> </w:t>
       </w:r>
-      <w:hyperlink r:id="rId103">
+      <w:hyperlink r:id="rId101">
         <w:r>
           <w:rPr>
             <w:rStyle w:val="Hyperlink"/>
@@ -5713,8 +5591,8 @@
         <w:t xml:space="preserve">.</w:t>
       </w:r>
     </w:p>
-    <w:bookmarkEnd w:id="104"/>
-    <w:bookmarkStart w:id="106" w:name="ref-Lu2026"/>
+    <w:bookmarkEnd w:id="102"/>
+    <w:bookmarkStart w:id="104" w:name="ref-Lu2026"/>
     <w:p>
       <w:pPr>
         <w:pStyle w:val="Bibliography"/>
@@ -5753,7 +5631,7 @@
       <w:r>
         <w:t xml:space="preserve"> </w:t>
       </w:r>
-      <w:hyperlink r:id="rId105">
+      <w:hyperlink r:id="rId103">
         <w:r>
           <w:rPr>
             <w:rStyle w:val="Hyperlink"/>
@@ -5765,8 +5643,8 @@
         <w:t xml:space="preserve">.</w:t>
       </w:r>
     </w:p>
-    <w:bookmarkEnd w:id="106"/>
-    <w:bookmarkStart w:id="108" w:name="ref-Luccioni2024"/>
+    <w:bookmarkEnd w:id="104"/>
+    <w:bookmarkStart w:id="106" w:name="ref-Luccioni2024"/>
     <w:p>
       <w:pPr>
         <w:pStyle w:val="Bibliography"/>
@@ -5777,7 +5655,7 @@
       <w:r>
         <w:t xml:space="preserve"> </w:t>
       </w:r>
-      <w:hyperlink r:id="rId107">
+      <w:hyperlink r:id="rId105">
         <w:r>
           <w:rPr>
             <w:rStyle w:val="Hyperlink"/>
@@ -5813,8 +5691,8 @@
         <w:t xml:space="preserve">, pp. 85–99.</w:t>
       </w:r>
     </w:p>
-    <w:bookmarkEnd w:id="108"/>
-    <w:bookmarkStart w:id="110" w:name="ref-Marwick2017"/>
+    <w:bookmarkEnd w:id="106"/>
+    <w:bookmarkStart w:id="108" w:name="ref-Marwick2017"/>
     <w:p>
       <w:pPr>
         <w:pStyle w:val="Bibliography"/>
@@ -5841,7 +5719,7 @@
       <w:r>
         <w:t xml:space="preserve"> </w:t>
       </w:r>
-      <w:hyperlink r:id="rId109">
+      <w:hyperlink r:id="rId107">
         <w:r>
           <w:rPr>
             <w:rStyle w:val="Hyperlink"/>
@@ -5853,8 +5731,8 @@
         <w:t xml:space="preserve">.</w:t>
       </w:r>
     </w:p>
-    <w:bookmarkEnd w:id="110"/>
-    <w:bookmarkStart w:id="112" w:name="ref-Messeri2024"/>
+    <w:bookmarkEnd w:id="108"/>
+    <w:bookmarkStart w:id="110" w:name="ref-Messeri2024"/>
     <w:p>
       <w:pPr>
         <w:pStyle w:val="Bibliography"/>
@@ -5881,7 +5759,7 @@
       <w:r>
         <w:t xml:space="preserve"> </w:t>
       </w:r>
-      <w:hyperlink r:id="rId111">
+      <w:hyperlink r:id="rId109">
         <w:r>
           <w:rPr>
             <w:rStyle w:val="Hyperlink"/>
@@ -5893,8 +5771,8 @@
         <w:t xml:space="preserve">.</w:t>
       </w:r>
     </w:p>
-    <w:bookmarkEnd w:id="112"/>
-    <w:bookmarkStart w:id="114" w:name="ref-Monakhov2026"/>
+    <w:bookmarkEnd w:id="110"/>
+    <w:bookmarkStart w:id="112" w:name="ref-Monakhov2026"/>
     <w:p>
       <w:pPr>
         <w:pStyle w:val="Bibliography"/>
@@ -5905,7 +5783,7 @@
       <w:r>
         <w:t xml:space="preserve"> </w:t>
       </w:r>
-      <w:hyperlink r:id="rId113">
+      <w:hyperlink r:id="rId111">
         <w:r>
           <w:rPr>
             <w:rStyle w:val="Hyperlink"/>
@@ -5941,8 +5819,8 @@
         <w:t xml:space="preserve">. Elsevier BV.</w:t>
       </w:r>
     </w:p>
-    <w:bookmarkEnd w:id="114"/>
-    <w:bookmarkStart w:id="116" w:name="ref-Nejjar2025"/>
+    <w:bookmarkEnd w:id="112"/>
+    <w:bookmarkStart w:id="114" w:name="ref-Nejjar2025"/>
     <w:p>
       <w:pPr>
         <w:pStyle w:val="Bibliography"/>
@@ -5978,7 +5856,7 @@
       <w:r>
         <w:t xml:space="preserve"> </w:t>
       </w:r>
-      <w:hyperlink r:id="rId115">
+      <w:hyperlink r:id="rId113">
         <w:r>
           <w:rPr>
             <w:rStyle w:val="Hyperlink"/>
@@ -5990,20 +5868,20 @@
         <w:t xml:space="preserve">.</w:t>
       </w:r>
     </w:p>
-    <w:bookmarkEnd w:id="116"/>
-    <w:bookmarkStart w:id="118" w:name="ref-OpenCodeRules2026"/>
+    <w:bookmarkEnd w:id="114"/>
+    <w:bookmarkStart w:id="116" w:name="ref-QuartoDocs2026"/>
     <w:p>
       <w:pPr>
         <w:pStyle w:val="Bibliography"/>
       </w:pPr>
       <w:r>
-        <w:t xml:space="preserve">OpenCode.</w:t>
-      </w:r>
-      <w:r>
-        <w:t xml:space="preserve"> </w:t>
-      </w:r>
-      <w:r>
-        <w:t xml:space="preserve">Rules</w:t>
+        <w:t xml:space="preserve">Quarto.</w:t>
+      </w:r>
+      <w:r>
+        <w:t xml:space="preserve"> </w:t>
+      </w:r>
+      <w:r>
+        <w:t xml:space="preserve">Tutorial: Hello, Quarto</w:t>
       </w:r>
       <w:r>
         <w:t xml:space="preserve">.</w:t>
@@ -6011,40 +5889,7 @@
       <w:r>
         <w:t xml:space="preserve"> </w:t>
       </w:r>
-      <w:hyperlink r:id="rId117">
-        <w:r>
-          <w:rPr>
-            <w:rStyle w:val="Hyperlink"/>
-          </w:rPr>
-          <w:t xml:space="preserve">https://opencode.ai/docs/rules/</w:t>
-        </w:r>
-      </w:hyperlink>
-      <w:r>
-        <w:t xml:space="preserve">, accessed September 17, 2026.</w:t>
-      </w:r>
-    </w:p>
-    <w:bookmarkEnd w:id="118"/>
-    <w:bookmarkStart w:id="120" w:name="ref-QuartoDocs2026"/>
-    <w:p>
-      <w:pPr>
-        <w:pStyle w:val="Bibliography"/>
-      </w:pPr>
-      <w:r>
-        <w:t xml:space="preserve">Quarto.</w:t>
-      </w:r>
-      <w:r>
-        <w:t xml:space="preserve"> </w:t>
-      </w:r>
-      <w:r>
-        <w:t xml:space="preserve">Tutorial: Hello, Quarto</w:t>
-      </w:r>
-      <w:r>
-        <w:t xml:space="preserve">.</w:t>
-      </w:r>
-      <w:r>
-        <w:t xml:space="preserve"> </w:t>
-      </w:r>
-      <w:hyperlink r:id="rId119">
+      <w:hyperlink r:id="rId115">
         <w:r>
           <w:rPr>
             <w:rStyle w:val="Hyperlink"/>
@@ -6056,8 +5901,8 @@
         <w:t xml:space="preserve">, accessed September 17, 2026.</w:t>
       </w:r>
     </w:p>
-    <w:bookmarkEnd w:id="120"/>
-    <w:bookmarkStart w:id="122" w:name="ref-Ram2013"/>
+    <w:bookmarkEnd w:id="116"/>
+    <w:bookmarkStart w:id="118" w:name="ref-Ram2013"/>
     <w:p>
       <w:pPr>
         <w:pStyle w:val="Bibliography"/>
@@ -6084,7 +5929,7 @@
       <w:r>
         <w:t xml:space="preserve"> </w:t>
       </w:r>
-      <w:hyperlink r:id="rId121">
+      <w:hyperlink r:id="rId117">
         <w:r>
           <w:rPr>
             <w:rStyle w:val="Hyperlink"/>
@@ -6096,8 +5941,8 @@
         <w:t xml:space="preserve">.</w:t>
       </w:r>
     </w:p>
-    <w:bookmarkEnd w:id="122"/>
-    <w:bookmarkStart w:id="124" w:name="ref-Scheepens2024"/>
+    <w:bookmarkEnd w:id="118"/>
+    <w:bookmarkStart w:id="120" w:name="ref-Scheepens2024"/>
     <w:p>
       <w:pPr>
         <w:pStyle w:val="Bibliography"/>
@@ -6136,7 +5981,7 @@
       <w:r>
         <w:t xml:space="preserve"> </w:t>
       </w:r>
-      <w:hyperlink r:id="rId123">
+      <w:hyperlink r:id="rId119">
         <w:r>
           <w:rPr>
             <w:rStyle w:val="Hyperlink"/>
@@ -6148,8 +5993,8 @@
         <w:t xml:space="preserve">.</w:t>
       </w:r>
     </w:p>
-    <w:bookmarkEnd w:id="124"/>
-    <w:bookmarkStart w:id="126" w:name="ref-Schweinberger2026privacy"/>
+    <w:bookmarkEnd w:id="120"/>
+    <w:bookmarkStart w:id="122" w:name="ref-Schweinberger2026privacy"/>
     <w:p>
       <w:pPr>
         <w:pStyle w:val="Bibliography"/>
@@ -6178,7 +6023,7 @@
       <w:r>
         <w:t xml:space="preserve"> </w:t>
       </w:r>
-      <w:hyperlink r:id="rId125">
+      <w:hyperlink r:id="rId121">
         <w:r>
           <w:rPr>
             <w:rStyle w:val="Hyperlink"/>
@@ -6190,8 +6035,8 @@
         <w:t xml:space="preserve">, accessed September 18, 2026.</w:t>
       </w:r>
     </w:p>
-    <w:bookmarkEnd w:id="126"/>
-    <w:bookmarkStart w:id="128" w:name="ref-Shaikhon2025"/>
+    <w:bookmarkEnd w:id="122"/>
+    <w:bookmarkStart w:id="124" w:name="ref-Shaikhon2025"/>
     <w:p>
       <w:pPr>
         <w:pStyle w:val="Bibliography"/>
@@ -6218,7 +6063,7 @@
       <w:r>
         <w:t xml:space="preserve"> </w:t>
       </w:r>
-      <w:hyperlink r:id="rId127">
+      <w:hyperlink r:id="rId123">
         <w:r>
           <w:rPr>
             <w:rStyle w:val="Hyperlink"/>
@@ -6230,8 +6075,8 @@
         <w:t xml:space="preserve">.</w:t>
       </w:r>
     </w:p>
-    <w:bookmarkEnd w:id="128"/>
-    <w:bookmarkStart w:id="130" w:name="ref-Spillias2025"/>
+    <w:bookmarkEnd w:id="124"/>
+    <w:bookmarkStart w:id="126" w:name="ref-Spillias2025"/>
     <w:p>
       <w:pPr>
         <w:pStyle w:val="Bibliography"/>
@@ -6267,7 +6112,7 @@
       <w:r>
         <w:t xml:space="preserve"> </w:t>
       </w:r>
-      <w:hyperlink r:id="rId129">
+      <w:hyperlink r:id="rId125">
         <w:r>
           <w:rPr>
             <w:rStyle w:val="Hyperlink"/>
@@ -6279,8 +6124,8 @@
         <w:t xml:space="preserve">.</w:t>
       </w:r>
     </w:p>
-    <w:bookmarkEnd w:id="130"/>
-    <w:bookmarkStart w:id="132" w:name="ref-Syme2026"/>
+    <w:bookmarkEnd w:id="126"/>
+    <w:bookmarkStart w:id="128" w:name="ref-Syme2026"/>
     <w:p>
       <w:pPr>
         <w:pStyle w:val="Bibliography"/>
@@ -6307,7 +6152,7 @@
       <w:r>
         <w:t xml:space="preserve"> </w:t>
       </w:r>
-      <w:hyperlink r:id="rId131">
+      <w:hyperlink r:id="rId127">
         <w:r>
           <w:rPr>
             <w:rStyle w:val="Hyperlink"/>
@@ -6319,8 +6164,8 @@
         <w:t xml:space="preserve">.</w:t>
       </w:r>
     </w:p>
-    <w:bookmarkEnd w:id="132"/>
-    <w:bookmarkStart w:id="134" w:name="ref-Taylor2023"/>
+    <w:bookmarkEnd w:id="128"/>
+    <w:bookmarkStart w:id="130" w:name="ref-Taylor2023"/>
     <w:p>
       <w:pPr>
         <w:pStyle w:val="Bibliography"/>
@@ -6331,7 +6176,7 @@
       <w:r>
         <w:t xml:space="preserve"> </w:t>
       </w:r>
-      <w:hyperlink r:id="rId133">
+      <w:hyperlink r:id="rId129">
         <w:r>
           <w:rPr>
             <w:rStyle w:val="Hyperlink"/>
@@ -6380,8 +6225,8 @@
         <w:t xml:space="preserve">. IOS Press.</w:t>
       </w:r>
     </w:p>
-    <w:bookmarkEnd w:id="134"/>
-    <w:bookmarkStart w:id="136" w:name="ref-Tenzer2024"/>
+    <w:bookmarkEnd w:id="130"/>
+    <w:bookmarkStart w:id="132" w:name="ref-Tenzer2024"/>
     <w:p>
       <w:pPr>
         <w:pStyle w:val="Bibliography"/>
@@ -6417,7 +6262,7 @@
       <w:r>
         <w:t xml:space="preserve"> </w:t>
       </w:r>
-      <w:hyperlink r:id="rId135">
+      <w:hyperlink r:id="rId131">
         <w:r>
           <w:rPr>
             <w:rStyle w:val="Hyperlink"/>
@@ -6429,8 +6274,8 @@
         <w:t xml:space="preserve">.</w:t>
       </w:r>
     </w:p>
-    <w:bookmarkEnd w:id="136"/>
-    <w:bookmarkStart w:id="138" w:name="ref-Walters2023"/>
+    <w:bookmarkEnd w:id="132"/>
+    <w:bookmarkStart w:id="134" w:name="ref-Walters2023"/>
     <w:p>
       <w:pPr>
         <w:pStyle w:val="Bibliography"/>
@@ -6466,7 +6311,7 @@
       <w:r>
         <w:t xml:space="preserve"> </w:t>
       </w:r>
-      <w:hyperlink r:id="rId137">
+      <w:hyperlink r:id="rId133">
         <w:r>
           <w:rPr>
             <w:rStyle w:val="Hyperlink"/>
@@ -6478,8 +6323,8 @@
         <w:t xml:space="preserve">.</w:t>
       </w:r>
     </w:p>
-    <w:bookmarkEnd w:id="138"/>
-    <w:bookmarkStart w:id="140" w:name="ref-Wickham2019"/>
+    <w:bookmarkEnd w:id="134"/>
+    <w:bookmarkStart w:id="136" w:name="ref-Wickham2019"/>
     <w:p>
       <w:pPr>
         <w:pStyle w:val="Bibliography"/>
@@ -6515,7 +6360,7 @@
       <w:r>
         <w:t xml:space="preserve"> </w:t>
       </w:r>
-      <w:hyperlink r:id="rId139">
+      <w:hyperlink r:id="rId135">
         <w:r>
           <w:rPr>
             <w:rStyle w:val="Hyperlink"/>
@@ -6527,8 +6372,8 @@
         <w:t xml:space="preserve">.</w:t>
       </w:r>
     </w:p>
-    <w:bookmarkEnd w:id="140"/>
-    <w:bookmarkStart w:id="142" w:name="ref-Wiest2024"/>
+    <w:bookmarkEnd w:id="136"/>
+    <w:bookmarkStart w:id="138" w:name="ref-Wiest2024"/>
     <w:p>
       <w:pPr>
         <w:pStyle w:val="Bibliography"/>
@@ -6564,7 +6409,7 @@
       <w:r>
         <w:t xml:space="preserve"> </w:t>
       </w:r>
-      <w:hyperlink r:id="rId141">
+      <w:hyperlink r:id="rId137">
         <w:r>
           <w:rPr>
             <w:rStyle w:val="Hyperlink"/>
@@ -6576,8 +6421,8 @@
         <w:t xml:space="preserve">.</w:t>
       </w:r>
     </w:p>
-    <w:bookmarkEnd w:id="142"/>
-    <w:bookmarkStart w:id="144" w:name="ref-Wilson2014"/>
+    <w:bookmarkEnd w:id="138"/>
+    <w:bookmarkStart w:id="140" w:name="ref-Wilson2014"/>
     <w:p>
       <w:pPr>
         <w:pStyle w:val="Bibliography"/>
@@ -6613,7 +6458,7 @@
       <w:r>
         <w:t xml:space="preserve"> </w:t>
       </w:r>
-      <w:hyperlink r:id="rId143">
+      <w:hyperlink r:id="rId139">
         <w:r>
           <w:rPr>
             <w:rStyle w:val="Hyperlink"/>
@@ -6625,8 +6470,8 @@
         <w:t xml:space="preserve">.</w:t>
       </w:r>
     </w:p>
-    <w:bookmarkEnd w:id="144"/>
-    <w:bookmarkStart w:id="146" w:name="ref-Xu2026"/>
+    <w:bookmarkEnd w:id="140"/>
+    <w:bookmarkStart w:id="142" w:name="ref-Xu2026"/>
     <w:p>
       <w:pPr>
         <w:pStyle w:val="Bibliography"/>
@@ -6671,7 +6516,7 @@
       <w:r>
         <w:t xml:space="preserve"> </w:t>
       </w:r>
-      <w:hyperlink r:id="rId145">
+      <w:hyperlink r:id="rId141">
         <w:r>
           <w:rPr>
             <w:rStyle w:val="Hyperlink"/>
@@ -6683,8 +6528,8 @@
         <w:t xml:space="preserve">.</w:t>
       </w:r>
     </w:p>
-    <w:bookmarkEnd w:id="146"/>
-    <w:bookmarkStart w:id="148" w:name="ref-ZamfirescuPereira2023"/>
+    <w:bookmarkEnd w:id="142"/>
+    <w:bookmarkStart w:id="144" w:name="ref-ZamfirescuPereira2023"/>
     <w:p>
       <w:pPr>
         <w:pStyle w:val="Bibliography"/>
@@ -6695,7 +6540,7 @@
       <w:r>
         <w:t xml:space="preserve"> </w:t>
       </w:r>
-      <w:hyperlink r:id="rId147">
+      <w:hyperlink r:id="rId143">
         <w:r>
           <w:rPr>
             <w:rStyle w:val="Hyperlink"/>
@@ -6707,8 +6552,8 @@
         <w:t xml:space="preserve">, New York, NY, USA.</w:t>
       </w:r>
     </w:p>
-    <w:bookmarkEnd w:id="148"/>
-    <w:bookmarkStart w:id="150" w:name="ref-Zanzotto2019"/>
+    <w:bookmarkEnd w:id="144"/>
+    <w:bookmarkStart w:id="146" w:name="ref-Zanzotto2019"/>
     <w:p>
       <w:pPr>
         <w:pStyle w:val="Bibliography"/>
@@ -6744,7 +6589,7 @@
       <w:r>
         <w:t xml:space="preserve"> </w:t>
       </w:r>
-      <w:hyperlink r:id="rId149">
+      <w:hyperlink r:id="rId145">
         <w:r>
           <w:rPr>
             <w:rStyle w:val="Hyperlink"/>
@@ -6756,8 +6601,8 @@
         <w:t xml:space="preserve">.</w:t>
       </w:r>
     </w:p>
-    <w:bookmarkEnd w:id="150"/>
-    <w:bookmarkStart w:id="152" w:name="ref-Zhang2025"/>
+    <w:bookmarkEnd w:id="146"/>
+    <w:bookmarkStart w:id="148" w:name="ref-Zhang2025"/>
     <w:p>
       <w:pPr>
         <w:pStyle w:val="Bibliography"/>
@@ -6793,7 +6638,7 @@
       <w:r>
         <w:t xml:space="preserve"> </w:t>
       </w:r>
-      <w:hyperlink r:id="rId151">
+      <w:hyperlink r:id="rId147">
         <w:r>
           <w:rPr>
             <w:rStyle w:val="Hyperlink"/>
@@ -6805,8 +6650,8 @@
         <w:t xml:space="preserve">.</w:t>
       </w:r>
     </w:p>
-    <w:bookmarkEnd w:id="152"/>
-    <w:bookmarkStart w:id="154" w:name="ref-Zheng2024"/>
+    <w:bookmarkEnd w:id="148"/>
+    <w:bookmarkStart w:id="150" w:name="ref-Zheng2024"/>
     <w:p>
       <w:pPr>
         <w:pStyle w:val="Bibliography"/>
@@ -6830,7 +6675,7 @@
       <w:r>
         <w:t xml:space="preserve"> </w:t>
       </w:r>
-      <w:hyperlink r:id="rId153">
+      <w:hyperlink r:id="rId149">
         <w:r>
           <w:rPr>
             <w:rStyle w:val="Hyperlink"/>
@@ -6842,8 +6687,8 @@
         <w:t xml:space="preserve">.</w:t>
       </w:r>
     </w:p>
-    <w:bookmarkEnd w:id="154"/>
-    <w:bookmarkStart w:id="156" w:name="ref-Ziems2024"/>
+    <w:bookmarkEnd w:id="150"/>
+    <w:bookmarkStart w:id="152" w:name="ref-Ziems2024"/>
     <w:p>
       <w:pPr>
         <w:pStyle w:val="Bibliography"/>
@@ -6870,7 +6715,7 @@
       <w:r>
         <w:t xml:space="preserve"> </w:t>
       </w:r>
-      <w:hyperlink r:id="rId155">
+      <w:hyperlink r:id="rId151">
         <w:r>
           <w:rPr>
             <w:rStyle w:val="Hyperlink"/>
@@ -6882,8 +6727,8 @@
         <w:t xml:space="preserve">.</w:t>
       </w:r>
     </w:p>
-    <w:bookmarkEnd w:id="156"/>
-    <w:bookmarkStart w:id="158" w:name="ref-Zimmer2026"/>
+    <w:bookmarkEnd w:id="152"/>
+    <w:bookmarkStart w:id="154" w:name="ref-Zimmer2026"/>
     <w:p>
       <w:pPr>
         <w:pStyle w:val="Bibliography"/>
@@ -6907,7 +6752,7 @@
       <w:r>
         <w:t xml:space="preserve"> </w:t>
       </w:r>
-      <w:hyperlink r:id="rId157">
+      <w:hyperlink r:id="rId153">
         <w:r>
           <w:rPr>
             <w:rStyle w:val="Hyperlink"/>
@@ -6919,14 +6764,14 @@
         <w:t xml:space="preserve">.</w:t>
       </w:r>
     </w:p>
-    <w:bookmarkEnd w:id="158"/>
-    <w:bookmarkEnd w:id="159"/>
+    <w:bookmarkEnd w:id="154"/>
+    <w:bookmarkEnd w:id="155"/>
     <w:p>
       <w:r>
         <w:br w:type="page"/>
       </w:r>
     </w:p>
-    <w:bookmarkStart w:id="160" w:name="colophon"/>
+    <w:bookmarkStart w:id="156" w:name="colophon"/>
     <w:p>
       <w:pPr>
         <w:pStyle w:val="Heading3"/>
@@ -6940,7 +6785,7 @@
         <w:pStyle w:val="FirstParagraph"/>
       </w:pPr>
       <w:r>
-        <w:t xml:space="preserve">This report was generated on 2026-09-18 20:25:20.722966 using the following computational environment and dependencies:</w:t>
+        <w:t xml:space="preserve">This report was generated on 2026-09-19 07:04:00.50144 using the following computational environment and dependencies:</w:t>
       </w:r>
     </w:p>
     <w:p>
@@ -7121,7 +6966,7 @@
         <w:rPr>
           <w:rStyle w:val="VerbatimChar"/>
         </w:rPr>
-        <w:t xml:space="preserve"> date     2026-09-18</w:t>
+        <w:t xml:space="preserve"> date     2026-09-19</w:t>
       </w:r>
       <w:r>
         <w:br/>
@@ -7664,11 +7509,11 @@
         <w:rPr>
           <w:rStyle w:val="VerbatimChar"/>
         </w:rPr>
-        <w:t xml:space="preserve">Head:     [5acf24b] 2026-09-19: writing and editing</w:t>
-      </w:r>
-    </w:p>
-    <w:bookmarkEnd w:id="160"/>
-    <w:bookmarkEnd w:id="161"/>
+        <w:t xml:space="preserve">Head:     [c1d02e6] 2026-09-19: Add Source column with URLs to table-stack.csv</w:t>
+      </w:r>
+    </w:p>
+    <w:bookmarkEnd w:id="156"/>
+    <w:bookmarkEnd w:id="157"/>
     <w:sectPr>
       <w:pgSz w:h="15840" w:w="12240"/>
       <w:pgMar w:bottom="1440" w:footer="720" w:gutter="0" w:header="720" w:left="1440" w:right="1440" w:top="1440"/>
@@ -8057,89 +7902,13 @@
       </w:pPr>
     </w:lvl>
   </w:abstractNum>
-  <w:abstractNum w:abstractNumId="991">
-    <w:nsid w:val="A991"/>
-    <w:multiLevelType w:val="multilevel"/>
-    <w:lvl w:ilvl="0">
-      <w:numFmt w:val="bullet"/>
-      <w:lvlText w:val="•"/>
-      <w:lvlJc w:val="left"/>
-      <w:pPr>
-        <w:ind w:left="720" w:hanging="480"/>
-      </w:pPr>
-    </w:lvl>
-    <w:lvl w:ilvl="1">
-      <w:numFmt w:val="bullet"/>
-      <w:lvlText w:val="–"/>
-      <w:lvlJc w:val="left"/>
-      <w:pPr>
-        <w:ind w:left="1440" w:hanging="480"/>
-      </w:pPr>
-    </w:lvl>
-    <w:lvl w:ilvl="2">
-      <w:numFmt w:val="bullet"/>
-      <w:lvlText w:val="•"/>
-      <w:lvlJc w:val="left"/>
-      <w:pPr>
-        <w:ind w:left="2160" w:hanging="480"/>
-      </w:pPr>
-    </w:lvl>
-    <w:lvl w:ilvl="3">
-      <w:numFmt w:val="bullet"/>
-      <w:lvlText w:val="–"/>
-      <w:lvlJc w:val="left"/>
-      <w:pPr>
-        <w:ind w:left="2880" w:hanging="480"/>
-      </w:pPr>
-    </w:lvl>
-    <w:lvl w:ilvl="4">
-      <w:numFmt w:val="bullet"/>
-      <w:lvlText w:val="•"/>
-      <w:lvlJc w:val="left"/>
-      <w:pPr>
-        <w:ind w:left="3600" w:hanging="480"/>
-      </w:pPr>
-    </w:lvl>
-    <w:lvl w:ilvl="5">
-      <w:numFmt w:val="bullet"/>
-      <w:lvlText w:val="–"/>
-      <w:lvlJc w:val="left"/>
-      <w:pPr>
-        <w:ind w:left="4320" w:hanging="480"/>
-      </w:pPr>
-    </w:lvl>
-    <w:lvl w:ilvl="6">
-      <w:numFmt w:val="bullet"/>
-      <w:lvlText w:val="•"/>
-      <w:lvlJc w:val="left"/>
-      <w:pPr>
-        <w:ind w:left="5040" w:hanging="480"/>
-      </w:pPr>
-    </w:lvl>
-    <w:lvl w:ilvl="7">
-      <w:numFmt w:val="bullet"/>
-      <w:lvlText w:val="–"/>
-      <w:lvlJc w:val="left"/>
-      <w:pPr>
-        <w:ind w:left="5760" w:hanging="480"/>
-      </w:pPr>
-    </w:lvl>
-    <w:lvl w:ilvl="8">
-      <w:numFmt w:val="bullet"/>
-      <w:lvlText w:val="•"/>
-      <w:lvlJc w:val="left"/>
-      <w:pPr>
-        <w:ind w:left="6480" w:hanging="480"/>
-      </w:pPr>
-    </w:lvl>
-  </w:abstractNum>
-  <w:abstractNum w:abstractNumId="99431">
-    <w:nsid w:val="A99431"/>
+  <w:abstractNum w:abstractNumId="99411">
+    <w:nsid w:val="A99411"/>
     <w:multiLevelType w:val="multilevel"/>
     <w:lvl w:ilvl="0">
       <w:start w:val="1"/>
       <w:numFmt w:val="decimal"/>
-      <w:lvlText w:val="(%1)"/>
+      <w:lvlText w:val="%1."/>
       <w:lvlJc w:val="left"/>
       <w:pPr>
         <w:ind w:left="720" w:hanging="480"/>
@@ -8148,7 +7917,7 @@
     <w:lvl w:ilvl="1">
       <w:start w:val="1"/>
       <w:numFmt w:val="decimal"/>
-      <w:lvlText w:val="(%2)"/>
+      <w:lvlText w:val="%2."/>
       <w:lvlJc w:val="left"/>
       <w:pPr>
         <w:ind w:left="1440" w:hanging="480"/>
@@ -8157,7 +7926,7 @@
     <w:lvl w:ilvl="2">
       <w:start w:val="1"/>
       <w:numFmt w:val="decimal"/>
-      <w:lvlText w:val="(%3)"/>
+      <w:lvlText w:val="%3."/>
       <w:lvlJc w:val="left"/>
       <w:pPr>
         <w:ind w:left="2160" w:hanging="480"/>
@@ -8166,7 +7935,7 @@
     <w:lvl w:ilvl="3">
       <w:start w:val="1"/>
       <w:numFmt w:val="decimal"/>
-      <w:lvlText w:val="(%4)"/>
+      <w:lvlText w:val="%4."/>
       <w:lvlJc w:val="left"/>
       <w:pPr>
         <w:ind w:left="2880" w:hanging="480"/>
@@ -8175,7 +7944,7 @@
     <w:lvl w:ilvl="4">
       <w:start w:val="1"/>
       <w:numFmt w:val="decimal"/>
-      <w:lvlText w:val="(%5)"/>
+      <w:lvlText w:val="%5."/>
       <w:lvlJc w:val="left"/>
       <w:pPr>
         <w:ind w:left="3600" w:hanging="480"/>
@@ -8184,7 +7953,7 @@
     <w:lvl w:ilvl="5">
       <w:start w:val="1"/>
       <w:numFmt w:val="decimal"/>
-      <w:lvlText w:val="(%6)"/>
+      <w:lvlText w:val="%6."/>
       <w:lvlJc w:val="left"/>
       <w:pPr>
         <w:ind w:left="4320" w:hanging="480"/>
@@ -8193,7 +7962,7 @@
     <w:lvl w:ilvl="6">
       <w:start w:val="1"/>
       <w:numFmt w:val="decimal"/>
-      <w:lvlText w:val="(%7)"/>
+      <w:lvlText w:val="%7."/>
       <w:lvlJc w:val="left"/>
       <w:pPr>
         <w:ind w:left="5040" w:hanging="480"/>
@@ -8202,7 +7971,7 @@
     <w:lvl w:ilvl="7">
       <w:start w:val="1"/>
       <w:numFmt w:val="decimal"/>
-      <w:lvlText w:val="(%8)"/>
+      <w:lvlText w:val="%8."/>
       <w:lvlJc w:val="left"/>
       <w:pPr>
         <w:ind w:left="5760" w:hanging="480"/>
@@ -8211,262 +7980,7 @@
     <w:lvl w:ilvl="8">
       <w:start w:val="1"/>
       <w:numFmt w:val="decimal"/>
-      <w:lvlText w:val="(%9)"/>
-      <w:lvlJc w:val="left"/>
-      <w:pPr>
-        <w:ind w:left="6480" w:hanging="480"/>
-      </w:pPr>
-    </w:lvl>
-  </w:abstractNum>
-  <w:abstractNum w:abstractNumId="99432">
-    <w:nsid w:val="A99432"/>
-    <w:multiLevelType w:val="multilevel"/>
-    <w:lvl w:ilvl="0">
-      <w:start w:val="2"/>
-      <w:numFmt w:val="decimal"/>
-      <w:lvlText w:val="(%1)"/>
-      <w:lvlJc w:val="left"/>
-      <w:pPr>
-        <w:ind w:left="720" w:hanging="480"/>
-      </w:pPr>
-    </w:lvl>
-    <w:lvl w:ilvl="1">
-      <w:start w:val="2"/>
-      <w:numFmt w:val="decimal"/>
-      <w:lvlText w:val="(%2)"/>
-      <w:lvlJc w:val="left"/>
-      <w:pPr>
-        <w:ind w:left="1440" w:hanging="480"/>
-      </w:pPr>
-    </w:lvl>
-    <w:lvl w:ilvl="2">
-      <w:start w:val="2"/>
-      <w:numFmt w:val="decimal"/>
-      <w:lvlText w:val="(%3)"/>
-      <w:lvlJc w:val="left"/>
-      <w:pPr>
-        <w:ind w:left="2160" w:hanging="480"/>
-      </w:pPr>
-    </w:lvl>
-    <w:lvl w:ilvl="3">
-      <w:start w:val="2"/>
-      <w:numFmt w:val="decimal"/>
-      <w:lvlText w:val="(%4)"/>
-      <w:lvlJc w:val="left"/>
-      <w:pPr>
-        <w:ind w:left="2880" w:hanging="480"/>
-      </w:pPr>
-    </w:lvl>
-    <w:lvl w:ilvl="4">
-      <w:start w:val="2"/>
-      <w:numFmt w:val="decimal"/>
-      <w:lvlText w:val="(%5)"/>
-      <w:lvlJc w:val="left"/>
-      <w:pPr>
-        <w:ind w:left="3600" w:hanging="480"/>
-      </w:pPr>
-    </w:lvl>
-    <w:lvl w:ilvl="5">
-      <w:start w:val="2"/>
-      <w:numFmt w:val="decimal"/>
-      <w:lvlText w:val="(%6)"/>
-      <w:lvlJc w:val="left"/>
-      <w:pPr>
-        <w:ind w:left="4320" w:hanging="480"/>
-      </w:pPr>
-    </w:lvl>
-    <w:lvl w:ilvl="6">
-      <w:start w:val="2"/>
-      <w:numFmt w:val="decimal"/>
-      <w:lvlText w:val="(%7)"/>
-      <w:lvlJc w:val="left"/>
-      <w:pPr>
-        <w:ind w:left="5040" w:hanging="480"/>
-      </w:pPr>
-    </w:lvl>
-    <w:lvl w:ilvl="7">
-      <w:start w:val="2"/>
-      <w:numFmt w:val="decimal"/>
-      <w:lvlText w:val="(%8)"/>
-      <w:lvlJc w:val="left"/>
-      <w:pPr>
-        <w:ind w:left="5760" w:hanging="480"/>
-      </w:pPr>
-    </w:lvl>
-    <w:lvl w:ilvl="8">
-      <w:start w:val="2"/>
-      <w:numFmt w:val="decimal"/>
-      <w:lvlText w:val="(%9)"/>
-      <w:lvlJc w:val="left"/>
-      <w:pPr>
-        <w:ind w:left="6480" w:hanging="480"/>
-      </w:pPr>
-    </w:lvl>
-  </w:abstractNum>
-  <w:abstractNum w:abstractNumId="99433">
-    <w:nsid w:val="A99433"/>
-    <w:multiLevelType w:val="multilevel"/>
-    <w:lvl w:ilvl="0">
-      <w:start w:val="3"/>
-      <w:numFmt w:val="decimal"/>
-      <w:lvlText w:val="(%1)"/>
-      <w:lvlJc w:val="left"/>
-      <w:pPr>
-        <w:ind w:left="720" w:hanging="480"/>
-      </w:pPr>
-    </w:lvl>
-    <w:lvl w:ilvl="1">
-      <w:start w:val="3"/>
-      <w:numFmt w:val="decimal"/>
-      <w:lvlText w:val="(%2)"/>
-      <w:lvlJc w:val="left"/>
-      <w:pPr>
-        <w:ind w:left="1440" w:hanging="480"/>
-      </w:pPr>
-    </w:lvl>
-    <w:lvl w:ilvl="2">
-      <w:start w:val="3"/>
-      <w:numFmt w:val="decimal"/>
-      <w:lvlText w:val="(%3)"/>
-      <w:lvlJc w:val="left"/>
-      <w:pPr>
-        <w:ind w:left="2160" w:hanging="480"/>
-      </w:pPr>
-    </w:lvl>
-    <w:lvl w:ilvl="3">
-      <w:start w:val="3"/>
-      <w:numFmt w:val="decimal"/>
-      <w:lvlText w:val="(%4)"/>
-      <w:lvlJc w:val="left"/>
-      <w:pPr>
-        <w:ind w:left="2880" w:hanging="480"/>
-      </w:pPr>
-    </w:lvl>
-    <w:lvl w:ilvl="4">
-      <w:start w:val="3"/>
-      <w:numFmt w:val="decimal"/>
-      <w:lvlText w:val="(%5)"/>
-      <w:lvlJc w:val="left"/>
-      <w:pPr>
-        <w:ind w:left="3600" w:hanging="480"/>
-      </w:pPr>
-    </w:lvl>
-    <w:lvl w:ilvl="5">
-      <w:start w:val="3"/>
-      <w:numFmt w:val="decimal"/>
-      <w:lvlText w:val="(%6)"/>
-      <w:lvlJc w:val="left"/>
-      <w:pPr>
-        <w:ind w:left="4320" w:hanging="480"/>
-      </w:pPr>
-    </w:lvl>
-    <w:lvl w:ilvl="6">
-      <w:start w:val="3"/>
-      <w:numFmt w:val="decimal"/>
-      <w:lvlText w:val="(%7)"/>
-      <w:lvlJc w:val="left"/>
-      <w:pPr>
-        <w:ind w:left="5040" w:hanging="480"/>
-      </w:pPr>
-    </w:lvl>
-    <w:lvl w:ilvl="7">
-      <w:start w:val="3"/>
-      <w:numFmt w:val="decimal"/>
-      <w:lvlText w:val="(%8)"/>
-      <w:lvlJc w:val="left"/>
-      <w:pPr>
-        <w:ind w:left="5760" w:hanging="480"/>
-      </w:pPr>
-    </w:lvl>
-    <w:lvl w:ilvl="8">
-      <w:start w:val="3"/>
-      <w:numFmt w:val="decimal"/>
-      <w:lvlText w:val="(%9)"/>
-      <w:lvlJc w:val="left"/>
-      <w:pPr>
-        <w:ind w:left="6480" w:hanging="480"/>
-      </w:pPr>
-    </w:lvl>
-  </w:abstractNum>
-  <w:abstractNum w:abstractNumId="99434">
-    <w:nsid w:val="A99434"/>
-    <w:multiLevelType w:val="multilevel"/>
-    <w:lvl w:ilvl="0">
-      <w:start w:val="4"/>
-      <w:numFmt w:val="decimal"/>
-      <w:lvlText w:val="(%1)"/>
-      <w:lvlJc w:val="left"/>
-      <w:pPr>
-        <w:ind w:left="720" w:hanging="480"/>
-      </w:pPr>
-    </w:lvl>
-    <w:lvl w:ilvl="1">
-      <w:start w:val="4"/>
-      <w:numFmt w:val="decimal"/>
-      <w:lvlText w:val="(%2)"/>
-      <w:lvlJc w:val="left"/>
-      <w:pPr>
-        <w:ind w:left="1440" w:hanging="480"/>
-      </w:pPr>
-    </w:lvl>
-    <w:lvl w:ilvl="2">
-      <w:start w:val="4"/>
-      <w:numFmt w:val="decimal"/>
-      <w:lvlText w:val="(%3)"/>
-      <w:lvlJc w:val="left"/>
-      <w:pPr>
-        <w:ind w:left="2160" w:hanging="480"/>
-      </w:pPr>
-    </w:lvl>
-    <w:lvl w:ilvl="3">
-      <w:start w:val="4"/>
-      <w:numFmt w:val="decimal"/>
-      <w:lvlText w:val="(%4)"/>
-      <w:lvlJc w:val="left"/>
-      <w:pPr>
-        <w:ind w:left="2880" w:hanging="480"/>
-      </w:pPr>
-    </w:lvl>
-    <w:lvl w:ilvl="4">
-      <w:start w:val="4"/>
-      <w:numFmt w:val="decimal"/>
-      <w:lvlText w:val="(%5)"/>
-      <w:lvlJc w:val="left"/>
-      <w:pPr>
-        <w:ind w:left="3600" w:hanging="480"/>
-      </w:pPr>
-    </w:lvl>
-    <w:lvl w:ilvl="5">
-      <w:start w:val="4"/>
-      <w:numFmt w:val="decimal"/>
-      <w:lvlText w:val="(%6)"/>
-      <w:lvlJc w:val="left"/>
-      <w:pPr>
-        <w:ind w:left="4320" w:hanging="480"/>
-      </w:pPr>
-    </w:lvl>
-    <w:lvl w:ilvl="6">
-      <w:start w:val="4"/>
-      <w:numFmt w:val="decimal"/>
-      <w:lvlText w:val="(%7)"/>
-      <w:lvlJc w:val="left"/>
-      <w:pPr>
-        <w:ind w:left="5040" w:hanging="480"/>
-      </w:pPr>
-    </w:lvl>
-    <w:lvl w:ilvl="7">
-      <w:start w:val="4"/>
-      <w:numFmt w:val="decimal"/>
-      <w:lvlText w:val="(%8)"/>
-      <w:lvlJc w:val="left"/>
-      <w:pPr>
-        <w:ind w:left="5760" w:hanging="480"/>
-      </w:pPr>
-    </w:lvl>
-    <w:lvl w:ilvl="8">
-      <w:start w:val="4"/>
-      <w:numFmt w:val="decimal"/>
-      <w:lvlText w:val="(%9)"/>
+      <w:lvlText w:val="%9."/>
       <w:lvlJc w:val="left"/>
       <w:pPr>
         <w:ind w:left="6480" w:hanging="480"/>
@@ -8486,10 +8000,7 @@
     <w:abstractNumId w:val="990"/>
   </w:num>
   <w:num w:numId="1001">
-    <w:abstractNumId w:val="991"/>
-  </w:num>
-  <w:num w:numId="1002">
-    <w:abstractNumId w:val="99431"/>
+    <w:abstractNumId w:val="99411"/>
     <w:lvlOverride w:ilvl="0">
       <w:startOverride w:val="1"/>
     </w:lvlOverride>
@@ -8516,96 +8027,6 @@
     </w:lvlOverride>
     <w:lvlOverride w:ilvl="8">
       <w:startOverride w:val="1"/>
-    </w:lvlOverride>
-  </w:num>
-  <w:num w:numId="1003">
-    <w:abstractNumId w:val="99432"/>
-    <w:lvlOverride w:ilvl="0">
-      <w:startOverride w:val="2"/>
-    </w:lvlOverride>
-    <w:lvlOverride w:ilvl="1">
-      <w:startOverride w:val="2"/>
-    </w:lvlOverride>
-    <w:lvlOverride w:ilvl="2">
-      <w:startOverride w:val="2"/>
-    </w:lvlOverride>
-    <w:lvlOverride w:ilvl="3">
-      <w:startOverride w:val="2"/>
-    </w:lvlOverride>
-    <w:lvlOverride w:ilvl="4">
-      <w:startOverride w:val="2"/>
-    </w:lvlOverride>
-    <w:lvlOverride w:ilvl="5">
-      <w:startOverride w:val="2"/>
-    </w:lvlOverride>
-    <w:lvlOverride w:ilvl="6">
-      <w:startOverride w:val="2"/>
-    </w:lvlOverride>
-    <w:lvlOverride w:ilvl="7">
-      <w:startOverride w:val="2"/>
-    </w:lvlOverride>
-    <w:lvlOverride w:ilvl="8">
-      <w:startOverride w:val="2"/>
-    </w:lvlOverride>
-  </w:num>
-  <w:num w:numId="1004">
-    <w:abstractNumId w:val="99433"/>
-    <w:lvlOverride w:ilvl="0">
-      <w:startOverride w:val="3"/>
-    </w:lvlOverride>
-    <w:lvlOverride w:ilvl="1">
-      <w:startOverride w:val="3"/>
-    </w:lvlOverride>
-    <w:lvlOverride w:ilvl="2">
-      <w:startOverride w:val="3"/>
-    </w:lvlOverride>
-    <w:lvlOverride w:ilvl="3">
-      <w:startOverride w:val="3"/>
-    </w:lvlOverride>
-    <w:lvlOverride w:ilvl="4">
-      <w:startOverride w:val="3"/>
-    </w:lvlOverride>
-    <w:lvlOverride w:ilvl="5">
-      <w:startOverride w:val="3"/>
-    </w:lvlOverride>
-    <w:lvlOverride w:ilvl="6">
-      <w:startOverride w:val="3"/>
-    </w:lvlOverride>
-    <w:lvlOverride w:ilvl="7">
-      <w:startOverride w:val="3"/>
-    </w:lvlOverride>
-    <w:lvlOverride w:ilvl="8">
-      <w:startOverride w:val="3"/>
-    </w:lvlOverride>
-  </w:num>
-  <w:num w:numId="1005">
-    <w:abstractNumId w:val="99434"/>
-    <w:lvlOverride w:ilvl="0">
-      <w:startOverride w:val="4"/>
-    </w:lvlOverride>
-    <w:lvlOverride w:ilvl="1">
-      <w:startOverride w:val="4"/>
-    </w:lvlOverride>
-    <w:lvlOverride w:ilvl="2">
-      <w:startOverride w:val="4"/>
-    </w:lvlOverride>
-    <w:lvlOverride w:ilvl="3">
-      <w:startOverride w:val="4"/>
-    </w:lvlOverride>
-    <w:lvlOverride w:ilvl="4">
-      <w:startOverride w:val="4"/>
-    </w:lvlOverride>
-    <w:lvlOverride w:ilvl="5">
-      <w:startOverride w:val="4"/>
-    </w:lvlOverride>
-    <w:lvlOverride w:ilvl="6">
-      <w:startOverride w:val="4"/>
-    </w:lvlOverride>
-    <w:lvlOverride w:ilvl="7">
-      <w:startOverride w:val="4"/>
-    </w:lvlOverride>
-    <w:lvlOverride w:ilvl="8">
-      <w:startOverride w:val="4"/>
     </w:lvlOverride>
   </w:num>
 </w:numbering>

</xml_diff>

<commit_message>
remove table caption line via template edit
</commit_message>
<xml_diff>
--- a/analysis/paper/paper.docx
+++ b/analysis/paper/paper.docx
@@ -8442,7 +8442,7 @@
         <w:pStyle w:val="FirstParagraph"/>
       </w:pPr>
       <w:r>
-        <w:t xml:space="preserve">This report was generated on 2026-09-26 00:10:30.551147 using the following computational environment and dependencies:</w:t>
+        <w:t xml:space="preserve">This report was generated on 2026-09-26 11:05:28.611636 using the following computational environment and dependencies:</w:t>
       </w:r>
     </w:p>
     <w:p>
@@ -9190,7 +9190,7 @@
         <w:rPr>
           <w:rStyle w:val="VerbatimChar"/>
         </w:rPr>
-        <w:t xml:space="preserve">Head:     [5dd47c0] 2026-09-26: git2r missing</w:t>
+        <w:t xml:space="preserve">Head:     [1912977] 2026-09-26: table captions</w:t>
       </w:r>
     </w:p>
     <w:bookmarkEnd w:id="193"/>
@@ -10431,10 +10431,6 @@
     </w:rPr>
     <w:tblPr>
       <w:tblInd w:type="dxa" w:w="0"/>
-      <w:tblBorders>
-        <w:top w:color="auto" w:space="0" w:sz="4" w:val="single"/>
-        <w:bottom w:color="auto" w:space="0" w:sz="4" w:val="single"/>
-      </w:tblBorders>
       <w:tblCellMar>
         <w:top w:type="dxa" w:w="0"/>
         <w:left w:type="dxa" w:w="108"/>

</xml_diff>

<commit_message>
update tables and figure captions
</commit_message>
<xml_diff>
--- a/analysis/paper/paper.docx
+++ b/analysis/paper/paper.docx
@@ -667,7 +667,25 @@
         <w:t xml:space="preserve"> </w:t>
       </w:r>
       <w:r>
-        <w:t xml:space="preserve">show</w:t>
+        <w:t xml:space="preserve">describe</w:t>
+      </w:r>
+      <w:r>
+        <w:t xml:space="preserve"> </w:t>
+      </w:r>
+      <w:r>
+        <w:t xml:space="preserve">how</w:t>
+      </w:r>
+      <w:r>
+        <w:t xml:space="preserve"> </w:t>
+      </w:r>
+      <w:r>
+        <w:t xml:space="preserve">to</w:t>
+      </w:r>
+      <w:r>
+        <w:t xml:space="preserve"> </w:t>
+      </w:r>
+      <w:r>
+        <w:t xml:space="preserve">use</w:t>
       </w:r>
       <w:r>
         <w:t xml:space="preserve"> </w:t>
@@ -1287,7 +1305,7 @@
         <w:t xml:space="preserve">(Dell’Acqua et al. 2026)</w:t>
       </w:r>
       <w:r>
-        <w:t xml:space="preserve">. This makes it hard to predict when an AI will produce high-quality output, and necessitates fine-grained human oversight. That said, a study of over 600 scientists, including archaeologists, found that 47% of researchers use some form of AI daily, saving on average 7 hours per week</w:t>
+        <w:t xml:space="preserve">. This makes it hard to predict when an AI will produce high-quality output, and necessitates fine-grained human oversight. That said, a study of over 600 scientists found that 47% of researchers use some form of AI daily, saving on average 7 hours per week</w:t>
       </w:r>
       <w:r>
         <w:t xml:space="preserve"> </w:t>
@@ -1327,7 +1345,16 @@
         <w:t xml:space="preserve">(Korinek 2025)</w:t>
       </w:r>
       <w:r>
-        <w:t xml:space="preserve">. An AI agent can autonomously operate directly on our computer to complete multiple steps towards a specific goal without constant human interaction. A wide variety of agentic systems have emerged recently, ranging from a single tool to an autonomous multi-agent system</w:t>
+        <w:t xml:space="preserve">. An AI agent can autonomously operate directly on our computer to complete multiple steps towards a specific goal without constant human interaction. A wide variety of agentic systems have emerged recently</w:t>
+      </w:r>
+      <w:r>
+        <w:t xml:space="preserve"> </w:t>
+      </w:r>
+      <w:r>
+        <w:t xml:space="preserve">(Barbaste et al. 2026)</w:t>
+      </w:r>
+      <w:r>
+        <w:t xml:space="preserve">, ranging from a single tool to an autonomous multi-agent system</w:t>
       </w:r>
       <w:r>
         <w:t xml:space="preserve"> </w:t>
@@ -1373,7 +1400,7 @@
               <w:pStyle w:val="ImageCaption"/>
             </w:pPr>
             <w:r>
-              <w:t xml:space="preserve">Table 1: Comparison of Web-based chat and agentic AI</w:t>
+              <w:t xml:space="preserve">Table 1: Comparison of web-based chat and agentic AI</w:t>
             </w:r>
             <w:r>
               <w:t xml:space="preserve"> </w:t>
@@ -1893,7 +1920,7 @@
         <w:t xml:space="preserve"> </w:t>
       </w:r>
       <w:r>
-        <w:t xml:space="preserve">(Taylor 2023; Zanzotto 2019)</w:t>
+        <w:t xml:space="preserve">(Taylor 2023)</w:t>
       </w:r>
       <w:r>
         <w:t xml:space="preserve">.</w:t>
@@ -1927,10 +1954,22 @@
         <w:t xml:space="preserve"> </w:t>
       </w:r>
       <w:r>
-        <w:t xml:space="preserve">(Spillias et al. 2026)</w:t>
-      </w:r>
-      <w:r>
-        <w:t xml:space="preserve">. Where archaeological work requires community consultation or consent, our approval of an agent’s actions does not replace those obligations. Recent guidance on archaeological AI ethics and heritage management provides additional reasons to make those responsibilities explicit by keeping you as the researcher at the helm of your project</w:t>
+        <w:t xml:space="preserve">(Cootsona et al. 2026)</w:t>
+      </w:r>
+      <w:r>
+        <w:t xml:space="preserve">. Where archaeological work requires community consultation or consent, our approval of an agent’s actions does not replace those obligations.</w:t>
+      </w:r>
+      <w:r>
+        <w:t xml:space="preserve"> </w:t>
+      </w:r>
+      <w:r>
+        <w:t xml:space="preserve">Cootsona et al. (2026)</w:t>
+      </w:r>
+      <w:r>
+        <w:t xml:space="preserve"> </w:t>
+      </w:r>
+      <w:r>
+        <w:t xml:space="preserve">describe a comprehensive operational model of community engagement in an archaeological project that uses AI. Recent guidance on archaeological AI ethics and heritage management provides additional reasons to make those responsibilities explicit by keeping you as the researcher at the helm of your project</w:t>
       </w:r>
       <w:r>
         <w:t xml:space="preserve"> </w:t>
@@ -1967,7 +2006,16 @@
               <w:pStyle w:val="ImageCaption"/>
             </w:pPr>
             <w:r>
-              <w:t xml:space="preserve">Table 2: Human in the loop (HITL) versus human at the helm (HATH) across several dimensions important to the research process.</w:t>
+              <w:t xml:space="preserve">Table 2: Human in the loop (HITL) versus human at the helm (HATH) approaches to working with AI across several dimensions important to the research process.</w:t>
+            </w:r>
+            <w:r>
+              <w:t xml:space="preserve"> </w:t>
+            </w:r>
+            <w:r>
+              <w:t xml:space="preserve">(Beck and Burri 2024, 2024; Hao et al. 2025; Jonker et al. 2024; Monakhov 2026; Taylor 2023; Zanzotto 2019)</w:t>
+            </w:r>
+            <w:r>
+              <w:t xml:space="preserve">.</w:t>
             </w:r>
           </w:p>
           <w:tbl>
@@ -1979,9 +2027,9 @@
               <w:tblLayout w:type="fixed"/>
             </w:tblPr>
             <w:tblGrid>
-              <w:gridCol w:w="1072"/>
-              <w:gridCol w:w="3320"/>
-              <w:gridCol w:w="3527"/>
+              <w:gridCol w:w="1278"/>
+              <w:gridCol w:w="3258"/>
+              <w:gridCol w:w="3382"/>
             </w:tblGrid>
             <w:tr>
               <w:trPr>
@@ -2337,13 +2385,7 @@
                     <w:jc w:val="center"/>
                   </w:pPr>
                   <w:r>
-                    <w:t xml:space="preserve">HITL is a system-design pattern common in ML and RL</w:t>
-                  </w:r>
-                  <w:r>
-                    <w:t xml:space="preserve"> </w:t>
-                  </w:r>
-                  <w:r>
-                    <w:t xml:space="preserve">(Taylor 2023; Zanzotto 2019)</w:t>
+                    <w:t xml:space="preserve">HITL is a system-design pattern common in machine learning</w:t>
                   </w:r>
                 </w:p>
               </w:tc>
@@ -2357,12 +2399,6 @@
                   </w:pPr>
                   <w:r>
                     <w:t xml:space="preserve">Extends meaningful human control to research contexts</w:t>
-                  </w:r>
-                  <w:r>
-                    <w:t xml:space="preserve"> </w:t>
-                  </w:r>
-                  <w:r>
-                    <w:t xml:space="preserve">(Beck and Burri 2024; Jonker et al. 2024)</w:t>
                   </w:r>
                 </w:p>
               </w:tc>
@@ -2392,12 +2428,6 @@
                   <w:r>
                     <w:t xml:space="preserve">Absent in law; legal discourse requires oversight, not mere presence in a loop</w:t>
                   </w:r>
-                  <w:r>
-                    <w:t xml:space="preserve"> </w:t>
-                  </w:r>
-                  <w:r>
-                    <w:t xml:space="preserve">(Beck and Burri 2024)</w:t>
-                  </w:r>
                 </w:p>
               </w:tc>
               <w:tc>
@@ -2410,12 +2440,6 @@
                   </w:pPr>
                   <w:r>
                     <w:t xml:space="preserve">Aligns with human oversight and control requirements in AI regulation</w:t>
-                  </w:r>
-                  <w:r>
-                    <w:t xml:space="preserve"> </w:t>
-                  </w:r>
-                  <w:r>
-                    <w:t xml:space="preserve">(Beck and Burri 2024; Monakhov 2026)</w:t>
                   </w:r>
                 </w:p>
               </w:tc>
@@ -2498,12 +2522,6 @@
                   </w:pPr>
                   <w:r>
                     <w:t xml:space="preserve">Human and AI as a joint sensemaking process; humans add value AI cannot</w:t>
-                  </w:r>
-                  <w:r>
-                    <w:t xml:space="preserve"> </w:t>
-                  </w:r>
-                  <w:r>
-                    <w:t xml:space="preserve">(Hao et al. 2025)</w:t>
                   </w:r>
                 </w:p>
               </w:tc>
@@ -2581,7 +2599,7 @@
         <w:t xml:space="preserve">(Marwick 2017)</w:t>
       </w:r>
       <w:r>
-        <w:t xml:space="preserve">, and learning how they work together, for example, for R users the tidyverse for data preparation and ggplot2 for visualization</w:t>
+        <w:t xml:space="preserve">, and learning how they work together, for example, for R users the tidyverse set of packages for data preparation and visualization</w:t>
       </w:r>
       <w:r>
         <w:t xml:space="preserve"> </w:t>
@@ -2590,7 +2608,7 @@
         <w:t xml:space="preserve">(Wickham et al. 2019)</w:t>
       </w:r>
       <w:r>
-        <w:t xml:space="preserve">. The here package helps construct portable project-relative file paths, and the renv records R package dependencies. The Quarto document format is ideal for writing your report, this combines prose and executable code in a document written as a plain-text file</w:t>
+        <w:t xml:space="preserve">. The Quarto document format is ideal for writing your report, this combines prose and executable code in a document written as a plain-text file</w:t>
       </w:r>
       <w:r>
         <w:t xml:space="preserve"> </w:t>
@@ -2599,7 +2617,7 @@
         <w:t xml:space="preserve">(Quarto)</w:t>
       </w:r>
       <w:r>
-        <w:t xml:space="preserve">. Quarto is an extension of the Markdown document format, which LLMs read and write very efficiently and accurately, much more so than Word documents and PDFs. We recommend using converters, such as Markitdown, to turn DOCX and PDF files into markdown so agents can efficiently read them. Documents that you want your agent to read and edit should be in Markdown format to improve the agent’s efficiency and minimize their resource consumption.</w:t>
+        <w:t xml:space="preserve">. Quarto is an extension of the Markdown document format, which LLMs read and write very efficiently and accurately, much more so than Word documents and PDFs. We recommend using converters, such as Markitdown or Docling, to turn DOCX and PDF files into markdown so agents can more efficiently read them. Documents that you want your agent to read and edit should be in Markdown format to improve the agent’s efficiency and minimize their resource consumption.</w:t>
       </w:r>
     </w:p>
     <w:p>
@@ -2607,16 +2625,16 @@
         <w:pStyle w:val="BodyText"/>
       </w:pPr>
       <w:r>
-        <w:t xml:space="preserve">Git is another free and open source software that specializes in collaboration and recording versions of project files (e.g. text, code, data) so you can inspect changes and retrieve earlier work</w:t>
-      </w:r>
-      <w:r>
-        <w:t xml:space="preserve"> </w:t>
-      </w:r>
-      <w:r>
-        <w:t xml:space="preserve">(Wilson et al. 2014)</w:t>
-      </w:r>
-      <w:r>
-        <w:t xml:space="preserve">. Agents are fluent in Git and efficient at using it to track changes over multiple files in a project. The toolkit we have sketched out here, centered on R, Markdown, and Git, is especially well-suited for working with AI agents because it gives the agent and the researcher a shared, inspectable medium using free and open source tools. Agents read Markdown instruction files, run the R code embedded in our Quarto documents, and their edits are traceable as Git commits. This is a robust system for linking reported results back to the executable analyses that generated them; every machine-generated change is recorded transparently in plain text for you to review before accepting or rejecting it.</w:t>
+        <w:t xml:space="preserve">Git is a free and open source software that specializes in collaboration and recording versions of project files (e.g. text, code, data) so you can inspect changes and retrieve earlier work</w:t>
+      </w:r>
+      <w:r>
+        <w:t xml:space="preserve"> </w:t>
+      </w:r>
+      <w:r>
+        <w:t xml:space="preserve">(Blischak et al. 2016)</w:t>
+      </w:r>
+      <w:r>
+        <w:t xml:space="preserve">. Agents can handle routine Git operations efficiently to track changes over multiple files in a project. The toolkit we have sketched out here, centered on R, Markdown, and Git, is especially well-suited for working with AI agents because it gives the agent and the researcher a shared, inspectable medium using free and open source tools. Agents read Markdown instruction files, run the R code embedded in our Quarto documents, and their edits are traceable as Git commits (a commit is a saved snapshot of your project’s files at a specific point in time). This is a robust system for linking reported results back to the executable analyses that generated them; the agent transparently records every machine-generated change in plain text for you to review before accepting or rejecting it.</w:t>
       </w:r>
     </w:p>
     <w:bookmarkEnd w:id="23"/>
@@ -2687,7 +2705,7 @@
               <w:pStyle w:val="ImageCaption"/>
             </w:pPr>
             <w:r>
-              <w:t xml:space="preserve">Table 3: Key parts of an agent harness and what they do.</w:t>
+              <w:t xml:space="preserve">Table 3: Key parts of a typical agent harness and what they do.</w:t>
             </w:r>
           </w:p>
           <w:tbl>
@@ -2998,7 +3016,7 @@
               <w:pStyle w:val="ImageCaption"/>
             </w:pPr>
             <w:r>
-              <w:t xml:space="preserve">Figure 1: agent-in-ide</w:t>
+              <w:t xml:space="preserve">Figure 1: Schematic illustration of an AI-assisted data analysis enviroment. The entire frame incapsulated in an Integrated Development Environment, such as RStudio or VS Code. On the left side is a Quarto document where we can see headings, lines of narrative text, an R code block, and a data visualisation. We can see the AI agent is active in the R code block. The human researcher is active in the narrative text. On the right side is the AI agent harness, for example OpenCode. We can see there are three agents active, agent 1 is operating in plan mode (so it cannot modify any file). Its scope of activities is limited to the current project’s working directory (which includes an AGENTS.md file). It has replied with some text and is now presenting a set of options to the researcher to choose from. At the bottom of the harness is the box to type prompts to the model, and below that text that indicates what model is currently in use, and how much the model has been used in the current session.</w:t>
             </w:r>
           </w:p>
           <w:bookmarkEnd w:id="28"/>
@@ -3060,7 +3078,7 @@
         <w:t xml:space="preserve">(Bertran et al. 2026; Messeri and Crockett 2024)</w:t>
       </w:r>
       <w:r>
-        <w:t xml:space="preserve">, giving you a chance to steer and challenge the model, request justification for decisions it proposes, and invite the model to criticize your ideas, in anticipation of human reviewers</w:t>
+        <w:t xml:space="preserve">, giving you a chance to steer and challenge the model, request justification for decisions it proposes, and invite the model to criticize your ideas, in preparation for human reviewers</w:t>
       </w:r>
       <w:r>
         <w:t xml:space="preserve"> </w:t>
@@ -3193,7 +3211,7 @@
               <w:pStyle w:val="ImageCaption"/>
             </w:pPr>
             <w:r>
-              <w:t xml:space="preserve">Table 4: Options for protecting restricted data when the model runs remotely.</w:t>
+              <w:t xml:space="preserve">Table 4: Options for minimizing risks of working with restricted data.</w:t>
             </w:r>
           </w:p>
           <w:tbl>
@@ -3525,7 +3543,7 @@
               <w:pStyle w:val="ImageCaption"/>
             </w:pPr>
             <w:r>
-              <w:t xml:space="preserve">Table 5: MCP servers and skills installed in the author’s OpenCode configuration. Readers can copy-paste this table into their AI agent and ask it to install them for global availability.</w:t>
+              <w:t xml:space="preserve">Table 5: MCP servers and skills installed in the author’s OpenCode configuration. Note that this is an area of rapid change. Readers can copy-paste this table into their AI agent and ask it to install them for global availability.</w:t>
             </w:r>
           </w:p>
           <w:tbl>
@@ -3537,10 +3555,10 @@
               <w:tblLayout w:type="fixed"/>
             </w:tblPr>
             <w:tblGrid>
-              <w:gridCol w:w="483"/>
-              <w:gridCol w:w="1003"/>
-              <w:gridCol w:w="4090"/>
-              <w:gridCol w:w="2342"/>
+              <w:gridCol w:w="339"/>
+              <w:gridCol w:w="705"/>
+              <w:gridCol w:w="5227"/>
+              <w:gridCol w:w="1646"/>
             </w:tblGrid>
             <w:tr>
               <w:trPr>
@@ -3973,6 +3991,66 @@
                   </w:pPr>
                   <w:r>
                     <w:t xml:space="preserve">https://github.com/Agents365-ai/zotero-cli-ai</w:t>
+                  </w:r>
+                </w:p>
+              </w:tc>
+            </w:tr>
+            <w:tr>
+              <w:tc>
+                <w:tcPr/>
+                <w:p>
+                  <w:pPr>
+                    <w:pStyle w:val="Compact"/>
+                    <w:jc w:val="left"/>
+                    <w:jc w:val="center"/>
+                  </w:pPr>
+                  <w:r>
+                    <w:t xml:space="preserve">Skill</w:t>
+                  </w:r>
+                </w:p>
+              </w:tc>
+              <w:tc>
+                <w:tcPr/>
+                <w:p>
+                  <w:pPr>
+                    <w:pStyle w:val="Compact"/>
+                    <w:jc w:val="left"/>
+                    <w:jc w:val="center"/>
+                  </w:pPr>
+                  <w:r>
+                    <w:t xml:space="preserve">paperdoctor</w:t>
+                  </w:r>
+                </w:p>
+              </w:tc>
+              <w:tc>
+                <w:tcPr/>
+                <w:p>
+                  <w:pPr>
+                    <w:pStyle w:val="Compact"/>
+                    <w:jc w:val="left"/>
+                    <w:jc w:val="center"/>
+                  </w:pPr>
+                  <w:r>
+                    <w:t xml:space="preserve">Suite of eleven skills that reviews a manuscript in progress by checking its claims, code, math, experiments, references and visual layout, then renders every finding into one interactive HTML report</w:t>
+                  </w:r>
+                </w:p>
+              </w:tc>
+              <w:tc>
+                <w:tcPr/>
+                <w:p>
+                  <w:pPr>
+                    <w:pStyle w:val="Compact"/>
+                    <w:jc w:val="left"/>
+                    <w:jc w:val="center"/>
+                  </w:pPr>
+                  <w:r>
+                    <w:t xml:space="preserve">https://github.com/QinghongLin/paperdoctor,</w:t>
+                  </w:r>
+                  <w:r>
+                    <w:t xml:space="preserve"> </w:t>
+                  </w:r>
+                  <w:r>
+                    <w:t xml:space="preserve">Lin et al. (2026)</w:t>
                   </w:r>
                 </w:p>
               </w:tc>
@@ -4362,7 +4440,19 @@
         <w:t xml:space="preserve"> </w:t>
       </w:r>
       <w:r>
-        <w:t xml:space="preserve">fetch scholarly papers while verification tools check each citation against publication databases through a reference-verification server. The literature search and verification tools are provided by the refcheck MCP server; they query Crossref and Semantic Scholar. The agent can then write the results of the literature search into your project-level bibtex file or to your Zotero library for reuse across multiple projects. Skills guides the agent but cannot force compliance, so you need to review the completeness and accuracy of results before incorporating them into your work. We recommend multiple iterations of literature search prompts, adjusting the prompt each time to steer the model to focus on different areas of the literature</w:t>
+        <w:t xml:space="preserve">fetch scholarly papers while verification tools check each citation against publication databases through a reference-verification server. The literature search and verification tools are provided by the refcheck MCP server; they query Crossref and Semantic Scholar. The agent can then write the results of the literature search into your project-level bibtex file or to your Zotero library for reuse across multiple projects. Skills guides the agent but cannot force compliance, so you need to review the completeness and accuracy of results before incorporating them into your work. Automated pre-submission review is an active area of development.</w:t>
+      </w:r>
+      <w:r>
+        <w:t xml:space="preserve"> </w:t>
+      </w:r>
+      <w:r>
+        <w:t xml:space="preserve">Lin et al. (2026)</w:t>
+      </w:r>
+      <w:r>
+        <w:t xml:space="preserve"> </w:t>
+      </w:r>
+      <w:r>
+        <w:t xml:space="preserve">describe PaperDoctor, an agent framework that checks a draft’s claims against its code, mathematics, experiments, prior work, references and visual layout, returns each finding with a pointer to the supporting evidence and a suggested revision, and selectively reruns experiments according to claim importance and compute budget. In their evaluation it reached 70.6% agreement with human advisors across 30 in-progress papers, so expect to disagree with some findings and check each one before revising. We recommend multiple iterations of literature search prompts, adjusting the prompt each time to steer the model to focus on different areas of the literature</w:t>
       </w:r>
       <w:r>
         <w:t xml:space="preserve"> </w:t>
@@ -4531,7 +4621,7 @@
         <w:pStyle w:val="Compact"/>
       </w:pPr>
       <w:r>
-        <w:t xml:space="preserve">Include instructions for the model to evaluate its code for correctness and completeness before stopping. This sets the agent to work in a loop: generate code -&gt; run it -&gt; test it -&gt; fix any errors -&gt; run it again -&gt; test it, etc. until your evaluation criteria have been satisfied. Specifying evaluation criteria and instructing the model to debug itself improves the accuracy of output</w:t>
+        <w:t xml:space="preserve">Include instructions for the model to evaluate its code for correctness and completeness before stopping. This sets the agent to work in a loop: generate code -&gt; run it -&gt; test it -&gt; fix any errors -&gt; repeat until your evaluation criteria have been satisfied. Specifying evaluation criteria and instructing the model to debug itself improves the accuracy of output</w:t>
       </w:r>
       <w:r>
         <w:t xml:space="preserve"> </w:t>
@@ -4681,7 +4771,7 @@
               <w:pStyle w:val="ImageCaption"/>
             </w:pPr>
             <w:r>
-              <w:t xml:space="preserve">Figure 2: workflow</w:t>
+              <w:t xml:space="preserve">Figure 2: The researcher-directed agentic workflow. Research, plan, execute, and verify proceed left to right, with the researcher directing at every stage and the agent acting underneath. The research and planning steps may involve several rounds of interation and reflinment, as indicated by the bi-directional arrows between the researcher and agent for those steps. Execution and verification are citical decision points for the researcher. Rejecting the agent’s work includes looping back to update the plan. Each stage writes to an inspectable record: Git commits, updates to plan.md, the Quarto report, and the verified bibliography.”</w:t>
             </w:r>
           </w:p>
           <w:bookmarkEnd w:id="36"/>
@@ -4798,7 +4888,34 @@
         <w:t xml:space="preserve"> </w:t>
       </w:r>
       <w:r>
-        <w:t xml:space="preserve">If archaeology might be similarly transformed, then we urgently need to prepare our students to manage the epistemic risks of heightened vulnerability to illusions of explanatory depth, exploratory breadth, and objectivity that come with using AI</w:t>
+        <w:t xml:space="preserve">For archaeology specifically,</w:t>
+      </w:r>
+      <w:r>
+        <w:t xml:space="preserve"> </w:t>
+      </w:r>
+      <w:r>
+        <w:t xml:space="preserve">Altaweel and Forte (2026)</w:t>
+      </w:r>
+      <w:r>
+        <w:t xml:space="preserve"> </w:t>
+      </w:r>
+      <w:r>
+        <w:t xml:space="preserve">proposes that we</w:t>
+      </w:r>
+      <w:r>
+        <w:t xml:space="preserve"> </w:t>
+      </w:r>
+      <w:r>
+        <w:t xml:space="preserve">“</w:t>
+      </w:r>
+      <w:r>
+        <w:t xml:space="preserve">position AI as a theory-generating and theory-testing instrument… not as a technician of truth, but as a co-creator of interpretive possibility</w:t>
+      </w:r>
+      <w:r>
+        <w:t xml:space="preserve">”</w:t>
+      </w:r>
+      <w:r>
+        <w:t xml:space="preserve">. This potentially expansive role for AI raises the urgency of the need to prepare our students to manage the epistemic risks of heightened vulnerability to illusions of explanatory depth, exploratory breadth, and objectivity that come with using AI</w:t>
       </w:r>
       <w:r>
         <w:t xml:space="preserve"> </w:t>
@@ -4860,7 +4977,7 @@
         <w:pStyle w:val="FirstParagraph"/>
       </w:pPr>
       <w:r>
-        <w:t xml:space="preserve">No permits were required for the preparation of this manuscript. The author used OpenCode (https://opencode.ai/), an open-source AI harness, and OpenRouter (https://openrouter.ai/) a commercial model provider. AI models used included Nemotron 3.5 Ultra (NVIDIA), Qwen3.8, Muse Spark 1.3 (Meta), GLM-5.3 Flash (Zhipu), and MiMo-V2.5 (Xiaomi). These are all open-weight and open-source models. They were free via openrouter at the time of writing. AI was used to assist with searching for literature, planning, drafting and editing the manuscript and figures, and reference checking. All AI-generated suggestions were reviewed and revised by the author.</w:t>
+        <w:t xml:space="preserve">No permits were required for the preparation of this manuscript. The author used OpenCode (https://opencode.ai/), an open-source AI harness, and OpenRouter (https://openrouter.ai/) a commercial model provider. AI models used included Nemotron 3 Ultra (NVIDIA), Muse Spark 1.3 (Meta), Qwen3.8 (Alibaba), GLM-5.3 Flash (Zhipu), and MiMo-V2.5 (Xiaomi). Qwen3.8, GLM-5.3 Flash, and MiMo-V2.5 have openly available weights under permissive licenses; Nemotron 3 Ultra was available as an open-weight model under the OpenMDW License Agreement, version 1.1; and Muse Spark 1.3 was a proprietary, closed-weight model accessed through an API. All models were available through OpenRouter at no cost at the time of writing, July-Sept 2026. AI was used to assist with searching for literature, planning, drafting and editing the manuscript and figures, and reference checking. All AI-generated suggestions were reviewed and revised by the author.</w:t>
       </w:r>
     </w:p>
     <w:bookmarkEnd w:id="38"/>
@@ -4918,7 +5035,7 @@
       </w:r>
     </w:p>
     <w:bookmarkEnd w:id="41"/>
-    <w:bookmarkStart w:id="194" w:name="references"/>
+    <w:bookmarkStart w:id="197" w:name="references"/>
     <w:p>
       <w:pPr>
         <w:pStyle w:val="Heading1"/>
@@ -4927,7 +5044,7 @@
         <w:t xml:space="preserve">References</w:t>
       </w:r>
     </w:p>
-    <w:bookmarkStart w:id="192" w:name="refs"/>
+    <w:bookmarkStart w:id="196" w:name="refs"/>
     <w:bookmarkStart w:id="43" w:name="ref-Abramson2026"/>
     <w:p>
       <w:pPr>
@@ -4968,7 +5085,53 @@
       </w:r>
     </w:p>
     <w:bookmarkEnd w:id="43"/>
-    <w:bookmarkStart w:id="45" w:name="ref-Bail2024Generative"/>
+    <w:bookmarkStart w:id="45" w:name="ref-AltaweelForte2026"/>
+    <w:p>
+      <w:pPr>
+        <w:pStyle w:val="Bibliography"/>
+      </w:pPr>
+      <w:r>
+        <w:t xml:space="preserve">Altaweel, Mark, and Maurizio Forte. 2026. Archeological Theory and</w:t>
+      </w:r>
+      <w:r>
+        <w:t xml:space="preserve"> </w:t>
+      </w:r>
+      <w:r>
+        <w:t xml:space="preserve">AI</w:t>
+      </w:r>
+      <w:r>
+        <w:t xml:space="preserve">: The Potential Past Through Agentic Systems.</w:t>
+      </w:r>
+      <w:r>
+        <w:t xml:space="preserve"> </w:t>
+      </w:r>
+      <w:r>
+        <w:rPr>
+          <w:iCs/>
+          <w:i/>
+        </w:rPr>
+        <w:t xml:space="preserve">AI &amp; Society</w:t>
+      </w:r>
+      <w:r>
+        <w:t xml:space="preserve">.</w:t>
+      </w:r>
+      <w:r>
+        <w:t xml:space="preserve"> </w:t>
+      </w:r>
+      <w:hyperlink r:id="rId44">
+        <w:r>
+          <w:rPr>
+            <w:rStyle w:val="Hyperlink"/>
+          </w:rPr>
+          <w:t xml:space="preserve">https://doi.org/10.1007/s00146-026-03287-0</w:t>
+        </w:r>
+      </w:hyperlink>
+      <w:r>
+        <w:t xml:space="preserve">.</w:t>
+      </w:r>
+    </w:p>
+    <w:bookmarkEnd w:id="45"/>
+    <w:bookmarkStart w:id="47" w:name="ref-Bail2024Generative"/>
     <w:p>
       <w:pPr>
         <w:pStyle w:val="Bibliography"/>
@@ -5028,7 +5191,7 @@
       <w:r>
         <w:t xml:space="preserve"> </w:t>
       </w:r>
-      <w:hyperlink r:id="rId44">
+      <w:hyperlink r:id="rId46">
         <w:r>
           <w:rPr>
             <w:rStyle w:val="Hyperlink"/>
@@ -5040,19 +5203,43 @@
         <w:t xml:space="preserve">.</w:t>
       </w:r>
     </w:p>
-    <w:bookmarkEnd w:id="45"/>
-    <w:bookmarkStart w:id="47" w:name="ref-BeckBurri2024"/>
+    <w:bookmarkEnd w:id="47"/>
+    <w:bookmarkStart w:id="49" w:name="ref-barbaste2026"/>
     <w:p>
       <w:pPr>
         <w:pStyle w:val="Bibliography"/>
       </w:pPr>
       <w:r>
+        <w:t xml:space="preserve">Barbaste, Paul, Tristan Darrigol, Germain Vu, and Tom Wiltberger. 2026.</w:t>
+      </w:r>
+      <w:r>
+        <w:t xml:space="preserve"> </w:t>
+      </w:r>
+      <w:hyperlink r:id="rId48">
+        <w:r>
+          <w:rPr>
+            <w:rStyle w:val="Hyperlink"/>
+          </w:rPr>
+          <w:t xml:space="preserve">Harness Engineering: Anatomy, Architecture, and Evolution of Coding Agents – a Source-Code Study of Eleven Systems</w:t>
+        </w:r>
+      </w:hyperlink>
+      <w:r>
+        <w:t xml:space="preserve">.</w:t>
+      </w:r>
+    </w:p>
+    <w:bookmarkEnd w:id="49"/>
+    <w:bookmarkStart w:id="51" w:name="ref-BeckBurri2024"/>
+    <w:p>
+      <w:pPr>
+        <w:pStyle w:val="Bibliography"/>
+      </w:pPr>
+      <w:r>
         <w:t xml:space="preserve">Beck, Juliane, and Thomas Burri. 2024.</w:t>
       </w:r>
       <w:r>
         <w:t xml:space="preserve"> </w:t>
       </w:r>
-      <w:hyperlink r:id="rId46">
+      <w:hyperlink r:id="rId50">
         <w:r>
           <w:rPr>
             <w:rStyle w:val="Hyperlink"/>
@@ -5149,8 +5336,8 @@
         <w:t xml:space="preserve">, pp. 104–130. Edward Elgar Publishing.</w:t>
       </w:r>
     </w:p>
-    <w:bookmarkEnd w:id="47"/>
-    <w:bookmarkStart w:id="49" w:name="ref-Bertran2026"/>
+    <w:bookmarkEnd w:id="51"/>
+    <w:bookmarkStart w:id="53" w:name="ref-Bertran2026"/>
     <w:p>
       <w:pPr>
         <w:pStyle w:val="Bibliography"/>
@@ -5177,7 +5364,7 @@
       <w:r>
         <w:t xml:space="preserve"> </w:t>
       </w:r>
-      <w:hyperlink r:id="rId48">
+      <w:hyperlink r:id="rId52">
         <w:r>
           <w:rPr>
             <w:rStyle w:val="Hyperlink"/>
@@ -5189,8 +5376,8 @@
         <w:t xml:space="preserve">.</w:t>
       </w:r>
     </w:p>
-    <w:bookmarkEnd w:id="49"/>
-    <w:bookmarkStart w:id="51" w:name="ref-Bischoff2026LargeLanguageModels"/>
+    <w:bookmarkEnd w:id="53"/>
+    <w:bookmarkStart w:id="55" w:name="ref-Bischoff2026LargeLanguageModels"/>
     <w:p>
       <w:pPr>
         <w:pStyle w:val="Bibliography"/>
@@ -5214,7 +5401,7 @@
       <w:r>
         <w:t xml:space="preserve"> </w:t>
       </w:r>
-      <w:hyperlink r:id="rId50">
+      <w:hyperlink r:id="rId54">
         <w:r>
           <w:rPr>
             <w:rStyle w:val="Hyperlink"/>
@@ -5226,8 +5413,48 @@
         <w:t xml:space="preserve">.</w:t>
       </w:r>
     </w:p>
-    <w:bookmarkEnd w:id="51"/>
-    <w:bookmarkStart w:id="53" w:name="ref-Boiko2023"/>
+    <w:bookmarkEnd w:id="55"/>
+    <w:bookmarkStart w:id="57" w:name="ref-BlischakDavenportWilson2016"/>
+    <w:p>
+      <w:pPr>
+        <w:pStyle w:val="Bibliography"/>
+      </w:pPr>
+      <w:r>
+        <w:t xml:space="preserve">Blischak, John D., Emily R. Davenport, and Greg Wilson. 2016. A Quick Introduction to Version Control with Git and GitHub.</w:t>
+      </w:r>
+      <w:r>
+        <w:t xml:space="preserve"> </w:t>
+      </w:r>
+      <w:r>
+        <w:rPr>
+          <w:iCs/>
+          <w:i/>
+        </w:rPr>
+        <w:t xml:space="preserve">PLOS Computational Biology</w:t>
+      </w:r>
+      <w:r>
+        <w:t xml:space="preserve"> </w:t>
+      </w:r>
+      <w:r>
+        <w:t xml:space="preserve">12(1):1–18.</w:t>
+      </w:r>
+      <w:r>
+        <w:t xml:space="preserve"> </w:t>
+      </w:r>
+      <w:hyperlink r:id="rId56">
+        <w:r>
+          <w:rPr>
+            <w:rStyle w:val="Hyperlink"/>
+          </w:rPr>
+          <w:t xml:space="preserve">https://doi.org/10.1371/journal.pcbi.1004668</w:t>
+        </w:r>
+      </w:hyperlink>
+      <w:r>
+        <w:t xml:space="preserve">.</w:t>
+      </w:r>
+    </w:p>
+    <w:bookmarkEnd w:id="57"/>
+    <w:bookmarkStart w:id="59" w:name="ref-Boiko2023"/>
     <w:p>
       <w:pPr>
         <w:pStyle w:val="Bibliography"/>
@@ -5263,7 +5490,7 @@
       <w:r>
         <w:t xml:space="preserve"> </w:t>
       </w:r>
-      <w:hyperlink r:id="rId52">
+      <w:hyperlink r:id="rId58">
         <w:r>
           <w:rPr>
             <w:rStyle w:val="Hyperlink"/>
@@ -5275,8 +5502,8 @@
         <w:t xml:space="preserve">.</w:t>
       </w:r>
     </w:p>
-    <w:bookmarkEnd w:id="53"/>
-    <w:bookmarkStart w:id="55" w:name="ref-Bridgeford2026"/>
+    <w:bookmarkEnd w:id="59"/>
+    <w:bookmarkStart w:id="61" w:name="ref-Bridgeford2026"/>
     <w:p>
       <w:pPr>
         <w:pStyle w:val="Bibliography"/>
@@ -5303,7 +5530,7 @@
       <w:r>
         <w:t xml:space="preserve"> </w:t>
       </w:r>
-      <w:hyperlink r:id="rId54">
+      <w:hyperlink r:id="rId60">
         <w:r>
           <w:rPr>
             <w:rStyle w:val="Hyperlink"/>
@@ -5315,8 +5542,8 @@
         <w:t xml:space="preserve">.</w:t>
       </w:r>
     </w:p>
-    <w:bookmarkEnd w:id="55"/>
-    <w:bookmarkStart w:id="57" w:name="ref-Brown2026book"/>
+    <w:bookmarkEnd w:id="61"/>
+    <w:bookmarkStart w:id="63" w:name="ref-Brown2026book"/>
     <w:p>
       <w:pPr>
         <w:pStyle w:val="Bibliography"/>
@@ -5339,7 +5566,7 @@
       <w:r>
         <w:t xml:space="preserve"> </w:t>
       </w:r>
-      <w:hyperlink r:id="rId56">
+      <w:hyperlink r:id="rId62">
         <w:r>
           <w:rPr>
             <w:rStyle w:val="Hyperlink"/>
@@ -5351,8 +5578,8 @@
         <w:t xml:space="preserve">, accessed September 18, 2026.</w:t>
       </w:r>
     </w:p>
-    <w:bookmarkEnd w:id="57"/>
-    <w:bookmarkStart w:id="59" w:name="ref-Brown2026a"/>
+    <w:bookmarkEnd w:id="63"/>
+    <w:bookmarkStart w:id="65" w:name="ref-Brown2026a"/>
     <w:p>
       <w:pPr>
         <w:pStyle w:val="Bibliography"/>
@@ -5379,7 +5606,7 @@
       <w:r>
         <w:t xml:space="preserve"> </w:t>
       </w:r>
-      <w:hyperlink r:id="rId58">
+      <w:hyperlink r:id="rId64">
         <w:r>
           <w:rPr>
             <w:rStyle w:val="Hyperlink"/>
@@ -5391,8 +5618,8 @@
         <w:t xml:space="preserve">.</w:t>
       </w:r>
     </w:p>
-    <w:bookmarkEnd w:id="59"/>
-    <w:bookmarkStart w:id="61" w:name="ref-Brown2026b"/>
+    <w:bookmarkEnd w:id="65"/>
+    <w:bookmarkStart w:id="67" w:name="ref-Brown2026b"/>
     <w:p>
       <w:pPr>
         <w:pStyle w:val="Bibliography"/>
@@ -5419,7 +5646,7 @@
       <w:r>
         <w:t xml:space="preserve"> </w:t>
       </w:r>
-      <w:hyperlink r:id="rId60">
+      <w:hyperlink r:id="rId66">
         <w:r>
           <w:rPr>
             <w:rStyle w:val="Hyperlink"/>
@@ -5431,8 +5658,8 @@
         <w:t xml:space="preserve">.</w:t>
       </w:r>
     </w:p>
-    <w:bookmarkEnd w:id="61"/>
-    <w:bookmarkStart w:id="63" w:name="ref-Brown2026local"/>
+    <w:bookmarkEnd w:id="67"/>
+    <w:bookmarkStart w:id="69" w:name="ref-Brown2026local"/>
     <w:p>
       <w:pPr>
         <w:pStyle w:val="Bibliography"/>
@@ -5452,7 +5679,7 @@
       <w:r>
         <w:t xml:space="preserve"> </w:t>
       </w:r>
-      <w:hyperlink r:id="rId62">
+      <w:hyperlink r:id="rId68">
         <w:r>
           <w:rPr>
             <w:rStyle w:val="Hyperlink"/>
@@ -5464,8 +5691,8 @@
         <w:t xml:space="preserve">, accessed September 18, 2026.</w:t>
       </w:r>
     </w:p>
-    <w:bookmarkEnd w:id="63"/>
-    <w:bookmarkStart w:id="65" w:name="ref-Campbell2024"/>
+    <w:bookmarkEnd w:id="69"/>
+    <w:bookmarkStart w:id="71" w:name="ref-Campbell2024"/>
     <w:p>
       <w:pPr>
         <w:pStyle w:val="Bibliography"/>
@@ -5492,7 +5719,7 @@
       <w:r>
         <w:t xml:space="preserve"> </w:t>
       </w:r>
-      <w:hyperlink r:id="rId64">
+      <w:hyperlink r:id="rId70">
         <w:r>
           <w:rPr>
             <w:rStyle w:val="Hyperlink"/>
@@ -5504,8 +5731,8 @@
         <w:t xml:space="preserve">.</w:t>
       </w:r>
     </w:p>
-    <w:bookmarkEnd w:id="65"/>
-    <w:bookmarkStart w:id="67" w:name="ref-CardarelliRagno2026"/>
+    <w:bookmarkEnd w:id="71"/>
+    <w:bookmarkStart w:id="73" w:name="ref-CardarelliRagno2026"/>
     <w:p>
       <w:pPr>
         <w:pStyle w:val="Bibliography"/>
@@ -5529,7 +5756,7 @@
       <w:r>
         <w:t xml:space="preserve"> </w:t>
       </w:r>
-      <w:hyperlink r:id="rId66">
+      <w:hyperlink r:id="rId72">
         <w:r>
           <w:rPr>
             <w:rStyle w:val="Hyperlink"/>
@@ -5541,8 +5768,8 @@
         <w:t xml:space="preserve">.</w:t>
       </w:r>
     </w:p>
-    <w:bookmarkEnd w:id="67"/>
-    <w:bookmarkStart w:id="69" w:name="ref-Chen2023"/>
+    <w:bookmarkEnd w:id="73"/>
+    <w:bookmarkStart w:id="75" w:name="ref-Chen2023"/>
     <w:p>
       <w:pPr>
         <w:pStyle w:val="Bibliography"/>
@@ -5566,7 +5793,7 @@
       <w:r>
         <w:t xml:space="preserve"> </w:t>
       </w:r>
-      <w:hyperlink r:id="rId68">
+      <w:hyperlink r:id="rId74">
         <w:r>
           <w:rPr>
             <w:rStyle w:val="Hyperlink"/>
@@ -5578,8 +5805,8 @@
         <w:t xml:space="preserve">.</w:t>
       </w:r>
     </w:p>
-    <w:bookmarkEnd w:id="69"/>
-    <w:bookmarkStart w:id="71" w:name="ref-Codreanu2026"/>
+    <w:bookmarkEnd w:id="75"/>
+    <w:bookmarkStart w:id="77" w:name="ref-Codreanu2026"/>
     <w:p>
       <w:pPr>
         <w:pStyle w:val="Bibliography"/>
@@ -5623,7 +5850,7 @@
       <w:r>
         <w:t xml:space="preserve"> </w:t>
       </w:r>
-      <w:hyperlink r:id="rId70">
+      <w:hyperlink r:id="rId76">
         <w:r>
           <w:rPr>
             <w:rStyle w:val="Hyperlink"/>
@@ -5635,8 +5862,8 @@
         <w:t xml:space="preserve">, accessed September 16, 2026.</w:t>
       </w:r>
     </w:p>
-    <w:bookmarkEnd w:id="71"/>
-    <w:bookmarkStart w:id="73" w:name="ref-Cooper2024"/>
+    <w:bookmarkEnd w:id="77"/>
+    <w:bookmarkStart w:id="79" w:name="ref-Cooper2024"/>
     <w:p>
       <w:pPr>
         <w:pStyle w:val="Bibliography"/>
@@ -5663,7 +5890,7 @@
       <w:r>
         <w:t xml:space="preserve"> </w:t>
       </w:r>
-      <w:hyperlink r:id="rId72">
+      <w:hyperlink r:id="rId78">
         <w:r>
           <w:rPr>
             <w:rStyle w:val="Hyperlink"/>
@@ -5675,8 +5902,8 @@
         <w:t xml:space="preserve">.</w:t>
       </w:r>
     </w:p>
-    <w:bookmarkEnd w:id="73"/>
-    <w:bookmarkStart w:id="75" w:name="ref-CootsonaCastilloSunseri2026"/>
+    <w:bookmarkEnd w:id="79"/>
+    <w:bookmarkStart w:id="81" w:name="ref-CootsonaCastilloSunseri2026"/>
     <w:p>
       <w:pPr>
         <w:pStyle w:val="Bibliography"/>
@@ -5700,7 +5927,7 @@
       <w:r>
         <w:t xml:space="preserve"> </w:t>
       </w:r>
-      <w:hyperlink r:id="rId74">
+      <w:hyperlink r:id="rId80">
         <w:r>
           <w:rPr>
             <w:rStyle w:val="Hyperlink"/>
@@ -5712,14 +5939,14 @@
         <w:t xml:space="preserve">.</w:t>
       </w:r>
     </w:p>
-    <w:bookmarkEnd w:id="75"/>
-    <w:bookmarkStart w:id="77" w:name="ref-DellAcqua2026"/>
+    <w:bookmarkEnd w:id="81"/>
+    <w:bookmarkStart w:id="83" w:name="ref-DellAcqua2026"/>
     <w:p>
       <w:pPr>
         <w:pStyle w:val="Bibliography"/>
       </w:pPr>
       <w:r>
-        <w:t xml:space="preserve">Dell’Acqua, Fabrizio, Edward McFowland, Ethan Mollick, Hila Lifshitz, Katherine C. Kellogg, Saran Rajendran, Lisa Krayer, François Candelon, and Karim R. Lakhani. 2026. Navigating the Jagged Technological Frontier: Field Experimental Evidence of the Effects of Artificial Intelligence on Knowledge Worker Productivity and Quality.</w:t>
+        <w:t xml:space="preserve">Dell’Acqua, Fabrizio, Edward McFowland, Ethan Mollick, Hila Lifshitz, Katherine C. Kellogg, Saran Rajendran, Lisa Krayer, et al. 2026. Navigating the Jagged Technological Frontier: Field Experimental Evidence of the Effects of Artificial Intelligence on Knowledge Worker Productivity and Quality.</w:t>
       </w:r>
       <w:r>
         <w:t xml:space="preserve"> </w:t>
@@ -5740,7 +5967,7 @@
       <w:r>
         <w:t xml:space="preserve"> </w:t>
       </w:r>
-      <w:hyperlink r:id="rId76">
+      <w:hyperlink r:id="rId82">
         <w:r>
           <w:rPr>
             <w:rStyle w:val="Hyperlink"/>
@@ -5752,8 +5979,8 @@
         <w:t xml:space="preserve">.</w:t>
       </w:r>
     </w:p>
-    <w:bookmarkEnd w:id="77"/>
-    <w:bookmarkStart w:id="79" w:name="ref-Dyck2026"/>
+    <w:bookmarkEnd w:id="83"/>
+    <w:bookmarkStart w:id="85" w:name="ref-Dyck2026"/>
     <w:p>
       <w:pPr>
         <w:pStyle w:val="Bibliography"/>
@@ -5780,7 +6007,7 @@
       <w:r>
         <w:t xml:space="preserve"> </w:t>
       </w:r>
-      <w:hyperlink r:id="rId78">
+      <w:hyperlink r:id="rId84">
         <w:r>
           <w:rPr>
             <w:rStyle w:val="Hyperlink"/>
@@ -5792,8 +6019,8 @@
         <w:t xml:space="preserve">.</w:t>
       </w:r>
     </w:p>
-    <w:bookmarkEnd w:id="79"/>
-    <w:bookmarkStart w:id="81" w:name="ref-Feuerriegel2024"/>
+    <w:bookmarkEnd w:id="85"/>
+    <w:bookmarkStart w:id="87" w:name="ref-Feuerriegel2024"/>
     <w:p>
       <w:pPr>
         <w:pStyle w:val="Bibliography"/>
@@ -5829,7 +6056,7 @@
       <w:r>
         <w:t xml:space="preserve"> </w:t>
       </w:r>
-      <w:hyperlink r:id="rId80">
+      <w:hyperlink r:id="rId86">
         <w:r>
           <w:rPr>
             <w:rStyle w:val="Hyperlink"/>
@@ -5841,8 +6068,8 @@
         <w:t xml:space="preserve">.</w:t>
       </w:r>
     </w:p>
-    <w:bookmarkEnd w:id="81"/>
-    <w:bookmarkStart w:id="83" w:name="ref-Gattiglia2025"/>
+    <w:bookmarkEnd w:id="87"/>
+    <w:bookmarkStart w:id="89" w:name="ref-Gattiglia2025"/>
     <w:p>
       <w:pPr>
         <w:pStyle w:val="Bibliography"/>
@@ -5869,7 +6096,7 @@
       <w:r>
         <w:t xml:space="preserve"> </w:t>
       </w:r>
-      <w:hyperlink r:id="rId82">
+      <w:hyperlink r:id="rId88">
         <w:r>
           <w:rPr>
             <w:rStyle w:val="Hyperlink"/>
@@ -5881,8 +6108,8 @@
         <w:t xml:space="preserve">.</w:t>
       </w:r>
     </w:p>
-    <w:bookmarkEnd w:id="83"/>
-    <w:bookmarkStart w:id="85" w:name="ref-GildeZuniga2024"/>
+    <w:bookmarkEnd w:id="89"/>
+    <w:bookmarkStart w:id="91" w:name="ref-GildeZuniga2024"/>
     <w:p>
       <w:pPr>
         <w:pStyle w:val="Bibliography"/>
@@ -5918,7 +6145,7 @@
       <w:r>
         <w:t xml:space="preserve"> </w:t>
       </w:r>
-      <w:hyperlink r:id="rId84">
+      <w:hyperlink r:id="rId90">
         <w:r>
           <w:rPr>
             <w:rStyle w:val="Hyperlink"/>
@@ -5930,8 +6157,8 @@
         <w:t xml:space="preserve">.</w:t>
       </w:r>
     </w:p>
-    <w:bookmarkEnd w:id="85"/>
-    <w:bookmarkStart w:id="87" w:name="ref-Gougherty2024"/>
+    <w:bookmarkEnd w:id="91"/>
+    <w:bookmarkStart w:id="93" w:name="ref-Gougherty2024"/>
     <w:p>
       <w:pPr>
         <w:pStyle w:val="Bibliography"/>
@@ -5979,7 +6206,7 @@
       <w:r>
         <w:t xml:space="preserve"> </w:t>
       </w:r>
-      <w:hyperlink r:id="rId86">
+      <w:hyperlink r:id="rId92">
         <w:r>
           <w:rPr>
             <w:rStyle w:val="Hyperlink"/>
@@ -5991,8 +6218,8 @@
         <w:t xml:space="preserve">.</w:t>
       </w:r>
     </w:p>
-    <w:bookmarkEnd w:id="87"/>
-    <w:bookmarkStart w:id="89" w:name="ref-Goyal2026"/>
+    <w:bookmarkEnd w:id="93"/>
+    <w:bookmarkStart w:id="95" w:name="ref-Goyal2026"/>
     <w:p>
       <w:pPr>
         <w:pStyle w:val="Bibliography"/>
@@ -6025,7 +6252,7 @@
       <w:r>
         <w:t xml:space="preserve"> </w:t>
       </w:r>
-      <w:hyperlink r:id="rId88">
+      <w:hyperlink r:id="rId94">
         <w:r>
           <w:rPr>
             <w:rStyle w:val="Hyperlink"/>
@@ -6037,8 +6264,8 @@
         <w:t xml:space="preserve">.</w:t>
       </w:r>
     </w:p>
-    <w:bookmarkEnd w:id="89"/>
-    <w:bookmarkStart w:id="91" w:name="ref-Grossmann2023Transformation"/>
+    <w:bookmarkEnd w:id="95"/>
+    <w:bookmarkStart w:id="97" w:name="ref-Grossmann2023Transformation"/>
     <w:p>
       <w:pPr>
         <w:pStyle w:val="Bibliography"/>
@@ -6077,7 +6304,7 @@
       <w:r>
         <w:t xml:space="preserve"> </w:t>
       </w:r>
-      <w:hyperlink r:id="rId90">
+      <w:hyperlink r:id="rId96">
         <w:r>
           <w:rPr>
             <w:rStyle w:val="Hyperlink"/>
@@ -6089,19 +6316,19 @@
         <w:t xml:space="preserve">.</w:t>
       </w:r>
     </w:p>
-    <w:bookmarkEnd w:id="91"/>
-    <w:bookmarkStart w:id="93" w:name="ref-Guo2024"/>
+    <w:bookmarkEnd w:id="97"/>
+    <w:bookmarkStart w:id="99" w:name="ref-Guo2024"/>
     <w:p>
       <w:pPr>
         <w:pStyle w:val="Bibliography"/>
       </w:pPr>
       <w:r>
-        <w:t xml:space="preserve">Guo, Taicheng, Xiuying Chen, Yaqi Wang, Ruidi Chang, Shichao Pei, Nitesh V. Chawla, Olaf Wiest, and Xiangliang Zhang. 2024.</w:t>
-      </w:r>
-      <w:r>
-        <w:t xml:space="preserve"> </w:t>
-      </w:r>
-      <w:hyperlink r:id="rId92">
+        <w:t xml:space="preserve">Guo, Taicheng, Xiuying Chen, Yaqi Wang, Ruidi Chang, Shichao Pei, Nitesh V. Chawla, Olaf Wiest, et al. 2024.</w:t>
+      </w:r>
+      <w:r>
+        <w:t xml:space="preserve"> </w:t>
+      </w:r>
+      <w:hyperlink r:id="rId98">
         <w:r>
           <w:rPr>
             <w:rStyle w:val="Hyperlink"/>
@@ -6113,8 +6340,8 @@
         <w:t xml:space="preserve">, pp. 8048–8057.</w:t>
       </w:r>
     </w:p>
-    <w:bookmarkEnd w:id="93"/>
-    <w:bookmarkStart w:id="95" w:name="ref-Haase2026"/>
+    <w:bookmarkEnd w:id="99"/>
+    <w:bookmarkStart w:id="101" w:name="ref-Haase2026"/>
     <w:p>
       <w:pPr>
         <w:pStyle w:val="Bibliography"/>
@@ -6141,7 +6368,7 @@
       <w:r>
         <w:t xml:space="preserve"> </w:t>
       </w:r>
-      <w:hyperlink r:id="rId94">
+      <w:hyperlink r:id="rId100">
         <w:r>
           <w:rPr>
             <w:rStyle w:val="Hyperlink"/>
@@ -6153,8 +6380,8 @@
         <w:t xml:space="preserve">.</w:t>
       </w:r>
     </w:p>
-    <w:bookmarkEnd w:id="95"/>
-    <w:bookmarkStart w:id="97" w:name="ref-Hao2025"/>
+    <w:bookmarkEnd w:id="101"/>
+    <w:bookmarkStart w:id="103" w:name="ref-Hao2025"/>
     <w:p>
       <w:pPr>
         <w:pStyle w:val="Bibliography"/>
@@ -6190,7 +6417,7 @@
       <w:r>
         <w:t xml:space="preserve"> </w:t>
       </w:r>
-      <w:hyperlink r:id="rId96">
+      <w:hyperlink r:id="rId102">
         <w:r>
           <w:rPr>
             <w:rStyle w:val="Hyperlink"/>
@@ -6202,8 +6429,8 @@
         <w:t xml:space="preserve">.</w:t>
       </w:r>
     </w:p>
-    <w:bookmarkEnd w:id="97"/>
-    <w:bookmarkStart w:id="99" w:name="ref-Hariri2025"/>
+    <w:bookmarkEnd w:id="103"/>
+    <w:bookmarkStart w:id="105" w:name="ref-Hariri2025"/>
     <w:p>
       <w:pPr>
         <w:pStyle w:val="Bibliography"/>
@@ -6214,7 +6441,7 @@
       <w:r>
         <w:t xml:space="preserve"> </w:t>
       </w:r>
-      <w:hyperlink r:id="rId98">
+      <w:hyperlink r:id="rId104">
         <w:r>
           <w:rPr>
             <w:rStyle w:val="Hyperlink"/>
@@ -6239,8 +6466,8 @@
         <w:t xml:space="preserve">, pp. 83–97. Lecture Notes in Computer Science. Springer Nature Switzerland.</w:t>
       </w:r>
     </w:p>
-    <w:bookmarkEnd w:id="99"/>
-    <w:bookmarkStart w:id="101" w:name="ref-Hou2025"/>
+    <w:bookmarkEnd w:id="105"/>
+    <w:bookmarkStart w:id="107" w:name="ref-Hou2025"/>
     <w:p>
       <w:pPr>
         <w:pStyle w:val="Bibliography"/>
@@ -6276,7 +6503,7 @@
       <w:r>
         <w:t xml:space="preserve"> </w:t>
       </w:r>
-      <w:hyperlink r:id="rId100">
+      <w:hyperlink r:id="rId106">
         <w:r>
           <w:rPr>
             <w:rStyle w:val="Hyperlink"/>
@@ -6288,8 +6515,8 @@
         <w:t xml:space="preserve">.</w:t>
       </w:r>
     </w:p>
-    <w:bookmarkEnd w:id="101"/>
-    <w:bookmarkStart w:id="103" w:name="ref-Jansen2025"/>
+    <w:bookmarkEnd w:id="107"/>
+    <w:bookmarkStart w:id="109" w:name="ref-Jansen2025"/>
     <w:p>
       <w:pPr>
         <w:pStyle w:val="Bibliography"/>
@@ -6316,7 +6543,7 @@
       <w:r>
         <w:t xml:space="preserve"> </w:t>
       </w:r>
-      <w:hyperlink r:id="rId102">
+      <w:hyperlink r:id="rId108">
         <w:r>
           <w:rPr>
             <w:rStyle w:val="Hyperlink"/>
@@ -6328,8 +6555,8 @@
         <w:t xml:space="preserve">.</w:t>
       </w:r>
     </w:p>
-    <w:bookmarkEnd w:id="103"/>
-    <w:bookmarkStart w:id="105" w:name="ref-JohnsonEberl2026"/>
+    <w:bookmarkEnd w:id="109"/>
+    <w:bookmarkStart w:id="111" w:name="ref-JohnsonEberl2026"/>
     <w:p>
       <w:pPr>
         <w:pStyle w:val="Bibliography"/>
@@ -6356,7 +6583,7 @@
       <w:r>
         <w:t xml:space="preserve"> </w:t>
       </w:r>
-      <w:hyperlink r:id="rId104">
+      <w:hyperlink r:id="rId110">
         <w:r>
           <w:rPr>
             <w:rStyle w:val="Hyperlink"/>
@@ -6368,8 +6595,8 @@
         <w:t xml:space="preserve">.</w:t>
       </w:r>
     </w:p>
-    <w:bookmarkEnd w:id="105"/>
-    <w:bookmarkStart w:id="107" w:name="ref-Jonker2024"/>
+    <w:bookmarkEnd w:id="111"/>
+    <w:bookmarkStart w:id="113" w:name="ref-Jonker2024"/>
     <w:p>
       <w:pPr>
         <w:pStyle w:val="Bibliography"/>
@@ -6380,7 +6607,7 @@
       <w:r>
         <w:t xml:space="preserve"> </w:t>
       </w:r>
-      <w:hyperlink r:id="rId106">
+      <w:hyperlink r:id="rId112">
         <w:r>
           <w:rPr>
             <w:rStyle w:val="Hyperlink"/>
@@ -6429,8 +6656,8 @@
         <w:t xml:space="preserve">, pp. 188–204. Edward Elgar Publishing.</w:t>
       </w:r>
     </w:p>
-    <w:bookmarkEnd w:id="107"/>
-    <w:bookmarkStart w:id="109" w:name="ref-Kansa2026"/>
+    <w:bookmarkEnd w:id="113"/>
+    <w:bookmarkStart w:id="115" w:name="ref-Kansa2026"/>
     <w:p>
       <w:pPr>
         <w:pStyle w:val="Bibliography"/>
@@ -6466,7 +6693,7 @@
       <w:r>
         <w:t xml:space="preserve"> </w:t>
       </w:r>
-      <w:hyperlink r:id="rId108">
+      <w:hyperlink r:id="rId114">
         <w:r>
           <w:rPr>
             <w:rStyle w:val="Hyperlink"/>
@@ -6478,8 +6705,8 @@
         <w:t xml:space="preserve">.</w:t>
       </w:r>
     </w:p>
-    <w:bookmarkEnd w:id="109"/>
-    <w:bookmarkStart w:id="111" w:name="ref-Kasneci2023"/>
+    <w:bookmarkEnd w:id="115"/>
+    <w:bookmarkStart w:id="117" w:name="ref-Kasneci2023"/>
     <w:p>
       <w:pPr>
         <w:pStyle w:val="Bibliography"/>
@@ -6515,7 +6742,7 @@
       <w:r>
         <w:t xml:space="preserve"> </w:t>
       </w:r>
-      <w:hyperlink r:id="rId110">
+      <w:hyperlink r:id="rId116">
         <w:r>
           <w:rPr>
             <w:rStyle w:val="Hyperlink"/>
@@ -6527,8 +6754,8 @@
         <w:t xml:space="preserve">.</w:t>
       </w:r>
     </w:p>
-    <w:bookmarkEnd w:id="111"/>
-    <w:bookmarkStart w:id="113" w:name="ref-Kim2026Power"/>
+    <w:bookmarkEnd w:id="117"/>
+    <w:bookmarkStart w:id="119" w:name="ref-Kim2026Power"/>
     <w:p>
       <w:pPr>
         <w:pStyle w:val="Bibliography"/>
@@ -6556,12 +6783,12 @@
         <w:t xml:space="preserve"> </w:t>
       </w:r>
       <w:r>
-        <w:t xml:space="preserve">6(2):1–42.</w:t>
-      </w:r>
-      <w:r>
-        <w:t xml:space="preserve"> </w:t>
-      </w:r>
-      <w:hyperlink r:id="rId112">
+        <w:t xml:space="preserve">6(2):173–184.</w:t>
+      </w:r>
+      <w:r>
+        <w:t xml:space="preserve"> </w:t>
+      </w:r>
+      <w:hyperlink r:id="rId118">
         <w:r>
           <w:rPr>
             <w:rStyle w:val="Hyperlink"/>
@@ -6573,8 +6800,8 @@
         <w:t xml:space="preserve">.</w:t>
       </w:r>
     </w:p>
-    <w:bookmarkEnd w:id="113"/>
-    <w:bookmarkStart w:id="115" w:name="ref-Korinek2023"/>
+    <w:bookmarkEnd w:id="119"/>
+    <w:bookmarkStart w:id="121" w:name="ref-Korinek2023"/>
     <w:p>
       <w:pPr>
         <w:pStyle w:val="Bibliography"/>
@@ -6601,7 +6828,7 @@
       <w:r>
         <w:t xml:space="preserve"> </w:t>
       </w:r>
-      <w:hyperlink r:id="rId114">
+      <w:hyperlink r:id="rId120">
         <w:r>
           <w:rPr>
             <w:rStyle w:val="Hyperlink"/>
@@ -6613,8 +6840,8 @@
         <w:t xml:space="preserve">.</w:t>
       </w:r>
     </w:p>
-    <w:bookmarkEnd w:id="115"/>
-    <w:bookmarkStart w:id="117" w:name="ref-Korinek2025"/>
+    <w:bookmarkEnd w:id="121"/>
+    <w:bookmarkStart w:id="123" w:name="ref-Korinek2025"/>
     <w:p>
       <w:pPr>
         <w:pStyle w:val="Bibliography"/>
@@ -6625,7 +6852,7 @@
       <w:r>
         <w:t xml:space="preserve"> </w:t>
       </w:r>
-      <w:hyperlink r:id="rId116">
+      <w:hyperlink r:id="rId122">
         <w:r>
           <w:rPr>
             <w:rStyle w:val="Hyperlink"/>
@@ -6655,8 +6882,8 @@
         <w:t xml:space="preserve">. National Bureau of Economic Research.</w:t>
       </w:r>
     </w:p>
-    <w:bookmarkEnd w:id="117"/>
-    <w:bookmarkStart w:id="119" w:name="ref-Moorthy2026"/>
+    <w:bookmarkEnd w:id="123"/>
+    <w:bookmarkStart w:id="125" w:name="ref-Moorthy2026"/>
     <w:p>
       <w:pPr>
         <w:pStyle w:val="Bibliography"/>
@@ -6701,7 +6928,7 @@
       <w:r>
         <w:t xml:space="preserve"> </w:t>
       </w:r>
-      <w:hyperlink r:id="rId118">
+      <w:hyperlink r:id="rId124">
         <w:r>
           <w:rPr>
             <w:rStyle w:val="Hyperlink"/>
@@ -6713,8 +6940,8 @@
         <w:t xml:space="preserve">.</w:t>
       </w:r>
     </w:p>
-    <w:bookmarkEnd w:id="119"/>
-    <w:bookmarkStart w:id="121" w:name="ref-Laban2025"/>
+    <w:bookmarkEnd w:id="125"/>
+    <w:bookmarkStart w:id="127" w:name="ref-Laban2025"/>
     <w:p>
       <w:pPr>
         <w:pStyle w:val="Bibliography"/>
@@ -6750,7 +6977,7 @@
       <w:r>
         <w:t xml:space="preserve"> </w:t>
       </w:r>
-      <w:hyperlink r:id="rId120">
+      <w:hyperlink r:id="rId126">
         <w:r>
           <w:rPr>
             <w:rStyle w:val="Hyperlink"/>
@@ -6762,8 +6989,8 @@
         <w:t xml:space="preserve">.</w:t>
       </w:r>
     </w:p>
-    <w:bookmarkEnd w:id="121"/>
-    <w:bookmarkStart w:id="123" w:name="ref-Leung2023"/>
+    <w:bookmarkEnd w:id="127"/>
+    <w:bookmarkStart w:id="129" w:name="ref-Leung2023"/>
     <w:p>
       <w:pPr>
         <w:pStyle w:val="Bibliography"/>
@@ -6790,7 +7017,7 @@
       <w:r>
         <w:t xml:space="preserve"> </w:t>
       </w:r>
-      <w:hyperlink r:id="rId122">
+      <w:hyperlink r:id="rId128">
         <w:r>
           <w:rPr>
             <w:rStyle w:val="Hyperlink"/>
@@ -6802,8 +7029,54 @@
         <w:t xml:space="preserve">.</w:t>
       </w:r>
     </w:p>
-    <w:bookmarkEnd w:id="123"/>
-    <w:bookmarkStart w:id="125" w:name="ref-Longkumer2025Generative"/>
+    <w:bookmarkEnd w:id="129"/>
+    <w:bookmarkStart w:id="131" w:name="ref-Lin2026"/>
+    <w:p>
+      <w:pPr>
+        <w:pStyle w:val="Bibliography"/>
+      </w:pPr>
+      <w:r>
+        <w:t xml:space="preserve">Lin, Kevin Qinghong, Siyuan Hu, Pan Lu, Yu Chen, Yanzhe Chen, Owen Queen, Yupeng Chen, et al. 2026.</w:t>
+      </w:r>
+      <w:r>
+        <w:t xml:space="preserve"> </w:t>
+      </w:r>
+      <w:r>
+        <w:t xml:space="preserve">PaperDoctor</w:t>
+      </w:r>
+      <w:r>
+        <w:t xml:space="preserve">: Evidence-Grounded and Actionable Feedback for Scientific Papers in Progress.</w:t>
+      </w:r>
+      <w:r>
+        <w:t xml:space="preserve"> </w:t>
+      </w:r>
+      <w:r>
+        <w:rPr>
+          <w:iCs/>
+          <w:i/>
+        </w:rPr>
+        <w:t xml:space="preserve">arXiv Preprint arXiv:2609.16995</w:t>
+      </w:r>
+      <w:r>
+        <w:t xml:space="preserve">.</w:t>
+      </w:r>
+      <w:r>
+        <w:t xml:space="preserve"> </w:t>
+      </w:r>
+      <w:hyperlink r:id="rId130">
+        <w:r>
+          <w:rPr>
+            <w:rStyle w:val="Hyperlink"/>
+          </w:rPr>
+          <w:t xml:space="preserve">https://doi.org/10.48550/arXiv.2609.16995</w:t>
+        </w:r>
+      </w:hyperlink>
+      <w:r>
+        <w:t xml:space="preserve">.</w:t>
+      </w:r>
+    </w:p>
+    <w:bookmarkEnd w:id="131"/>
+    <w:bookmarkStart w:id="133" w:name="ref-Longkumer2025Generative"/>
     <w:p>
       <w:pPr>
         <w:pStyle w:val="Bibliography"/>
@@ -6890,7 +7163,7 @@
       <w:r>
         <w:t xml:space="preserve"> </w:t>
       </w:r>
-      <w:hyperlink r:id="rId124">
+      <w:hyperlink r:id="rId132">
         <w:r>
           <w:rPr>
             <w:rStyle w:val="Hyperlink"/>
@@ -6902,14 +7175,14 @@
         <w:t xml:space="preserve">.</w:t>
       </w:r>
     </w:p>
-    <w:bookmarkEnd w:id="125"/>
-    <w:bookmarkStart w:id="127" w:name="ref-Lu2026"/>
+    <w:bookmarkEnd w:id="133"/>
+    <w:bookmarkStart w:id="135" w:name="ref-Lu2026"/>
     <w:p>
       <w:pPr>
         <w:pStyle w:val="Bibliography"/>
       </w:pPr>
       <w:r>
-        <w:t xml:space="preserve">Lu, Chris, Cong Lu, Robert Tjarko Lange, Yutaro Yamada, Shengran Hu, Jakob Foerster, David Ha, and Jeff Clune. 2026. Towards End-to-End Automation of</w:t>
+        <w:t xml:space="preserve">Lu, Chris, Cong Lu, Robert Tjarko Lange, Yutaro Yamada, Shengran Hu, Jakob Foerster, David Ha, et al. 2026. Towards End-to-End Automation of</w:t>
       </w:r>
       <w:r>
         <w:t xml:space="preserve"> </w:t>
@@ -6942,7 +7215,7 @@
       <w:r>
         <w:t xml:space="preserve"> </w:t>
       </w:r>
-      <w:hyperlink r:id="rId126">
+      <w:hyperlink r:id="rId134">
         <w:r>
           <w:rPr>
             <w:rStyle w:val="Hyperlink"/>
@@ -6954,8 +7227,8 @@
         <w:t xml:space="preserve">.</w:t>
       </w:r>
     </w:p>
-    <w:bookmarkEnd w:id="127"/>
-    <w:bookmarkStart w:id="129" w:name="ref-MBran2024"/>
+    <w:bookmarkEnd w:id="135"/>
+    <w:bookmarkStart w:id="137" w:name="ref-MBran2024"/>
     <w:p>
       <w:pPr>
         <w:pStyle w:val="Bibliography"/>
@@ -6991,7 +7264,7 @@
       <w:r>
         <w:t xml:space="preserve"> </w:t>
       </w:r>
-      <w:hyperlink r:id="rId128">
+      <w:hyperlink r:id="rId136">
         <w:r>
           <w:rPr>
             <w:rStyle w:val="Hyperlink"/>
@@ -7003,8 +7276,8 @@
         <w:t xml:space="preserve">.</w:t>
       </w:r>
     </w:p>
-    <w:bookmarkEnd w:id="129"/>
-    <w:bookmarkStart w:id="131" w:name="ref-Marwick2017"/>
+    <w:bookmarkEnd w:id="137"/>
+    <w:bookmarkStart w:id="139" w:name="ref-Marwick2017"/>
     <w:p>
       <w:pPr>
         <w:pStyle w:val="Bibliography"/>
@@ -7031,7 +7304,7 @@
       <w:r>
         <w:t xml:space="preserve"> </w:t>
       </w:r>
-      <w:hyperlink r:id="rId130">
+      <w:hyperlink r:id="rId138">
         <w:r>
           <w:rPr>
             <w:rStyle w:val="Hyperlink"/>
@@ -7043,8 +7316,8 @@
         <w:t xml:space="preserve">.</w:t>
       </w:r>
     </w:p>
-    <w:bookmarkEnd w:id="131"/>
-    <w:bookmarkStart w:id="133" w:name="ref-Messeri2024"/>
+    <w:bookmarkEnd w:id="139"/>
+    <w:bookmarkStart w:id="141" w:name="ref-Messeri2024"/>
     <w:p>
       <w:pPr>
         <w:pStyle w:val="Bibliography"/>
@@ -7071,7 +7344,7 @@
       <w:r>
         <w:t xml:space="preserve"> </w:t>
       </w:r>
-      <w:hyperlink r:id="rId132">
+      <w:hyperlink r:id="rId140">
         <w:r>
           <w:rPr>
             <w:rStyle w:val="Hyperlink"/>
@@ -7083,8 +7356,8 @@
         <w:t xml:space="preserve">.</w:t>
       </w:r>
     </w:p>
-    <w:bookmarkEnd w:id="133"/>
-    <w:bookmarkStart w:id="135" w:name="ref-Miao2026"/>
+    <w:bookmarkEnd w:id="141"/>
+    <w:bookmarkStart w:id="143" w:name="ref-Miao2026"/>
     <w:p>
       <w:pPr>
         <w:pStyle w:val="Bibliography"/>
@@ -7108,7 +7381,7 @@
       <w:r>
         <w:t xml:space="preserve"> </w:t>
       </w:r>
-      <w:hyperlink r:id="rId134">
+      <w:hyperlink r:id="rId142">
         <w:r>
           <w:rPr>
             <w:rStyle w:val="Hyperlink"/>
@@ -7120,8 +7393,8 @@
         <w:t xml:space="preserve">.</w:t>
       </w:r>
     </w:p>
-    <w:bookmarkEnd w:id="135"/>
-    <w:bookmarkStart w:id="137" w:name="ref-Monakhov2026"/>
+    <w:bookmarkEnd w:id="143"/>
+    <w:bookmarkStart w:id="145" w:name="ref-Monakhov2026"/>
     <w:p>
       <w:pPr>
         <w:pStyle w:val="Bibliography"/>
@@ -7132,7 +7405,7 @@
       <w:r>
         <w:t xml:space="preserve"> </w:t>
       </w:r>
-      <w:hyperlink r:id="rId136">
+      <w:hyperlink r:id="rId144">
         <w:r>
           <w:rPr>
             <w:rStyle w:val="Hyperlink"/>
@@ -7168,8 +7441,8 @@
         <w:t xml:space="preserve">. Elsevier BV.</w:t>
       </w:r>
     </w:p>
-    <w:bookmarkEnd w:id="137"/>
-    <w:bookmarkStart w:id="139" w:name="ref-NationalAcademies2026"/>
+    <w:bookmarkEnd w:id="145"/>
+    <w:bookmarkStart w:id="147" w:name="ref-NationalAcademies2026"/>
     <w:p>
       <w:pPr>
         <w:pStyle w:val="Bibliography"/>
@@ -7180,7 +7453,7 @@
       <w:r>
         <w:t xml:space="preserve"> </w:t>
       </w:r>
-      <w:hyperlink r:id="rId138">
+      <w:hyperlink r:id="rId146">
         <w:r>
           <w:rPr>
             <w:rStyle w:val="Hyperlink"/>
@@ -7194,8 +7467,8 @@
         <w:t xml:space="preserve">. The National Academies Press, Washington, DC.</w:t>
       </w:r>
     </w:p>
-    <w:bookmarkEnd w:id="139"/>
-    <w:bookmarkStart w:id="141" w:name="ref-Nejjar2025"/>
+    <w:bookmarkEnd w:id="147"/>
+    <w:bookmarkStart w:id="149" w:name="ref-Nejjar2025"/>
     <w:p>
       <w:pPr>
         <w:pStyle w:val="Bibliography"/>
@@ -7231,7 +7504,7 @@
       <w:r>
         <w:t xml:space="preserve"> </w:t>
       </w:r>
-      <w:hyperlink r:id="rId140">
+      <w:hyperlink r:id="rId148">
         <w:r>
           <w:rPr>
             <w:rStyle w:val="Hyperlink"/>
@@ -7243,8 +7516,8 @@
         <w:t xml:space="preserve">.</w:t>
       </w:r>
     </w:p>
-    <w:bookmarkEnd w:id="141"/>
-    <w:bookmarkStart w:id="143" w:name="ref-Park2023"/>
+    <w:bookmarkEnd w:id="149"/>
+    <w:bookmarkStart w:id="151" w:name="ref-Park2023"/>
     <w:p>
       <w:pPr>
         <w:pStyle w:val="Bibliography"/>
@@ -7255,7 +7528,7 @@
       <w:r>
         <w:t xml:space="preserve"> </w:t>
       </w:r>
-      <w:hyperlink r:id="rId142">
+      <w:hyperlink r:id="rId150">
         <w:r>
           <w:rPr>
             <w:rStyle w:val="Hyperlink"/>
@@ -7267,8 +7540,8 @@
         <w:t xml:space="preserve">, pp. 1–22.</w:t>
       </w:r>
     </w:p>
-    <w:bookmarkEnd w:id="143"/>
-    <w:bookmarkStart w:id="145" w:name="ref-Piper2026"/>
+    <w:bookmarkEnd w:id="151"/>
+    <w:bookmarkStart w:id="153" w:name="ref-Piper2026"/>
     <w:p>
       <w:pPr>
         <w:pStyle w:val="Bibliography"/>
@@ -7295,7 +7568,7 @@
       <w:r>
         <w:t xml:space="preserve"> </w:t>
       </w:r>
-      <w:hyperlink r:id="rId144">
+      <w:hyperlink r:id="rId152">
         <w:r>
           <w:rPr>
             <w:rStyle w:val="Hyperlink"/>
@@ -7307,8 +7580,8 @@
         <w:t xml:space="preserve">.</w:t>
       </w:r>
     </w:p>
-    <w:bookmarkEnd w:id="145"/>
-    <w:bookmarkStart w:id="147" w:name="ref-QuartoDocs2026"/>
+    <w:bookmarkEnd w:id="153"/>
+    <w:bookmarkStart w:id="155" w:name="ref-QuartoDocs2026"/>
     <w:p>
       <w:pPr>
         <w:pStyle w:val="Bibliography"/>
@@ -7328,7 +7601,7 @@
       <w:r>
         <w:t xml:space="preserve"> </w:t>
       </w:r>
-      <w:hyperlink r:id="rId146">
+      <w:hyperlink r:id="rId154">
         <w:r>
           <w:rPr>
             <w:rStyle w:val="Hyperlink"/>
@@ -7340,8 +7613,8 @@
         <w:t xml:space="preserve">, accessed September 17, 2026.</w:t>
       </w:r>
     </w:p>
-    <w:bookmarkEnd w:id="147"/>
-    <w:bookmarkStart w:id="149" w:name="ref-Rafiee2025"/>
+    <w:bookmarkEnd w:id="155"/>
+    <w:bookmarkStart w:id="157" w:name="ref-Rafiee2025"/>
     <w:p>
       <w:pPr>
         <w:pStyle w:val="Bibliography"/>
@@ -7374,7 +7647,7 @@
       <w:r>
         <w:t xml:space="preserve"> </w:t>
       </w:r>
-      <w:hyperlink r:id="rId148">
+      <w:hyperlink r:id="rId156">
         <w:r>
           <w:rPr>
             <w:rStyle w:val="Hyperlink"/>
@@ -7386,8 +7659,8 @@
         <w:t xml:space="preserve">.</w:t>
       </w:r>
     </w:p>
-    <w:bookmarkEnd w:id="149"/>
-    <w:bookmarkStart w:id="151" w:name="ref-Scheepens2024"/>
+    <w:bookmarkEnd w:id="157"/>
+    <w:bookmarkStart w:id="159" w:name="ref-Scheepens2024"/>
     <w:p>
       <w:pPr>
         <w:pStyle w:val="Bibliography"/>
@@ -7426,7 +7699,7 @@
       <w:r>
         <w:t xml:space="preserve"> </w:t>
       </w:r>
-      <w:hyperlink r:id="rId150">
+      <w:hyperlink r:id="rId158">
         <w:r>
           <w:rPr>
             <w:rStyle w:val="Hyperlink"/>
@@ -7438,19 +7711,19 @@
         <w:t xml:space="preserve">.</w:t>
       </w:r>
     </w:p>
-    <w:bookmarkEnd w:id="151"/>
-    <w:bookmarkStart w:id="153" w:name="ref-Schick2023"/>
+    <w:bookmarkEnd w:id="159"/>
+    <w:bookmarkStart w:id="161" w:name="ref-Schick2023"/>
     <w:p>
       <w:pPr>
         <w:pStyle w:val="Bibliography"/>
       </w:pPr>
       <w:r>
-        <w:t xml:space="preserve">Schick, Timo, Jane Dwivedi-Yu, Roberto Dessi, Roberta Raileanu, Maria Lomeli, Eric Hambro, Luke Zettlemoyer, Nicola Cancedda, and Thomas Scialom. 2023.</w:t>
-      </w:r>
-      <w:r>
-        <w:t xml:space="preserve"> </w:t>
-      </w:r>
-      <w:hyperlink r:id="rId152">
+        <w:t xml:space="preserve">Schick, Timo, Jane Dwivedi-Yu, Roberto Dessi, Roberta Raileanu, Maria Lomeli, Eric Hambro, Luke Zettlemoyer, et al. 2023.</w:t>
+      </w:r>
+      <w:r>
+        <w:t xml:space="preserve"> </w:t>
+      </w:r>
+      <w:hyperlink r:id="rId160">
         <w:r>
           <w:rPr>
             <w:rStyle w:val="Hyperlink"/>
@@ -7462,8 +7735,8 @@
         <w:t xml:space="preserve">, pp. 68539–68551.</w:t>
       </w:r>
     </w:p>
-    <w:bookmarkEnd w:id="153"/>
-    <w:bookmarkStart w:id="155" w:name="ref-Schweinberger2026privacy"/>
+    <w:bookmarkEnd w:id="161"/>
+    <w:bookmarkStart w:id="163" w:name="ref-Schweinberger2026privacy"/>
     <w:p>
       <w:pPr>
         <w:pStyle w:val="Bibliography"/>
@@ -7492,7 +7765,7 @@
       <w:r>
         <w:t xml:space="preserve"> </w:t>
       </w:r>
-      <w:hyperlink r:id="rId154">
+      <w:hyperlink r:id="rId162">
         <w:r>
           <w:rPr>
             <w:rStyle w:val="Hyperlink"/>
@@ -7504,8 +7777,8 @@
         <w:t xml:space="preserve">, accessed September 18, 2026.</w:t>
       </w:r>
     </w:p>
-    <w:bookmarkEnd w:id="155"/>
-    <w:bookmarkStart w:id="157" w:name="ref-Shaikhon2025"/>
+    <w:bookmarkEnd w:id="163"/>
+    <w:bookmarkStart w:id="165" w:name="ref-Shaikhon2025"/>
     <w:p>
       <w:pPr>
         <w:pStyle w:val="Bibliography"/>
@@ -7532,7 +7805,7 @@
       <w:r>
         <w:t xml:space="preserve"> </w:t>
       </w:r>
-      <w:hyperlink r:id="rId156">
+      <w:hyperlink r:id="rId164">
         <w:r>
           <w:rPr>
             <w:rStyle w:val="Hyperlink"/>
@@ -7544,68 +7817,19 @@
         <w:t xml:space="preserve">.</w:t>
       </w:r>
     </w:p>
-    <w:bookmarkEnd w:id="157"/>
-    <w:bookmarkStart w:id="159" w:name="ref-Spillias2025"/>
+    <w:bookmarkEnd w:id="165"/>
+    <w:bookmarkStart w:id="167" w:name="ref-Taylor2023"/>
     <w:p>
       <w:pPr>
         <w:pStyle w:val="Bibliography"/>
       </w:pPr>
       <w:r>
-        <w:t xml:space="preserve">Spillias, Scott, Rowan Trebilco, Matthew P. Adams, Fabio Boschetti, Andrew Constable, Piers Dunstan, Simon Ferrier, et al. 2026.</w:t>
-      </w:r>
-      <w:r>
-        <w:t xml:space="preserve"> </w:t>
-      </w:r>
-      <w:r>
-        <w:t xml:space="preserve">The Future of Artificial Intelligence in Ecosystem Modeling</w:t>
-      </w:r>
-      <w:r>
-        <w:t xml:space="preserve">.</w:t>
-      </w:r>
-      <w:r>
-        <w:t xml:space="preserve"> </w:t>
-      </w:r>
-      <w:r>
-        <w:rPr>
-          <w:iCs/>
-          <w:i/>
-        </w:rPr>
-        <w:t xml:space="preserve">BioScience</w:t>
-      </w:r>
-      <w:r>
-        <w:t xml:space="preserve"> </w:t>
-      </w:r>
-      <w:r>
-        <w:t xml:space="preserve">76(1):57–70.</w:t>
-      </w:r>
-      <w:r>
-        <w:t xml:space="preserve"> </w:t>
-      </w:r>
-      <w:hyperlink r:id="rId158">
-        <w:r>
-          <w:rPr>
-            <w:rStyle w:val="Hyperlink"/>
-          </w:rPr>
-          <w:t xml:space="preserve">https://doi.org/10.1093/biosci/biaf169</w:t>
-        </w:r>
-      </w:hyperlink>
-      <w:r>
-        <w:t xml:space="preserve">.</w:t>
-      </w:r>
-    </w:p>
-    <w:bookmarkEnd w:id="159"/>
-    <w:bookmarkStart w:id="161" w:name="ref-Taylor2023"/>
-    <w:p>
-      <w:pPr>
-        <w:pStyle w:val="Bibliography"/>
-      </w:pPr>
-      <w:r>
         <w:t xml:space="preserve">Taylor, Matthew E. 2023.</w:t>
       </w:r>
       <w:r>
         <w:t xml:space="preserve"> </w:t>
       </w:r>
-      <w:hyperlink r:id="rId160">
+      <w:hyperlink r:id="rId166">
         <w:r>
           <w:rPr>
             <w:rStyle w:val="Hyperlink"/>
@@ -7654,8 +7878,8 @@
         <w:t xml:space="preserve">. IOS Press.</w:t>
       </w:r>
     </w:p>
-    <w:bookmarkEnd w:id="161"/>
-    <w:bookmarkStart w:id="163" w:name="ref-Tenzer2024"/>
+    <w:bookmarkEnd w:id="167"/>
+    <w:bookmarkStart w:id="169" w:name="ref-Tenzer2024"/>
     <w:p>
       <w:pPr>
         <w:pStyle w:val="Bibliography"/>
@@ -7691,7 +7915,7 @@
       <w:r>
         <w:t xml:space="preserve"> </w:t>
       </w:r>
-      <w:hyperlink r:id="rId162">
+      <w:hyperlink r:id="rId168">
         <w:r>
           <w:rPr>
             <w:rStyle w:val="Hyperlink"/>
@@ -7703,8 +7927,8 @@
         <w:t xml:space="preserve">.</w:t>
       </w:r>
     </w:p>
-    <w:bookmarkEnd w:id="163"/>
-    <w:bookmarkStart w:id="165" w:name="ref-RoyalSociety2024"/>
+    <w:bookmarkEnd w:id="169"/>
+    <w:bookmarkStart w:id="171" w:name="ref-RoyalSociety2024"/>
     <w:p>
       <w:pPr>
         <w:pStyle w:val="Bibliography"/>
@@ -7715,7 +7939,7 @@
       <w:r>
         <w:t xml:space="preserve"> </w:t>
       </w:r>
-      <w:hyperlink r:id="rId164">
+      <w:hyperlink r:id="rId170">
         <w:r>
           <w:rPr>
             <w:rStyle w:val="Hyperlink"/>
@@ -7833,8 +8057,8 @@
         <w:t xml:space="preserve">. The Royal Society, London.</w:t>
       </w:r>
     </w:p>
-    <w:bookmarkEnd w:id="165"/>
-    <w:bookmarkStart w:id="167" w:name="ref-Walters2023"/>
+    <w:bookmarkEnd w:id="171"/>
+    <w:bookmarkStart w:id="173" w:name="ref-Walters2023"/>
     <w:p>
       <w:pPr>
         <w:pStyle w:val="Bibliography"/>
@@ -7870,7 +8094,7 @@
       <w:r>
         <w:t xml:space="preserve"> </w:t>
       </w:r>
-      <w:hyperlink r:id="rId166">
+      <w:hyperlink r:id="rId172">
         <w:r>
           <w:rPr>
             <w:rStyle w:val="Hyperlink"/>
@@ -7882,8 +8106,8 @@
         <w:t xml:space="preserve">.</w:t>
       </w:r>
     </w:p>
-    <w:bookmarkEnd w:id="167"/>
-    <w:bookmarkStart w:id="169" w:name="ref-Wang2024"/>
+    <w:bookmarkEnd w:id="173"/>
+    <w:bookmarkStart w:id="175" w:name="ref-Wang2024"/>
     <w:p>
       <w:pPr>
         <w:pStyle w:val="Bibliography"/>
@@ -7919,7 +8143,7 @@
       <w:r>
         <w:t xml:space="preserve"> </w:t>
       </w:r>
-      <w:hyperlink r:id="rId168">
+      <w:hyperlink r:id="rId174">
         <w:r>
           <w:rPr>
             <w:rStyle w:val="Hyperlink"/>
@@ -7931,8 +8155,8 @@
         <w:t xml:space="preserve">.</w:t>
       </w:r>
     </w:p>
-    <w:bookmarkEnd w:id="169"/>
-    <w:bookmarkStart w:id="171" w:name="ref-Wickham2019"/>
+    <w:bookmarkEnd w:id="175"/>
+    <w:bookmarkStart w:id="177" w:name="ref-Wickham2019"/>
     <w:p>
       <w:pPr>
         <w:pStyle w:val="Bibliography"/>
@@ -7968,7 +8192,7 @@
       <w:r>
         <w:t xml:space="preserve"> </w:t>
       </w:r>
-      <w:hyperlink r:id="rId170">
+      <w:hyperlink r:id="rId176">
         <w:r>
           <w:rPr>
             <w:rStyle w:val="Hyperlink"/>
@@ -7980,8 +8204,8 @@
         <w:t xml:space="preserve">.</w:t>
       </w:r>
     </w:p>
-    <w:bookmarkEnd w:id="171"/>
-    <w:bookmarkStart w:id="173" w:name="ref-Wiest2024"/>
+    <w:bookmarkEnd w:id="177"/>
+    <w:bookmarkStart w:id="179" w:name="ref-Wiest2024"/>
     <w:p>
       <w:pPr>
         <w:pStyle w:val="Bibliography"/>
@@ -8017,7 +8241,7 @@
       <w:r>
         <w:t xml:space="preserve"> </w:t>
       </w:r>
-      <w:hyperlink r:id="rId172">
+      <w:hyperlink r:id="rId178">
         <w:r>
           <w:rPr>
             <w:rStyle w:val="Hyperlink"/>
@@ -8029,57 +8253,8 @@
         <w:t xml:space="preserve">.</w:t>
       </w:r>
     </w:p>
-    <w:bookmarkEnd w:id="173"/>
-    <w:bookmarkStart w:id="175" w:name="ref-Wilson2014"/>
-    <w:p>
-      <w:pPr>
-        <w:pStyle w:val="Bibliography"/>
-      </w:pPr>
-      <w:r>
-        <w:t xml:space="preserve">Wilson, Greg, D. A. Aruliah, C. Titus Brown, Neil P. Chue Hong, Matt Davis, Richard T. Guy, Steven H. D. Haddock, et al. 2014.</w:t>
-      </w:r>
-      <w:r>
-        <w:t xml:space="preserve"> </w:t>
-      </w:r>
-      <w:r>
-        <w:t xml:space="preserve">Best Practices for Scientific Computing</w:t>
-      </w:r>
-      <w:r>
-        <w:t xml:space="preserve">.</w:t>
-      </w:r>
-      <w:r>
-        <w:t xml:space="preserve"> </w:t>
-      </w:r>
-      <w:r>
-        <w:rPr>
-          <w:iCs/>
-          <w:i/>
-        </w:rPr>
-        <w:t xml:space="preserve">PLOS Biology</w:t>
-      </w:r>
-      <w:r>
-        <w:t xml:space="preserve"> </w:t>
-      </w:r>
-      <w:r>
-        <w:t xml:space="preserve">12(1):e1001745.</w:t>
-      </w:r>
-      <w:r>
-        <w:t xml:space="preserve"> </w:t>
-      </w:r>
-      <w:hyperlink r:id="rId174">
-        <w:r>
-          <w:rPr>
-            <w:rStyle w:val="Hyperlink"/>
-          </w:rPr>
-          <w:t xml:space="preserve">https://doi.org/10.1371/journal.pbio.1001745</w:t>
-        </w:r>
-      </w:hyperlink>
-      <w:r>
-        <w:t xml:space="preserve">.</w:t>
-      </w:r>
-    </w:p>
-    <w:bookmarkEnd w:id="175"/>
-    <w:bookmarkStart w:id="177" w:name="ref-Xu2026"/>
+    <w:bookmarkEnd w:id="179"/>
+    <w:bookmarkStart w:id="181" w:name="ref-Xu2026"/>
     <w:p>
       <w:pPr>
         <w:pStyle w:val="Bibliography"/>
@@ -8124,7 +8299,7 @@
       <w:r>
         <w:t xml:space="preserve"> </w:t>
       </w:r>
-      <w:hyperlink r:id="rId176">
+      <w:hyperlink r:id="rId180">
         <w:r>
           <w:rPr>
             <w:rStyle w:val="Hyperlink"/>
@@ -8136,8 +8311,8 @@
         <w:t xml:space="preserve">.</w:t>
       </w:r>
     </w:p>
-    <w:bookmarkEnd w:id="177"/>
-    <w:bookmarkStart w:id="179" w:name="ref-Xu2024"/>
+    <w:bookmarkEnd w:id="181"/>
+    <w:bookmarkStart w:id="183" w:name="ref-Xu2024"/>
     <w:p>
       <w:pPr>
         <w:pStyle w:val="Bibliography"/>
@@ -8173,7 +8348,7 @@
       <w:r>
         <w:t xml:space="preserve"> </w:t>
       </w:r>
-      <w:hyperlink r:id="rId178">
+      <w:hyperlink r:id="rId182">
         <w:r>
           <w:rPr>
             <w:rStyle w:val="Hyperlink"/>
@@ -8185,8 +8360,8 @@
         <w:t xml:space="preserve">.</w:t>
       </w:r>
     </w:p>
-    <w:bookmarkEnd w:id="179"/>
-    <w:bookmarkStart w:id="181" w:name="ref-ZamfirescuPereira2023"/>
+    <w:bookmarkEnd w:id="183"/>
+    <w:bookmarkStart w:id="185" w:name="ref-ZamfirescuPereira2023"/>
     <w:p>
       <w:pPr>
         <w:pStyle w:val="Bibliography"/>
@@ -8197,7 +8372,7 @@
       <w:r>
         <w:t xml:space="preserve"> </w:t>
       </w:r>
-      <w:hyperlink r:id="rId180">
+      <w:hyperlink r:id="rId184">
         <w:r>
           <w:rPr>
             <w:rStyle w:val="Hyperlink"/>
@@ -8209,8 +8384,8 @@
         <w:t xml:space="preserve">, New York, NY, USA.</w:t>
       </w:r>
     </w:p>
-    <w:bookmarkEnd w:id="181"/>
-    <w:bookmarkStart w:id="183" w:name="ref-Zanzotto2019"/>
+    <w:bookmarkEnd w:id="185"/>
+    <w:bookmarkStart w:id="187" w:name="ref-Zanzotto2019"/>
     <w:p>
       <w:pPr>
         <w:pStyle w:val="Bibliography"/>
@@ -8246,7 +8421,7 @@
       <w:r>
         <w:t xml:space="preserve"> </w:t>
       </w:r>
-      <w:hyperlink r:id="rId182">
+      <w:hyperlink r:id="rId186">
         <w:r>
           <w:rPr>
             <w:rStyle w:val="Hyperlink"/>
@@ -8258,8 +8433,8 @@
         <w:t xml:space="preserve">.</w:t>
       </w:r>
     </w:p>
-    <w:bookmarkEnd w:id="183"/>
-    <w:bookmarkStart w:id="185" w:name="ref-Zhang2025"/>
+    <w:bookmarkEnd w:id="187"/>
+    <w:bookmarkStart w:id="189" w:name="ref-Zhang2025"/>
     <w:p>
       <w:pPr>
         <w:pStyle w:val="Bibliography"/>
@@ -8295,7 +8470,7 @@
       <w:r>
         <w:t xml:space="preserve"> </w:t>
       </w:r>
-      <w:hyperlink r:id="rId184">
+      <w:hyperlink r:id="rId188">
         <w:r>
           <w:rPr>
             <w:rStyle w:val="Hyperlink"/>
@@ -8307,8 +8482,8 @@
         <w:t xml:space="preserve">.</w:t>
       </w:r>
     </w:p>
-    <w:bookmarkEnd w:id="185"/>
-    <w:bookmarkStart w:id="187" w:name="ref-Zheng2024"/>
+    <w:bookmarkEnd w:id="189"/>
+    <w:bookmarkStart w:id="191" w:name="ref-Zheng2024"/>
     <w:p>
       <w:pPr>
         <w:pStyle w:val="Bibliography"/>
@@ -8332,7 +8507,7 @@
       <w:r>
         <w:t xml:space="preserve"> </w:t>
       </w:r>
-      <w:hyperlink r:id="rId186">
+      <w:hyperlink r:id="rId190">
         <w:r>
           <w:rPr>
             <w:rStyle w:val="Hyperlink"/>
@@ -8344,8 +8519,8 @@
         <w:t xml:space="preserve">.</w:t>
       </w:r>
     </w:p>
-    <w:bookmarkEnd w:id="187"/>
-    <w:bookmarkStart w:id="189" w:name="ref-Ziems2024"/>
+    <w:bookmarkEnd w:id="191"/>
+    <w:bookmarkStart w:id="193" w:name="ref-Ziems2024"/>
     <w:p>
       <w:pPr>
         <w:pStyle w:val="Bibliography"/>
@@ -8372,7 +8547,7 @@
       <w:r>
         <w:t xml:space="preserve"> </w:t>
       </w:r>
-      <w:hyperlink r:id="rId188">
+      <w:hyperlink r:id="rId192">
         <w:r>
           <w:rPr>
             <w:rStyle w:val="Hyperlink"/>
@@ -8384,8 +8559,8 @@
         <w:t xml:space="preserve">.</w:t>
       </w:r>
     </w:p>
-    <w:bookmarkEnd w:id="189"/>
-    <w:bookmarkStart w:id="191" w:name="ref-Zimmer2026"/>
+    <w:bookmarkEnd w:id="193"/>
+    <w:bookmarkStart w:id="195" w:name="ref-Zimmer2026"/>
     <w:p>
       <w:pPr>
         <w:pStyle w:val="Bibliography"/>
@@ -8409,7 +8584,7 @@
       <w:r>
         <w:t xml:space="preserve"> </w:t>
       </w:r>
-      <w:hyperlink r:id="rId190">
+      <w:hyperlink r:id="rId194">
         <w:r>
           <w:rPr>
             <w:rStyle w:val="Hyperlink"/>
@@ -8421,780 +8596,9 @@
         <w:t xml:space="preserve">.</w:t>
       </w:r>
     </w:p>
-    <w:bookmarkEnd w:id="191"/>
-    <w:bookmarkEnd w:id="192"/>
-    <w:p>
-      <w:r>
-        <w:br w:type="page"/>
-      </w:r>
-    </w:p>
-    <w:bookmarkStart w:id="193" w:name="colophon"/>
-    <w:p>
-      <w:pPr>
-        <w:pStyle w:val="Heading3"/>
-      </w:pPr>
-      <w:r>
-        <w:t xml:space="preserve">Colophon</w:t>
-      </w:r>
-    </w:p>
-    <w:p>
-      <w:pPr>
-        <w:pStyle w:val="FirstParagraph"/>
-      </w:pPr>
-      <w:r>
-        <w:t xml:space="preserve">This report was generated on 2026-09-26 11:05:28.611636 using the following computational environment and dependencies:</w:t>
-      </w:r>
-    </w:p>
-    <w:p>
-      <w:pPr>
-        <w:pStyle w:val="SourceCode"/>
-      </w:pPr>
-      <w:r>
-        <w:rPr>
-          <w:rStyle w:val="CommentTok"/>
-        </w:rPr>
-        <w:t xml:space="preserve"># which R packages and versions?</w:t>
-      </w:r>
-      <w:r>
-        <w:br/>
-      </w:r>
-      <w:r>
-        <w:rPr>
-          <w:rStyle w:val="ControlFlowTok"/>
-        </w:rPr>
-        <w:t xml:space="preserve">if</w:t>
-      </w:r>
-      <w:r>
-        <w:rPr>
-          <w:rStyle w:val="NormalTok"/>
-        </w:rPr>
-        <w:t xml:space="preserve"> (</w:t>
-      </w:r>
-      <w:r>
-        <w:rPr>
-          <w:rStyle w:val="FunctionTok"/>
-        </w:rPr>
-        <w:t xml:space="preserve">requireNamespace</w:t>
-      </w:r>
-      <w:r>
-        <w:rPr>
-          <w:rStyle w:val="NormalTok"/>
-        </w:rPr>
-        <w:t xml:space="preserve">(</w:t>
-      </w:r>
-      <w:r>
-        <w:rPr>
-          <w:rStyle w:val="StringTok"/>
-        </w:rPr>
-        <w:t xml:space="preserve">"devtools"</w:t>
-      </w:r>
-      <w:r>
-        <w:rPr>
-          <w:rStyle w:val="NormalTok"/>
-        </w:rPr>
-        <w:t xml:space="preserve">, </w:t>
-      </w:r>
-      <w:r>
-        <w:rPr>
-          <w:rStyle w:val="AttributeTok"/>
-        </w:rPr>
-        <w:t xml:space="preserve">quietly =</w:t>
-      </w:r>
-      <w:r>
-        <w:rPr>
-          <w:rStyle w:val="NormalTok"/>
-        </w:rPr>
-        <w:t xml:space="preserve"> </w:t>
-      </w:r>
-      <w:r>
-        <w:rPr>
-          <w:rStyle w:val="ConstantTok"/>
-        </w:rPr>
-        <w:t xml:space="preserve">TRUE</w:t>
-      </w:r>
-      <w:r>
-        <w:rPr>
-          <w:rStyle w:val="NormalTok"/>
-        </w:rPr>
-        <w:t xml:space="preserve">)) devtools</w:t>
-      </w:r>
-      <w:r>
-        <w:rPr>
-          <w:rStyle w:val="SpecialCharTok"/>
-        </w:rPr>
-        <w:t xml:space="preserve">::</w:t>
-      </w:r>
-      <w:r>
-        <w:rPr>
-          <w:rStyle w:val="FunctionTok"/>
-        </w:rPr>
-        <w:t xml:space="preserve">session_info</w:t>
-      </w:r>
-      <w:r>
-        <w:rPr>
-          <w:rStyle w:val="NormalTok"/>
-        </w:rPr>
-        <w:t xml:space="preserve">()</w:t>
-      </w:r>
-    </w:p>
-    <w:p>
-      <w:pPr>
-        <w:pStyle w:val="SourceCode"/>
-      </w:pPr>
-      <w:r>
-        <w:rPr>
-          <w:rStyle w:val="VerbatimChar"/>
-        </w:rPr>
-        <w:t xml:space="preserve">─ Session info ───────────────────────────────────────────────────────────────</w:t>
-      </w:r>
-      <w:r>
-        <w:br/>
-      </w:r>
-      <w:r>
-        <w:rPr>
-          <w:rStyle w:val="VerbatimChar"/>
-        </w:rPr>
-        <w:t xml:space="preserve"> setting  value</w:t>
-      </w:r>
-      <w:r>
-        <w:br/>
-      </w:r>
-      <w:r>
-        <w:rPr>
-          <w:rStyle w:val="VerbatimChar"/>
-        </w:rPr>
-        <w:t xml:space="preserve"> version  R version 4.6.1 (2026-06-24)</w:t>
-      </w:r>
-      <w:r>
-        <w:br/>
-      </w:r>
-      <w:r>
-        <w:rPr>
-          <w:rStyle w:val="VerbatimChar"/>
-        </w:rPr>
-        <w:t xml:space="preserve"> os       macOS Ventura 13.3.1</w:t>
-      </w:r>
-      <w:r>
-        <w:br/>
-      </w:r>
-      <w:r>
-        <w:rPr>
-          <w:rStyle w:val="VerbatimChar"/>
-        </w:rPr>
-        <w:t xml:space="preserve"> system   aarch64, darwin23</w:t>
-      </w:r>
-      <w:r>
-        <w:br/>
-      </w:r>
-      <w:r>
-        <w:rPr>
-          <w:rStyle w:val="VerbatimChar"/>
-        </w:rPr>
-        <w:t xml:space="preserve"> ui       X11</w:t>
-      </w:r>
-      <w:r>
-        <w:br/>
-      </w:r>
-      <w:r>
-        <w:rPr>
-          <w:rStyle w:val="VerbatimChar"/>
-        </w:rPr>
-        <w:t xml:space="preserve"> language (EN)</w:t>
-      </w:r>
-      <w:r>
-        <w:br/>
-      </w:r>
-      <w:r>
-        <w:rPr>
-          <w:rStyle w:val="VerbatimChar"/>
-        </w:rPr>
-        <w:t xml:space="preserve"> collate  en_US.UTF-8</w:t>
-      </w:r>
-      <w:r>
-        <w:br/>
-      </w:r>
-      <w:r>
-        <w:rPr>
-          <w:rStyle w:val="VerbatimChar"/>
-        </w:rPr>
-        <w:t xml:space="preserve"> ctype    en_US.UTF-8</w:t>
-      </w:r>
-      <w:r>
-        <w:br/>
-      </w:r>
-      <w:r>
-        <w:rPr>
-          <w:rStyle w:val="VerbatimChar"/>
-        </w:rPr>
-        <w:t xml:space="preserve"> tz       America/Los_Angeles</w:t>
-      </w:r>
-      <w:r>
-        <w:br/>
-      </w:r>
-      <w:r>
-        <w:rPr>
-          <w:rStyle w:val="VerbatimChar"/>
-        </w:rPr>
-        <w:t xml:space="preserve"> date     2026-09-26</w:t>
-      </w:r>
-      <w:r>
-        <w:br/>
-      </w:r>
-      <w:r>
-        <w:rPr>
-          <w:rStyle w:val="VerbatimChar"/>
-        </w:rPr>
-        <w:t xml:space="preserve"> pandoc   3.10 @ /Applications/RStudio.app/Contents/Resources/app/quarto/bin/tools/aarch64/ (via rmarkdown)</w:t>
-      </w:r>
-      <w:r>
-        <w:br/>
-      </w:r>
-      <w:r>
-        <w:rPr>
-          <w:rStyle w:val="VerbatimChar"/>
-        </w:rPr>
-        <w:t xml:space="preserve"> quarto   1.4.549 @ /usr/local/bin/quarto</w:t>
-      </w:r>
-      <w:r>
-        <w:br/>
-      </w:r>
-      <w:r>
-        <w:br/>
-      </w:r>
-      <w:r>
-        <w:rPr>
-          <w:rStyle w:val="VerbatimChar"/>
-        </w:rPr>
-        <w:t xml:space="preserve">─ Packages ───────────────────────────────────────────────────────────────────</w:t>
-      </w:r>
-      <w:r>
-        <w:br/>
-      </w:r>
-      <w:r>
-        <w:rPr>
-          <w:rStyle w:val="VerbatimChar"/>
-        </w:rPr>
-        <w:t xml:space="preserve"> ! package     * version date (UTC) lib source</w:t>
-      </w:r>
-      <w:r>
-        <w:br/>
-      </w:r>
-      <w:r>
-        <w:rPr>
-          <w:rStyle w:val="VerbatimChar"/>
-        </w:rPr>
-        <w:t xml:space="preserve"> P cachem        1.1.0   2024-05-16 [?] RSPM</w:t>
-      </w:r>
-      <w:r>
-        <w:br/>
-      </w:r>
-      <w:r>
-        <w:rPr>
-          <w:rStyle w:val="VerbatimChar"/>
-        </w:rPr>
-        <w:t xml:space="preserve"> P cli           3.6.6   2026-04-09 [?] RSPM</w:t>
-      </w:r>
-      <w:r>
-        <w:br/>
-      </w:r>
-      <w:r>
-        <w:rPr>
-          <w:rStyle w:val="VerbatimChar"/>
-        </w:rPr>
-        <w:t xml:space="preserve"> P devtools      2.5.2   2026-04-30 [?] RSPM</w:t>
-      </w:r>
-      <w:r>
-        <w:br/>
-      </w:r>
-      <w:r>
-        <w:rPr>
-          <w:rStyle w:val="VerbatimChar"/>
-        </w:rPr>
-        <w:t xml:space="preserve"> P digest        0.6.39  2025-11-19 [?] RSPM</w:t>
-      </w:r>
-      <w:r>
-        <w:br/>
-      </w:r>
-      <w:r>
-        <w:rPr>
-          <w:rStyle w:val="VerbatimChar"/>
-        </w:rPr>
-        <w:t xml:space="preserve"> P ellipsis      0.3.3   2026-04-04 [?] RSPM</w:t>
-      </w:r>
-      <w:r>
-        <w:br/>
-      </w:r>
-      <w:r>
-        <w:rPr>
-          <w:rStyle w:val="VerbatimChar"/>
-        </w:rPr>
-        <w:t xml:space="preserve"> P evaluate      1.0.5   2025-08-27 [?] RSPM</w:t>
-      </w:r>
-      <w:r>
-        <w:br/>
-      </w:r>
-      <w:r>
-        <w:rPr>
-          <w:rStyle w:val="VerbatimChar"/>
-        </w:rPr>
-        <w:t xml:space="preserve"> P fastmap       1.2.0   2024-05-15 [?] RSPM</w:t>
-      </w:r>
-      <w:r>
-        <w:br/>
-      </w:r>
-      <w:r>
-        <w:rPr>
-          <w:rStyle w:val="VerbatimChar"/>
-        </w:rPr>
-        <w:t xml:space="preserve"> P fs            2.1.0   2026-04-18 [?] RSPM</w:t>
-      </w:r>
-      <w:r>
-        <w:br/>
-      </w:r>
-      <w:r>
-        <w:rPr>
-          <w:rStyle w:val="VerbatimChar"/>
-        </w:rPr>
-        <w:t xml:space="preserve"> P glue          1.8.1   2026-04-17 [?] RSPM</w:t>
-      </w:r>
-      <w:r>
-        <w:br/>
-      </w:r>
-      <w:r>
-        <w:rPr>
-          <w:rStyle w:val="VerbatimChar"/>
-        </w:rPr>
-        <w:t xml:space="preserve"> P here          1.0.2   2025-09-15 [?] RSPM</w:t>
-      </w:r>
-      <w:r>
-        <w:br/>
-      </w:r>
-      <w:r>
-        <w:rPr>
-          <w:rStyle w:val="VerbatimChar"/>
-        </w:rPr>
-        <w:t xml:space="preserve"> P htmltools     0.5.9   2025-12-04 [?] RSPM</w:t>
-      </w:r>
-      <w:r>
-        <w:br/>
-      </w:r>
-      <w:r>
-        <w:rPr>
-          <w:rStyle w:val="VerbatimChar"/>
-        </w:rPr>
-        <w:t xml:space="preserve"> P jsonlite      2.0.0   2025-03-27 [?] RSPM</w:t>
-      </w:r>
-      <w:r>
-        <w:br/>
-      </w:r>
-      <w:r>
-        <w:rPr>
-          <w:rStyle w:val="VerbatimChar"/>
-        </w:rPr>
-        <w:t xml:space="preserve"> P knitr         1.52    2026-09-06 [?] RSPM</w:t>
-      </w:r>
-      <w:r>
-        <w:br/>
-      </w:r>
-      <w:r>
-        <w:rPr>
-          <w:rStyle w:val="VerbatimChar"/>
-        </w:rPr>
-        <w:t xml:space="preserve"> P lifecycle     1.0.5   2026-01-08 [?] RSPM</w:t>
-      </w:r>
-      <w:r>
-        <w:br/>
-      </w:r>
-      <w:r>
-        <w:rPr>
-          <w:rStyle w:val="VerbatimChar"/>
-        </w:rPr>
-        <w:t xml:space="preserve"> P magrittr      2.0.5   2026-04-04 [?] RSPM</w:t>
-      </w:r>
-      <w:r>
-        <w:br/>
-      </w:r>
-      <w:r>
-        <w:rPr>
-          <w:rStyle w:val="VerbatimChar"/>
-        </w:rPr>
-        <w:t xml:space="preserve"> P memoise       2.0.1   2021-11-26 [?] RSPM</w:t>
-      </w:r>
-      <w:r>
-        <w:br/>
-      </w:r>
-      <w:r>
-        <w:rPr>
-          <w:rStyle w:val="VerbatimChar"/>
-        </w:rPr>
-        <w:t xml:space="preserve"> P otel          0.2.0   2025-08-29 [?] RSPM</w:t>
-      </w:r>
-      <w:r>
-        <w:br/>
-      </w:r>
-      <w:r>
-        <w:rPr>
-          <w:rStyle w:val="VerbatimChar"/>
-        </w:rPr>
-        <w:t xml:space="preserve"> P pkgbuild      1.4.8   2025-05-26 [?] RSPM</w:t>
-      </w:r>
-      <w:r>
-        <w:br/>
-      </w:r>
-      <w:r>
-        <w:rPr>
-          <w:rStyle w:val="VerbatimChar"/>
-        </w:rPr>
-        <w:t xml:space="preserve"> P pkgload       1.5.3   2026-06-15 [?] RSPM</w:t>
-      </w:r>
-      <w:r>
-        <w:br/>
-      </w:r>
-      <w:r>
-        <w:rPr>
-          <w:rStyle w:val="VerbatimChar"/>
-        </w:rPr>
-        <w:t xml:space="preserve"> P purrr         1.2.2   2026-04-10 [?] RSPM</w:t>
-      </w:r>
-      <w:r>
-        <w:br/>
-      </w:r>
-      <w:r>
-        <w:rPr>
-          <w:rStyle w:val="VerbatimChar"/>
-        </w:rPr>
-        <w:t xml:space="preserve"> P R6            2.6.1   2025-02-15 [?] RSPM</w:t>
-      </w:r>
-      <w:r>
-        <w:br/>
-      </w:r>
-      <w:r>
-        <w:rPr>
-          <w:rStyle w:val="VerbatimChar"/>
-        </w:rPr>
-        <w:t xml:space="preserve"> P rlang         1.3.0   2026-07-05 [?] RSPM</w:t>
-      </w:r>
-      <w:r>
-        <w:br/>
-      </w:r>
-      <w:r>
-        <w:rPr>
-          <w:rStyle w:val="VerbatimChar"/>
-        </w:rPr>
-        <w:t xml:space="preserve"> P rmarkdown     2.32    2026-09-01 [?] CRAN (R 4.6.1)</w:t>
-      </w:r>
-      <w:r>
-        <w:br/>
-      </w:r>
-      <w:r>
-        <w:rPr>
-          <w:rStyle w:val="VerbatimChar"/>
-        </w:rPr>
-        <w:t xml:space="preserve"> P rprojroot     2.1.1   2025-08-26 [?] RSPM</w:t>
-      </w:r>
-      <w:r>
-        <w:br/>
-      </w:r>
-      <w:r>
-        <w:rPr>
-          <w:rStyle w:val="VerbatimChar"/>
-        </w:rPr>
-        <w:t xml:space="preserve"> P rstudioapi    0.19.0  2026-06-11 [?] RSPM</w:t>
-      </w:r>
-      <w:r>
-        <w:br/>
-      </w:r>
-      <w:r>
-        <w:rPr>
-          <w:rStyle w:val="VerbatimChar"/>
-        </w:rPr>
-        <w:t xml:space="preserve"> P sessioninfo   1.2.4   2026-06-04 [?] RSPM</w:t>
-      </w:r>
-      <w:r>
-        <w:br/>
-      </w:r>
-      <w:r>
-        <w:rPr>
-          <w:rStyle w:val="VerbatimChar"/>
-        </w:rPr>
-        <w:t xml:space="preserve"> P usethis       3.2.2   2026-09-10 [?] RSPM</w:t>
-      </w:r>
-      <w:r>
-        <w:br/>
-      </w:r>
-      <w:r>
-        <w:rPr>
-          <w:rStyle w:val="VerbatimChar"/>
-        </w:rPr>
-        <w:t xml:space="preserve"> P vctrs         0.7.3   2026-04-11 [?] RSPM</w:t>
-      </w:r>
-      <w:r>
-        <w:br/>
-      </w:r>
-      <w:r>
-        <w:rPr>
-          <w:rStyle w:val="VerbatimChar"/>
-        </w:rPr>
-        <w:t xml:space="preserve"> P xfun          0.61    2026-09-16 [?] RSPM</w:t>
-      </w:r>
-      <w:r>
-        <w:br/>
-      </w:r>
-      <w:r>
-        <w:rPr>
-          <w:rStyle w:val="VerbatimChar"/>
-        </w:rPr>
-        <w:t xml:space="preserve"> P yaml          2.3.12  2025-12-10 [?] RSPM</w:t>
-      </w:r>
-      <w:r>
-        <w:br/>
-      </w:r>
-      <w:r>
-        <w:br/>
-      </w:r>
-      <w:r>
-        <w:rPr>
-          <w:rStyle w:val="VerbatimChar"/>
-        </w:rPr>
-        <w:t xml:space="preserve"> [1] /Users/bmarwick/Library/Caches/org.R-project.R/R/renv/library/agentic-ai-for-archaeology-d51787bc/macos/R-4.6/aarch64-apple-darwin23</w:t>
-      </w:r>
-      <w:r>
-        <w:br/>
-      </w:r>
-      <w:r>
-        <w:rPr>
-          <w:rStyle w:val="VerbatimChar"/>
-        </w:rPr>
-        <w:t xml:space="preserve"> [2] /Library/Frameworks/R.framework/Versions/4.6/Resources/library</w:t>
-      </w:r>
-      <w:r>
-        <w:br/>
-      </w:r>
-      <w:r>
-        <w:br/>
-      </w:r>
-      <w:r>
-        <w:rPr>
-          <w:rStyle w:val="VerbatimChar"/>
-        </w:rPr>
-        <w:t xml:space="preserve"> P ── Loaded and on-disk path mismatch.</w:t>
-      </w:r>
-      <w:r>
-        <w:br/>
-      </w:r>
-      <w:r>
-        <w:br/>
-      </w:r>
-      <w:r>
-        <w:rPr>
-          <w:rStyle w:val="VerbatimChar"/>
-        </w:rPr>
-        <w:t xml:space="preserve">──────────────────────────────────────────────────────────────────────────────</w:t>
-      </w:r>
-    </w:p>
-    <w:p>
-      <w:pPr>
-        <w:pStyle w:val="FirstParagraph"/>
-      </w:pPr>
-      <w:r>
-        <w:t xml:space="preserve">The current Git commit details are:</w:t>
-      </w:r>
-    </w:p>
-    <w:p>
-      <w:pPr>
-        <w:pStyle w:val="SourceCode"/>
-      </w:pPr>
-      <w:r>
-        <w:rPr>
-          <w:rStyle w:val="CommentTok"/>
-        </w:rPr>
-        <w:t xml:space="preserve"># what commit is this file at? </w:t>
-      </w:r>
-      <w:r>
-        <w:br/>
-      </w:r>
-      <w:r>
-        <w:rPr>
-          <w:rStyle w:val="ControlFlowTok"/>
-        </w:rPr>
-        <w:t xml:space="preserve">if</w:t>
-      </w:r>
-      <w:r>
-        <w:rPr>
-          <w:rStyle w:val="NormalTok"/>
-        </w:rPr>
-        <w:t xml:space="preserve"> (</w:t>
-      </w:r>
-      <w:r>
-        <w:rPr>
-          <w:rStyle w:val="FunctionTok"/>
-        </w:rPr>
-        <w:t xml:space="preserve">requireNamespace</w:t>
-      </w:r>
-      <w:r>
-        <w:rPr>
-          <w:rStyle w:val="NormalTok"/>
-        </w:rPr>
-        <w:t xml:space="preserve">(</w:t>
-      </w:r>
-      <w:r>
-        <w:rPr>
-          <w:rStyle w:val="StringTok"/>
-        </w:rPr>
-        <w:t xml:space="preserve">"git2r"</w:t>
-      </w:r>
-      <w:r>
-        <w:rPr>
-          <w:rStyle w:val="NormalTok"/>
-        </w:rPr>
-        <w:t xml:space="preserve">, </w:t>
-      </w:r>
-      <w:r>
-        <w:rPr>
-          <w:rStyle w:val="AttributeTok"/>
-        </w:rPr>
-        <w:t xml:space="preserve">quietly =</w:t>
-      </w:r>
-      <w:r>
-        <w:rPr>
-          <w:rStyle w:val="NormalTok"/>
-        </w:rPr>
-        <w:t xml:space="preserve"> </w:t>
-      </w:r>
-      <w:r>
-        <w:rPr>
-          <w:rStyle w:val="ConstantTok"/>
-        </w:rPr>
-        <w:t xml:space="preserve">TRUE</w:t>
-      </w:r>
-      <w:r>
-        <w:rPr>
-          <w:rStyle w:val="NormalTok"/>
-        </w:rPr>
-        <w:t xml:space="preserve">) </w:t>
-      </w:r>
-      <w:r>
-        <w:rPr>
-          <w:rStyle w:val="SpecialCharTok"/>
-        </w:rPr>
-        <w:t xml:space="preserve">&amp;&amp;</w:t>
-      </w:r>
-      <w:r>
-        <w:rPr>
-          <w:rStyle w:val="NormalTok"/>
-        </w:rPr>
-        <w:t xml:space="preserve"> git2r</w:t>
-      </w:r>
-      <w:r>
-        <w:rPr>
-          <w:rStyle w:val="SpecialCharTok"/>
-        </w:rPr>
-        <w:t xml:space="preserve">::</w:t>
-      </w:r>
-      <w:r>
-        <w:rPr>
-          <w:rStyle w:val="FunctionTok"/>
-        </w:rPr>
-        <w:t xml:space="preserve">in_repository</w:t>
-      </w:r>
-      <w:r>
-        <w:rPr>
-          <w:rStyle w:val="NormalTok"/>
-        </w:rPr>
-        <w:t xml:space="preserve">(</w:t>
-      </w:r>
-      <w:r>
-        <w:rPr>
-          <w:rStyle w:val="AttributeTok"/>
-        </w:rPr>
-        <w:t xml:space="preserve">path =</w:t>
-      </w:r>
-      <w:r>
-        <w:rPr>
-          <w:rStyle w:val="NormalTok"/>
-        </w:rPr>
-        <w:t xml:space="preserve"> </w:t>
-      </w:r>
-      <w:r>
-        <w:rPr>
-          <w:rStyle w:val="StringTok"/>
-        </w:rPr>
-        <w:t xml:space="preserve">"."</w:t>
-      </w:r>
-      <w:r>
-        <w:rPr>
-          <w:rStyle w:val="NormalTok"/>
-        </w:rPr>
-        <w:t xml:space="preserve">)) git2r</w:t>
-      </w:r>
-      <w:r>
-        <w:rPr>
-          <w:rStyle w:val="SpecialCharTok"/>
-        </w:rPr>
-        <w:t xml:space="preserve">::</w:t>
-      </w:r>
-      <w:r>
-        <w:rPr>
-          <w:rStyle w:val="FunctionTok"/>
-        </w:rPr>
-        <w:t xml:space="preserve">repository</w:t>
-      </w:r>
-      <w:r>
-        <w:rPr>
-          <w:rStyle w:val="NormalTok"/>
-        </w:rPr>
-        <w:t xml:space="preserve">(here</w:t>
-      </w:r>
-      <w:r>
-        <w:rPr>
-          <w:rStyle w:val="SpecialCharTok"/>
-        </w:rPr>
-        <w:t xml:space="preserve">::</w:t>
-      </w:r>
-      <w:r>
-        <w:rPr>
-          <w:rStyle w:val="FunctionTok"/>
-        </w:rPr>
-        <w:t xml:space="preserve">here</w:t>
-      </w:r>
-      <w:r>
-        <w:rPr>
-          <w:rStyle w:val="NormalTok"/>
-        </w:rPr>
-        <w:t xml:space="preserve">())  </w:t>
-      </w:r>
-    </w:p>
-    <w:p>
-      <w:pPr>
-        <w:pStyle w:val="SourceCode"/>
-      </w:pPr>
-      <w:r>
-        <w:rPr>
-          <w:rStyle w:val="VerbatimChar"/>
-        </w:rPr>
-        <w:t xml:space="preserve">Local:    main /Users/bmarwick/Downloads/agentic-ai-for-archaeology</w:t>
-      </w:r>
-      <w:r>
-        <w:br/>
-      </w:r>
-      <w:r>
-        <w:rPr>
-          <w:rStyle w:val="VerbatimChar"/>
-        </w:rPr>
-        <w:t xml:space="preserve">Remote:   main @ origin (https://github.com/benmarwick/agenticai.git)</w:t>
-      </w:r>
-      <w:r>
-        <w:br/>
-      </w:r>
-      <w:r>
-        <w:rPr>
-          <w:rStyle w:val="VerbatimChar"/>
-        </w:rPr>
-        <w:t xml:space="preserve">Head:     [1912977] 2026-09-26: table captions</w:t>
-      </w:r>
-    </w:p>
-    <w:bookmarkEnd w:id="193"/>
-    <w:bookmarkEnd w:id="194"/>
+    <w:bookmarkEnd w:id="195"/>
+    <w:bookmarkEnd w:id="196"/>
+    <w:bookmarkEnd w:id="197"/>
     <w:sectPr>
       <w:footnotePr>
         <w:numRestart w:val="eachSect"/>

</xml_diff>

<commit_message>
minor edits to text and table
</commit_message>
<xml_diff>
--- a/analysis/paper/paper.docx
+++ b/analysis/paper/paper.docx
@@ -75,7 +75,7 @@
         <w:t xml:space="preserve"> </w:t>
       </w:r>
       <w:r>
-        <w:t xml:space="preserve">26,</w:t>
+        <w:t xml:space="preserve">27,</w:t>
       </w:r>
       <w:r>
         <w:t xml:space="preserve"> </w:t>
@@ -2663,7 +2663,16 @@
         </w:r>
       </w:hyperlink>
       <w:r>
-        <w:t xml:space="preserve">). At the time of writing widely used harnesses include Claude Code, GitHub Copilot, OpenAI Codex and OpenCode. We recommend the OpenCode terminal user interface (running in the terminal pane of an integrated development environment such as RStudio or VS Code) because it is free, open source, and not tied to any model vendor</w:t>
+        <w:t xml:space="preserve">). At the time of writing widely used harnesses include Claude Code</w:t>
+      </w:r>
+      <w:r>
+        <w:t xml:space="preserve"> </w:t>
+      </w:r>
+      <w:r>
+        <w:t xml:space="preserve">(Liu et al. 2026)</w:t>
+      </w:r>
+      <w:r>
+        <w:t xml:space="preserve">, GitHub Copilot, OpenAI Codex and OpenCode. We recommend the OpenCode terminal user interface (running in the terminal pane of an integrated development environment such as RStudio or VS Code) because it is free, open source, and not tied to any model vendor</w:t>
       </w:r>
       <w:r>
         <w:t xml:space="preserve"> </w:t>
@@ -3016,7 +3025,34 @@
               <w:pStyle w:val="ImageCaption"/>
             </w:pPr>
             <w:r>
-              <w:t xml:space="preserve">Figure 1: Schematic illustration of an AI-assisted data analysis enviroment. The entire frame incapsulated in an Integrated Development Environment, such as RStudio or VS Code. On the left side is a Quarto document where we can see headings, lines of narrative text, an R code block, and a data visualisation. We can see the AI agent is active in the R code block. The human researcher is active in the narrative text. On the right side is the AI agent harness, for example OpenCode. We can see there are three agents active, agent 1 is operating in plan mode (so it cannot modify any file). Its scope of activities is limited to the current project’s working directory (which includes an AGENTS.md file). It has replied with some text and is now presenting a set of options to the researcher to choose from. At the bottom of the harness is the box to type prompts to the model, and below that text that indicates what model is currently in use, and how much the model has been used in the current session.</w:t>
+              <w:t xml:space="preserve">Figure 1: Schematic illustration of a typical human-at-the-heml data analysis enviroment that includes agentic AI. The entire frame incapsulated in an Integrated Development Environment, such as RStudio or VS Code. On the left side is a Quarto document where we can see headings (</w:t>
+            </w:r>
+            <w:r>
+              <w:t xml:space="preserve">‘</w:t>
+            </w:r>
+            <w:r>
+              <w:t xml:space="preserve">Exploring the data</w:t>
+            </w:r>
+            <w:r>
+              <w:t xml:space="preserve">’</w:t>
+            </w:r>
+            <w:r>
+              <w:t xml:space="preserve">,</w:t>
+            </w:r>
+            <w:r>
+              <w:t xml:space="preserve"> </w:t>
+            </w:r>
+            <w:r>
+              <w:t xml:space="preserve">‘</w:t>
+            </w:r>
+            <w:r>
+              <w:t xml:space="preserve">Results</w:t>
+            </w:r>
+            <w:r>
+              <w:t xml:space="preserve">’</w:t>
+            </w:r>
+            <w:r>
+              <w:t xml:space="preserve">), lines of narrative text, an R code block, and a data visualisation. We can see the AI agent is active in the R code block. The human researcher is active in the narrative text. On the right side is the AI agent’s harness, for example, OpenCode. We can see there are three agents active, agent 1 is operating in plan mode (so it cannot modify any file). Its scope of activities is limited to the current project’s working directory (which includes a project-level AGENTS.md file and a git repository for tracking changes). The agent has replied with some text and is now presenting a set of options to the researcher to choose from. At the bottom of the harness is the box to type prompts to the model, and below that text that indicates what model is currently in use, and how much the model has been used in the current session.</w:t>
             </w:r>
           </w:p>
           <w:bookmarkEnd w:id="28"/>
@@ -3140,7 +3176,7 @@
         <w:pStyle w:val="BodyText"/>
       </w:pPr>
       <w:r>
-        <w:t xml:space="preserve">Planning an analysis with a LLM can be effective when using a state-of-the-art, reasoning-enabled large frontier model because these are often better at the long-horizon, open-ended, branching tasks involved in drafting a plan</w:t>
+        <w:t xml:space="preserve">Planning an analysis with a LLM works best with a state-of-the-art, reasoning-enabled large frontier model because these are often better at the long-horizon, open-ended, branching tasks involved in drafting a plan</w:t>
       </w:r>
       <w:r>
         <w:t xml:space="preserve"> </w:t>
@@ -3480,7 +3516,7 @@
         <w:pStyle w:val="FirstParagraph"/>
       </w:pPr>
       <w:r>
-        <w:t xml:space="preserve">With the harness configured, working with an AI to generate plans and analyse data is more efficient by using tools, skills and Model Context Protocols (MCPs) to do common research tasks such as search for and verify references, write and run code, organise and manage files, and simulate peer review. A tool performs a single computer action and returns a result, such as reading, editing and renaming a file, or starting R and running R code. A skill is a simple markdown file of metadata and instructions and supporting resources for a recurring task</w:t>
+        <w:t xml:space="preserve">With the harness configured, working with an AI to generate plans and analyse data is more efficient by using tools, skills and Model Context Protocols (MCPs) to do common research tasks such as search for and verify references, write and run code, organise and manage files, and simulate peer review. A tool performs a single computer action and returns a result, such as reading, editing and renaming a file, or running R code. A skill is a simple markdown file of metadata and instructions and supporting resources for a recurring task</w:t>
       </w:r>
       <w:r>
         <w:t xml:space="preserve"> </w:t>
@@ -3489,7 +3525,7 @@
         <w:t xml:space="preserve">(Xu and Yan 2026)</w:t>
       </w:r>
       <w:r>
-        <w:t xml:space="preserve">. The agent reads the full skill file when a task contains words that matches the metadata, and the skill file contents is sent to the model as part of the prompt. For example, we have a skill file for the tidyverse idiom of the R language. When we ask for R code, the harness loads that file into the context and sends it to the model along with the rest of the prompt, and the output follows those conventions. MCP is an open source standard for connecting an agent to external data sources and services; they can also provide specialist tools</w:t>
+        <w:t xml:space="preserve">. The agent reads the full skill file when a task contains words that matches the metadata, and the skill file’s contents are sent to the model as part of the prompt. For example, we have a skill file for the tidyverse idiom of the R language. When we ask for R code, the harness loads that file into the context and sends it to the model along with the rest of the prompt, and the output follows those conventions. MCP is an open source standard for connecting an agent to external data sources and services; they can also provide specialist tools</w:t>
       </w:r>
       <w:r>
         <w:t xml:space="preserve"> </w:t>
@@ -3515,7 +3551,7 @@
         <w:t xml:space="preserve"> </w:t>
       </w:r>
       <w:r>
-        <w:t xml:space="preserve">lists the MCP servers and skills named in this guide plus the instructions files that govern them. These are open formats so you can work with your agent to write new skills and MCP servers to meet the needs of your specific project.</w:t>
+        <w:t xml:space="preserve">lists the MCP servers and skills named in this guide plus the instructions files that govern them. These are open formats so you can work with your agent to write new skills and MCP servers to meet the needs of your specific projects.</w:t>
       </w:r>
     </w:p>
     <w:tbl>
@@ -3543,7 +3579,7 @@
               <w:pStyle w:val="ImageCaption"/>
             </w:pPr>
             <w:r>
-              <w:t xml:space="preserve">Table 5: MCP servers and skills installed in the author’s OpenCode configuration. Note that this is an area of rapid change. Readers can copy-paste this table into their AI agent and ask it to install them for global availability.</w:t>
+              <w:t xml:space="preserve">Table 5: Instructions, MCP servers and skills installed in the our OpenCode configuration that we have found useful for assistence with routine research tasks. Readers can copy-paste this table into their AI agent and ask it to install the skills and MCP servers for global availability across their projects. This list is a snapshot of a fast-moving field: some of these projects may disappear, and better ones may soon replace them. Ask your AI agent to search for the current state-of-the-art skills and MCP servers for your specific purpose.</w:t>
             </w:r>
           </w:p>
           <w:tbl>
@@ -3555,10 +3591,10 @@
               <w:tblLayout w:type="fixed"/>
             </w:tblPr>
             <w:tblGrid>
-              <w:gridCol w:w="339"/>
-              <w:gridCol w:w="705"/>
-              <w:gridCol w:w="5227"/>
-              <w:gridCol w:w="1646"/>
+              <w:gridCol w:w="363"/>
+              <w:gridCol w:w="755"/>
+              <w:gridCol w:w="5037"/>
+              <w:gridCol w:w="1763"/>
             </w:tblGrid>
             <w:tr>
               <w:trPr>
@@ -4031,7 +4067,7 @@
                     <w:jc w:val="center"/>
                   </w:pPr>
                   <w:r>
-                    <w:t xml:space="preserve">Suite of eleven skills that reviews a manuscript in progress by checking its claims, code, math, experiments, references and visual layout, then renders every finding into one interactive HTML report</w:t>
+                    <w:t xml:space="preserve">Suite of skills that reviews a manuscript in progress by checking its claims, code, math, references and visual layout, then renders every finding into one interactive HTML report</w:t>
                   </w:r>
                 </w:p>
               </w:tc>
@@ -4051,6 +4087,66 @@
                   </w:r>
                   <w:r>
                     <w:t xml:space="preserve">Lin et al. (2026)</w:t>
+                  </w:r>
+                </w:p>
+              </w:tc>
+            </w:tr>
+            <w:tr>
+              <w:tc>
+                <w:tcPr/>
+                <w:p>
+                  <w:pPr>
+                    <w:pStyle w:val="Compact"/>
+                    <w:jc w:val="left"/>
+                    <w:jc w:val="center"/>
+                  </w:pPr>
+                  <w:r>
+                    <w:t xml:space="preserve">Skill</w:t>
+                  </w:r>
+                </w:p>
+              </w:tc>
+              <w:tc>
+                <w:tcPr/>
+                <w:p>
+                  <w:pPr>
+                    <w:pStyle w:val="Compact"/>
+                    <w:jc w:val="left"/>
+                    <w:jc w:val="center"/>
+                  </w:pPr>
+                  <w:r>
+                    <w:t xml:space="preserve">open-scholar-skill</w:t>
+                  </w:r>
+                </w:p>
+              </w:tc>
+              <w:tc>
+                <w:tcPr/>
+                <w:p>
+                  <w:pPr>
+                    <w:pStyle w:val="Compact"/>
+                    <w:jc w:val="left"/>
+                    <w:jc w:val="center"/>
+                  </w:pPr>
+                  <w:r>
+                    <w:t xml:space="preserve">Suite of skills for assisting with social science research through a pipeline of verification gates, e.g. idea generation, theory exploration, study design, analysis, ethics, etc</w:t>
+                  </w:r>
+                </w:p>
+              </w:tc>
+              <w:tc>
+                <w:tcPr/>
+                <w:p>
+                  <w:pPr>
+                    <w:pStyle w:val="Compact"/>
+                    <w:jc w:val="left"/>
+                    <w:jc w:val="center"/>
+                  </w:pPr>
+                  <w:r>
+                    <w:t xml:space="preserve">https://github.com/joshzyj/open-scholar-skill,</w:t>
+                  </w:r>
+                  <w:r>
+                    <w:t xml:space="preserve"> </w:t>
+                  </w:r>
+                  <w:r>
+                    <w:t xml:space="preserve">Zhang (2026)</w:t>
                   </w:r>
                 </w:p>
               </w:tc>
@@ -4440,7 +4536,7 @@
         <w:t xml:space="preserve"> </w:t>
       </w:r>
       <w:r>
-        <w:t xml:space="preserve">fetch scholarly papers while verification tools check each citation against publication databases through a reference-verification server. The literature search and verification tools are provided by the refcheck MCP server; they query Crossref and Semantic Scholar. The agent can then write the results of the literature search into your project-level bibtex file or to your Zotero library for reuse across multiple projects. Skills guides the agent but cannot force compliance, so you need to review the completeness and accuracy of results before incorporating them into your work. Automated pre-submission review is an active area of development.</w:t>
+        <w:t xml:space="preserve">fetch scholarly papers while verification tools check each citation against publication databases through a reference-verification server. The literature search and verification tools are provided by the refcheck MCP server; they query Crossref and Semantic Scholar. The agent can then write the results of the literature search into your project-level bibtex file or to your Zotero library for reuse across multiple projects. Skills guides the agent but cannot force compliance, so you need to review the completeness and accuracy of results before incorporating them into your work. Skill files can assist with automated manuscript review to prepare your work for human review. For example,</w:t>
       </w:r>
       <w:r>
         <w:t xml:space="preserve"> </w:t>
@@ -4452,7 +4548,7 @@
         <w:t xml:space="preserve"> </w:t>
       </w:r>
       <w:r>
-        <w:t xml:space="preserve">describe PaperDoctor, an agent framework that checks a draft’s claims against its code, mathematics, experiments, prior work, references and visual layout, returns each finding with a pointer to the supporting evidence and a suggested revision, and selectively reruns experiments according to claim importance and compute budget. In their evaluation it reached 70.6% agreement with human advisors across 30 in-progress papers, so expect to disagree with some findings and check each one before revising. We recommend multiple iterations of literature search prompts, adjusting the prompt each time to steer the model to focus on different areas of the literature</w:t>
+        <w:t xml:space="preserve">describe PaperDoctor, an agent framework that checks a draft’s claims against its code, prior work, references and visual layout, returns each finding with a pointer to the supporting evidence and a suggested revision. In their evaluation it reached 71% agreement with human advisers across 30 in-progress papers, so you should expect to disagree with some findings and check each one before revising. We recommend multiple iterations with literature search, verification, and manuscript review skills and MCP servers, adjusting the prompt each time to steer the model to focus on different areas of your project</w:t>
       </w:r>
       <w:r>
         <w:t xml:space="preserve"> </w:t>
@@ -4461,7 +4557,7 @@
         <w:t xml:space="preserve">(Krishna Moorthy et al. 2026)</w:t>
       </w:r>
       <w:r>
-        <w:t xml:space="preserve">. Multiple rounds of verification are also important to ensure the bibliography is free of hallucinated details.</w:t>
+        <w:t xml:space="preserve">.</w:t>
       </w:r>
     </w:p>
     <w:p>
@@ -4537,7 +4633,7 @@
         <w:t xml:space="preserve">(Zheng et al. 2024)</w:t>
       </w:r>
       <w:r>
-        <w:t xml:space="preserve">, generating high-quality, real-world code for research still requires your understanding of your project’s context, debugging skills, and integration with the overall goals of your research project. When using an AI agent to plan and write code for data analysis, we recommend you:</w:t>
+        <w:t xml:space="preserve">, generating high-quality, real-world code for research still requires your understanding of your project’s context, debugging skills, and integration with the overall goals of your research project. For example, when using an AI agent to plan and write code for data analysis, such as a stone artefact assemblage, we recommend you:</w:t>
       </w:r>
     </w:p>
     <w:p>
@@ -4558,7 +4654,7 @@
         <w:t xml:space="preserve">(Brown and Spillias 2026)</w:t>
       </w:r>
       <w:r>
-        <w:t xml:space="preserve">. The archaeological expertise you bring to writing this prompt can make a big difference to the quality and consistency of responses to your prompts</w:t>
+        <w:t xml:space="preserve">. This might include the geographic location of the assemblage, associated radiocarbon ages, lithic typology, etc. The archaeological expertise you bring to writing this prompt can make a big difference to the quality and consistency of responses to your prompts</w:t>
       </w:r>
       <w:r>
         <w:t xml:space="preserve"> </w:t>
@@ -4579,7 +4675,28 @@
         <w:pStyle w:val="Compact"/>
       </w:pPr>
       <w:r>
-        <w:t xml:space="preserve">Include with the prompt the dataset, a narrative summary of the data or a synthetic version of the data generated by a local LLM. This is another form of context and will improve the quality of the model’s output</w:t>
+        <w:t xml:space="preserve">Include with the prompt the dataset, or a narrative summary of the data or a synthetic version of the data generated by a local LLM. For a stone artefact assemblage this could simply be mentioning the raw data file in your prompt, e.g. </w:t>
+      </w:r>
+      <w:r>
+        <w:t xml:space="preserve">‘</w:t>
+      </w:r>
+      <w:r>
+        <w:t xml:space="preserve">Look at me data in</w:t>
+      </w:r>
+      <w:r>
+        <w:t xml:space="preserve"> </w:t>
+      </w:r>
+      <w:r>
+        <w:rPr>
+          <w:rStyle w:val="VerbatimChar"/>
+        </w:rPr>
+        <w:t xml:space="preserve">@analysis/data/stone-artefact-data.csv</w:t>
+      </w:r>
+      <w:r>
+        <w:t xml:space="preserve">’</w:t>
+      </w:r>
+      <w:r>
+        <w:t xml:space="preserve">, that will direct the agent to read the data file. Include a data dictionary that defines the variables, for example, maximum length, technological length, maximum dimension, etc. Including your data is another form of context and will improve the quality of the model’s output</w:t>
       </w:r>
       <w:r>
         <w:t xml:space="preserve"> </w:t>
@@ -4609,7 +4726,16 @@
         <w:t xml:space="preserve">(Brown and Spillias 2026)</w:t>
       </w:r>
       <w:r>
-        <w:t xml:space="preserve">. Use the agent’s tools to help you get this literature.</w:t>
+        <w:t xml:space="preserve">. For a stone artefact analysis we would request the agent use the FactoMineR and factoextra R packages for the multivariate analyses, and follow the guidance in</w:t>
+      </w:r>
+      <w:r>
+        <w:t xml:space="preserve"> </w:t>
+      </w:r>
+      <w:r>
+        <w:t xml:space="preserve">Greenacre et al. (2022)</w:t>
+      </w:r>
+      <w:r>
+        <w:t xml:space="preserve">. Use the agent’s tools to help you get the literature specific to your analysis.</w:t>
       </w:r>
     </w:p>
     <w:p>
@@ -4628,6 +4754,9 @@
       </w:r>
       <w:r>
         <w:t xml:space="preserve">(Chen et al. 2023)</w:t>
+      </w:r>
+      <w:r>
+        <w:t xml:space="preserve">.</w:t>
       </w:r>
     </w:p>
     <w:p>
@@ -4771,7 +4900,7 @@
               <w:pStyle w:val="ImageCaption"/>
             </w:pPr>
             <w:r>
-              <w:t xml:space="preserve">Figure 2: The researcher-directed agentic workflow. Research, plan, execute, and verify proceed left to right, with the researcher directing at every stage and the agent acting underneath. The research and planning steps may involve several rounds of interation and reflinment, as indicated by the bi-directional arrows between the researcher and agent for those steps. Execution and verification are citical decision points for the researcher. Rejecting the agent’s work includes looping back to update the plan. Each stage writes to an inspectable record: Git commits, updates to plan.md, the Quarto report, and the verified bibliography.”</w:t>
+              <w:t xml:space="preserve">Figure 2: The researcher-directed agentic workflow. Research, plan, execute, and verify proceed left to right, with the researcher directing at every stage and the agent acting underneath, invoking tools, skills and MCP servers in multi-step, long-running tasks to achieve the goals set by the researchers. The research and planning steps may involve several rounds of interation and refinment, as indicated by the bi-directional arrows between the researcher and agent for those steps. Execution and verification are critical decision points for the researcher. Rejecting the agent’s work includes looping back to update the plan to steer the agent into alignment with you. Each stage writes to a record that is inspectable by you and others: Git commits, updates to plan.md, the Quarto report, and the verified bibliography.”</w:t>
             </w:r>
           </w:p>
           <w:bookmarkEnd w:id="36"/>
@@ -4932,7 +5061,7 @@
         <w:pStyle w:val="BodyText"/>
       </w:pPr>
       <w:r>
-        <w:t xml:space="preserve">In reducing the time needed for routine and repetitive tasks, AI enables us to scale up analytic exploration</w:t>
+        <w:t xml:space="preserve">By streamlining routine tasks, AI enables us to scale up analytic exploration</w:t>
       </w:r>
       <w:r>
         <w:t xml:space="preserve"> </w:t>
@@ -4977,7 +5106,7 @@
         <w:pStyle w:val="FirstParagraph"/>
       </w:pPr>
       <w:r>
-        <w:t xml:space="preserve">No permits were required for the preparation of this manuscript. The author used OpenCode (https://opencode.ai/), an open-source AI harness, and OpenRouter (https://openrouter.ai/) a commercial model provider. AI models used included Nemotron 3 Ultra (NVIDIA), Muse Spark 1.3 (Meta), Qwen3.8 (Alibaba), GLM-5.3 Flash (Zhipu), and MiMo-V2.5 (Xiaomi). Qwen3.8, GLM-5.3 Flash, and MiMo-V2.5 have openly available weights under permissive licenses; Nemotron 3 Ultra was available as an open-weight model under the OpenMDW License Agreement, version 1.1; and Muse Spark 1.3 was a proprietary, closed-weight model accessed through an API. All models were available through OpenRouter at no cost at the time of writing, July-Sept 2026. AI was used to assist with searching for literature, planning, drafting and editing the manuscript and figures, and reference checking. All AI-generated suggestions were reviewed and revised by the author.</w:t>
+        <w:t xml:space="preserve">The author used OpenCode (https://opencode.ai/), an open-source AI harness, and OpenRouter (https://openrouter.ai/) a commercial model provider. AI models used included Nemotron 3 Ultra (NVIDIA), Muse Spark 1.3 (Meta), Qwen3.8 (Alibaba), GLM-5.3 Flash (Zhipu), and MiMo-V2.5 (Xiaomi). Qwen3.8, GLM-5.3 Flash, and MiMo-V2.5 have openly available weights under permissive licenses; Nemotron 3 Ultra was available as an open-weight model under the OpenMDW License Agreement, version 1.1; and Muse Spark 1.3 was a proprietary, closed-weight model accessed through an API. All models were available through OpenRouter at no cost at the time of writing, July-Sept 2026. AI was used to assist with searching for literature, planning, drafting and editing the manuscript and figures, and reference checking. All AI-generated suggestions were reviewed and revised by the author. No permits were required to prepare this manuscript.</w:t>
       </w:r>
     </w:p>
     <w:bookmarkEnd w:id="38"/>
@@ -5035,7 +5164,7 @@
       </w:r>
     </w:p>
     <w:bookmarkEnd w:id="41"/>
-    <w:bookmarkStart w:id="197" w:name="references"/>
+    <w:bookmarkStart w:id="203" w:name="references"/>
     <w:p>
       <w:pPr>
         <w:pStyle w:val="Heading1"/>
@@ -5044,7 +5173,7 @@
         <w:t xml:space="preserve">References</w:t>
       </w:r>
     </w:p>
-    <w:bookmarkStart w:id="196" w:name="refs"/>
+    <w:bookmarkStart w:id="202" w:name="refs"/>
     <w:bookmarkStart w:id="43" w:name="ref-Abramson2026"/>
     <w:p>
       <w:pPr>
@@ -6265,7 +6394,47 @@
       </w:r>
     </w:p>
     <w:bookmarkEnd w:id="95"/>
-    <w:bookmarkStart w:id="97" w:name="ref-Grossmann2023Transformation"/>
+    <w:bookmarkStart w:id="97" w:name="ref-Greenacre2022Principal"/>
+    <w:p>
+      <w:pPr>
+        <w:pStyle w:val="Bibliography"/>
+      </w:pPr>
+      <w:r>
+        <w:t xml:space="preserve">Greenacre, Michael, Patrick J. F. Groenen, Trevor Hastie, Alfonso Iodice D’Enza, Angelos Markos, and Elena Tuzhilina. 2022. Principal Component Analysis.</w:t>
+      </w:r>
+      <w:r>
+        <w:t xml:space="preserve"> </w:t>
+      </w:r>
+      <w:r>
+        <w:rPr>
+          <w:iCs/>
+          <w:i/>
+        </w:rPr>
+        <w:t xml:space="preserve">Nature Reviews Methods Primers</w:t>
+      </w:r>
+      <w:r>
+        <w:t xml:space="preserve"> </w:t>
+      </w:r>
+      <w:r>
+        <w:t xml:space="preserve">2(1):100.</w:t>
+      </w:r>
+      <w:r>
+        <w:t xml:space="preserve"> </w:t>
+      </w:r>
+      <w:hyperlink r:id="rId96">
+        <w:r>
+          <w:rPr>
+            <w:rStyle w:val="Hyperlink"/>
+          </w:rPr>
+          <w:t xml:space="preserve">https://doi.org/10.1038/s43586-022-00184-w</w:t>
+        </w:r>
+      </w:hyperlink>
+      <w:r>
+        <w:t xml:space="preserve">.</w:t>
+      </w:r>
+    </w:p>
+    <w:bookmarkEnd w:id="97"/>
+    <w:bookmarkStart w:id="99" w:name="ref-Grossmann2023Transformation"/>
     <w:p>
       <w:pPr>
         <w:pStyle w:val="Bibliography"/>
@@ -6304,7 +6473,7 @@
       <w:r>
         <w:t xml:space="preserve"> </w:t>
       </w:r>
-      <w:hyperlink r:id="rId96">
+      <w:hyperlink r:id="rId98">
         <w:r>
           <w:rPr>
             <w:rStyle w:val="Hyperlink"/>
@@ -6316,8 +6485,8 @@
         <w:t xml:space="preserve">.</w:t>
       </w:r>
     </w:p>
-    <w:bookmarkEnd w:id="97"/>
-    <w:bookmarkStart w:id="99" w:name="ref-Guo2024"/>
+    <w:bookmarkEnd w:id="99"/>
+    <w:bookmarkStart w:id="101" w:name="ref-Guo2024"/>
     <w:p>
       <w:pPr>
         <w:pStyle w:val="Bibliography"/>
@@ -6328,7 +6497,7 @@
       <w:r>
         <w:t xml:space="preserve"> </w:t>
       </w:r>
-      <w:hyperlink r:id="rId98">
+      <w:hyperlink r:id="rId100">
         <w:r>
           <w:rPr>
             <w:rStyle w:val="Hyperlink"/>
@@ -6340,8 +6509,8 @@
         <w:t xml:space="preserve">, pp. 8048–8057.</w:t>
       </w:r>
     </w:p>
-    <w:bookmarkEnd w:id="99"/>
-    <w:bookmarkStart w:id="101" w:name="ref-Haase2026"/>
+    <w:bookmarkEnd w:id="101"/>
+    <w:bookmarkStart w:id="103" w:name="ref-Haase2026"/>
     <w:p>
       <w:pPr>
         <w:pStyle w:val="Bibliography"/>
@@ -6368,7 +6537,7 @@
       <w:r>
         <w:t xml:space="preserve"> </w:t>
       </w:r>
-      <w:hyperlink r:id="rId100">
+      <w:hyperlink r:id="rId102">
         <w:r>
           <w:rPr>
             <w:rStyle w:val="Hyperlink"/>
@@ -6380,8 +6549,8 @@
         <w:t xml:space="preserve">.</w:t>
       </w:r>
     </w:p>
-    <w:bookmarkEnd w:id="101"/>
-    <w:bookmarkStart w:id="103" w:name="ref-Hao2025"/>
+    <w:bookmarkEnd w:id="103"/>
+    <w:bookmarkStart w:id="105" w:name="ref-Hao2025"/>
     <w:p>
       <w:pPr>
         <w:pStyle w:val="Bibliography"/>
@@ -6417,7 +6586,7 @@
       <w:r>
         <w:t xml:space="preserve"> </w:t>
       </w:r>
-      <w:hyperlink r:id="rId102">
+      <w:hyperlink r:id="rId104">
         <w:r>
           <w:rPr>
             <w:rStyle w:val="Hyperlink"/>
@@ -6429,8 +6598,8 @@
         <w:t xml:space="preserve">.</w:t>
       </w:r>
     </w:p>
-    <w:bookmarkEnd w:id="103"/>
-    <w:bookmarkStart w:id="105" w:name="ref-Hariri2025"/>
+    <w:bookmarkEnd w:id="105"/>
+    <w:bookmarkStart w:id="107" w:name="ref-Hariri2025"/>
     <w:p>
       <w:pPr>
         <w:pStyle w:val="Bibliography"/>
@@ -6441,7 +6610,7 @@
       <w:r>
         <w:t xml:space="preserve"> </w:t>
       </w:r>
-      <w:hyperlink r:id="rId104">
+      <w:hyperlink r:id="rId106">
         <w:r>
           <w:rPr>
             <w:rStyle w:val="Hyperlink"/>
@@ -6466,8 +6635,8 @@
         <w:t xml:space="preserve">, pp. 83–97. Lecture Notes in Computer Science. Springer Nature Switzerland.</w:t>
       </w:r>
     </w:p>
-    <w:bookmarkEnd w:id="105"/>
-    <w:bookmarkStart w:id="107" w:name="ref-Hou2025"/>
+    <w:bookmarkEnd w:id="107"/>
+    <w:bookmarkStart w:id="109" w:name="ref-Hou2025"/>
     <w:p>
       <w:pPr>
         <w:pStyle w:val="Bibliography"/>
@@ -6503,7 +6672,7 @@
       <w:r>
         <w:t xml:space="preserve"> </w:t>
       </w:r>
-      <w:hyperlink r:id="rId106">
+      <w:hyperlink r:id="rId108">
         <w:r>
           <w:rPr>
             <w:rStyle w:val="Hyperlink"/>
@@ -6515,8 +6684,8 @@
         <w:t xml:space="preserve">.</w:t>
       </w:r>
     </w:p>
-    <w:bookmarkEnd w:id="107"/>
-    <w:bookmarkStart w:id="109" w:name="ref-Jansen2025"/>
+    <w:bookmarkEnd w:id="109"/>
+    <w:bookmarkStart w:id="111" w:name="ref-Jansen2025"/>
     <w:p>
       <w:pPr>
         <w:pStyle w:val="Bibliography"/>
@@ -6543,7 +6712,7 @@
       <w:r>
         <w:t xml:space="preserve"> </w:t>
       </w:r>
-      <w:hyperlink r:id="rId108">
+      <w:hyperlink r:id="rId110">
         <w:r>
           <w:rPr>
             <w:rStyle w:val="Hyperlink"/>
@@ -6555,8 +6724,8 @@
         <w:t xml:space="preserve">.</w:t>
       </w:r>
     </w:p>
-    <w:bookmarkEnd w:id="109"/>
-    <w:bookmarkStart w:id="111" w:name="ref-JohnsonEberl2026"/>
+    <w:bookmarkEnd w:id="111"/>
+    <w:bookmarkStart w:id="113" w:name="ref-JohnsonEberl2026"/>
     <w:p>
       <w:pPr>
         <w:pStyle w:val="Bibliography"/>
@@ -6583,7 +6752,7 @@
       <w:r>
         <w:t xml:space="preserve"> </w:t>
       </w:r>
-      <w:hyperlink r:id="rId110">
+      <w:hyperlink r:id="rId112">
         <w:r>
           <w:rPr>
             <w:rStyle w:val="Hyperlink"/>
@@ -6595,8 +6764,8 @@
         <w:t xml:space="preserve">.</w:t>
       </w:r>
     </w:p>
-    <w:bookmarkEnd w:id="111"/>
-    <w:bookmarkStart w:id="113" w:name="ref-Jonker2024"/>
+    <w:bookmarkEnd w:id="113"/>
+    <w:bookmarkStart w:id="115" w:name="ref-Jonker2024"/>
     <w:p>
       <w:pPr>
         <w:pStyle w:val="Bibliography"/>
@@ -6607,7 +6776,7 @@
       <w:r>
         <w:t xml:space="preserve"> </w:t>
       </w:r>
-      <w:hyperlink r:id="rId112">
+      <w:hyperlink r:id="rId114">
         <w:r>
           <w:rPr>
             <w:rStyle w:val="Hyperlink"/>
@@ -6656,8 +6825,8 @@
         <w:t xml:space="preserve">, pp. 188–204. Edward Elgar Publishing.</w:t>
       </w:r>
     </w:p>
-    <w:bookmarkEnd w:id="113"/>
-    <w:bookmarkStart w:id="115" w:name="ref-Kansa2026"/>
+    <w:bookmarkEnd w:id="115"/>
+    <w:bookmarkStart w:id="117" w:name="ref-Kansa2026"/>
     <w:p>
       <w:pPr>
         <w:pStyle w:val="Bibliography"/>
@@ -6693,7 +6862,7 @@
       <w:r>
         <w:t xml:space="preserve"> </w:t>
       </w:r>
-      <w:hyperlink r:id="rId114">
+      <w:hyperlink r:id="rId116">
         <w:r>
           <w:rPr>
             <w:rStyle w:val="Hyperlink"/>
@@ -6705,8 +6874,8 @@
         <w:t xml:space="preserve">.</w:t>
       </w:r>
     </w:p>
-    <w:bookmarkEnd w:id="115"/>
-    <w:bookmarkStart w:id="117" w:name="ref-Kasneci2023"/>
+    <w:bookmarkEnd w:id="117"/>
+    <w:bookmarkStart w:id="119" w:name="ref-Kasneci2023"/>
     <w:p>
       <w:pPr>
         <w:pStyle w:val="Bibliography"/>
@@ -6742,7 +6911,7 @@
       <w:r>
         <w:t xml:space="preserve"> </w:t>
       </w:r>
-      <w:hyperlink r:id="rId116">
+      <w:hyperlink r:id="rId118">
         <w:r>
           <w:rPr>
             <w:rStyle w:val="Hyperlink"/>
@@ -6754,8 +6923,8 @@
         <w:t xml:space="preserve">.</w:t>
       </w:r>
     </w:p>
-    <w:bookmarkEnd w:id="117"/>
-    <w:bookmarkStart w:id="119" w:name="ref-Kim2026Power"/>
+    <w:bookmarkEnd w:id="119"/>
+    <w:bookmarkStart w:id="121" w:name="ref-Kim2026Power"/>
     <w:p>
       <w:pPr>
         <w:pStyle w:val="Bibliography"/>
@@ -6788,7 +6957,7 @@
       <w:r>
         <w:t xml:space="preserve"> </w:t>
       </w:r>
-      <w:hyperlink r:id="rId118">
+      <w:hyperlink r:id="rId120">
         <w:r>
           <w:rPr>
             <w:rStyle w:val="Hyperlink"/>
@@ -6800,8 +6969,8 @@
         <w:t xml:space="preserve">.</w:t>
       </w:r>
     </w:p>
-    <w:bookmarkEnd w:id="119"/>
-    <w:bookmarkStart w:id="121" w:name="ref-Korinek2023"/>
+    <w:bookmarkEnd w:id="121"/>
+    <w:bookmarkStart w:id="123" w:name="ref-Korinek2023"/>
     <w:p>
       <w:pPr>
         <w:pStyle w:val="Bibliography"/>
@@ -6828,7 +6997,7 @@
       <w:r>
         <w:t xml:space="preserve"> </w:t>
       </w:r>
-      <w:hyperlink r:id="rId120">
+      <w:hyperlink r:id="rId122">
         <w:r>
           <w:rPr>
             <w:rStyle w:val="Hyperlink"/>
@@ -6840,8 +7009,8 @@
         <w:t xml:space="preserve">.</w:t>
       </w:r>
     </w:p>
-    <w:bookmarkEnd w:id="121"/>
-    <w:bookmarkStart w:id="123" w:name="ref-Korinek2025"/>
+    <w:bookmarkEnd w:id="123"/>
+    <w:bookmarkStart w:id="125" w:name="ref-Korinek2025"/>
     <w:p>
       <w:pPr>
         <w:pStyle w:val="Bibliography"/>
@@ -6852,7 +7021,7 @@
       <w:r>
         <w:t xml:space="preserve"> </w:t>
       </w:r>
-      <w:hyperlink r:id="rId122">
+      <w:hyperlink r:id="rId124">
         <w:r>
           <w:rPr>
             <w:rStyle w:val="Hyperlink"/>
@@ -6882,8 +7051,8 @@
         <w:t xml:space="preserve">. National Bureau of Economic Research.</w:t>
       </w:r>
     </w:p>
-    <w:bookmarkEnd w:id="123"/>
-    <w:bookmarkStart w:id="125" w:name="ref-Moorthy2026"/>
+    <w:bookmarkEnd w:id="125"/>
+    <w:bookmarkStart w:id="127" w:name="ref-Moorthy2026"/>
     <w:p>
       <w:pPr>
         <w:pStyle w:val="Bibliography"/>
@@ -6928,7 +7097,7 @@
       <w:r>
         <w:t xml:space="preserve"> </w:t>
       </w:r>
-      <w:hyperlink r:id="rId124">
+      <w:hyperlink r:id="rId126">
         <w:r>
           <w:rPr>
             <w:rStyle w:val="Hyperlink"/>
@@ -6940,8 +7109,8 @@
         <w:t xml:space="preserve">.</w:t>
       </w:r>
     </w:p>
-    <w:bookmarkEnd w:id="125"/>
-    <w:bookmarkStart w:id="127" w:name="ref-Laban2025"/>
+    <w:bookmarkEnd w:id="127"/>
+    <w:bookmarkStart w:id="129" w:name="ref-Laban2025"/>
     <w:p>
       <w:pPr>
         <w:pStyle w:val="Bibliography"/>
@@ -6977,7 +7146,7 @@
       <w:r>
         <w:t xml:space="preserve"> </w:t>
       </w:r>
-      <w:hyperlink r:id="rId126">
+      <w:hyperlink r:id="rId128">
         <w:r>
           <w:rPr>
             <w:rStyle w:val="Hyperlink"/>
@@ -6989,8 +7158,8 @@
         <w:t xml:space="preserve">.</w:t>
       </w:r>
     </w:p>
-    <w:bookmarkEnd w:id="127"/>
-    <w:bookmarkStart w:id="129" w:name="ref-Leung2023"/>
+    <w:bookmarkEnd w:id="129"/>
+    <w:bookmarkStart w:id="131" w:name="ref-Leung2023"/>
     <w:p>
       <w:pPr>
         <w:pStyle w:val="Bibliography"/>
@@ -7017,7 +7186,7 @@
       <w:r>
         <w:t xml:space="preserve"> </w:t>
       </w:r>
-      <w:hyperlink r:id="rId128">
+      <w:hyperlink r:id="rId130">
         <w:r>
           <w:rPr>
             <w:rStyle w:val="Hyperlink"/>
@@ -7029,8 +7198,8 @@
         <w:t xml:space="preserve">.</w:t>
       </w:r>
     </w:p>
-    <w:bookmarkEnd w:id="129"/>
-    <w:bookmarkStart w:id="131" w:name="ref-Lin2026"/>
+    <w:bookmarkEnd w:id="131"/>
+    <w:bookmarkStart w:id="133" w:name="ref-Lin2026"/>
     <w:p>
       <w:pPr>
         <w:pStyle w:val="Bibliography"/>
@@ -7063,7 +7232,7 @@
       <w:r>
         <w:t xml:space="preserve"> </w:t>
       </w:r>
-      <w:hyperlink r:id="rId130">
+      <w:hyperlink r:id="rId132">
         <w:r>
           <w:rPr>
             <w:rStyle w:val="Hyperlink"/>
@@ -7075,8 +7244,66 @@
         <w:t xml:space="preserve">.</w:t>
       </w:r>
     </w:p>
-    <w:bookmarkEnd w:id="131"/>
-    <w:bookmarkStart w:id="133" w:name="ref-Longkumer2025Generative"/>
+    <w:bookmarkEnd w:id="133"/>
+    <w:bookmarkStart w:id="135" w:name="ref-Liu2026Dive"/>
+    <w:p>
+      <w:pPr>
+        <w:pStyle w:val="Bibliography"/>
+      </w:pPr>
+      <w:r>
+        <w:t xml:space="preserve">Liu, Jiacheng, Xiaohan Zhao, Xinyi Shang, and Zhiqiang Shen. 2026. Dive into</w:t>
+      </w:r>
+      <w:r>
+        <w:t xml:space="preserve"> </w:t>
+      </w:r>
+      <w:r>
+        <w:t xml:space="preserve">Claude Code</w:t>
+      </w:r>
+      <w:r>
+        <w:t xml:space="preserve">: The Design Space of Today’s and Future</w:t>
+      </w:r>
+      <w:r>
+        <w:t xml:space="preserve"> </w:t>
+      </w:r>
+      <w:r>
+        <w:t xml:space="preserve">AI</w:t>
+      </w:r>
+      <w:r>
+        <w:t xml:space="preserve"> </w:t>
+      </w:r>
+      <w:r>
+        <w:t xml:space="preserve">Agent Systems.</w:t>
+      </w:r>
+      <w:r>
+        <w:t xml:space="preserve"> </w:t>
+      </w:r>
+      <w:r>
+        <w:rPr>
+          <w:iCs/>
+          <w:i/>
+        </w:rPr>
+        <w:t xml:space="preserve">arXiv Preprint arXiv:2604.14228</w:t>
+      </w:r>
+      <w:r>
+        <w:t xml:space="preserve">.</w:t>
+      </w:r>
+      <w:r>
+        <w:t xml:space="preserve"> </w:t>
+      </w:r>
+      <w:hyperlink r:id="rId134">
+        <w:r>
+          <w:rPr>
+            <w:rStyle w:val="Hyperlink"/>
+          </w:rPr>
+          <w:t xml:space="preserve">https://doi.org/10.48550/arXiv.2604.14228</w:t>
+        </w:r>
+      </w:hyperlink>
+      <w:r>
+        <w:t xml:space="preserve">.</w:t>
+      </w:r>
+    </w:p>
+    <w:bookmarkEnd w:id="135"/>
+    <w:bookmarkStart w:id="137" w:name="ref-Longkumer2025Generative"/>
     <w:p>
       <w:pPr>
         <w:pStyle w:val="Bibliography"/>
@@ -7163,7 +7390,7 @@
       <w:r>
         <w:t xml:space="preserve"> </w:t>
       </w:r>
-      <w:hyperlink r:id="rId132">
+      <w:hyperlink r:id="rId136">
         <w:r>
           <w:rPr>
             <w:rStyle w:val="Hyperlink"/>
@@ -7175,8 +7402,8 @@
         <w:t xml:space="preserve">.</w:t>
       </w:r>
     </w:p>
-    <w:bookmarkEnd w:id="133"/>
-    <w:bookmarkStart w:id="135" w:name="ref-Lu2026"/>
+    <w:bookmarkEnd w:id="137"/>
+    <w:bookmarkStart w:id="139" w:name="ref-Lu2026"/>
     <w:p>
       <w:pPr>
         <w:pStyle w:val="Bibliography"/>
@@ -7215,7 +7442,7 @@
       <w:r>
         <w:t xml:space="preserve"> </w:t>
       </w:r>
-      <w:hyperlink r:id="rId134">
+      <w:hyperlink r:id="rId138">
         <w:r>
           <w:rPr>
             <w:rStyle w:val="Hyperlink"/>
@@ -7227,8 +7454,8 @@
         <w:t xml:space="preserve">.</w:t>
       </w:r>
     </w:p>
-    <w:bookmarkEnd w:id="135"/>
-    <w:bookmarkStart w:id="137" w:name="ref-MBran2024"/>
+    <w:bookmarkEnd w:id="139"/>
+    <w:bookmarkStart w:id="141" w:name="ref-MBran2024"/>
     <w:p>
       <w:pPr>
         <w:pStyle w:val="Bibliography"/>
@@ -7264,7 +7491,7 @@
       <w:r>
         <w:t xml:space="preserve"> </w:t>
       </w:r>
-      <w:hyperlink r:id="rId136">
+      <w:hyperlink r:id="rId140">
         <w:r>
           <w:rPr>
             <w:rStyle w:val="Hyperlink"/>
@@ -7276,8 +7503,8 @@
         <w:t xml:space="preserve">.</w:t>
       </w:r>
     </w:p>
-    <w:bookmarkEnd w:id="137"/>
-    <w:bookmarkStart w:id="139" w:name="ref-Marwick2017"/>
+    <w:bookmarkEnd w:id="141"/>
+    <w:bookmarkStart w:id="143" w:name="ref-Marwick2017"/>
     <w:p>
       <w:pPr>
         <w:pStyle w:val="Bibliography"/>
@@ -7304,7 +7531,7 @@
       <w:r>
         <w:t xml:space="preserve"> </w:t>
       </w:r>
-      <w:hyperlink r:id="rId138">
+      <w:hyperlink r:id="rId142">
         <w:r>
           <w:rPr>
             <w:rStyle w:val="Hyperlink"/>
@@ -7316,8 +7543,8 @@
         <w:t xml:space="preserve">.</w:t>
       </w:r>
     </w:p>
-    <w:bookmarkEnd w:id="139"/>
-    <w:bookmarkStart w:id="141" w:name="ref-Messeri2024"/>
+    <w:bookmarkEnd w:id="143"/>
+    <w:bookmarkStart w:id="145" w:name="ref-Messeri2024"/>
     <w:p>
       <w:pPr>
         <w:pStyle w:val="Bibliography"/>
@@ -7344,7 +7571,7 @@
       <w:r>
         <w:t xml:space="preserve"> </w:t>
       </w:r>
-      <w:hyperlink r:id="rId140">
+      <w:hyperlink r:id="rId144">
         <w:r>
           <w:rPr>
             <w:rStyle w:val="Hyperlink"/>
@@ -7356,8 +7583,8 @@
         <w:t xml:space="preserve">.</w:t>
       </w:r>
     </w:p>
-    <w:bookmarkEnd w:id="141"/>
-    <w:bookmarkStart w:id="143" w:name="ref-Miao2026"/>
+    <w:bookmarkEnd w:id="145"/>
+    <w:bookmarkStart w:id="147" w:name="ref-Miao2026"/>
     <w:p>
       <w:pPr>
         <w:pStyle w:val="Bibliography"/>
@@ -7381,7 +7608,7 @@
       <w:r>
         <w:t xml:space="preserve"> </w:t>
       </w:r>
-      <w:hyperlink r:id="rId142">
+      <w:hyperlink r:id="rId146">
         <w:r>
           <w:rPr>
             <w:rStyle w:val="Hyperlink"/>
@@ -7393,8 +7620,8 @@
         <w:t xml:space="preserve">.</w:t>
       </w:r>
     </w:p>
-    <w:bookmarkEnd w:id="143"/>
-    <w:bookmarkStart w:id="145" w:name="ref-Monakhov2026"/>
+    <w:bookmarkEnd w:id="147"/>
+    <w:bookmarkStart w:id="149" w:name="ref-Monakhov2026"/>
     <w:p>
       <w:pPr>
         <w:pStyle w:val="Bibliography"/>
@@ -7405,7 +7632,7 @@
       <w:r>
         <w:t xml:space="preserve"> </w:t>
       </w:r>
-      <w:hyperlink r:id="rId144">
+      <w:hyperlink r:id="rId148">
         <w:r>
           <w:rPr>
             <w:rStyle w:val="Hyperlink"/>
@@ -7441,8 +7668,8 @@
         <w:t xml:space="preserve">. Elsevier BV.</w:t>
       </w:r>
     </w:p>
-    <w:bookmarkEnd w:id="145"/>
-    <w:bookmarkStart w:id="147" w:name="ref-NationalAcademies2026"/>
+    <w:bookmarkEnd w:id="149"/>
+    <w:bookmarkStart w:id="151" w:name="ref-NationalAcademies2026"/>
     <w:p>
       <w:pPr>
         <w:pStyle w:val="Bibliography"/>
@@ -7453,7 +7680,7 @@
       <w:r>
         <w:t xml:space="preserve"> </w:t>
       </w:r>
-      <w:hyperlink r:id="rId146">
+      <w:hyperlink r:id="rId150">
         <w:r>
           <w:rPr>
             <w:rStyle w:val="Hyperlink"/>
@@ -7467,8 +7694,8 @@
         <w:t xml:space="preserve">. The National Academies Press, Washington, DC.</w:t>
       </w:r>
     </w:p>
-    <w:bookmarkEnd w:id="147"/>
-    <w:bookmarkStart w:id="149" w:name="ref-Nejjar2025"/>
+    <w:bookmarkEnd w:id="151"/>
+    <w:bookmarkStart w:id="153" w:name="ref-Nejjar2025"/>
     <w:p>
       <w:pPr>
         <w:pStyle w:val="Bibliography"/>
@@ -7504,7 +7731,7 @@
       <w:r>
         <w:t xml:space="preserve"> </w:t>
       </w:r>
-      <w:hyperlink r:id="rId148">
+      <w:hyperlink r:id="rId152">
         <w:r>
           <w:rPr>
             <w:rStyle w:val="Hyperlink"/>
@@ -7516,8 +7743,8 @@
         <w:t xml:space="preserve">.</w:t>
       </w:r>
     </w:p>
-    <w:bookmarkEnd w:id="149"/>
-    <w:bookmarkStart w:id="151" w:name="ref-Park2023"/>
+    <w:bookmarkEnd w:id="153"/>
+    <w:bookmarkStart w:id="155" w:name="ref-Park2023"/>
     <w:p>
       <w:pPr>
         <w:pStyle w:val="Bibliography"/>
@@ -7528,7 +7755,7 @@
       <w:r>
         <w:t xml:space="preserve"> </w:t>
       </w:r>
-      <w:hyperlink r:id="rId150">
+      <w:hyperlink r:id="rId154">
         <w:r>
           <w:rPr>
             <w:rStyle w:val="Hyperlink"/>
@@ -7540,8 +7767,8 @@
         <w:t xml:space="preserve">, pp. 1–22.</w:t>
       </w:r>
     </w:p>
-    <w:bookmarkEnd w:id="151"/>
-    <w:bookmarkStart w:id="153" w:name="ref-Piper2026"/>
+    <w:bookmarkEnd w:id="155"/>
+    <w:bookmarkStart w:id="157" w:name="ref-Piper2026"/>
     <w:p>
       <w:pPr>
         <w:pStyle w:val="Bibliography"/>
@@ -7568,7 +7795,7 @@
       <w:r>
         <w:t xml:space="preserve"> </w:t>
       </w:r>
-      <w:hyperlink r:id="rId152">
+      <w:hyperlink r:id="rId156">
         <w:r>
           <w:rPr>
             <w:rStyle w:val="Hyperlink"/>
@@ -7580,8 +7807,8 @@
         <w:t xml:space="preserve">.</w:t>
       </w:r>
     </w:p>
-    <w:bookmarkEnd w:id="153"/>
-    <w:bookmarkStart w:id="155" w:name="ref-QuartoDocs2026"/>
+    <w:bookmarkEnd w:id="157"/>
+    <w:bookmarkStart w:id="159" w:name="ref-QuartoDocs2026"/>
     <w:p>
       <w:pPr>
         <w:pStyle w:val="Bibliography"/>
@@ -7601,7 +7828,7 @@
       <w:r>
         <w:t xml:space="preserve"> </w:t>
       </w:r>
-      <w:hyperlink r:id="rId154">
+      <w:hyperlink r:id="rId158">
         <w:r>
           <w:rPr>
             <w:rStyle w:val="Hyperlink"/>
@@ -7613,8 +7840,8 @@
         <w:t xml:space="preserve">, accessed September 17, 2026.</w:t>
       </w:r>
     </w:p>
-    <w:bookmarkEnd w:id="155"/>
-    <w:bookmarkStart w:id="157" w:name="ref-Rafiee2025"/>
+    <w:bookmarkEnd w:id="159"/>
+    <w:bookmarkStart w:id="161" w:name="ref-Rafiee2025"/>
     <w:p>
       <w:pPr>
         <w:pStyle w:val="Bibliography"/>
@@ -7647,7 +7874,7 @@
       <w:r>
         <w:t xml:space="preserve"> </w:t>
       </w:r>
-      <w:hyperlink r:id="rId156">
+      <w:hyperlink r:id="rId160">
         <w:r>
           <w:rPr>
             <w:rStyle w:val="Hyperlink"/>
@@ -7659,8 +7886,8 @@
         <w:t xml:space="preserve">.</w:t>
       </w:r>
     </w:p>
-    <w:bookmarkEnd w:id="157"/>
-    <w:bookmarkStart w:id="159" w:name="ref-Scheepens2024"/>
+    <w:bookmarkEnd w:id="161"/>
+    <w:bookmarkStart w:id="163" w:name="ref-Scheepens2024"/>
     <w:p>
       <w:pPr>
         <w:pStyle w:val="Bibliography"/>
@@ -7699,7 +7926,7 @@
       <w:r>
         <w:t xml:space="preserve"> </w:t>
       </w:r>
-      <w:hyperlink r:id="rId158">
+      <w:hyperlink r:id="rId162">
         <w:r>
           <w:rPr>
             <w:rStyle w:val="Hyperlink"/>
@@ -7711,8 +7938,8 @@
         <w:t xml:space="preserve">.</w:t>
       </w:r>
     </w:p>
-    <w:bookmarkEnd w:id="159"/>
-    <w:bookmarkStart w:id="161" w:name="ref-Schick2023"/>
+    <w:bookmarkEnd w:id="163"/>
+    <w:bookmarkStart w:id="165" w:name="ref-Schick2023"/>
     <w:p>
       <w:pPr>
         <w:pStyle w:val="Bibliography"/>
@@ -7723,7 +7950,7 @@
       <w:r>
         <w:t xml:space="preserve"> </w:t>
       </w:r>
-      <w:hyperlink r:id="rId160">
+      <w:hyperlink r:id="rId164">
         <w:r>
           <w:rPr>
             <w:rStyle w:val="Hyperlink"/>
@@ -7735,8 +7962,8 @@
         <w:t xml:space="preserve">, pp. 68539–68551.</w:t>
       </w:r>
     </w:p>
-    <w:bookmarkEnd w:id="161"/>
-    <w:bookmarkStart w:id="163" w:name="ref-Schweinberger2026privacy"/>
+    <w:bookmarkEnd w:id="165"/>
+    <w:bookmarkStart w:id="167" w:name="ref-Schweinberger2026privacy"/>
     <w:p>
       <w:pPr>
         <w:pStyle w:val="Bibliography"/>
@@ -7765,7 +7992,7 @@
       <w:r>
         <w:t xml:space="preserve"> </w:t>
       </w:r>
-      <w:hyperlink r:id="rId162">
+      <w:hyperlink r:id="rId166">
         <w:r>
           <w:rPr>
             <w:rStyle w:val="Hyperlink"/>
@@ -7777,8 +8004,8 @@
         <w:t xml:space="preserve">, accessed September 18, 2026.</w:t>
       </w:r>
     </w:p>
-    <w:bookmarkEnd w:id="163"/>
-    <w:bookmarkStart w:id="165" w:name="ref-Shaikhon2025"/>
+    <w:bookmarkEnd w:id="167"/>
+    <w:bookmarkStart w:id="169" w:name="ref-Shaikhon2025"/>
     <w:p>
       <w:pPr>
         <w:pStyle w:val="Bibliography"/>
@@ -7805,7 +8032,7 @@
       <w:r>
         <w:t xml:space="preserve"> </w:t>
       </w:r>
-      <w:hyperlink r:id="rId164">
+      <w:hyperlink r:id="rId168">
         <w:r>
           <w:rPr>
             <w:rStyle w:val="Hyperlink"/>
@@ -7817,8 +8044,8 @@
         <w:t xml:space="preserve">.</w:t>
       </w:r>
     </w:p>
-    <w:bookmarkEnd w:id="165"/>
-    <w:bookmarkStart w:id="167" w:name="ref-Taylor2023"/>
+    <w:bookmarkEnd w:id="169"/>
+    <w:bookmarkStart w:id="171" w:name="ref-Taylor2023"/>
     <w:p>
       <w:pPr>
         <w:pStyle w:val="Bibliography"/>
@@ -7829,7 +8056,7 @@
       <w:r>
         <w:t xml:space="preserve"> </w:t>
       </w:r>
-      <w:hyperlink r:id="rId166">
+      <w:hyperlink r:id="rId170">
         <w:r>
           <w:rPr>
             <w:rStyle w:val="Hyperlink"/>
@@ -7878,8 +8105,8 @@
         <w:t xml:space="preserve">. IOS Press.</w:t>
       </w:r>
     </w:p>
-    <w:bookmarkEnd w:id="167"/>
-    <w:bookmarkStart w:id="169" w:name="ref-Tenzer2024"/>
+    <w:bookmarkEnd w:id="171"/>
+    <w:bookmarkStart w:id="173" w:name="ref-Tenzer2024"/>
     <w:p>
       <w:pPr>
         <w:pStyle w:val="Bibliography"/>
@@ -7915,7 +8142,7 @@
       <w:r>
         <w:t xml:space="preserve"> </w:t>
       </w:r>
-      <w:hyperlink r:id="rId168">
+      <w:hyperlink r:id="rId172">
         <w:r>
           <w:rPr>
             <w:rStyle w:val="Hyperlink"/>
@@ -7927,8 +8154,8 @@
         <w:t xml:space="preserve">.</w:t>
       </w:r>
     </w:p>
-    <w:bookmarkEnd w:id="169"/>
-    <w:bookmarkStart w:id="171" w:name="ref-RoyalSociety2024"/>
+    <w:bookmarkEnd w:id="173"/>
+    <w:bookmarkStart w:id="175" w:name="ref-RoyalSociety2024"/>
     <w:p>
       <w:pPr>
         <w:pStyle w:val="Bibliography"/>
@@ -7939,7 +8166,7 @@
       <w:r>
         <w:t xml:space="preserve"> </w:t>
       </w:r>
-      <w:hyperlink r:id="rId170">
+      <w:hyperlink r:id="rId174">
         <w:r>
           <w:rPr>
             <w:rStyle w:val="Hyperlink"/>
@@ -8057,8 +8284,8 @@
         <w:t xml:space="preserve">. The Royal Society, London.</w:t>
       </w:r>
     </w:p>
-    <w:bookmarkEnd w:id="171"/>
-    <w:bookmarkStart w:id="173" w:name="ref-Walters2023"/>
+    <w:bookmarkEnd w:id="175"/>
+    <w:bookmarkStart w:id="177" w:name="ref-Walters2023"/>
     <w:p>
       <w:pPr>
         <w:pStyle w:val="Bibliography"/>
@@ -8094,7 +8321,7 @@
       <w:r>
         <w:t xml:space="preserve"> </w:t>
       </w:r>
-      <w:hyperlink r:id="rId172">
+      <w:hyperlink r:id="rId176">
         <w:r>
           <w:rPr>
             <w:rStyle w:val="Hyperlink"/>
@@ -8106,8 +8333,8 @@
         <w:t xml:space="preserve">.</w:t>
       </w:r>
     </w:p>
-    <w:bookmarkEnd w:id="173"/>
-    <w:bookmarkStart w:id="175" w:name="ref-Wang2024"/>
+    <w:bookmarkEnd w:id="177"/>
+    <w:bookmarkStart w:id="179" w:name="ref-Wang2024"/>
     <w:p>
       <w:pPr>
         <w:pStyle w:val="Bibliography"/>
@@ -8143,7 +8370,7 @@
       <w:r>
         <w:t xml:space="preserve"> </w:t>
       </w:r>
-      <w:hyperlink r:id="rId174">
+      <w:hyperlink r:id="rId178">
         <w:r>
           <w:rPr>
             <w:rStyle w:val="Hyperlink"/>
@@ -8155,8 +8382,8 @@
         <w:t xml:space="preserve">.</w:t>
       </w:r>
     </w:p>
-    <w:bookmarkEnd w:id="175"/>
-    <w:bookmarkStart w:id="177" w:name="ref-Wickham2019"/>
+    <w:bookmarkEnd w:id="179"/>
+    <w:bookmarkStart w:id="181" w:name="ref-Wickham2019"/>
     <w:p>
       <w:pPr>
         <w:pStyle w:val="Bibliography"/>
@@ -8192,7 +8419,7 @@
       <w:r>
         <w:t xml:space="preserve"> </w:t>
       </w:r>
-      <w:hyperlink r:id="rId176">
+      <w:hyperlink r:id="rId180">
         <w:r>
           <w:rPr>
             <w:rStyle w:val="Hyperlink"/>
@@ -8204,8 +8431,8 @@
         <w:t xml:space="preserve">.</w:t>
       </w:r>
     </w:p>
-    <w:bookmarkEnd w:id="177"/>
-    <w:bookmarkStart w:id="179" w:name="ref-Wiest2024"/>
+    <w:bookmarkEnd w:id="181"/>
+    <w:bookmarkStart w:id="183" w:name="ref-Wiest2024"/>
     <w:p>
       <w:pPr>
         <w:pStyle w:val="Bibliography"/>
@@ -8241,7 +8468,7 @@
       <w:r>
         <w:t xml:space="preserve"> </w:t>
       </w:r>
-      <w:hyperlink r:id="rId178">
+      <w:hyperlink r:id="rId182">
         <w:r>
           <w:rPr>
             <w:rStyle w:val="Hyperlink"/>
@@ -8253,8 +8480,8 @@
         <w:t xml:space="preserve">.</w:t>
       </w:r>
     </w:p>
-    <w:bookmarkEnd w:id="179"/>
-    <w:bookmarkStart w:id="181" w:name="ref-Xu2026"/>
+    <w:bookmarkEnd w:id="183"/>
+    <w:bookmarkStart w:id="185" w:name="ref-Xu2026"/>
     <w:p>
       <w:pPr>
         <w:pStyle w:val="Bibliography"/>
@@ -8299,7 +8526,7 @@
       <w:r>
         <w:t xml:space="preserve"> </w:t>
       </w:r>
-      <w:hyperlink r:id="rId180">
+      <w:hyperlink r:id="rId184">
         <w:r>
           <w:rPr>
             <w:rStyle w:val="Hyperlink"/>
@@ -8311,8 +8538,8 @@
         <w:t xml:space="preserve">.</w:t>
       </w:r>
     </w:p>
-    <w:bookmarkEnd w:id="181"/>
-    <w:bookmarkStart w:id="183" w:name="ref-Xu2024"/>
+    <w:bookmarkEnd w:id="185"/>
+    <w:bookmarkStart w:id="187" w:name="ref-Xu2024"/>
     <w:p>
       <w:pPr>
         <w:pStyle w:val="Bibliography"/>
@@ -8348,7 +8575,7 @@
       <w:r>
         <w:t xml:space="preserve"> </w:t>
       </w:r>
-      <w:hyperlink r:id="rId182">
+      <w:hyperlink r:id="rId186">
         <w:r>
           <w:rPr>
             <w:rStyle w:val="Hyperlink"/>
@@ -8360,8 +8587,8 @@
         <w:t xml:space="preserve">.</w:t>
       </w:r>
     </w:p>
-    <w:bookmarkEnd w:id="183"/>
-    <w:bookmarkStart w:id="185" w:name="ref-ZamfirescuPereira2023"/>
+    <w:bookmarkEnd w:id="187"/>
+    <w:bookmarkStart w:id="189" w:name="ref-ZamfirescuPereira2023"/>
     <w:p>
       <w:pPr>
         <w:pStyle w:val="Bibliography"/>
@@ -8372,7 +8599,7 @@
       <w:r>
         <w:t xml:space="preserve"> </w:t>
       </w:r>
-      <w:hyperlink r:id="rId184">
+      <w:hyperlink r:id="rId188">
         <w:r>
           <w:rPr>
             <w:rStyle w:val="Hyperlink"/>
@@ -8384,8 +8611,8 @@
         <w:t xml:space="preserve">, New York, NY, USA.</w:t>
       </w:r>
     </w:p>
-    <w:bookmarkEnd w:id="185"/>
-    <w:bookmarkStart w:id="187" w:name="ref-Zanzotto2019"/>
+    <w:bookmarkEnd w:id="189"/>
+    <w:bookmarkStart w:id="191" w:name="ref-Zanzotto2019"/>
     <w:p>
       <w:pPr>
         <w:pStyle w:val="Bibliography"/>
@@ -8421,7 +8648,7 @@
       <w:r>
         <w:t xml:space="preserve"> </w:t>
       </w:r>
-      <w:hyperlink r:id="rId186">
+      <w:hyperlink r:id="rId190">
         <w:r>
           <w:rPr>
             <w:rStyle w:val="Hyperlink"/>
@@ -8433,8 +8660,8 @@
         <w:t xml:space="preserve">.</w:t>
       </w:r>
     </w:p>
-    <w:bookmarkEnd w:id="187"/>
-    <w:bookmarkStart w:id="189" w:name="ref-Zhang2025"/>
+    <w:bookmarkEnd w:id="191"/>
+    <w:bookmarkStart w:id="193" w:name="ref-Zhang2025"/>
     <w:p>
       <w:pPr>
         <w:pStyle w:val="Bibliography"/>
@@ -8470,7 +8697,7 @@
       <w:r>
         <w:t xml:space="preserve"> </w:t>
       </w:r>
-      <w:hyperlink r:id="rId188">
+      <w:hyperlink r:id="rId192">
         <w:r>
           <w:rPr>
             <w:rStyle w:val="Hyperlink"/>
@@ -8482,8 +8709,57 @@
         <w:t xml:space="preserve">.</w:t>
       </w:r>
     </w:p>
-    <w:bookmarkEnd w:id="189"/>
-    <w:bookmarkStart w:id="191" w:name="ref-Zheng2024"/>
+    <w:bookmarkEnd w:id="193"/>
+    <w:bookmarkStart w:id="195" w:name="ref-Zhang2026Vibe"/>
+    <w:p>
+      <w:pPr>
+        <w:pStyle w:val="Bibliography"/>
+      </w:pPr>
+      <w:r>
+        <w:t xml:space="preserve">Zhang, Yongjun. 2026. Vibe Researching: Can</w:t>
+      </w:r>
+      <w:r>
+        <w:t xml:space="preserve"> </w:t>
+      </w:r>
+      <w:r>
+        <w:t xml:space="preserve">AI</w:t>
+      </w:r>
+      <w:r>
+        <w:t xml:space="preserve"> </w:t>
+      </w:r>
+      <w:r>
+        <w:t xml:space="preserve">Agents with Skills Replace or Augment Social Scientists?</w:t>
+      </w:r>
+      <w:r>
+        <w:t xml:space="preserve"> </w:t>
+      </w:r>
+      <w:r>
+        <w:rPr>
+          <w:iCs/>
+          <w:i/>
+        </w:rPr>
+        <w:t xml:space="preserve">Chinese Sociological Review</w:t>
+      </w:r>
+      <w:r>
+        <w:t xml:space="preserve">:1–36.</w:t>
+      </w:r>
+      <w:r>
+        <w:t xml:space="preserve"> </w:t>
+      </w:r>
+      <w:hyperlink r:id="rId194">
+        <w:r>
+          <w:rPr>
+            <w:rStyle w:val="Hyperlink"/>
+          </w:rPr>
+          <w:t xml:space="preserve">https://doi.org/10.1080/21620555.2026.2707167</w:t>
+        </w:r>
+      </w:hyperlink>
+      <w:r>
+        <w:t xml:space="preserve">.</w:t>
+      </w:r>
+    </w:p>
+    <w:bookmarkEnd w:id="195"/>
+    <w:bookmarkStart w:id="197" w:name="ref-Zheng2024"/>
     <w:p>
       <w:pPr>
         <w:pStyle w:val="Bibliography"/>
@@ -8507,7 +8783,7 @@
       <w:r>
         <w:t xml:space="preserve"> </w:t>
       </w:r>
-      <w:hyperlink r:id="rId190">
+      <w:hyperlink r:id="rId196">
         <w:r>
           <w:rPr>
             <w:rStyle w:val="Hyperlink"/>
@@ -8519,8 +8795,8 @@
         <w:t xml:space="preserve">.</w:t>
       </w:r>
     </w:p>
-    <w:bookmarkEnd w:id="191"/>
-    <w:bookmarkStart w:id="193" w:name="ref-Ziems2024"/>
+    <w:bookmarkEnd w:id="197"/>
+    <w:bookmarkStart w:id="199" w:name="ref-Ziems2024"/>
     <w:p>
       <w:pPr>
         <w:pStyle w:val="Bibliography"/>
@@ -8547,7 +8823,7 @@
       <w:r>
         <w:t xml:space="preserve"> </w:t>
       </w:r>
-      <w:hyperlink r:id="rId192">
+      <w:hyperlink r:id="rId198">
         <w:r>
           <w:rPr>
             <w:rStyle w:val="Hyperlink"/>
@@ -8559,8 +8835,8 @@
         <w:t xml:space="preserve">.</w:t>
       </w:r>
     </w:p>
-    <w:bookmarkEnd w:id="193"/>
-    <w:bookmarkStart w:id="195" w:name="ref-Zimmer2026"/>
+    <w:bookmarkEnd w:id="199"/>
+    <w:bookmarkStart w:id="201" w:name="ref-Zimmer2026"/>
     <w:p>
       <w:pPr>
         <w:pStyle w:val="Bibliography"/>
@@ -8584,7 +8860,7 @@
       <w:r>
         <w:t xml:space="preserve"> </w:t>
       </w:r>
-      <w:hyperlink r:id="rId194">
+      <w:hyperlink r:id="rId200">
         <w:r>
           <w:rPr>
             <w:rStyle w:val="Hyperlink"/>
@@ -8596,9 +8872,9 @@
         <w:t xml:space="preserve">.</w:t>
       </w:r>
     </w:p>
-    <w:bookmarkEnd w:id="195"/>
-    <w:bookmarkEnd w:id="196"/>
-    <w:bookmarkEnd w:id="197"/>
+    <w:bookmarkEnd w:id="201"/>
+    <w:bookmarkEnd w:id="202"/>
+    <w:bookmarkEnd w:id="203"/>
     <w:sectPr>
       <w:footnotePr>
         <w:numRestart w:val="eachSect"/>

</xml_diff>

<commit_message>
add mention of anthropic social science report
</commit_message>
<xml_diff>
--- a/analysis/paper/paper.docx
+++ b/analysis/paper/paper.docx
@@ -1360,7 +1360,19 @@
         <w:t xml:space="preserve">(Haase and Pokutta 2026; Zimmer et al. 2026)</w:t>
       </w:r>
       <w:r>
-        <w:t xml:space="preserve">. Our guide focuses on the low-autonomy end of the range: the agent works only within a single project and you direct each stage. We are not describing end-to-end fully automated AI pipelines that generate ideas, run experiments and write manuscripts with limited human intervention</w:t>
+        <w:t xml:space="preserve">. However, relatively few researchers have adopted agentic AI: in their survey of 1,260 social scientists,</w:t>
+      </w:r>
+      <w:r>
+        <w:t xml:space="preserve"> </w:t>
+      </w:r>
+      <w:r>
+        <w:t xml:space="preserve">Lyttelton et al. (2026)</w:t>
+      </w:r>
+      <w:r>
+        <w:t xml:space="preserve"> </w:t>
+      </w:r>
+      <w:r>
+        <w:t xml:space="preserve">found only 20% use agents. Our guide focuses on how archaeologists can use agentic AI so that the agent works only within a single project and you direct each stage. We are not describing end-to-end fully automated AI pipelines that generate ideas, run experiments and write manuscripts with limited human intervention</w:t>
       </w:r>
       <w:r>
         <w:t xml:space="preserve"> </w:t>
@@ -1403,7 +1415,7 @@
               <w:t xml:space="preserve"> </w:t>
             </w:r>
             <w:r>
-              <w:t xml:space="preserve">(Boiko et al. 2023; Guo et al. 2024; Kasneci et al. 2023; M. Bran et al. 2024; Park et al. 2023; Rafiee and Woo 2025; Schick et al. 2023; Wang et al. 2024; Xu et al. 2024)</w:t>
+              <w:t xml:space="preserve">(Boiko et al. 2023; Bran et al. 2024; Guo et al. 2024; Kasneci et al. 2023; Park et al. 2023; Rafiee and Woo 2025; Schick et al. 2023; Wang et al. 2024; Xu et al. 2024)</w:t>
             </w:r>
           </w:p>
           <w:tbl>
@@ -5209,7 +5221,7 @@
       </w:r>
     </w:p>
     <w:bookmarkEnd w:id="41"/>
-    <w:bookmarkStart w:id="203" w:name="references"/>
+    <w:bookmarkStart w:id="205" w:name="references"/>
     <w:p>
       <w:pPr>
         <w:pStyle w:val="Heading1"/>
@@ -5218,7 +5230,7 @@
         <w:t xml:space="preserve">References</w:t>
       </w:r>
     </w:p>
-    <w:bookmarkStart w:id="202" w:name="refs"/>
+    <w:bookmarkStart w:id="204" w:name="refs"/>
     <w:bookmarkStart w:id="43" w:name="ref-Abramson2026"/>
     <w:p>
       <w:pPr>
@@ -5677,7 +5689,56 @@
       </w:r>
     </w:p>
     <w:bookmarkEnd w:id="59"/>
-    <w:bookmarkStart w:id="61" w:name="ref-Bridgeford2026"/>
+    <w:bookmarkStart w:id="61" w:name="ref-MBran2024"/>
+    <w:p>
+      <w:pPr>
+        <w:pStyle w:val="Bibliography"/>
+      </w:pPr>
+      <w:r>
+        <w:t xml:space="preserve">Bran, Andres, Sam Cox, Oliver Schilter, Carlo Baldassari, Andrew D. White, and Philippe Schwaller. 2024.</w:t>
+      </w:r>
+      <w:r>
+        <w:t xml:space="preserve"> </w:t>
+      </w:r>
+      <w:r>
+        <w:t xml:space="preserve">Augmenting Large Language Models With Chemistry Tools</w:t>
+      </w:r>
+      <w:r>
+        <w:t xml:space="preserve">.</w:t>
+      </w:r>
+      <w:r>
+        <w:t xml:space="preserve"> </w:t>
+      </w:r>
+      <w:r>
+        <w:rPr>
+          <w:iCs/>
+          <w:i/>
+        </w:rPr>
+        <w:t xml:space="preserve">Nature Machine Intelligence</w:t>
+      </w:r>
+      <w:r>
+        <w:t xml:space="preserve"> </w:t>
+      </w:r>
+      <w:r>
+        <w:t xml:space="preserve">6(5):525–535.</w:t>
+      </w:r>
+      <w:r>
+        <w:t xml:space="preserve"> </w:t>
+      </w:r>
+      <w:hyperlink r:id="rId60">
+        <w:r>
+          <w:rPr>
+            <w:rStyle w:val="Hyperlink"/>
+          </w:rPr>
+          <w:t xml:space="preserve">https://doi.org/10.1038/s42256-024-00832-8</w:t>
+        </w:r>
+      </w:hyperlink>
+      <w:r>
+        <w:t xml:space="preserve">.</w:t>
+      </w:r>
+    </w:p>
+    <w:bookmarkEnd w:id="61"/>
+    <w:bookmarkStart w:id="63" w:name="ref-Bridgeford2026"/>
     <w:p>
       <w:pPr>
         <w:pStyle w:val="Bibliography"/>
@@ -5704,7 +5765,7 @@
       <w:r>
         <w:t xml:space="preserve"> </w:t>
       </w:r>
-      <w:hyperlink r:id="rId60">
+      <w:hyperlink r:id="rId62">
         <w:r>
           <w:rPr>
             <w:rStyle w:val="Hyperlink"/>
@@ -5716,8 +5777,8 @@
         <w:t xml:space="preserve">.</w:t>
       </w:r>
     </w:p>
-    <w:bookmarkEnd w:id="61"/>
-    <w:bookmarkStart w:id="63" w:name="ref-Brown2026book"/>
+    <w:bookmarkEnd w:id="63"/>
+    <w:bookmarkStart w:id="65" w:name="ref-Brown2026book"/>
     <w:p>
       <w:pPr>
         <w:pStyle w:val="Bibliography"/>
@@ -5740,7 +5801,7 @@
       <w:r>
         <w:t xml:space="preserve"> </w:t>
       </w:r>
-      <w:hyperlink r:id="rId62">
+      <w:hyperlink r:id="rId64">
         <w:r>
           <w:rPr>
             <w:rStyle w:val="Hyperlink"/>
@@ -5752,8 +5813,8 @@
         <w:t xml:space="preserve">, accessed September 18, 2026.</w:t>
       </w:r>
     </w:p>
-    <w:bookmarkEnd w:id="63"/>
-    <w:bookmarkStart w:id="65" w:name="ref-Brown2026a"/>
+    <w:bookmarkEnd w:id="65"/>
+    <w:bookmarkStart w:id="67" w:name="ref-Brown2026a"/>
     <w:p>
       <w:pPr>
         <w:pStyle w:val="Bibliography"/>
@@ -5780,7 +5841,7 @@
       <w:r>
         <w:t xml:space="preserve"> </w:t>
       </w:r>
-      <w:hyperlink r:id="rId64">
+      <w:hyperlink r:id="rId66">
         <w:r>
           <w:rPr>
             <w:rStyle w:val="Hyperlink"/>
@@ -5792,8 +5853,8 @@
         <w:t xml:space="preserve">.</w:t>
       </w:r>
     </w:p>
-    <w:bookmarkEnd w:id="65"/>
-    <w:bookmarkStart w:id="67" w:name="ref-Brown2026b"/>
+    <w:bookmarkEnd w:id="67"/>
+    <w:bookmarkStart w:id="69" w:name="ref-Brown2026b"/>
     <w:p>
       <w:pPr>
         <w:pStyle w:val="Bibliography"/>
@@ -5820,7 +5881,7 @@
       <w:r>
         <w:t xml:space="preserve"> </w:t>
       </w:r>
-      <w:hyperlink r:id="rId66">
+      <w:hyperlink r:id="rId68">
         <w:r>
           <w:rPr>
             <w:rStyle w:val="Hyperlink"/>
@@ -5832,8 +5893,8 @@
         <w:t xml:space="preserve">.</w:t>
       </w:r>
     </w:p>
-    <w:bookmarkEnd w:id="67"/>
-    <w:bookmarkStart w:id="69" w:name="ref-Brown2026local"/>
+    <w:bookmarkEnd w:id="69"/>
+    <w:bookmarkStart w:id="71" w:name="ref-Brown2026local"/>
     <w:p>
       <w:pPr>
         <w:pStyle w:val="Bibliography"/>
@@ -5853,7 +5914,7 @@
       <w:r>
         <w:t xml:space="preserve"> </w:t>
       </w:r>
-      <w:hyperlink r:id="rId68">
+      <w:hyperlink r:id="rId70">
         <w:r>
           <w:rPr>
             <w:rStyle w:val="Hyperlink"/>
@@ -5865,8 +5926,8 @@
         <w:t xml:space="preserve">, accessed September 18, 2026.</w:t>
       </w:r>
     </w:p>
-    <w:bookmarkEnd w:id="69"/>
-    <w:bookmarkStart w:id="71" w:name="ref-Campbell2024"/>
+    <w:bookmarkEnd w:id="71"/>
+    <w:bookmarkStart w:id="73" w:name="ref-Campbell2024"/>
     <w:p>
       <w:pPr>
         <w:pStyle w:val="Bibliography"/>
@@ -5893,7 +5954,7 @@
       <w:r>
         <w:t xml:space="preserve"> </w:t>
       </w:r>
-      <w:hyperlink r:id="rId70">
+      <w:hyperlink r:id="rId72">
         <w:r>
           <w:rPr>
             <w:rStyle w:val="Hyperlink"/>
@@ -5905,8 +5966,8 @@
         <w:t xml:space="preserve">.</w:t>
       </w:r>
     </w:p>
-    <w:bookmarkEnd w:id="71"/>
-    <w:bookmarkStart w:id="73" w:name="ref-CardarelliRagno2026"/>
+    <w:bookmarkEnd w:id="73"/>
+    <w:bookmarkStart w:id="75" w:name="ref-CardarelliRagno2026"/>
     <w:p>
       <w:pPr>
         <w:pStyle w:val="Bibliography"/>
@@ -5930,7 +5991,7 @@
       <w:r>
         <w:t xml:space="preserve"> </w:t>
       </w:r>
-      <w:hyperlink r:id="rId72">
+      <w:hyperlink r:id="rId74">
         <w:r>
           <w:rPr>
             <w:rStyle w:val="Hyperlink"/>
@@ -5942,8 +6003,8 @@
         <w:t xml:space="preserve">.</w:t>
       </w:r>
     </w:p>
-    <w:bookmarkEnd w:id="73"/>
-    <w:bookmarkStart w:id="75" w:name="ref-Chen2023"/>
+    <w:bookmarkEnd w:id="75"/>
+    <w:bookmarkStart w:id="77" w:name="ref-Chen2023"/>
     <w:p>
       <w:pPr>
         <w:pStyle w:val="Bibliography"/>
@@ -5967,7 +6028,7 @@
       <w:r>
         <w:t xml:space="preserve"> </w:t>
       </w:r>
-      <w:hyperlink r:id="rId74">
+      <w:hyperlink r:id="rId76">
         <w:r>
           <w:rPr>
             <w:rStyle w:val="Hyperlink"/>
@@ -5979,8 +6040,8 @@
         <w:t xml:space="preserve">.</w:t>
       </w:r>
     </w:p>
-    <w:bookmarkEnd w:id="75"/>
-    <w:bookmarkStart w:id="77" w:name="ref-Codreanu2026"/>
+    <w:bookmarkEnd w:id="77"/>
+    <w:bookmarkStart w:id="79" w:name="ref-Codreanu2026"/>
     <w:p>
       <w:pPr>
         <w:pStyle w:val="Bibliography"/>
@@ -6024,7 +6085,7 @@
       <w:r>
         <w:t xml:space="preserve"> </w:t>
       </w:r>
-      <w:hyperlink r:id="rId76">
+      <w:hyperlink r:id="rId78">
         <w:r>
           <w:rPr>
             <w:rStyle w:val="Hyperlink"/>
@@ -6036,8 +6097,8 @@
         <w:t xml:space="preserve">, accessed September 16, 2026.</w:t>
       </w:r>
     </w:p>
-    <w:bookmarkEnd w:id="77"/>
-    <w:bookmarkStart w:id="79" w:name="ref-Cooper2024"/>
+    <w:bookmarkEnd w:id="79"/>
+    <w:bookmarkStart w:id="81" w:name="ref-Cooper2024"/>
     <w:p>
       <w:pPr>
         <w:pStyle w:val="Bibliography"/>
@@ -6064,7 +6125,7 @@
       <w:r>
         <w:t xml:space="preserve"> </w:t>
       </w:r>
-      <w:hyperlink r:id="rId78">
+      <w:hyperlink r:id="rId80">
         <w:r>
           <w:rPr>
             <w:rStyle w:val="Hyperlink"/>
@@ -6076,8 +6137,8 @@
         <w:t xml:space="preserve">.</w:t>
       </w:r>
     </w:p>
-    <w:bookmarkEnd w:id="79"/>
-    <w:bookmarkStart w:id="81" w:name="ref-CootsonaCastilloSunseri2026"/>
+    <w:bookmarkEnd w:id="81"/>
+    <w:bookmarkStart w:id="83" w:name="ref-CootsonaCastilloSunseri2026"/>
     <w:p>
       <w:pPr>
         <w:pStyle w:val="Bibliography"/>
@@ -6101,7 +6162,7 @@
       <w:r>
         <w:t xml:space="preserve"> </w:t>
       </w:r>
-      <w:hyperlink r:id="rId80">
+      <w:hyperlink r:id="rId82">
         <w:r>
           <w:rPr>
             <w:rStyle w:val="Hyperlink"/>
@@ -6113,8 +6174,8 @@
         <w:t xml:space="preserve">.</w:t>
       </w:r>
     </w:p>
-    <w:bookmarkEnd w:id="81"/>
-    <w:bookmarkStart w:id="83" w:name="ref-DellAcqua2026"/>
+    <w:bookmarkEnd w:id="83"/>
+    <w:bookmarkStart w:id="85" w:name="ref-DellAcqua2026"/>
     <w:p>
       <w:pPr>
         <w:pStyle w:val="Bibliography"/>
@@ -6141,7 +6202,7 @@
       <w:r>
         <w:t xml:space="preserve"> </w:t>
       </w:r>
-      <w:hyperlink r:id="rId82">
+      <w:hyperlink r:id="rId84">
         <w:r>
           <w:rPr>
             <w:rStyle w:val="Hyperlink"/>
@@ -6153,8 +6214,8 @@
         <w:t xml:space="preserve">.</w:t>
       </w:r>
     </w:p>
-    <w:bookmarkEnd w:id="83"/>
-    <w:bookmarkStart w:id="85" w:name="ref-Dyck2026"/>
+    <w:bookmarkEnd w:id="85"/>
+    <w:bookmarkStart w:id="87" w:name="ref-Dyck2026"/>
     <w:p>
       <w:pPr>
         <w:pStyle w:val="Bibliography"/>
@@ -6181,7 +6242,7 @@
       <w:r>
         <w:t xml:space="preserve"> </w:t>
       </w:r>
-      <w:hyperlink r:id="rId84">
+      <w:hyperlink r:id="rId86">
         <w:r>
           <w:rPr>
             <w:rStyle w:val="Hyperlink"/>
@@ -6193,8 +6254,8 @@
         <w:t xml:space="preserve">.</w:t>
       </w:r>
     </w:p>
-    <w:bookmarkEnd w:id="85"/>
-    <w:bookmarkStart w:id="87" w:name="ref-Feuerriegel2024"/>
+    <w:bookmarkEnd w:id="87"/>
+    <w:bookmarkStart w:id="89" w:name="ref-Feuerriegel2024"/>
     <w:p>
       <w:pPr>
         <w:pStyle w:val="Bibliography"/>
@@ -6230,7 +6291,7 @@
       <w:r>
         <w:t xml:space="preserve"> </w:t>
       </w:r>
-      <w:hyperlink r:id="rId86">
+      <w:hyperlink r:id="rId88">
         <w:r>
           <w:rPr>
             <w:rStyle w:val="Hyperlink"/>
@@ -6242,8 +6303,8 @@
         <w:t xml:space="preserve">.</w:t>
       </w:r>
     </w:p>
-    <w:bookmarkEnd w:id="87"/>
-    <w:bookmarkStart w:id="89" w:name="ref-Gattiglia2025"/>
+    <w:bookmarkEnd w:id="89"/>
+    <w:bookmarkStart w:id="91" w:name="ref-Gattiglia2025"/>
     <w:p>
       <w:pPr>
         <w:pStyle w:val="Bibliography"/>
@@ -6270,7 +6331,7 @@
       <w:r>
         <w:t xml:space="preserve"> </w:t>
       </w:r>
-      <w:hyperlink r:id="rId88">
+      <w:hyperlink r:id="rId90">
         <w:r>
           <w:rPr>
             <w:rStyle w:val="Hyperlink"/>
@@ -6282,8 +6343,8 @@
         <w:t xml:space="preserve">.</w:t>
       </w:r>
     </w:p>
-    <w:bookmarkEnd w:id="89"/>
-    <w:bookmarkStart w:id="91" w:name="ref-GildeZuniga2024"/>
+    <w:bookmarkEnd w:id="91"/>
+    <w:bookmarkStart w:id="93" w:name="ref-GildeZuniga2024"/>
     <w:p>
       <w:pPr>
         <w:pStyle w:val="Bibliography"/>
@@ -6319,7 +6380,7 @@
       <w:r>
         <w:t xml:space="preserve"> </w:t>
       </w:r>
-      <w:hyperlink r:id="rId90">
+      <w:hyperlink r:id="rId92">
         <w:r>
           <w:rPr>
             <w:rStyle w:val="Hyperlink"/>
@@ -6331,8 +6392,8 @@
         <w:t xml:space="preserve">.</w:t>
       </w:r>
     </w:p>
-    <w:bookmarkEnd w:id="91"/>
-    <w:bookmarkStart w:id="93" w:name="ref-Gougherty2024"/>
+    <w:bookmarkEnd w:id="93"/>
+    <w:bookmarkStart w:id="95" w:name="ref-Gougherty2024"/>
     <w:p>
       <w:pPr>
         <w:pStyle w:val="Bibliography"/>
@@ -6380,7 +6441,7 @@
       <w:r>
         <w:t xml:space="preserve"> </w:t>
       </w:r>
-      <w:hyperlink r:id="rId92">
+      <w:hyperlink r:id="rId94">
         <w:r>
           <w:rPr>
             <w:rStyle w:val="Hyperlink"/>
@@ -6392,8 +6453,8 @@
         <w:t xml:space="preserve">.</w:t>
       </w:r>
     </w:p>
-    <w:bookmarkEnd w:id="93"/>
-    <w:bookmarkStart w:id="95" w:name="ref-Goyal2026"/>
+    <w:bookmarkEnd w:id="95"/>
+    <w:bookmarkStart w:id="97" w:name="ref-Goyal2026"/>
     <w:p>
       <w:pPr>
         <w:pStyle w:val="Bibliography"/>
@@ -6426,7 +6487,7 @@
       <w:r>
         <w:t xml:space="preserve"> </w:t>
       </w:r>
-      <w:hyperlink r:id="rId94">
+      <w:hyperlink r:id="rId96">
         <w:r>
           <w:rPr>
             <w:rStyle w:val="Hyperlink"/>
@@ -6438,8 +6499,8 @@
         <w:t xml:space="preserve">.</w:t>
       </w:r>
     </w:p>
-    <w:bookmarkEnd w:id="95"/>
-    <w:bookmarkStart w:id="97" w:name="ref-Greenacre2022Principal"/>
+    <w:bookmarkEnd w:id="97"/>
+    <w:bookmarkStart w:id="99" w:name="ref-Greenacre2022Principal"/>
     <w:p>
       <w:pPr>
         <w:pStyle w:val="Bibliography"/>
@@ -6466,7 +6527,7 @@
       <w:r>
         <w:t xml:space="preserve"> </w:t>
       </w:r>
-      <w:hyperlink r:id="rId96">
+      <w:hyperlink r:id="rId98">
         <w:r>
           <w:rPr>
             <w:rStyle w:val="Hyperlink"/>
@@ -6478,8 +6539,8 @@
         <w:t xml:space="preserve">.</w:t>
       </w:r>
     </w:p>
-    <w:bookmarkEnd w:id="97"/>
-    <w:bookmarkStart w:id="99" w:name="ref-Grossmann2023Transformation"/>
+    <w:bookmarkEnd w:id="99"/>
+    <w:bookmarkStart w:id="101" w:name="ref-Grossmann2023Transformation"/>
     <w:p>
       <w:pPr>
         <w:pStyle w:val="Bibliography"/>
@@ -6518,7 +6579,7 @@
       <w:r>
         <w:t xml:space="preserve"> </w:t>
       </w:r>
-      <w:hyperlink r:id="rId98">
+      <w:hyperlink r:id="rId100">
         <w:r>
           <w:rPr>
             <w:rStyle w:val="Hyperlink"/>
@@ -6530,8 +6591,8 @@
         <w:t xml:space="preserve">.</w:t>
       </w:r>
     </w:p>
-    <w:bookmarkEnd w:id="99"/>
-    <w:bookmarkStart w:id="101" w:name="ref-Guo2024"/>
+    <w:bookmarkEnd w:id="101"/>
+    <w:bookmarkStart w:id="103" w:name="ref-Guo2024"/>
     <w:p>
       <w:pPr>
         <w:pStyle w:val="Bibliography"/>
@@ -6542,7 +6603,7 @@
       <w:r>
         <w:t xml:space="preserve"> </w:t>
       </w:r>
-      <w:hyperlink r:id="rId100">
+      <w:hyperlink r:id="rId102">
         <w:r>
           <w:rPr>
             <w:rStyle w:val="Hyperlink"/>
@@ -6554,8 +6615,8 @@
         <w:t xml:space="preserve">, pp. 8048–8057.</w:t>
       </w:r>
     </w:p>
-    <w:bookmarkEnd w:id="101"/>
-    <w:bookmarkStart w:id="103" w:name="ref-Haase2026"/>
+    <w:bookmarkEnd w:id="103"/>
+    <w:bookmarkStart w:id="105" w:name="ref-Haase2026"/>
     <w:p>
       <w:pPr>
         <w:pStyle w:val="Bibliography"/>
@@ -6582,7 +6643,7 @@
       <w:r>
         <w:t xml:space="preserve"> </w:t>
       </w:r>
-      <w:hyperlink r:id="rId102">
+      <w:hyperlink r:id="rId104">
         <w:r>
           <w:rPr>
             <w:rStyle w:val="Hyperlink"/>
@@ -6594,8 +6655,8 @@
         <w:t xml:space="preserve">.</w:t>
       </w:r>
     </w:p>
-    <w:bookmarkEnd w:id="103"/>
-    <w:bookmarkStart w:id="105" w:name="ref-Hao2025"/>
+    <w:bookmarkEnd w:id="105"/>
+    <w:bookmarkStart w:id="107" w:name="ref-Hao2025"/>
     <w:p>
       <w:pPr>
         <w:pStyle w:val="Bibliography"/>
@@ -6631,7 +6692,7 @@
       <w:r>
         <w:t xml:space="preserve"> </w:t>
       </w:r>
-      <w:hyperlink r:id="rId104">
+      <w:hyperlink r:id="rId106">
         <w:r>
           <w:rPr>
             <w:rStyle w:val="Hyperlink"/>
@@ -6643,8 +6704,8 @@
         <w:t xml:space="preserve">.</w:t>
       </w:r>
     </w:p>
-    <w:bookmarkEnd w:id="105"/>
-    <w:bookmarkStart w:id="107" w:name="ref-Hariri2025"/>
+    <w:bookmarkEnd w:id="107"/>
+    <w:bookmarkStart w:id="109" w:name="ref-Hariri2025"/>
     <w:p>
       <w:pPr>
         <w:pStyle w:val="Bibliography"/>
@@ -6655,7 +6716,7 @@
       <w:r>
         <w:t xml:space="preserve"> </w:t>
       </w:r>
-      <w:hyperlink r:id="rId106">
+      <w:hyperlink r:id="rId108">
         <w:r>
           <w:rPr>
             <w:rStyle w:val="Hyperlink"/>
@@ -6680,8 +6741,8 @@
         <w:t xml:space="preserve">, pp. 83–97. Lecture Notes in Computer Science. Springer Nature Switzerland.</w:t>
       </w:r>
     </w:p>
-    <w:bookmarkEnd w:id="107"/>
-    <w:bookmarkStart w:id="109" w:name="ref-Hou2025"/>
+    <w:bookmarkEnd w:id="109"/>
+    <w:bookmarkStart w:id="111" w:name="ref-Hou2025"/>
     <w:p>
       <w:pPr>
         <w:pStyle w:val="Bibliography"/>
@@ -6717,7 +6778,7 @@
       <w:r>
         <w:t xml:space="preserve"> </w:t>
       </w:r>
-      <w:hyperlink r:id="rId108">
+      <w:hyperlink r:id="rId110">
         <w:r>
           <w:rPr>
             <w:rStyle w:val="Hyperlink"/>
@@ -6729,8 +6790,8 @@
         <w:t xml:space="preserve">.</w:t>
       </w:r>
     </w:p>
-    <w:bookmarkEnd w:id="109"/>
-    <w:bookmarkStart w:id="111" w:name="ref-Jansen2025"/>
+    <w:bookmarkEnd w:id="111"/>
+    <w:bookmarkStart w:id="113" w:name="ref-Jansen2025"/>
     <w:p>
       <w:pPr>
         <w:pStyle w:val="Bibliography"/>
@@ -6757,7 +6818,7 @@
       <w:r>
         <w:t xml:space="preserve"> </w:t>
       </w:r>
-      <w:hyperlink r:id="rId110">
+      <w:hyperlink r:id="rId112">
         <w:r>
           <w:rPr>
             <w:rStyle w:val="Hyperlink"/>
@@ -6769,8 +6830,8 @@
         <w:t xml:space="preserve">.</w:t>
       </w:r>
     </w:p>
-    <w:bookmarkEnd w:id="111"/>
-    <w:bookmarkStart w:id="113" w:name="ref-JohnsonEberl2026"/>
+    <w:bookmarkEnd w:id="113"/>
+    <w:bookmarkStart w:id="115" w:name="ref-JohnsonEberl2026"/>
     <w:p>
       <w:pPr>
         <w:pStyle w:val="Bibliography"/>
@@ -6797,7 +6858,7 @@
       <w:r>
         <w:t xml:space="preserve"> </w:t>
       </w:r>
-      <w:hyperlink r:id="rId112">
+      <w:hyperlink r:id="rId114">
         <w:r>
           <w:rPr>
             <w:rStyle w:val="Hyperlink"/>
@@ -6809,8 +6870,8 @@
         <w:t xml:space="preserve">.</w:t>
       </w:r>
     </w:p>
-    <w:bookmarkEnd w:id="113"/>
-    <w:bookmarkStart w:id="115" w:name="ref-Jonker2024"/>
+    <w:bookmarkEnd w:id="115"/>
+    <w:bookmarkStart w:id="117" w:name="ref-Jonker2024"/>
     <w:p>
       <w:pPr>
         <w:pStyle w:val="Bibliography"/>
@@ -6821,7 +6882,7 @@
       <w:r>
         <w:t xml:space="preserve"> </w:t>
       </w:r>
-      <w:hyperlink r:id="rId114">
+      <w:hyperlink r:id="rId116">
         <w:r>
           <w:rPr>
             <w:rStyle w:val="Hyperlink"/>
@@ -6870,8 +6931,8 @@
         <w:t xml:space="preserve">, pp. 188–204. Edward Elgar Publishing.</w:t>
       </w:r>
     </w:p>
-    <w:bookmarkEnd w:id="115"/>
-    <w:bookmarkStart w:id="117" w:name="ref-Kansa2026"/>
+    <w:bookmarkEnd w:id="117"/>
+    <w:bookmarkStart w:id="119" w:name="ref-Kansa2026"/>
     <w:p>
       <w:pPr>
         <w:pStyle w:val="Bibliography"/>
@@ -6907,7 +6968,7 @@
       <w:r>
         <w:t xml:space="preserve"> </w:t>
       </w:r>
-      <w:hyperlink r:id="rId116">
+      <w:hyperlink r:id="rId118">
         <w:r>
           <w:rPr>
             <w:rStyle w:val="Hyperlink"/>
@@ -6919,8 +6980,8 @@
         <w:t xml:space="preserve">.</w:t>
       </w:r>
     </w:p>
-    <w:bookmarkEnd w:id="117"/>
-    <w:bookmarkStart w:id="119" w:name="ref-Kasneci2023"/>
+    <w:bookmarkEnd w:id="119"/>
+    <w:bookmarkStart w:id="121" w:name="ref-Kasneci2023"/>
     <w:p>
       <w:pPr>
         <w:pStyle w:val="Bibliography"/>
@@ -6956,7 +7017,7 @@
       <w:r>
         <w:t xml:space="preserve"> </w:t>
       </w:r>
-      <w:hyperlink r:id="rId118">
+      <w:hyperlink r:id="rId120">
         <w:r>
           <w:rPr>
             <w:rStyle w:val="Hyperlink"/>
@@ -6968,8 +7029,8 @@
         <w:t xml:space="preserve">.</w:t>
       </w:r>
     </w:p>
-    <w:bookmarkEnd w:id="119"/>
-    <w:bookmarkStart w:id="121" w:name="ref-Kim2026Power"/>
+    <w:bookmarkEnd w:id="121"/>
+    <w:bookmarkStart w:id="123" w:name="ref-Kim2026Power"/>
     <w:p>
       <w:pPr>
         <w:pStyle w:val="Bibliography"/>
@@ -7002,7 +7063,7 @@
       <w:r>
         <w:t xml:space="preserve"> </w:t>
       </w:r>
-      <w:hyperlink r:id="rId120">
+      <w:hyperlink r:id="rId122">
         <w:r>
           <w:rPr>
             <w:rStyle w:val="Hyperlink"/>
@@ -7014,8 +7075,8 @@
         <w:t xml:space="preserve">.</w:t>
       </w:r>
     </w:p>
-    <w:bookmarkEnd w:id="121"/>
-    <w:bookmarkStart w:id="123" w:name="ref-Korinek2023"/>
+    <w:bookmarkEnd w:id="123"/>
+    <w:bookmarkStart w:id="125" w:name="ref-Korinek2023"/>
     <w:p>
       <w:pPr>
         <w:pStyle w:val="Bibliography"/>
@@ -7042,7 +7103,7 @@
       <w:r>
         <w:t xml:space="preserve"> </w:t>
       </w:r>
-      <w:hyperlink r:id="rId122">
+      <w:hyperlink r:id="rId124">
         <w:r>
           <w:rPr>
             <w:rStyle w:val="Hyperlink"/>
@@ -7054,8 +7115,8 @@
         <w:t xml:space="preserve">.</w:t>
       </w:r>
     </w:p>
-    <w:bookmarkEnd w:id="123"/>
-    <w:bookmarkStart w:id="125" w:name="ref-Korinek2025"/>
+    <w:bookmarkEnd w:id="125"/>
+    <w:bookmarkStart w:id="127" w:name="ref-Korinek2025"/>
     <w:p>
       <w:pPr>
         <w:pStyle w:val="Bibliography"/>
@@ -7066,7 +7127,7 @@
       <w:r>
         <w:t xml:space="preserve"> </w:t>
       </w:r>
-      <w:hyperlink r:id="rId124">
+      <w:hyperlink r:id="rId126">
         <w:r>
           <w:rPr>
             <w:rStyle w:val="Hyperlink"/>
@@ -7096,8 +7157,8 @@
         <w:t xml:space="preserve">. National Bureau of Economic Research.</w:t>
       </w:r>
     </w:p>
-    <w:bookmarkEnd w:id="125"/>
-    <w:bookmarkStart w:id="127" w:name="ref-Moorthy2026"/>
+    <w:bookmarkEnd w:id="127"/>
+    <w:bookmarkStart w:id="129" w:name="ref-Moorthy2026"/>
     <w:p>
       <w:pPr>
         <w:pStyle w:val="Bibliography"/>
@@ -7142,7 +7203,7 @@
       <w:r>
         <w:t xml:space="preserve"> </w:t>
       </w:r>
-      <w:hyperlink r:id="rId126">
+      <w:hyperlink r:id="rId128">
         <w:r>
           <w:rPr>
             <w:rStyle w:val="Hyperlink"/>
@@ -7154,8 +7215,8 @@
         <w:t xml:space="preserve">.</w:t>
       </w:r>
     </w:p>
-    <w:bookmarkEnd w:id="127"/>
-    <w:bookmarkStart w:id="129" w:name="ref-Laban2025"/>
+    <w:bookmarkEnd w:id="129"/>
+    <w:bookmarkStart w:id="131" w:name="ref-Laban2025"/>
     <w:p>
       <w:pPr>
         <w:pStyle w:val="Bibliography"/>
@@ -7191,7 +7252,7 @@
       <w:r>
         <w:t xml:space="preserve"> </w:t>
       </w:r>
-      <w:hyperlink r:id="rId128">
+      <w:hyperlink r:id="rId130">
         <w:r>
           <w:rPr>
             <w:rStyle w:val="Hyperlink"/>
@@ -7203,8 +7264,8 @@
         <w:t xml:space="preserve">.</w:t>
       </w:r>
     </w:p>
-    <w:bookmarkEnd w:id="129"/>
-    <w:bookmarkStart w:id="131" w:name="ref-Leung2023"/>
+    <w:bookmarkEnd w:id="131"/>
+    <w:bookmarkStart w:id="133" w:name="ref-Leung2023"/>
     <w:p>
       <w:pPr>
         <w:pStyle w:val="Bibliography"/>
@@ -7231,7 +7292,7 @@
       <w:r>
         <w:t xml:space="preserve"> </w:t>
       </w:r>
-      <w:hyperlink r:id="rId130">
+      <w:hyperlink r:id="rId132">
         <w:r>
           <w:rPr>
             <w:rStyle w:val="Hyperlink"/>
@@ -7243,8 +7304,8 @@
         <w:t xml:space="preserve">.</w:t>
       </w:r>
     </w:p>
-    <w:bookmarkEnd w:id="131"/>
-    <w:bookmarkStart w:id="133" w:name="ref-Lin2026"/>
+    <w:bookmarkEnd w:id="133"/>
+    <w:bookmarkStart w:id="135" w:name="ref-Lin2026"/>
     <w:p>
       <w:pPr>
         <w:pStyle w:val="Bibliography"/>
@@ -7277,7 +7338,7 @@
       <w:r>
         <w:t xml:space="preserve"> </w:t>
       </w:r>
-      <w:hyperlink r:id="rId132">
+      <w:hyperlink r:id="rId134">
         <w:r>
           <w:rPr>
             <w:rStyle w:val="Hyperlink"/>
@@ -7289,8 +7350,8 @@
         <w:t xml:space="preserve">.</w:t>
       </w:r>
     </w:p>
-    <w:bookmarkEnd w:id="133"/>
-    <w:bookmarkStart w:id="135" w:name="ref-Liu2026Dive"/>
+    <w:bookmarkEnd w:id="135"/>
+    <w:bookmarkStart w:id="137" w:name="ref-Liu2026Dive"/>
     <w:p>
       <w:pPr>
         <w:pStyle w:val="Bibliography"/>
@@ -7335,7 +7396,7 @@
       <w:r>
         <w:t xml:space="preserve"> </w:t>
       </w:r>
-      <w:hyperlink r:id="rId134">
+      <w:hyperlink r:id="rId136">
         <w:r>
           <w:rPr>
             <w:rStyle w:val="Hyperlink"/>
@@ -7347,8 +7408,8 @@
         <w:t xml:space="preserve">.</w:t>
       </w:r>
     </w:p>
-    <w:bookmarkEnd w:id="135"/>
-    <w:bookmarkStart w:id="137" w:name="ref-Longkumer2025Generative"/>
+    <w:bookmarkEnd w:id="137"/>
+    <w:bookmarkStart w:id="139" w:name="ref-Longkumer2025Generative"/>
     <w:p>
       <w:pPr>
         <w:pStyle w:val="Bibliography"/>
@@ -7435,7 +7496,7 @@
       <w:r>
         <w:t xml:space="preserve"> </w:t>
       </w:r>
-      <w:hyperlink r:id="rId136">
+      <w:hyperlink r:id="rId138">
         <w:r>
           <w:rPr>
             <w:rStyle w:val="Hyperlink"/>
@@ -7447,8 +7508,8 @@
         <w:t xml:space="preserve">.</w:t>
       </w:r>
     </w:p>
-    <w:bookmarkEnd w:id="137"/>
-    <w:bookmarkStart w:id="139" w:name="ref-Lu2026"/>
+    <w:bookmarkEnd w:id="139"/>
+    <w:bookmarkStart w:id="141" w:name="ref-Lu2026"/>
     <w:p>
       <w:pPr>
         <w:pStyle w:val="Bibliography"/>
@@ -7487,7 +7548,7 @@
       <w:r>
         <w:t xml:space="preserve"> </w:t>
       </w:r>
-      <w:hyperlink r:id="rId138">
+      <w:hyperlink r:id="rId140">
         <w:r>
           <w:rPr>
             <w:rStyle w:val="Hyperlink"/>
@@ -7499,57 +7560,32 @@
         <w:t xml:space="preserve">.</w:t>
       </w:r>
     </w:p>
-    <w:bookmarkEnd w:id="139"/>
-    <w:bookmarkStart w:id="141" w:name="ref-MBran2024"/>
+    <w:bookmarkEnd w:id="141"/>
+    <w:bookmarkStart w:id="143" w:name="ref-lyttelton2026agents"/>
     <w:p>
       <w:pPr>
         <w:pStyle w:val="Bibliography"/>
       </w:pPr>
       <w:r>
-        <w:t xml:space="preserve">M. Bran, Andres, Sam Cox, Oliver Schilter, Carlo Baldassari, Andrew D. White, and Philippe Schwaller. 2024.</w:t>
-      </w:r>
-      <w:r>
-        <w:t xml:space="preserve"> </w:t>
-      </w:r>
-      <w:r>
-        <w:t xml:space="preserve">Augmenting Large Language Models With Chemistry Tools</w:t>
-      </w:r>
+        <w:t xml:space="preserve">Lyttelton, Thomas, Maxim Massenkoff, and Nathan Wilmers. 2026. Coding Agents in the Social Sciences.</w:t>
+      </w:r>
+      <w:r>
+        <w:t xml:space="preserve"> </w:t>
+      </w:r>
+      <w:hyperlink r:id="rId142">
+        <w:r>
+          <w:rPr>
+            <w:rStyle w:val="Hyperlink"/>
+          </w:rPr>
+          <w:t xml:space="preserve">https://www.anthropic.com/research/coding-agents-social-sciences</w:t>
+        </w:r>
+      </w:hyperlink>
       <w:r>
         <w:t xml:space="preserve">.</w:t>
       </w:r>
-      <w:r>
-        <w:t xml:space="preserve"> </w:t>
-      </w:r>
-      <w:r>
-        <w:rPr>
-          <w:iCs/>
-          <w:i/>
-        </w:rPr>
-        <w:t xml:space="preserve">Nature Machine Intelligence</w:t>
-      </w:r>
-      <w:r>
-        <w:t xml:space="preserve"> </w:t>
-      </w:r>
-      <w:r>
-        <w:t xml:space="preserve">6(5):525–535.</w:t>
-      </w:r>
-      <w:r>
-        <w:t xml:space="preserve"> </w:t>
-      </w:r>
-      <w:hyperlink r:id="rId140">
-        <w:r>
-          <w:rPr>
-            <w:rStyle w:val="Hyperlink"/>
-          </w:rPr>
-          <w:t xml:space="preserve">https://doi.org/10.1038/s42256-024-00832-8</w:t>
-        </w:r>
-      </w:hyperlink>
-      <w:r>
-        <w:t xml:space="preserve">.</w:t>
-      </w:r>
-    </w:p>
-    <w:bookmarkEnd w:id="141"/>
-    <w:bookmarkStart w:id="143" w:name="ref-Marwick2017"/>
+    </w:p>
+    <w:bookmarkEnd w:id="143"/>
+    <w:bookmarkStart w:id="145" w:name="ref-Marwick2017"/>
     <w:p>
       <w:pPr>
         <w:pStyle w:val="Bibliography"/>
@@ -7576,7 +7612,7 @@
       <w:r>
         <w:t xml:space="preserve"> </w:t>
       </w:r>
-      <w:hyperlink r:id="rId142">
+      <w:hyperlink r:id="rId144">
         <w:r>
           <w:rPr>
             <w:rStyle w:val="Hyperlink"/>
@@ -7588,8 +7624,8 @@
         <w:t xml:space="preserve">.</w:t>
       </w:r>
     </w:p>
-    <w:bookmarkEnd w:id="143"/>
-    <w:bookmarkStart w:id="145" w:name="ref-Messeri2024"/>
+    <w:bookmarkEnd w:id="145"/>
+    <w:bookmarkStart w:id="147" w:name="ref-Messeri2024"/>
     <w:p>
       <w:pPr>
         <w:pStyle w:val="Bibliography"/>
@@ -7616,7 +7652,7 @@
       <w:r>
         <w:t xml:space="preserve"> </w:t>
       </w:r>
-      <w:hyperlink r:id="rId144">
+      <w:hyperlink r:id="rId146">
         <w:r>
           <w:rPr>
             <w:rStyle w:val="Hyperlink"/>
@@ -7628,8 +7664,8 @@
         <w:t xml:space="preserve">.</w:t>
       </w:r>
     </w:p>
-    <w:bookmarkEnd w:id="145"/>
-    <w:bookmarkStart w:id="147" w:name="ref-Miao2026"/>
+    <w:bookmarkEnd w:id="147"/>
+    <w:bookmarkStart w:id="149" w:name="ref-Miao2026"/>
     <w:p>
       <w:pPr>
         <w:pStyle w:val="Bibliography"/>
@@ -7653,7 +7689,7 @@
       <w:r>
         <w:t xml:space="preserve"> </w:t>
       </w:r>
-      <w:hyperlink r:id="rId146">
+      <w:hyperlink r:id="rId148">
         <w:r>
           <w:rPr>
             <w:rStyle w:val="Hyperlink"/>
@@ -7665,8 +7701,8 @@
         <w:t xml:space="preserve">.</w:t>
       </w:r>
     </w:p>
-    <w:bookmarkEnd w:id="147"/>
-    <w:bookmarkStart w:id="149" w:name="ref-Monakhov2026"/>
+    <w:bookmarkEnd w:id="149"/>
+    <w:bookmarkStart w:id="151" w:name="ref-Monakhov2026"/>
     <w:p>
       <w:pPr>
         <w:pStyle w:val="Bibliography"/>
@@ -7677,7 +7713,7 @@
       <w:r>
         <w:t xml:space="preserve"> </w:t>
       </w:r>
-      <w:hyperlink r:id="rId148">
+      <w:hyperlink r:id="rId150">
         <w:r>
           <w:rPr>
             <w:rStyle w:val="Hyperlink"/>
@@ -7713,8 +7749,8 @@
         <w:t xml:space="preserve">. Elsevier BV.</w:t>
       </w:r>
     </w:p>
-    <w:bookmarkEnd w:id="149"/>
-    <w:bookmarkStart w:id="151" w:name="ref-NationalAcademies2026"/>
+    <w:bookmarkEnd w:id="151"/>
+    <w:bookmarkStart w:id="153" w:name="ref-NationalAcademies2026"/>
     <w:p>
       <w:pPr>
         <w:pStyle w:val="Bibliography"/>
@@ -7725,7 +7761,7 @@
       <w:r>
         <w:t xml:space="preserve"> </w:t>
       </w:r>
-      <w:hyperlink r:id="rId150">
+      <w:hyperlink r:id="rId152">
         <w:r>
           <w:rPr>
             <w:rStyle w:val="Hyperlink"/>
@@ -7739,8 +7775,8 @@
         <w:t xml:space="preserve">. The National Academies Press, Washington, DC.</w:t>
       </w:r>
     </w:p>
-    <w:bookmarkEnd w:id="151"/>
-    <w:bookmarkStart w:id="153" w:name="ref-Nejjar2025"/>
+    <w:bookmarkEnd w:id="153"/>
+    <w:bookmarkStart w:id="155" w:name="ref-Nejjar2025"/>
     <w:p>
       <w:pPr>
         <w:pStyle w:val="Bibliography"/>
@@ -7776,7 +7812,7 @@
       <w:r>
         <w:t xml:space="preserve"> </w:t>
       </w:r>
-      <w:hyperlink r:id="rId152">
+      <w:hyperlink r:id="rId154">
         <w:r>
           <w:rPr>
             <w:rStyle w:val="Hyperlink"/>
@@ -7788,8 +7824,8 @@
         <w:t xml:space="preserve">.</w:t>
       </w:r>
     </w:p>
-    <w:bookmarkEnd w:id="153"/>
-    <w:bookmarkStart w:id="155" w:name="ref-Park2023"/>
+    <w:bookmarkEnd w:id="155"/>
+    <w:bookmarkStart w:id="157" w:name="ref-Park2023"/>
     <w:p>
       <w:pPr>
         <w:pStyle w:val="Bibliography"/>
@@ -7800,7 +7836,7 @@
       <w:r>
         <w:t xml:space="preserve"> </w:t>
       </w:r>
-      <w:hyperlink r:id="rId154">
+      <w:hyperlink r:id="rId156">
         <w:r>
           <w:rPr>
             <w:rStyle w:val="Hyperlink"/>
@@ -7812,8 +7848,8 @@
         <w:t xml:space="preserve">, pp. 1–22.</w:t>
       </w:r>
     </w:p>
-    <w:bookmarkEnd w:id="155"/>
-    <w:bookmarkStart w:id="157" w:name="ref-Piper2026"/>
+    <w:bookmarkEnd w:id="157"/>
+    <w:bookmarkStart w:id="159" w:name="ref-Piper2026"/>
     <w:p>
       <w:pPr>
         <w:pStyle w:val="Bibliography"/>
@@ -7840,7 +7876,7 @@
       <w:r>
         <w:t xml:space="preserve"> </w:t>
       </w:r>
-      <w:hyperlink r:id="rId156">
+      <w:hyperlink r:id="rId158">
         <w:r>
           <w:rPr>
             <w:rStyle w:val="Hyperlink"/>
@@ -7852,8 +7888,8 @@
         <w:t xml:space="preserve">.</w:t>
       </w:r>
     </w:p>
-    <w:bookmarkEnd w:id="157"/>
-    <w:bookmarkStart w:id="159" w:name="ref-QuartoDocs2026"/>
+    <w:bookmarkEnd w:id="159"/>
+    <w:bookmarkStart w:id="161" w:name="ref-QuartoDocs2026"/>
     <w:p>
       <w:pPr>
         <w:pStyle w:val="Bibliography"/>
@@ -7873,7 +7909,7 @@
       <w:r>
         <w:t xml:space="preserve"> </w:t>
       </w:r>
-      <w:hyperlink r:id="rId158">
+      <w:hyperlink r:id="rId160">
         <w:r>
           <w:rPr>
             <w:rStyle w:val="Hyperlink"/>
@@ -7885,8 +7921,8 @@
         <w:t xml:space="preserve">, accessed September 17, 2026.</w:t>
       </w:r>
     </w:p>
-    <w:bookmarkEnd w:id="159"/>
-    <w:bookmarkStart w:id="161" w:name="ref-Rafiee2025"/>
+    <w:bookmarkEnd w:id="161"/>
+    <w:bookmarkStart w:id="163" w:name="ref-Rafiee2025"/>
     <w:p>
       <w:pPr>
         <w:pStyle w:val="Bibliography"/>
@@ -7919,7 +7955,7 @@
       <w:r>
         <w:t xml:space="preserve"> </w:t>
       </w:r>
-      <w:hyperlink r:id="rId160">
+      <w:hyperlink r:id="rId162">
         <w:r>
           <w:rPr>
             <w:rStyle w:val="Hyperlink"/>
@@ -7931,8 +7967,8 @@
         <w:t xml:space="preserve">.</w:t>
       </w:r>
     </w:p>
-    <w:bookmarkEnd w:id="161"/>
-    <w:bookmarkStart w:id="163" w:name="ref-Scheepens2024"/>
+    <w:bookmarkEnd w:id="163"/>
+    <w:bookmarkStart w:id="165" w:name="ref-Scheepens2024"/>
     <w:p>
       <w:pPr>
         <w:pStyle w:val="Bibliography"/>
@@ -7971,7 +8007,7 @@
       <w:r>
         <w:t xml:space="preserve"> </w:t>
       </w:r>
-      <w:hyperlink r:id="rId162">
+      <w:hyperlink r:id="rId164">
         <w:r>
           <w:rPr>
             <w:rStyle w:val="Hyperlink"/>
@@ -7983,8 +8019,8 @@
         <w:t xml:space="preserve">.</w:t>
       </w:r>
     </w:p>
-    <w:bookmarkEnd w:id="163"/>
-    <w:bookmarkStart w:id="165" w:name="ref-Schick2023"/>
+    <w:bookmarkEnd w:id="165"/>
+    <w:bookmarkStart w:id="167" w:name="ref-Schick2023"/>
     <w:p>
       <w:pPr>
         <w:pStyle w:val="Bibliography"/>
@@ -7995,7 +8031,7 @@
       <w:r>
         <w:t xml:space="preserve"> </w:t>
       </w:r>
-      <w:hyperlink r:id="rId164">
+      <w:hyperlink r:id="rId166">
         <w:r>
           <w:rPr>
             <w:rStyle w:val="Hyperlink"/>
@@ -8007,8 +8043,8 @@
         <w:t xml:space="preserve">, pp. 68539–68551.</w:t>
       </w:r>
     </w:p>
-    <w:bookmarkEnd w:id="165"/>
-    <w:bookmarkStart w:id="167" w:name="ref-Schweinberger2026privacy"/>
+    <w:bookmarkEnd w:id="167"/>
+    <w:bookmarkStart w:id="169" w:name="ref-Schweinberger2026privacy"/>
     <w:p>
       <w:pPr>
         <w:pStyle w:val="Bibliography"/>
@@ -8037,7 +8073,7 @@
       <w:r>
         <w:t xml:space="preserve"> </w:t>
       </w:r>
-      <w:hyperlink r:id="rId166">
+      <w:hyperlink r:id="rId168">
         <w:r>
           <w:rPr>
             <w:rStyle w:val="Hyperlink"/>
@@ -8049,8 +8085,8 @@
         <w:t xml:space="preserve">, accessed September 18, 2026.</w:t>
       </w:r>
     </w:p>
-    <w:bookmarkEnd w:id="167"/>
-    <w:bookmarkStart w:id="169" w:name="ref-Shaikhon2025"/>
+    <w:bookmarkEnd w:id="169"/>
+    <w:bookmarkStart w:id="171" w:name="ref-Shaikhon2025"/>
     <w:p>
       <w:pPr>
         <w:pStyle w:val="Bibliography"/>
@@ -8077,7 +8113,7 @@
       <w:r>
         <w:t xml:space="preserve"> </w:t>
       </w:r>
-      <w:hyperlink r:id="rId168">
+      <w:hyperlink r:id="rId170">
         <w:r>
           <w:rPr>
             <w:rStyle w:val="Hyperlink"/>
@@ -8089,8 +8125,8 @@
         <w:t xml:space="preserve">.</w:t>
       </w:r>
     </w:p>
-    <w:bookmarkEnd w:id="169"/>
-    <w:bookmarkStart w:id="171" w:name="ref-Taylor2023"/>
+    <w:bookmarkEnd w:id="171"/>
+    <w:bookmarkStart w:id="173" w:name="ref-Taylor2023"/>
     <w:p>
       <w:pPr>
         <w:pStyle w:val="Bibliography"/>
@@ -8101,7 +8137,7 @@
       <w:r>
         <w:t xml:space="preserve"> </w:t>
       </w:r>
-      <w:hyperlink r:id="rId170">
+      <w:hyperlink r:id="rId172">
         <w:r>
           <w:rPr>
             <w:rStyle w:val="Hyperlink"/>
@@ -8150,8 +8186,8 @@
         <w:t xml:space="preserve">. IOS Press.</w:t>
       </w:r>
     </w:p>
-    <w:bookmarkEnd w:id="171"/>
-    <w:bookmarkStart w:id="173" w:name="ref-Tenzer2024"/>
+    <w:bookmarkEnd w:id="173"/>
+    <w:bookmarkStart w:id="175" w:name="ref-Tenzer2024"/>
     <w:p>
       <w:pPr>
         <w:pStyle w:val="Bibliography"/>
@@ -8187,7 +8223,7 @@
       <w:r>
         <w:t xml:space="preserve"> </w:t>
       </w:r>
-      <w:hyperlink r:id="rId172">
+      <w:hyperlink r:id="rId174">
         <w:r>
           <w:rPr>
             <w:rStyle w:val="Hyperlink"/>
@@ -8199,8 +8235,8 @@
         <w:t xml:space="preserve">.</w:t>
       </w:r>
     </w:p>
-    <w:bookmarkEnd w:id="173"/>
-    <w:bookmarkStart w:id="175" w:name="ref-RoyalSociety2024"/>
+    <w:bookmarkEnd w:id="175"/>
+    <w:bookmarkStart w:id="177" w:name="ref-RoyalSociety2024"/>
     <w:p>
       <w:pPr>
         <w:pStyle w:val="Bibliography"/>
@@ -8211,7 +8247,7 @@
       <w:r>
         <w:t xml:space="preserve"> </w:t>
       </w:r>
-      <w:hyperlink r:id="rId174">
+      <w:hyperlink r:id="rId176">
         <w:r>
           <w:rPr>
             <w:rStyle w:val="Hyperlink"/>
@@ -8329,8 +8365,8 @@
         <w:t xml:space="preserve">. The Royal Society, London.</w:t>
       </w:r>
     </w:p>
-    <w:bookmarkEnd w:id="175"/>
-    <w:bookmarkStart w:id="177" w:name="ref-Walters2023"/>
+    <w:bookmarkEnd w:id="177"/>
+    <w:bookmarkStart w:id="179" w:name="ref-Walters2023"/>
     <w:p>
       <w:pPr>
         <w:pStyle w:val="Bibliography"/>
@@ -8366,7 +8402,7 @@
       <w:r>
         <w:t xml:space="preserve"> </w:t>
       </w:r>
-      <w:hyperlink r:id="rId176">
+      <w:hyperlink r:id="rId178">
         <w:r>
           <w:rPr>
             <w:rStyle w:val="Hyperlink"/>
@@ -8378,8 +8414,8 @@
         <w:t xml:space="preserve">.</w:t>
       </w:r>
     </w:p>
-    <w:bookmarkEnd w:id="177"/>
-    <w:bookmarkStart w:id="179" w:name="ref-Wang2024"/>
+    <w:bookmarkEnd w:id="179"/>
+    <w:bookmarkStart w:id="181" w:name="ref-Wang2024"/>
     <w:p>
       <w:pPr>
         <w:pStyle w:val="Bibliography"/>
@@ -8415,7 +8451,7 @@
       <w:r>
         <w:t xml:space="preserve"> </w:t>
       </w:r>
-      <w:hyperlink r:id="rId178">
+      <w:hyperlink r:id="rId180">
         <w:r>
           <w:rPr>
             <w:rStyle w:val="Hyperlink"/>
@@ -8427,8 +8463,8 @@
         <w:t xml:space="preserve">.</w:t>
       </w:r>
     </w:p>
-    <w:bookmarkEnd w:id="179"/>
-    <w:bookmarkStart w:id="181" w:name="ref-Wickham2019"/>
+    <w:bookmarkEnd w:id="181"/>
+    <w:bookmarkStart w:id="183" w:name="ref-Wickham2019"/>
     <w:p>
       <w:pPr>
         <w:pStyle w:val="Bibliography"/>
@@ -8464,7 +8500,7 @@
       <w:r>
         <w:t xml:space="preserve"> </w:t>
       </w:r>
-      <w:hyperlink r:id="rId180">
+      <w:hyperlink r:id="rId182">
         <w:r>
           <w:rPr>
             <w:rStyle w:val="Hyperlink"/>
@@ -8476,8 +8512,8 @@
         <w:t xml:space="preserve">.</w:t>
       </w:r>
     </w:p>
-    <w:bookmarkEnd w:id="181"/>
-    <w:bookmarkStart w:id="183" w:name="ref-Wiest2024"/>
+    <w:bookmarkEnd w:id="183"/>
+    <w:bookmarkStart w:id="185" w:name="ref-Wiest2024"/>
     <w:p>
       <w:pPr>
         <w:pStyle w:val="Bibliography"/>
@@ -8513,7 +8549,7 @@
       <w:r>
         <w:t xml:space="preserve"> </w:t>
       </w:r>
-      <w:hyperlink r:id="rId182">
+      <w:hyperlink r:id="rId184">
         <w:r>
           <w:rPr>
             <w:rStyle w:val="Hyperlink"/>
@@ -8525,8 +8561,8 @@
         <w:t xml:space="preserve">.</w:t>
       </w:r>
     </w:p>
-    <w:bookmarkEnd w:id="183"/>
-    <w:bookmarkStart w:id="185" w:name="ref-Xu2026"/>
+    <w:bookmarkEnd w:id="185"/>
+    <w:bookmarkStart w:id="187" w:name="ref-Xu2026"/>
     <w:p>
       <w:pPr>
         <w:pStyle w:val="Bibliography"/>
@@ -8571,7 +8607,7 @@
       <w:r>
         <w:t xml:space="preserve"> </w:t>
       </w:r>
-      <w:hyperlink r:id="rId184">
+      <w:hyperlink r:id="rId186">
         <w:r>
           <w:rPr>
             <w:rStyle w:val="Hyperlink"/>
@@ -8583,8 +8619,8 @@
         <w:t xml:space="preserve">.</w:t>
       </w:r>
     </w:p>
-    <w:bookmarkEnd w:id="185"/>
-    <w:bookmarkStart w:id="187" w:name="ref-Xu2024"/>
+    <w:bookmarkEnd w:id="187"/>
+    <w:bookmarkStart w:id="189" w:name="ref-Xu2024"/>
     <w:p>
       <w:pPr>
         <w:pStyle w:val="Bibliography"/>
@@ -8620,7 +8656,7 @@
       <w:r>
         <w:t xml:space="preserve"> </w:t>
       </w:r>
-      <w:hyperlink r:id="rId186">
+      <w:hyperlink r:id="rId188">
         <w:r>
           <w:rPr>
             <w:rStyle w:val="Hyperlink"/>
@@ -8632,8 +8668,8 @@
         <w:t xml:space="preserve">.</w:t>
       </w:r>
     </w:p>
-    <w:bookmarkEnd w:id="187"/>
-    <w:bookmarkStart w:id="189" w:name="ref-ZamfirescuPereira2023"/>
+    <w:bookmarkEnd w:id="189"/>
+    <w:bookmarkStart w:id="191" w:name="ref-ZamfirescuPereira2023"/>
     <w:p>
       <w:pPr>
         <w:pStyle w:val="Bibliography"/>
@@ -8644,7 +8680,7 @@
       <w:r>
         <w:t xml:space="preserve"> </w:t>
       </w:r>
-      <w:hyperlink r:id="rId188">
+      <w:hyperlink r:id="rId190">
         <w:r>
           <w:rPr>
             <w:rStyle w:val="Hyperlink"/>
@@ -8656,8 +8692,8 @@
         <w:t xml:space="preserve">, New York, NY, USA.</w:t>
       </w:r>
     </w:p>
-    <w:bookmarkEnd w:id="189"/>
-    <w:bookmarkStart w:id="191" w:name="ref-Zanzotto2019"/>
+    <w:bookmarkEnd w:id="191"/>
+    <w:bookmarkStart w:id="193" w:name="ref-Zanzotto2019"/>
     <w:p>
       <w:pPr>
         <w:pStyle w:val="Bibliography"/>
@@ -8693,7 +8729,7 @@
       <w:r>
         <w:t xml:space="preserve"> </w:t>
       </w:r>
-      <w:hyperlink r:id="rId190">
+      <w:hyperlink r:id="rId192">
         <w:r>
           <w:rPr>
             <w:rStyle w:val="Hyperlink"/>
@@ -8705,8 +8741,8 @@
         <w:t xml:space="preserve">.</w:t>
       </w:r>
     </w:p>
-    <w:bookmarkEnd w:id="191"/>
-    <w:bookmarkStart w:id="193" w:name="ref-Zhang2025"/>
+    <w:bookmarkEnd w:id="193"/>
+    <w:bookmarkStart w:id="195" w:name="ref-Zhang2025"/>
     <w:p>
       <w:pPr>
         <w:pStyle w:val="Bibliography"/>
@@ -8742,7 +8778,7 @@
       <w:r>
         <w:t xml:space="preserve"> </w:t>
       </w:r>
-      <w:hyperlink r:id="rId192">
+      <w:hyperlink r:id="rId194">
         <w:r>
           <w:rPr>
             <w:rStyle w:val="Hyperlink"/>
@@ -8754,8 +8790,8 @@
         <w:t xml:space="preserve">.</w:t>
       </w:r>
     </w:p>
-    <w:bookmarkEnd w:id="193"/>
-    <w:bookmarkStart w:id="195" w:name="ref-Zhang2026Vibe"/>
+    <w:bookmarkEnd w:id="195"/>
+    <w:bookmarkStart w:id="197" w:name="ref-Zhang2026Vibe"/>
     <w:p>
       <w:pPr>
         <w:pStyle w:val="Bibliography"/>
@@ -8791,7 +8827,7 @@
       <w:r>
         <w:t xml:space="preserve"> </w:t>
       </w:r>
-      <w:hyperlink r:id="rId194">
+      <w:hyperlink r:id="rId196">
         <w:r>
           <w:rPr>
             <w:rStyle w:val="Hyperlink"/>
@@ -8803,8 +8839,8 @@
         <w:t xml:space="preserve">.</w:t>
       </w:r>
     </w:p>
-    <w:bookmarkEnd w:id="195"/>
-    <w:bookmarkStart w:id="197" w:name="ref-Zheng2024"/>
+    <w:bookmarkEnd w:id="197"/>
+    <w:bookmarkStart w:id="199" w:name="ref-Zheng2024"/>
     <w:p>
       <w:pPr>
         <w:pStyle w:val="Bibliography"/>
@@ -8828,7 +8864,7 @@
       <w:r>
         <w:t xml:space="preserve"> </w:t>
       </w:r>
-      <w:hyperlink r:id="rId196">
+      <w:hyperlink r:id="rId198">
         <w:r>
           <w:rPr>
             <w:rStyle w:val="Hyperlink"/>
@@ -8840,8 +8876,8 @@
         <w:t xml:space="preserve">.</w:t>
       </w:r>
     </w:p>
-    <w:bookmarkEnd w:id="197"/>
-    <w:bookmarkStart w:id="199" w:name="ref-Ziems2024"/>
+    <w:bookmarkEnd w:id="199"/>
+    <w:bookmarkStart w:id="201" w:name="ref-Ziems2024"/>
     <w:p>
       <w:pPr>
         <w:pStyle w:val="Bibliography"/>
@@ -8868,7 +8904,7 @@
       <w:r>
         <w:t xml:space="preserve"> </w:t>
       </w:r>
-      <w:hyperlink r:id="rId198">
+      <w:hyperlink r:id="rId200">
         <w:r>
           <w:rPr>
             <w:rStyle w:val="Hyperlink"/>
@@ -8880,8 +8916,8 @@
         <w:t xml:space="preserve">.</w:t>
       </w:r>
     </w:p>
-    <w:bookmarkEnd w:id="199"/>
-    <w:bookmarkStart w:id="201" w:name="ref-Zimmer2026"/>
+    <w:bookmarkEnd w:id="201"/>
+    <w:bookmarkStart w:id="203" w:name="ref-Zimmer2026"/>
     <w:p>
       <w:pPr>
         <w:pStyle w:val="Bibliography"/>
@@ -8905,7 +8941,7 @@
       <w:r>
         <w:t xml:space="preserve"> </w:t>
       </w:r>
-      <w:hyperlink r:id="rId200">
+      <w:hyperlink r:id="rId202">
         <w:r>
           <w:rPr>
             <w:rStyle w:val="Hyperlink"/>
@@ -8917,9 +8953,9 @@
         <w:t xml:space="preserve">.</w:t>
       </w:r>
     </w:p>
-    <w:bookmarkEnd w:id="201"/>
-    <w:bookmarkEnd w:id="202"/>
     <w:bookmarkEnd w:id="203"/>
+    <w:bookmarkEnd w:id="204"/>
+    <w:bookmarkEnd w:id="205"/>
     <w:sectPr>
       <w:footnotePr>
         <w:numRestart w:val="eachSect"/>

</xml_diff>

<commit_message>
add SI, editing text
</commit_message>
<xml_diff>
--- a/analysis/paper/paper.docx
+++ b/analysis/paper/paper.docx
@@ -69,13 +69,13 @@
         <w:pStyle w:val="Date"/>
       </w:pPr>
       <w:r>
-        <w:t xml:space="preserve">September</w:t>
-      </w:r>
-      <w:r>
-        <w:t xml:space="preserve"> </w:t>
-      </w:r>
-      <w:r>
-        <w:t xml:space="preserve">27,</w:t>
+        <w:t xml:space="preserve">October</w:t>
+      </w:r>
+      <w:r>
+        <w:t xml:space="preserve"> </w:t>
+      </w:r>
+      <w:r>
+        <w:t xml:space="preserve">2,</w:t>
       </w:r>
       <w:r>
         <w:t xml:space="preserve"> </w:t>
@@ -1372,7 +1372,7 @@
         <w:t xml:space="preserve"> </w:t>
       </w:r>
       <w:r>
-        <w:t xml:space="preserve">found only 20% use agents. Our guide focuses on how archaeologists can use agentic AI so that the agent works only within a single project and you direct each stage. We are not describing end-to-end fully automated AI pipelines that generate ideas, run experiments and write manuscripts with limited human intervention</w:t>
+        <w:t xml:space="preserve">found only 20% use agents. The true figure is probably much lower as this sample was taken from researchers recruited in exchange for access to a commercial AI product. Our guide focuses on how archaeologists can use agentic AI so that the agent works only within a single project and you direct each stage. We are not describing end-to-end fully automated AI pipelines that generate ideas, run experiments and write manuscripts with limited human intervention</w:t>
       </w:r>
       <w:r>
         <w:t xml:space="preserve"> </w:t>
@@ -1415,7 +1415,7 @@
               <w:t xml:space="preserve"> </w:t>
             </w:r>
             <w:r>
-              <w:t xml:space="preserve">(Boiko et al. 2023; Bran et al. 2024; Guo et al. 2024; Kasneci et al. 2023; Park et al. 2023; Rafiee and Woo 2025; Schick et al. 2023; Wang et al. 2024; Xu et al. 2024)</w:t>
+              <w:t xml:space="preserve">(Boiko et al. 2023; Bran et al. 2024; Rafiee and Woo 2025; Wang et al. 2024)</w:t>
             </w:r>
           </w:p>
           <w:tbl>
@@ -1957,7 +1957,7 @@
         <w:pStyle w:val="BodyText"/>
       </w:pPr>
       <w:r>
-        <w:t xml:space="preserve">A high level of researcher control is necessary to honor our responsibilities toward the communities involved in our work and affected by it. AI-generated perspectives cannot replace community participation</w:t>
+        <w:t xml:space="preserve">The high level of researcher control associated with the human at the helm approach is necessary to honor our responsibilities toward the communities involved in our work and affected by it. AI-generated perspectives cannot replace community participation</w:t>
       </w:r>
       <w:r>
         <w:t xml:space="preserve"> </w:t>
@@ -2021,7 +2021,7 @@
               <w:t xml:space="preserve"> </w:t>
             </w:r>
             <w:r>
-              <w:t xml:space="preserve">(Beck and Burri 2024, 2024; Hao et al. 2025; Jonker et al. 2024; Monakhov 2026; Taylor 2023; Zanzotto 2019)</w:t>
+              <w:t xml:space="preserve">(Beck and Burri 2024; Hao et al. 2025; Jonker et al. 2024; Monakhov 2026; Taylor 2023)</w:t>
             </w:r>
             <w:r>
               <w:t xml:space="preserve">.</w:t>
@@ -2617,16 +2617,7 @@
         <w:t xml:space="preserve">(Wickham et al. 2019)</w:t>
       </w:r>
       <w:r>
-        <w:t xml:space="preserve">. The Quarto document format is ideal for writing your report, this combines prose and executable code in a document written as a plain-text file</w:t>
-      </w:r>
-      <w:r>
-        <w:t xml:space="preserve"> </w:t>
-      </w:r>
-      <w:r>
-        <w:t xml:space="preserve">(Quarto)</w:t>
-      </w:r>
-      <w:r>
-        <w:t xml:space="preserve">. Quarto is an extension of the Markdown document format, which LLMs read and write very efficiently and accurately, much more so than Word documents and PDFs. We recommend using converters, such as Markitdown or Docling, to turn DOCX and PDF files into markdown so agents can more efficiently read them. Documents that you want your agent to read and edit should be in Markdown format to improve the agent’s efficiency and minimize their resource consumption.</w:t>
+        <w:t xml:space="preserve">. The Quarto document format is ideal for writing your report, this combines prose and executable code in a document written as a plain-text file. Quarto is an extension of the Markdown document format, which LLMs read and write very efficiently and accurately, much more so than Word documents and PDFs. We recommend using converters, such as Markitdown or Docling, to turn DOCX and PDF files into markdown so agents can more efficiently read them. Documents that you want your agent to read and edit should be in Markdown format to improve the agent’s efficiency and minimize their resource consumption.</w:t>
       </w:r>
     </w:p>
     <w:p>
@@ -2681,7 +2672,7 @@
         <w:t xml:space="preserve">(Liu et al. 2026)</w:t>
       </w:r>
       <w:r>
-        <w:t xml:space="preserve">, GitHub Copilot, OpenAI Codex and OpenCode. We recommend the OpenCode terminal user interface (running in the terminal pane of an integrated development environment such as RStudio or VS Code) because it is free, open source, and not tied to any model vendor (</w:t>
+        <w:t xml:space="preserve">, GitHub Copilot, OpenAI Codex and OpenCode. We recommend the OpenCode terminal user interface (running in the terminal pane of an integrated development environment such as RStudio, Positron or VS Code) because it is free, open source, and not tied to any model vendor (</w:t>
       </w:r>
       <w:hyperlink w:anchor="fig-agent-in-ide">
         <w:r>
@@ -3031,7 +3022,7 @@
               <w:pStyle w:val="ImageCaption"/>
             </w:pPr>
             <w:r>
-              <w:t xml:space="preserve">Figure 1: Schematic illustration of a typical human-at-the-helm data analysis enviroment that includes agentic AI. The entire frame incapsulated in an Integrated Development Environment, such as RStudio or VS Code. On the left side is a Quarto document where we can see headings (</w:t>
+              <w:t xml:space="preserve">Figure 1: Schematic illustration of a typical human-at-the-helm data analysis enviroment that includes agentic AI. The entire frame incapsulated in an Integrated Development Environment, such as RStudio, Positron, or VS Code. On the left side is a Quarto document where we can see headings (</w:t>
             </w:r>
             <w:r>
               <w:t xml:space="preserve">‘</w:t>
@@ -3182,16 +3173,25 @@
         <w:pStyle w:val="BodyText"/>
       </w:pPr>
       <w:r>
-        <w:t xml:space="preserve">Planning an analysis with a LLM works best with a state-of-the-art, reasoning-enabled large frontier model because these are often better at the long-horizon, open-ended, branching tasks involved in drafting a plan</w:t>
-      </w:r>
-      <w:r>
-        <w:t xml:space="preserve"> </w:t>
-      </w:r>
-      <w:r>
-        <w:t xml:space="preserve">(Lu et al. 2026; Zhang et al. 2025)</w:t>
-      </w:r>
-      <w:r>
-        <w:t xml:space="preserve">. However, larger models can be slower, more expensive and resource intensive, so we recommend switching to a smaller model to implement the individual steps of the plan. When your plan is set, switch your harness to build mode and direct the model to execute one step of the plan. As the model completes a step, verify completion by inspecting the Git diff, check the output against your plan, and for more complex steps, interrogate the model to have it justify its actions. Agents sometimes report finished work they never completed</w:t>
+        <w:t xml:space="preserve">Planning an analysis with an LLM can benefit from using a state-of-the-art, reasoning-enabled frontier model. Larger models execute substantially more steps before failing than smaller models do, even where the smaller models are near-perfect on any single step, so small per-step accuracy gains compound into large gains in the length of a task the model can complete</w:t>
+      </w:r>
+      <w:r>
+        <w:t xml:space="preserve"> </w:t>
+      </w:r>
+      <w:r>
+        <w:t xml:space="preserve">(Kwa et al. 2025; Sinha et al. 2026)</w:t>
+      </w:r>
+      <w:r>
+        <w:t xml:space="preserve">. Because larger models are slower, more expensive and more resource intensive, we recommend switching to a smaller model once the plan is fixed and the remaining steps are well-defined</w:t>
+      </w:r>
+      <w:r>
+        <w:t xml:space="preserve"> </w:t>
+      </w:r>
+      <w:r>
+        <w:t xml:space="preserve">(Chen and Varoquaux 2026)</w:t>
+      </w:r>
+      <w:r>
+        <w:t xml:space="preserve">. When your plan is set, switch your harness to build mode and direct the model to execute one step of the plan. As the model completes a step, verify completion by inspecting the Git diff, check the output against your plan, and for more complex steps, interrogate the model to have it justify its actions. Agents sometimes report finished work they never completed and ignore instructions</w:t>
       </w:r>
       <w:r>
         <w:t xml:space="preserve"> </w:t>
@@ -3585,7 +3585,7 @@
               <w:pStyle w:val="ImageCaption"/>
             </w:pPr>
             <w:r>
-              <w:t xml:space="preserve">Table 5: Instructions, MCP servers and skills installed in the our OpenCode configuration that we have found useful for assistence with routine research tasks. Readers can copy-paste this table into their AI agent and ask it to install the skills and MCP servers for global availability across their projects. This list is a snapshot of a fast-moving field: some of these projects may disappear, and better ones may soon replace them. Ask your AI agent to search for the current state-of-the-art skills and MCP servers for your specific purpose.</w:t>
+              <w:t xml:space="preserve">Table 5: Instructions, MCP servers and skills installed in the our OpenCode configuration that we have found useful for assistence with routine research tasks. Readers can copy-paste this table into their AI agent and ask it to install the skills and MCP servers for global availability across their projects. This list is a snapshot of a fast-moving field: some of these projects may disappear, and better ones may soon replace them. Ask your AI agent to search for the current state-of-the-art skills and MCP servers for your specific purpose. The access date for all repositories was 1 Oct 2026.</w:t>
             </w:r>
           </w:p>
           <w:tbl>
@@ -4614,7 +4614,7 @@
         <w:t xml:space="preserve"> </w:t>
       </w:r>
       <w:r>
-        <w:t xml:space="preserve">(Krishna Moorthy et al. 2026)</w:t>
+        <w:t xml:space="preserve">(Moorthy et al. 2026)</w:t>
       </w:r>
       <w:r>
         <w:t xml:space="preserve">.</w:t>
@@ -4673,7 +4673,7 @@
         <w:t xml:space="preserve"> </w:t>
       </w:r>
       <w:r>
-        <w:t xml:space="preserve">(Krishna Moorthy et al. 2026)</w:t>
+        <w:t xml:space="preserve">(Moorthy et al. 2026)</w:t>
       </w:r>
       <w:r>
         <w:t xml:space="preserve">, though no single model dominates all extraction tasks, so you should test several model-prompt pairings. Before using machine-coded variables, you should define them in detail, compare an AI-collected sample against human coding, and document errors.</w:t>
@@ -4695,17 +4695,11 @@
       <w:r>
         <w:t xml:space="preserve">, generating high-quality, real-world code for research still requires your understanding of your project’s context, debugging skills, and integration with the overall goals of your research project. For example, when using an AI agent to plan and write code for data analysis, such as a stone artefact assemblage, we recommend you:</w:t>
       </w:r>
-    </w:p>
-    <w:p>
-      <w:pPr>
-        <w:numPr>
-          <w:ilvl w:val="0"/>
-          <w:numId w:val="1001"/>
-        </w:numPr>
-        <w:pStyle w:val="Compact"/>
-      </w:pPr>
-      <w:r>
-        <w:t xml:space="preserve">Write a prompt that is detailed and specific about the study’s context, research question, types of variables and data collection methods</w:t>
+      <w:r>
+        <w:t xml:space="preserve"> </w:t>
+      </w:r>
+      <w:r>
+        <w:t xml:space="preserve">1. Write a prompt that is detailed and specific about the study’s context, research question, types of variables and data collection methods</w:t>
       </w:r>
       <w:r>
         <w:t xml:space="preserve"> </w:t>
@@ -4725,23 +4719,17 @@
       <w:r>
         <w:t xml:space="preserve">. Rich context minimizes ambiguity and helps to align the model with your goals.</w:t>
       </w:r>
-    </w:p>
-    <w:p>
-      <w:pPr>
-        <w:numPr>
-          <w:ilvl w:val="0"/>
-          <w:numId w:val="1001"/>
-        </w:numPr>
-        <w:pStyle w:val="Compact"/>
-      </w:pPr>
-      <w:r>
-        <w:t xml:space="preserve">Include with the prompt the dataset, or a narrative summary of the data or a synthetic version of the data generated by a local LLM. For a stone artefact assemblage this could simply be mentioning the raw data file in your prompt, e.g. </w:t>
+      <w:r>
+        <w:t xml:space="preserve"> </w:t>
+      </w:r>
+      <w:r>
+        <w:t xml:space="preserve">2. Include with the prompt the dataset, or a narrative summary of the data or a synthetic version of the data generated by a local LLM. For a stone artefact assemblage this could simply be mentioning the raw data file in your prompt, e.g. </w:t>
       </w:r>
       <w:r>
         <w:t xml:space="preserve">‘</w:t>
       </w:r>
       <w:r>
-        <w:t xml:space="preserve">Look at me data in</w:t>
+        <w:t xml:space="preserve">Look at my data in</w:t>
       </w:r>
       <w:r>
         <w:t xml:space="preserve"> </w:t>
@@ -4767,17 +4755,11 @@
       <w:r>
         <w:t xml:space="preserve">.</w:t>
       </w:r>
-    </w:p>
-    <w:p>
-      <w:pPr>
-        <w:numPr>
-          <w:ilvl w:val="0"/>
-          <w:numId w:val="1001"/>
-        </w:numPr>
-        <w:pStyle w:val="Compact"/>
-      </w:pPr>
-      <w:r>
-        <w:t xml:space="preserve">Include high-quality trustworthy reference materials, such as the names of widely used R packages relevant to your work, DOIs to exemplary studies similar to what you want to do, or technical methodological literature that describes relevant methods and best practices in detail</w:t>
+      <w:r>
+        <w:t xml:space="preserve"> </w:t>
+      </w:r>
+      <w:r>
+        <w:t xml:space="preserve">3. Include high-quality trustworthy reference materials, such as the names of widely used R packages relevant to your work, DOIs to exemplary studies similar to what you want to do, or technical methodological literature that describes relevant methods and best practices in detail</w:t>
       </w:r>
       <w:r>
         <w:t xml:space="preserve"> </w:t>
@@ -4797,17 +4779,11 @@
       <w:r>
         <w:t xml:space="preserve">. Use the agent’s tools to help you get the literature specific to your analysis.</w:t>
       </w:r>
-    </w:p>
-    <w:p>
-      <w:pPr>
-        <w:numPr>
-          <w:ilvl w:val="0"/>
-          <w:numId w:val="1001"/>
-        </w:numPr>
-        <w:pStyle w:val="Compact"/>
-      </w:pPr>
-      <w:r>
-        <w:t xml:space="preserve">Include instructions for the model to evaluate its code for correctness and completeness before stopping. This sets the agent to work in a loop: generate code -&gt; run it -&gt; test it -&gt; fix any errors -&gt; repeat until your evaluation criteria have been satisfied. Specifying evaluation criteria and instructing the model to debug itself improves the accuracy of output</w:t>
+      <w:r>
+        <w:t xml:space="preserve"> </w:t>
+      </w:r>
+      <w:r>
+        <w:t xml:space="preserve">4. Include instructions for the model to evaluate its code for correctness and completeness before stopping. This sets the agent to work in a loop: generate code -&gt; run it -&gt; test it -&gt; fix any errors -&gt; repeat until your evaluation criteria have been satisfied. Specifying evaluation criteria and instructing the model to debug itself improves the accuracy of output</w:t>
       </w:r>
       <w:r>
         <w:t xml:space="preserve"> </w:t>
@@ -4821,7 +4797,7 @@
     </w:p>
     <w:p>
       <w:pPr>
-        <w:pStyle w:val="FirstParagraph"/>
+        <w:pStyle w:val="BodyText"/>
       </w:pPr>
       <w:r>
         <w:t xml:space="preserve">Tools that execute code can expose errors for inspection, but even automated correction still needs expert review.</w:t>
@@ -5221,16 +5197,16 @@
       </w:r>
     </w:p>
     <w:bookmarkEnd w:id="41"/>
-    <w:bookmarkStart w:id="205" w:name="references"/>
+    <w:bookmarkStart w:id="195" w:name="references-cited"/>
     <w:p>
       <w:pPr>
         <w:pStyle w:val="Heading1"/>
       </w:pPr>
       <w:r>
-        <w:t xml:space="preserve">References</w:t>
-      </w:r>
-    </w:p>
-    <w:bookmarkStart w:id="204" w:name="refs"/>
+        <w:t xml:space="preserve">References Cited</w:t>
+      </w:r>
+    </w:p>
+    <w:bookmarkStart w:id="194" w:name="refs"/>
     <w:bookmarkStart w:id="43" w:name="ref-Abramson2026"/>
     <w:p>
       <w:pPr>
@@ -5396,7 +5372,19 @@
         <w:pStyle w:val="Bibliography"/>
       </w:pPr>
       <w:r>
-        <w:t xml:space="preserve">Barbaste, Paul, Tristan Darrigol, Germain Vu, and Tom Wiltberger. 2026.</w:t>
+        <w:t xml:space="preserve">Barbaste, Paul, Tristan Darrigol, Germain Vu, and Tom Wiltberger. 2026. Harness Engineering: Anatomy, Architecture, and Evolution of Coding Agents –</w:t>
+      </w:r>
+      <w:r>
+        <w:t xml:space="preserve"> </w:t>
+      </w:r>
+      <w:r>
+        <w:t xml:space="preserve">A</w:t>
+      </w:r>
+      <w:r>
+        <w:t xml:space="preserve"> </w:t>
+      </w:r>
+      <w:r>
+        <w:t xml:space="preserve">Source-Code Study of Eleven Systems.</w:t>
       </w:r>
       <w:r>
         <w:t xml:space="preserve"> </w:t>
@@ -5406,7 +5394,7 @@
           <w:rPr>
             <w:rStyle w:val="Hyperlink"/>
           </w:rPr>
-          <w:t xml:space="preserve">Harness Engineering: Anatomy, Architecture, and Evolution of Coding Agents – a Source-Code Study of Eleven Systems</w:t>
+          <w:t xml:space="preserve">https://doi.org/10.48550/arXiv.2609.00006</w:t>
         </w:r>
       </w:hyperlink>
       <w:r>
@@ -5420,7 +5408,56 @@
         <w:pStyle w:val="Bibliography"/>
       </w:pPr>
       <w:r>
-        <w:t xml:space="preserve">Beck, Juliane, and Thomas Burri. 2024.</w:t>
+        <w:t xml:space="preserve">Beck, Juliane, and Thomas Burri. 2024. From</w:t>
+      </w:r>
+      <w:r>
+        <w:t xml:space="preserve"> </w:t>
+      </w:r>
+      <w:r>
+        <w:t xml:space="preserve">“Human Control”</w:t>
+      </w:r>
+      <w:r>
+        <w:t xml:space="preserve"> </w:t>
+      </w:r>
+      <w:r>
+        <w:t xml:space="preserve">in International Law to</w:t>
+      </w:r>
+      <w:r>
+        <w:t xml:space="preserve"> </w:t>
+      </w:r>
+      <w:r>
+        <w:t xml:space="preserve">“Human Oversight”</w:t>
+      </w:r>
+      <w:r>
+        <w:t xml:space="preserve"> </w:t>
+      </w:r>
+      <w:r>
+        <w:t xml:space="preserve">in the New</w:t>
+      </w:r>
+      <w:r>
+        <w:t xml:space="preserve"> </w:t>
+      </w:r>
+      <w:r>
+        <w:t xml:space="preserve">EU</w:t>
+      </w:r>
+      <w:r>
+        <w:t xml:space="preserve"> </w:t>
+      </w:r>
+      <w:r>
+        <w:t xml:space="preserve">Act on Artificial Intelligence. In</w:t>
+      </w:r>
+      <w:r>
+        <w:t xml:space="preserve"> </w:t>
+      </w:r>
+      <w:r>
+        <w:rPr>
+          <w:iCs/>
+          <w:i/>
+        </w:rPr>
+        <w:t xml:space="preserve">Research Handbook on Meaningful Human Control of Artificial Intelligence Systems</w:t>
+      </w:r>
+      <w:r>
+        <w:t xml:space="preserve">, pp. 104–130. Edward Elgar Publishing, Cheltenham, UK.</w:t>
       </w:r>
       <w:r>
         <w:t xml:space="preserve"> </w:t>
@@ -5430,96 +5467,11 @@
           <w:rPr>
             <w:rStyle w:val="Hyperlink"/>
           </w:rPr>
-          <w:t xml:space="preserve">From</w:t>
-        </w:r>
-        <w:r>
-          <w:rPr>
-            <w:rStyle w:val="Hyperlink"/>
-          </w:rPr>
-          <w:t xml:space="preserve"> </w:t>
-        </w:r>
-        <w:r>
-          <w:rPr>
-            <w:rStyle w:val="Hyperlink"/>
-          </w:rPr>
-          <w:t xml:space="preserve">“Human Control”</w:t>
-        </w:r>
-        <w:r>
-          <w:rPr>
-            <w:rStyle w:val="Hyperlink"/>
-          </w:rPr>
-          <w:t xml:space="preserve"> </w:t>
-        </w:r>
-        <w:r>
-          <w:rPr>
-            <w:rStyle w:val="Hyperlink"/>
-          </w:rPr>
-          <w:t xml:space="preserve">in International Law to</w:t>
-        </w:r>
-        <w:r>
-          <w:rPr>
-            <w:rStyle w:val="Hyperlink"/>
-          </w:rPr>
-          <w:t xml:space="preserve"> </w:t>
-        </w:r>
-        <w:r>
-          <w:rPr>
-            <w:rStyle w:val="Hyperlink"/>
-          </w:rPr>
-          <w:t xml:space="preserve">“Human Oversight”</w:t>
-        </w:r>
-        <w:r>
-          <w:rPr>
-            <w:rStyle w:val="Hyperlink"/>
-          </w:rPr>
-          <w:t xml:space="preserve"> </w:t>
-        </w:r>
-        <w:r>
-          <w:rPr>
-            <w:rStyle w:val="Hyperlink"/>
-          </w:rPr>
-          <w:t xml:space="preserve">in the New</w:t>
-        </w:r>
-        <w:r>
-          <w:rPr>
-            <w:rStyle w:val="Hyperlink"/>
-          </w:rPr>
-          <w:t xml:space="preserve"> </w:t>
-        </w:r>
-        <w:r>
-          <w:rPr>
-            <w:rStyle w:val="Hyperlink"/>
-          </w:rPr>
-          <w:t xml:space="preserve">EU</w:t>
-        </w:r>
-        <w:r>
-          <w:rPr>
-            <w:rStyle w:val="Hyperlink"/>
-          </w:rPr>
-          <w:t xml:space="preserve"> </w:t>
-        </w:r>
-        <w:r>
-          <w:rPr>
-            <w:rStyle w:val="Hyperlink"/>
-          </w:rPr>
-          <w:t xml:space="preserve">Act on Artificial Intelligence</w:t>
+          <w:t xml:space="preserve">https://doi.org/10.4337/9781802204131.00014</w:t>
         </w:r>
       </w:hyperlink>
       <w:r>
-        <w:t xml:space="preserve">. In</w:t>
-      </w:r>
-      <w:r>
-        <w:t xml:space="preserve"> </w:t>
-      </w:r>
-      <w:r>
-        <w:rPr>
-          <w:iCs/>
-          <w:i/>
-        </w:rPr>
-        <w:t xml:space="preserve">Research Handbook on Meaningful Human Control of Artificial Intelligence Systems</w:t>
-      </w:r>
-      <w:r>
-        <w:t xml:space="preserve">, pp. 104–130. Edward Elgar Publishing.</w:t>
+        <w:t xml:space="preserve">.</w:t>
       </w:r>
     </w:p>
     <w:bookmarkEnd w:id="51"/>
@@ -5574,19 +5526,6 @@
       <w:r>
         <w:t xml:space="preserve"> </w:t>
       </w:r>
-      <w:r>
-        <w:rPr>
-          <w:iCs/>
-          <w:i/>
-        </w:rPr>
-        <w:t xml:space="preserve">SocArXiv</w:t>
-      </w:r>
-      <w:r>
-        <w:t xml:space="preserve">.</w:t>
-      </w:r>
-      <w:r>
-        <w:t xml:space="preserve"> </w:t>
-      </w:r>
       <w:hyperlink r:id="rId54">
         <w:r>
           <w:rPr>
@@ -5695,7 +5634,7 @@
         <w:pStyle w:val="Bibliography"/>
       </w:pPr>
       <w:r>
-        <w:t xml:space="preserve">Bran, Andres, Sam Cox, Oliver Schilter, Carlo Baldassari, Andrew D. White, and Philippe Schwaller. 2024.</w:t>
+        <w:t xml:space="preserve">Bran, Andres, Sam Cox, Oliver Schilter, et al. 2024.</w:t>
       </w:r>
       <w:r>
         <w:t xml:space="preserve"> </w:t>
@@ -5744,7 +5683,7 @@
         <w:pStyle w:val="Bibliography"/>
       </w:pPr>
       <w:r>
-        <w:t xml:space="preserve">Bridgeford, Eric W., Iain Campbell, Zijao Chen, Zhicheng Lin, Harrison Ritz, Joachim Vandekerckhove, and Russell A. Poldrack. 2026. Twelve Quick Tips for AI-Assisted Coding in Science.</w:t>
+        <w:t xml:space="preserve">Bridgeford, Eric W., Iain Campbell, Zijao Chen, et al. 2026. Twelve Quick Tips for AI-Assisted Coding in Science.</w:t>
       </w:r>
       <w:r>
         <w:t xml:space="preserve"> </w:t>
@@ -5933,7 +5872,7 @@
         <w:pStyle w:val="Bibliography"/>
       </w:pPr>
       <w:r>
-        <w:t xml:space="preserve">Campbell, Heather, Thomas Bluck, Ella Curry, Derrick Harris, Billie Pike, and Bethany Wright. 2024. Should We Still Teach or Learn Coding? A Postgraduate Student Perspective on the Use of Large Language Models for Coding in Ecology and Evolution.</w:t>
+        <w:t xml:space="preserve">Campbell, Heather, Thomas Bluck, Ella Curry, et al. 2024. Should We Still Teach or Learn Coding? A Postgraduate Student Perspective on the Use of Large Language Models for Coding in Ecology and Evolution.</w:t>
       </w:r>
       <w:r>
         <w:t xml:space="preserve"> </w:t>
@@ -5978,19 +5917,6 @@
       <w:r>
         <w:t xml:space="preserve"> </w:t>
       </w:r>
-      <w:r>
-        <w:rPr>
-          <w:iCs/>
-          <w:i/>
-        </w:rPr>
-        <w:t xml:space="preserve">arXiv Preprint arXiv:2609.11198</w:t>
-      </w:r>
-      <w:r>
-        <w:t xml:space="preserve">.</w:t>
-      </w:r>
-      <w:r>
-        <w:t xml:space="preserve"> </w:t>
-      </w:r>
       <w:hyperlink r:id="rId74">
         <w:r>
           <w:rPr>
@@ -6004,7 +5930,56 @@
       </w:r>
     </w:p>
     <w:bookmarkEnd w:id="75"/>
-    <w:bookmarkStart w:id="77" w:name="ref-Chen2023"/>
+    <w:bookmarkStart w:id="77" w:name="ref-ChenVaroquaux2026"/>
+    <w:p>
+      <w:pPr>
+        <w:pStyle w:val="Bibliography"/>
+      </w:pPr>
+      <w:r>
+        <w:t xml:space="preserve">Chen, Lihu, and Gaël Varoquaux. 2026. What Is the Role of Small Models in the</w:t>
+      </w:r>
+      <w:r>
+        <w:t xml:space="preserve"> </w:t>
+      </w:r>
+      <w:r>
+        <w:t xml:space="preserve">LLM</w:t>
+      </w:r>
+      <w:r>
+        <w:t xml:space="preserve"> </w:t>
+      </w:r>
+      <w:r>
+        <w:t xml:space="preserve">Era: A Survey.</w:t>
+      </w:r>
+      <w:r>
+        <w:t xml:space="preserve"> </w:t>
+      </w:r>
+      <w:r>
+        <w:rPr>
+          <w:iCs/>
+          <w:i/>
+        </w:rPr>
+        <w:t xml:space="preserve">Computational Linguistics</w:t>
+      </w:r>
+      <w:r>
+        <w:t xml:space="preserve">:1–42.</w:t>
+      </w:r>
+      <w:r>
+        <w:t xml:space="preserve"> </w:t>
+      </w:r>
+      <w:hyperlink r:id="rId76">
+        <w:r>
+          <w:rPr>
+            <w:rStyle w:val="Hyperlink"/>
+          </w:rPr>
+          <w:t xml:space="preserve">https://doi.org/10.1162/coli.a.652</w:t>
+        </w:r>
+      </w:hyperlink>
+      <w:r>
+        <w:t xml:space="preserve">.</w:t>
+      </w:r>
+    </w:p>
+    <w:bookmarkEnd w:id="77"/>
+    <w:bookmarkStart w:id="79" w:name="ref-Chen2023"/>
     <w:p>
       <w:pPr>
         <w:pStyle w:val="Bibliography"/>
@@ -6028,7 +6003,7 @@
       <w:r>
         <w:t xml:space="preserve"> </w:t>
       </w:r>
-      <w:hyperlink r:id="rId76">
+      <w:hyperlink r:id="rId78">
         <w:r>
           <w:rPr>
             <w:rStyle w:val="Hyperlink"/>
@@ -6040,14 +6015,14 @@
         <w:t xml:space="preserve">.</w:t>
       </w:r>
     </w:p>
-    <w:bookmarkEnd w:id="77"/>
-    <w:bookmarkStart w:id="79" w:name="ref-Codreanu2026"/>
+    <w:bookmarkEnd w:id="79"/>
+    <w:bookmarkStart w:id="81" w:name="ref-Codreanu2026"/>
     <w:p>
       <w:pPr>
         <w:pStyle w:val="Bibliography"/>
       </w:pPr>
       <w:r>
-        <w:t xml:space="preserve">Codreanu, Mihai, Alex Imas, Juan Mateos-Garcia, Evalyne Muiruri, Ana Trišović, Scott Strand, Arthur Turrell, et al. 2026.</w:t>
+        <w:t xml:space="preserve">Codreanu, Mihai, Alex Imas, Juan Mateos-Garcia, et al. 2026.</w:t>
       </w:r>
       <w:r>
         <w:t xml:space="preserve"> </w:t>
@@ -6085,20 +6060,20 @@
       <w:r>
         <w:t xml:space="preserve"> </w:t>
       </w:r>
-      <w:hyperlink r:id="rId78">
+      <w:hyperlink r:id="rId80">
         <w:r>
           <w:rPr>
             <w:rStyle w:val="Hyperlink"/>
           </w:rPr>
-          <w:t xml:space="preserve">https://ai.google/static/documents/AI-in-Science.pdf</w:t>
+          <w:t xml:space="preserve">https://doi.org/10.2139/ssrn.7465898</w:t>
         </w:r>
       </w:hyperlink>
       <w:r>
         <w:t xml:space="preserve">, accessed September 16, 2026.</w:t>
       </w:r>
     </w:p>
-    <w:bookmarkEnd w:id="79"/>
-    <w:bookmarkStart w:id="81" w:name="ref-Cooper2024"/>
+    <w:bookmarkEnd w:id="81"/>
+    <w:bookmarkStart w:id="83" w:name="ref-Cooper2024"/>
     <w:p>
       <w:pPr>
         <w:pStyle w:val="Bibliography"/>
@@ -6125,7 +6100,7 @@
       <w:r>
         <w:t xml:space="preserve"> </w:t>
       </w:r>
-      <w:hyperlink r:id="rId80">
+      <w:hyperlink r:id="rId82">
         <w:r>
           <w:rPr>
             <w:rStyle w:val="Hyperlink"/>
@@ -6137,8 +6112,8 @@
         <w:t xml:space="preserve">.</w:t>
       </w:r>
     </w:p>
-    <w:bookmarkEnd w:id="81"/>
-    <w:bookmarkStart w:id="83" w:name="ref-CootsonaCastilloSunseri2026"/>
+    <w:bookmarkEnd w:id="83"/>
+    <w:bookmarkStart w:id="85" w:name="ref-CootsonaCastilloSunseri2026"/>
     <w:p>
       <w:pPr>
         <w:pStyle w:val="Bibliography"/>
@@ -6162,7 +6137,7 @@
       <w:r>
         <w:t xml:space="preserve"> </w:t>
       </w:r>
-      <w:hyperlink r:id="rId82">
+      <w:hyperlink r:id="rId84">
         <w:r>
           <w:rPr>
             <w:rStyle w:val="Hyperlink"/>
@@ -6174,14 +6149,14 @@
         <w:t xml:space="preserve">.</w:t>
       </w:r>
     </w:p>
-    <w:bookmarkEnd w:id="83"/>
-    <w:bookmarkStart w:id="85" w:name="ref-DellAcqua2026"/>
+    <w:bookmarkEnd w:id="85"/>
+    <w:bookmarkStart w:id="87" w:name="ref-DellAcqua2026"/>
     <w:p>
       <w:pPr>
         <w:pStyle w:val="Bibliography"/>
       </w:pPr>
       <w:r>
-        <w:t xml:space="preserve">Dell’Acqua, Fabrizio, Edward McFowland, Ethan Mollick, Hila Lifshitz, Katherine C. Kellogg, Saran Rajendran, Lisa Krayer, et al. 2026. Navigating the Jagged Technological Frontier: Field Experimental Evidence of the Effects of Artificial Intelligence on Knowledge Worker Productivity and Quality.</w:t>
+        <w:t xml:space="preserve">Dell’Acqua, Fabrizio, Edward McFowland, Ethan Mollick, et al. 2026. Navigating the Jagged Technological Frontier: Field Experimental Evidence of the Effects of Artificial Intelligence on Knowledge Worker Productivity and Quality.</w:t>
       </w:r>
       <w:r>
         <w:t xml:space="preserve"> </w:t>
@@ -6202,7 +6177,7 @@
       <w:r>
         <w:t xml:space="preserve"> </w:t>
       </w:r>
-      <w:hyperlink r:id="rId84">
+      <w:hyperlink r:id="rId86">
         <w:r>
           <w:rPr>
             <w:rStyle w:val="Hyperlink"/>
@@ -6214,8 +6189,8 @@
         <w:t xml:space="preserve">.</w:t>
       </w:r>
     </w:p>
-    <w:bookmarkEnd w:id="85"/>
-    <w:bookmarkStart w:id="87" w:name="ref-Dyck2026"/>
+    <w:bookmarkEnd w:id="87"/>
+    <w:bookmarkStart w:id="89" w:name="ref-Dyck2026"/>
     <w:p>
       <w:pPr>
         <w:pStyle w:val="Bibliography"/>
@@ -6242,7 +6217,7 @@
       <w:r>
         <w:t xml:space="preserve"> </w:t>
       </w:r>
-      <w:hyperlink r:id="rId86">
+      <w:hyperlink r:id="rId88">
         <w:r>
           <w:rPr>
             <w:rStyle w:val="Hyperlink"/>
@@ -6254,8 +6229,8 @@
         <w:t xml:space="preserve">.</w:t>
       </w:r>
     </w:p>
-    <w:bookmarkEnd w:id="87"/>
-    <w:bookmarkStart w:id="89" w:name="ref-Feuerriegel2024"/>
+    <w:bookmarkEnd w:id="89"/>
+    <w:bookmarkStart w:id="91" w:name="ref-Feuerriegel2024"/>
     <w:p>
       <w:pPr>
         <w:pStyle w:val="Bibliography"/>
@@ -6291,7 +6266,7 @@
       <w:r>
         <w:t xml:space="preserve"> </w:t>
       </w:r>
-      <w:hyperlink r:id="rId88">
+      <w:hyperlink r:id="rId90">
         <w:r>
           <w:rPr>
             <w:rStyle w:val="Hyperlink"/>
@@ -6303,8 +6278,8 @@
         <w:t xml:space="preserve">.</w:t>
       </w:r>
     </w:p>
-    <w:bookmarkEnd w:id="89"/>
-    <w:bookmarkStart w:id="91" w:name="ref-Gattiglia2025"/>
+    <w:bookmarkEnd w:id="91"/>
+    <w:bookmarkStart w:id="93" w:name="ref-Gattiglia2025"/>
     <w:p>
       <w:pPr>
         <w:pStyle w:val="Bibliography"/>
@@ -6331,7 +6306,7 @@
       <w:r>
         <w:t xml:space="preserve"> </w:t>
       </w:r>
-      <w:hyperlink r:id="rId90">
+      <w:hyperlink r:id="rId92">
         <w:r>
           <w:rPr>
             <w:rStyle w:val="Hyperlink"/>
@@ -6343,8 +6318,8 @@
         <w:t xml:space="preserve">.</w:t>
       </w:r>
     </w:p>
-    <w:bookmarkEnd w:id="91"/>
-    <w:bookmarkStart w:id="93" w:name="ref-GildeZuniga2024"/>
+    <w:bookmarkEnd w:id="93"/>
+    <w:bookmarkStart w:id="95" w:name="ref-GildeZuniga2024"/>
     <w:p>
       <w:pPr>
         <w:pStyle w:val="Bibliography"/>
@@ -6380,7 +6355,7 @@
       <w:r>
         <w:t xml:space="preserve"> </w:t>
       </w:r>
-      <w:hyperlink r:id="rId92">
+      <w:hyperlink r:id="rId94">
         <w:r>
           <w:rPr>
             <w:rStyle w:val="Hyperlink"/>
@@ -6392,8 +6367,8 @@
         <w:t xml:space="preserve">.</w:t>
       </w:r>
     </w:p>
-    <w:bookmarkEnd w:id="93"/>
-    <w:bookmarkStart w:id="95" w:name="ref-Gougherty2024"/>
+    <w:bookmarkEnd w:id="95"/>
+    <w:bookmarkStart w:id="97" w:name="ref-Gougherty2024"/>
     <w:p>
       <w:pPr>
         <w:pStyle w:val="Bibliography"/>
@@ -6441,7 +6416,7 @@
       <w:r>
         <w:t xml:space="preserve"> </w:t>
       </w:r>
-      <w:hyperlink r:id="rId94">
+      <w:hyperlink r:id="rId96">
         <w:r>
           <w:rPr>
             <w:rStyle w:val="Hyperlink"/>
@@ -6453,14 +6428,14 @@
         <w:t xml:space="preserve">.</w:t>
       </w:r>
     </w:p>
-    <w:bookmarkEnd w:id="95"/>
-    <w:bookmarkStart w:id="97" w:name="ref-Goyal2026"/>
+    <w:bookmarkEnd w:id="97"/>
+    <w:bookmarkStart w:id="99" w:name="ref-Goyal2026"/>
     <w:p>
       <w:pPr>
         <w:pStyle w:val="Bibliography"/>
       </w:pPr>
       <w:r>
-        <w:t xml:space="preserve">Goyal, Palash, Mihir Parmar, Yiwen Song, Hamid Palangi, Tomas Pfister, and Jinsung Yoon. 2026.</w:t>
+        <w:t xml:space="preserve">Goyal, Palash, Mihir Parmar, Yiwen Song, et al. 2026.</w:t>
       </w:r>
       <w:r>
         <w:t xml:space="preserve"> </w:t>
@@ -6474,20 +6449,7 @@
       <w:r>
         <w:t xml:space="preserve"> </w:t>
       </w:r>
-      <w:r>
-        <w:rPr>
-          <w:iCs/>
-          <w:i/>
-        </w:rPr>
-        <w:t xml:space="preserve">arXiv Preprint arXiv:2601.22638</w:t>
-      </w:r>
-      <w:r>
-        <w:t xml:space="preserve">.</w:t>
-      </w:r>
-      <w:r>
-        <w:t xml:space="preserve"> </w:t>
-      </w:r>
-      <w:hyperlink r:id="rId96">
+      <w:hyperlink r:id="rId98">
         <w:r>
           <w:rPr>
             <w:rStyle w:val="Hyperlink"/>
@@ -6499,14 +6461,14 @@
         <w:t xml:space="preserve">.</w:t>
       </w:r>
     </w:p>
-    <w:bookmarkEnd w:id="97"/>
-    <w:bookmarkStart w:id="99" w:name="ref-Greenacre2022Principal"/>
+    <w:bookmarkEnd w:id="99"/>
+    <w:bookmarkStart w:id="101" w:name="ref-Greenacre2022Principal"/>
     <w:p>
       <w:pPr>
         <w:pStyle w:val="Bibliography"/>
       </w:pPr>
       <w:r>
-        <w:t xml:space="preserve">Greenacre, Michael, Patrick J. F. Groenen, Trevor Hastie, Alfonso Iodice D’Enza, Angelos Markos, and Elena Tuzhilina. 2022. Principal Component Analysis.</w:t>
+        <w:t xml:space="preserve">Greenacre, Michael, Patrick J. F. Groenen, Trevor Hastie, et al. 2022. Principal Component Analysis.</w:t>
       </w:r>
       <w:r>
         <w:t xml:space="preserve"> </w:t>
@@ -6527,7 +6489,7 @@
       <w:r>
         <w:t xml:space="preserve"> </w:t>
       </w:r>
-      <w:hyperlink r:id="rId98">
+      <w:hyperlink r:id="rId100">
         <w:r>
           <w:rPr>
             <w:rStyle w:val="Hyperlink"/>
@@ -6539,14 +6501,14 @@
         <w:t xml:space="preserve">.</w:t>
       </w:r>
     </w:p>
-    <w:bookmarkEnd w:id="99"/>
-    <w:bookmarkStart w:id="101" w:name="ref-Grossmann2023Transformation"/>
+    <w:bookmarkEnd w:id="101"/>
+    <w:bookmarkStart w:id="103" w:name="ref-Grossmann2023Transformation"/>
     <w:p>
       <w:pPr>
         <w:pStyle w:val="Bibliography"/>
       </w:pPr>
       <w:r>
-        <w:t xml:space="preserve">Grossmann, Igor, Matthew Feinberg, Dawn C. Parker, Nicholas A. Christakis, Philip E. Tetlock, and William A. Cunningham. 2023.</w:t>
+        <w:t xml:space="preserve">Grossmann, Igor, Matthew Feinberg, Dawn C. Parker, et al. 2023.</w:t>
       </w:r>
       <w:r>
         <w:t xml:space="preserve"> </w:t>
@@ -6579,7 +6541,7 @@
       <w:r>
         <w:t xml:space="preserve"> </w:t>
       </w:r>
-      <w:hyperlink r:id="rId100">
+      <w:hyperlink r:id="rId102">
         <w:r>
           <w:rPr>
             <w:rStyle w:val="Hyperlink"/>
@@ -6589,30 +6551,6 @@
       </w:hyperlink>
       <w:r>
         <w:t xml:space="preserve">.</w:t>
-      </w:r>
-    </w:p>
-    <w:bookmarkEnd w:id="101"/>
-    <w:bookmarkStart w:id="103" w:name="ref-Guo2024"/>
-    <w:p>
-      <w:pPr>
-        <w:pStyle w:val="Bibliography"/>
-      </w:pPr>
-      <w:r>
-        <w:t xml:space="preserve">Guo, Taicheng, Xiuying Chen, Yaqi Wang, Ruidi Chang, Shichao Pei, Nitesh V. Chawla, Olaf Wiest, et al. 2024.</w:t>
-      </w:r>
-      <w:r>
-        <w:t xml:space="preserve"> </w:t>
-      </w:r>
-      <w:hyperlink r:id="rId102">
-        <w:r>
-          <w:rPr>
-            <w:rStyle w:val="Hyperlink"/>
-          </w:rPr>
-          <w:t xml:space="preserve">Large Language Model Based Multi-Agents: A Survey of Progress and Challenges</w:t>
-        </w:r>
-      </w:hyperlink>
-      <w:r>
-        <w:t xml:space="preserve">, pp. 8048–8057.</w:t>
       </w:r>
     </w:p>
     <w:bookmarkEnd w:id="103"/>
@@ -6711,7 +6649,20 @@
         <w:pStyle w:val="Bibliography"/>
       </w:pPr>
       <w:r>
-        <w:t xml:space="preserve">Hariri, Ali, Stéphane Jean, and Mickaël Baron. 2025.</w:t>
+        <w:t xml:space="preserve">Hariri, Ali, Stéphane Jean, and Mickaël Baron. 2025. Towards Automating RDF Extraction for Archaeological Knowledge Graphs with LLMs. In</w:t>
+      </w:r>
+      <w:r>
+        <w:t xml:space="preserve"> </w:t>
+      </w:r>
+      <w:r>
+        <w:rPr>
+          <w:iCs/>
+          <w:i/>
+        </w:rPr>
+        <w:t xml:space="preserve">Database and Expert Systems Applications</w:t>
+      </w:r>
+      <w:r>
+        <w:t xml:space="preserve">, pp. 83–97. Lecture Notes in Computer Science. Springer Nature Switzerland, Cham, Switzerland.</w:t>
       </w:r>
       <w:r>
         <w:t xml:space="preserve"> </w:t>
@@ -6721,24 +6672,11 @@
           <w:rPr>
             <w:rStyle w:val="Hyperlink"/>
           </w:rPr>
-          <w:t xml:space="preserve">Towards Automating RDF Extraction for Archaeological Knowledge Graphs with LLMs</w:t>
+          <w:t xml:space="preserve">https://doi.org/10.1007/978-3-032-02049-9_6</w:t>
         </w:r>
       </w:hyperlink>
       <w:r>
-        <w:t xml:space="preserve">. In</w:t>
-      </w:r>
-      <w:r>
-        <w:t xml:space="preserve"> </w:t>
-      </w:r>
-      <w:r>
-        <w:rPr>
-          <w:iCs/>
-          <w:i/>
-        </w:rPr>
-        <w:t xml:space="preserve">Database and Expert Systems Applications</w:t>
-      </w:r>
-      <w:r>
-        <w:t xml:space="preserve">, pp. 83–97. Lecture Notes in Computer Science. Springer Nature Switzerland.</w:t>
+        <w:t xml:space="preserve">.</w:t>
       </w:r>
     </w:p>
     <w:bookmarkEnd w:id="109"/>
@@ -6877,7 +6815,32 @@
         <w:pStyle w:val="Bibliography"/>
       </w:pPr>
       <w:r>
-        <w:t xml:space="preserve">Jonker, Catholijn M., Luciano Cavalcante Siebert, and Pradeep K. Murukannaiah. 2024.</w:t>
+        <w:t xml:space="preserve">Jonker, Catholijn M., Luciano Cavalcante Siebert, and Pradeep K. Murukannaiah. 2024. Reflective Hybrid Intelligence for Meaningful</w:t>
+      </w:r>
+      <w:r>
+        <w:t xml:space="preserve"> </w:t>
+      </w:r>
+      <w:r>
+        <w:t xml:space="preserve">Human Control</w:t>
+      </w:r>
+      <w:r>
+        <w:t xml:space="preserve"> </w:t>
+      </w:r>
+      <w:r>
+        <w:t xml:space="preserve">in Decision-Support Systems. In</w:t>
+      </w:r>
+      <w:r>
+        <w:t xml:space="preserve"> </w:t>
+      </w:r>
+      <w:r>
+        <w:rPr>
+          <w:iCs/>
+          <w:i/>
+        </w:rPr>
+        <w:t xml:space="preserve">Research Handbook on Meaningful Human Control of Artificial Intelligence Systems</w:t>
+      </w:r>
+      <w:r>
+        <w:t xml:space="preserve">, pp. 188–204. Edward Elgar Publishing, Cheltenham, UK.</w:t>
       </w:r>
       <w:r>
         <w:t xml:space="preserve"> </w:t>
@@ -6887,48 +6850,11 @@
           <w:rPr>
             <w:rStyle w:val="Hyperlink"/>
           </w:rPr>
-          <w:t xml:space="preserve">Reflective Hybrid Intelligence for Meaningful</w:t>
-        </w:r>
-        <w:r>
-          <w:rPr>
-            <w:rStyle w:val="Hyperlink"/>
-          </w:rPr>
-          <w:t xml:space="preserve"> </w:t>
-        </w:r>
-        <w:r>
-          <w:rPr>
-            <w:rStyle w:val="Hyperlink"/>
-          </w:rPr>
-          <w:t xml:space="preserve">Human Control</w:t>
-        </w:r>
-        <w:r>
-          <w:rPr>
-            <w:rStyle w:val="Hyperlink"/>
-          </w:rPr>
-          <w:t xml:space="preserve"> </w:t>
-        </w:r>
-        <w:r>
-          <w:rPr>
-            <w:rStyle w:val="Hyperlink"/>
-          </w:rPr>
-          <w:t xml:space="preserve">in Decision-Support Systems</w:t>
+          <w:t xml:space="preserve">https://doi.org/10.4337/9781802204131.00019</w:t>
         </w:r>
       </w:hyperlink>
       <w:r>
-        <w:t xml:space="preserve">. In</w:t>
-      </w:r>
-      <w:r>
-        <w:t xml:space="preserve"> </w:t>
-      </w:r>
-      <w:r>
-        <w:rPr>
-          <w:iCs/>
-          <w:i/>
-        </w:rPr>
-        <w:t xml:space="preserve">Research Handbook on Meaningful Human Control of Artificial Intelligence Systems</w:t>
-      </w:r>
-      <w:r>
-        <w:t xml:space="preserve">, pp. 188–204. Edward Elgar Publishing.</w:t>
+        <w:t xml:space="preserve">.</w:t>
       </w:r>
     </w:p>
     <w:bookmarkEnd w:id="117"/>
@@ -6963,7 +6889,10 @@
         <w:t xml:space="preserve">Internet Archaeology</w:t>
       </w:r>
       <w:r>
-        <w:t xml:space="preserve">(71).</w:t>
+        <w:t xml:space="preserve"> </w:t>
+      </w:r>
+      <w:r>
+        <w:t xml:space="preserve">71.</w:t>
       </w:r>
       <w:r>
         <w:t xml:space="preserve"> </w:t>
@@ -6981,62 +6910,13 @@
       </w:r>
     </w:p>
     <w:bookmarkEnd w:id="119"/>
-    <w:bookmarkStart w:id="121" w:name="ref-Kasneci2023"/>
+    <w:bookmarkStart w:id="121" w:name="ref-Kim2026Power"/>
     <w:p>
       <w:pPr>
         <w:pStyle w:val="Bibliography"/>
       </w:pPr>
       <w:r>
-        <w:t xml:space="preserve">Kasneci, Enkelejda, Kathrin Sessler, Stefan Küchemann, Maria Bannert, Daryna Dementieva, Frank Fischer, Urs Gasser, et al. 2023.</w:t>
-      </w:r>
-      <w:r>
-        <w:t xml:space="preserve"> </w:t>
-      </w:r>
-      <w:r>
-        <w:t xml:space="preserve">ChatGPT for Good? On Opportunities and Challenges of Large Language Models for Education</w:t>
-      </w:r>
-      <w:r>
-        <w:t xml:space="preserve">.</w:t>
-      </w:r>
-      <w:r>
-        <w:t xml:space="preserve"> </w:t>
-      </w:r>
-      <w:r>
-        <w:rPr>
-          <w:iCs/>
-          <w:i/>
-        </w:rPr>
-        <w:t xml:space="preserve">Learning and Individual Differences</w:t>
-      </w:r>
-      <w:r>
-        <w:t xml:space="preserve"> </w:t>
-      </w:r>
-      <w:r>
-        <w:t xml:space="preserve">103:102274.</w:t>
-      </w:r>
-      <w:r>
-        <w:t xml:space="preserve"> </w:t>
-      </w:r>
-      <w:hyperlink r:id="rId120">
-        <w:r>
-          <w:rPr>
-            <w:rStyle w:val="Hyperlink"/>
-          </w:rPr>
-          <w:t xml:space="preserve">https://doi.org/10.1016/j.lindif.2023.102274</w:t>
-        </w:r>
-      </w:hyperlink>
-      <w:r>
-        <w:t xml:space="preserve">.</w:t>
-      </w:r>
-    </w:p>
-    <w:bookmarkEnd w:id="121"/>
-    <w:bookmarkStart w:id="123" w:name="ref-Kim2026Power"/>
-    <w:p>
-      <w:pPr>
-        <w:pStyle w:val="Bibliography"/>
-      </w:pPr>
-      <w:r>
-        <w:t xml:space="preserve">Kim, Hajung, Jia Qi, Zhe Feng, Xiaoya Zhang, Yuting Han, Jinbo He, and Feng Ji. 2026. Can Large Language Models (</w:t>
+        <w:t xml:space="preserve">Kim, Hajung, Jia Qi, Zhe Feng, et al. 2026. Can Large Language Models (</w:t>
       </w:r>
       <w:r>
         <w:t xml:space="preserve">LLMs</w:t>
@@ -7063,7 +6943,7 @@
       <w:r>
         <w:t xml:space="preserve"> </w:t>
       </w:r>
-      <w:hyperlink r:id="rId122">
+      <w:hyperlink r:id="rId120">
         <w:r>
           <w:rPr>
             <w:rStyle w:val="Hyperlink"/>
@@ -7075,8 +6955,8 @@
         <w:t xml:space="preserve">.</w:t>
       </w:r>
     </w:p>
-    <w:bookmarkEnd w:id="123"/>
-    <w:bookmarkStart w:id="125" w:name="ref-Korinek2023"/>
+    <w:bookmarkEnd w:id="121"/>
+    <w:bookmarkStart w:id="123" w:name="ref-Korinek2023"/>
     <w:p>
       <w:pPr>
         <w:pStyle w:val="Bibliography"/>
@@ -7103,7 +6983,7 @@
       <w:r>
         <w:t xml:space="preserve"> </w:t>
       </w:r>
-      <w:hyperlink r:id="rId124">
+      <w:hyperlink r:id="rId122">
         <w:r>
           <w:rPr>
             <w:rStyle w:val="Hyperlink"/>
@@ -7115,14 +6995,84 @@
         <w:t xml:space="preserve">.</w:t>
       </w:r>
     </w:p>
+    <w:bookmarkEnd w:id="123"/>
+    <w:bookmarkStart w:id="125" w:name="ref-Korinek2025"/>
+    <w:p>
+      <w:pPr>
+        <w:pStyle w:val="Bibliography"/>
+      </w:pPr>
+      <w:r>
+        <w:t xml:space="preserve">Korinek, Anton. 2025.</w:t>
+      </w:r>
+      <w:r>
+        <w:t xml:space="preserve"> </w:t>
+      </w:r>
+      <w:r>
+        <w:t xml:space="preserve">AI</w:t>
+      </w:r>
+      <w:r>
+        <w:t xml:space="preserve"> </w:t>
+      </w:r>
+      <w:r>
+        <w:t xml:space="preserve">Agents for Economic Research.</w:t>
+      </w:r>
+      <w:r>
+        <w:t xml:space="preserve"> </w:t>
+      </w:r>
+      <w:hyperlink r:id="rId124">
+        <w:r>
+          <w:rPr>
+            <w:rStyle w:val="Hyperlink"/>
+          </w:rPr>
+          <w:t xml:space="preserve">https://www.nber.org/papers/w34202</w:t>
+        </w:r>
+      </w:hyperlink>
+      <w:r>
+        <w:t xml:space="preserve">, accessed September 29, 2026.</w:t>
+      </w:r>
+    </w:p>
     <w:bookmarkEnd w:id="125"/>
-    <w:bookmarkStart w:id="127" w:name="ref-Korinek2025"/>
+    <w:bookmarkStart w:id="127" w:name="ref-Kwa2025"/>
     <w:p>
       <w:pPr>
         <w:pStyle w:val="Bibliography"/>
       </w:pPr>
       <w:r>
-        <w:t xml:space="preserve">Korinek, Anton. 2025.</w:t>
+        <w:t xml:space="preserve">Kwa, Thomas, Ben West, Joel Becker, et al. 2025.</w:t>
+      </w:r>
+      <w:r>
+        <w:t xml:space="preserve"> </w:t>
+      </w:r>
+      <w:r>
+        <w:t xml:space="preserve">Measuring</w:t>
+      </w:r>
+      <w:r>
+        <w:t xml:space="preserve"> </w:t>
+      </w:r>
+      <w:r>
+        <w:t xml:space="preserve">AI</w:t>
+      </w:r>
+      <w:r>
+        <w:t xml:space="preserve"> </w:t>
+      </w:r>
+      <w:r>
+        <w:t xml:space="preserve">Ability to Complete Long Software Tasks</w:t>
+      </w:r>
+      <w:r>
+        <w:t xml:space="preserve">.</w:t>
+      </w:r>
+      <w:r>
+        <w:t xml:space="preserve"> </w:t>
+      </w:r>
+      <w:r>
+        <w:rPr>
+          <w:iCs/>
+          <w:i/>
+        </w:rPr>
+        <w:t xml:space="preserve">Advances in Neural Information Processing Systems</w:t>
+      </w:r>
+      <w:r>
+        <w:t xml:space="preserve">, pp. 102382–102435.</w:t>
       </w:r>
       <w:r>
         <w:t xml:space="preserve"> </w:t>
@@ -7131,40 +7081,492 @@
         <w:r>
           <w:rPr>
             <w:rStyle w:val="Hyperlink"/>
-            <w:iCs/>
-            <w:i/>
           </w:rPr>
-          <w:t xml:space="preserve">AI</w:t>
+          <w:t xml:space="preserve">https://doi.org/10.52202/085713-3086</w:t>
         </w:r>
+      </w:hyperlink>
+      <w:r>
+        <w:t xml:space="preserve">.</w:t>
+      </w:r>
+    </w:p>
+    <w:bookmarkEnd w:id="127"/>
+    <w:bookmarkStart w:id="129" w:name="ref-Laban2025"/>
+    <w:p>
+      <w:pPr>
+        <w:pStyle w:val="Bibliography"/>
+      </w:pPr>
+      <w:r>
+        <w:t xml:space="preserve">Laban, Philippe, Hiroaki Hayashi, Yingbo Zhou, and Jennifer Neville. 2025.</w:t>
+      </w:r>
+      <w:r>
+        <w:t xml:space="preserve"> </w:t>
+      </w:r>
+      <w:r>
+        <w:t xml:space="preserve">LLMs</w:t>
+      </w:r>
+      <w:r>
+        <w:t xml:space="preserve"> </w:t>
+      </w:r>
+      <w:r>
+        <w:t xml:space="preserve">Get Lost in Multi-Turn Conversation.</w:t>
+      </w:r>
+      <w:r>
+        <w:t xml:space="preserve"> </w:t>
+      </w:r>
+      <w:hyperlink r:id="rId128">
         <w:r>
           <w:rPr>
             <w:rStyle w:val="Hyperlink"/>
-            <w:iCs/>
-            <w:i/>
           </w:rPr>
-          <w:t xml:space="preserve"> </w:t>
+          <w:t xml:space="preserve">https://doi.org/10.48550/arXiv.2505.06120</w:t>
         </w:r>
+      </w:hyperlink>
+      <w:r>
+        <w:t xml:space="preserve">.</w:t>
+      </w:r>
+    </w:p>
+    <w:bookmarkEnd w:id="129"/>
+    <w:bookmarkStart w:id="131" w:name="ref-Leung2023"/>
+    <w:p>
+      <w:pPr>
+        <w:pStyle w:val="Bibliography"/>
+      </w:pPr>
+      <w:r>
+        <w:t xml:space="preserve">Leung, Tiffany I., Taiane de Azevedo Cardoso, Amaryllis Mavragani, and Gunther Eysenbach. 2023. Best Practices for Using AI Tools as an Author, Peer Reviewer, or Editor.</w:t>
+      </w:r>
+      <w:r>
+        <w:t xml:space="preserve"> </w:t>
+      </w:r>
+      <w:r>
+        <w:rPr>
+          <w:iCs/>
+          <w:i/>
+        </w:rPr>
+        <w:t xml:space="preserve">Journal of Medical Internet Research</w:t>
+      </w:r>
+      <w:r>
+        <w:t xml:space="preserve"> </w:t>
+      </w:r>
+      <w:r>
+        <w:t xml:space="preserve">25:e51584.</w:t>
+      </w:r>
+      <w:r>
+        <w:t xml:space="preserve"> </w:t>
+      </w:r>
+      <w:hyperlink r:id="rId130">
         <w:r>
           <w:rPr>
             <w:rStyle w:val="Hyperlink"/>
-            <w:iCs/>
-            <w:i/>
           </w:rPr>
-          <w:t xml:space="preserve">Agents for Economic Research</w:t>
+          <w:t xml:space="preserve">https://doi.org/10.2196/51584</w:t>
         </w:r>
       </w:hyperlink>
       <w:r>
-        <w:t xml:space="preserve">. National Bureau of Economic Research.</w:t>
-      </w:r>
-    </w:p>
-    <w:bookmarkEnd w:id="127"/>
-    <w:bookmarkStart w:id="129" w:name="ref-Moorthy2026"/>
+        <w:t xml:space="preserve">.</w:t>
+      </w:r>
+    </w:p>
+    <w:bookmarkEnd w:id="131"/>
+    <w:bookmarkStart w:id="133" w:name="ref-Lin2026"/>
     <w:p>
       <w:pPr>
         <w:pStyle w:val="Bibliography"/>
       </w:pPr>
       <w:r>
-        <w:t xml:space="preserve">Krishna Moorthy, Sruthi M., Man Qi, Alice Rosen, Yadvinder Malhi, and Roberto Salguero-Gómez. 2026.</w:t>
+        <w:t xml:space="preserve">Lin, Kevin Qinghong, Siyuan Hu, Pan Lu, et al. 2026.</w:t>
+      </w:r>
+      <w:r>
+        <w:t xml:space="preserve"> </w:t>
+      </w:r>
+      <w:r>
+        <w:t xml:space="preserve">PaperDoctor</w:t>
+      </w:r>
+      <w:r>
+        <w:t xml:space="preserve">: Evidence-Grounded and Actionable Feedback for Scientific Papers in Progress.</w:t>
+      </w:r>
+      <w:r>
+        <w:t xml:space="preserve"> </w:t>
+      </w:r>
+      <w:hyperlink r:id="rId132">
+        <w:r>
+          <w:rPr>
+            <w:rStyle w:val="Hyperlink"/>
+          </w:rPr>
+          <w:t xml:space="preserve">https://doi.org/10.48550/arXiv.2609.16995</w:t>
+        </w:r>
+      </w:hyperlink>
+      <w:r>
+        <w:t xml:space="preserve">.</w:t>
+      </w:r>
+    </w:p>
+    <w:bookmarkEnd w:id="133"/>
+    <w:bookmarkStart w:id="135" w:name="ref-Liu2026Dive"/>
+    <w:p>
+      <w:pPr>
+        <w:pStyle w:val="Bibliography"/>
+      </w:pPr>
+      <w:r>
+        <w:t xml:space="preserve">Liu, Jiacheng, Xiaohan Zhao, Xinyi Shang, and Zhiqiang Shen. 2026. Dive into</w:t>
+      </w:r>
+      <w:r>
+        <w:t xml:space="preserve"> </w:t>
+      </w:r>
+      <w:r>
+        <w:t xml:space="preserve">Claude Code</w:t>
+      </w:r>
+      <w:r>
+        <w:t xml:space="preserve">: The Design Space of Today’s and Future</w:t>
+      </w:r>
+      <w:r>
+        <w:t xml:space="preserve"> </w:t>
+      </w:r>
+      <w:r>
+        <w:t xml:space="preserve">AI</w:t>
+      </w:r>
+      <w:r>
+        <w:t xml:space="preserve"> </w:t>
+      </w:r>
+      <w:r>
+        <w:t xml:space="preserve">Agent Systems.</w:t>
+      </w:r>
+      <w:r>
+        <w:t xml:space="preserve"> </w:t>
+      </w:r>
+      <w:hyperlink r:id="rId134">
+        <w:r>
+          <w:rPr>
+            <w:rStyle w:val="Hyperlink"/>
+          </w:rPr>
+          <w:t xml:space="preserve">https://doi.org/10.48550/arXiv.2604.14228</w:t>
+        </w:r>
+      </w:hyperlink>
+      <w:r>
+        <w:t xml:space="preserve">.</w:t>
+      </w:r>
+    </w:p>
+    <w:bookmarkEnd w:id="135"/>
+    <w:bookmarkStart w:id="137" w:name="ref-Longkumer2025Generative"/>
+    <w:p>
+      <w:pPr>
+        <w:pStyle w:val="Bibliography"/>
+      </w:pPr>
+      <w:r>
+        <w:t xml:space="preserve">Longkumer, Tiatemsu. 2025. Generative</w:t>
+      </w:r>
+      <w:r>
+        <w:t xml:space="preserve"> </w:t>
+      </w:r>
+      <w:r>
+        <w:t xml:space="preserve">AI</w:t>
+      </w:r>
+      <w:r>
+        <w:t xml:space="preserve"> </w:t>
+      </w:r>
+      <w:r>
+        <w:t xml:space="preserve">in</w:t>
+      </w:r>
+      <w:r>
+        <w:t xml:space="preserve"> </w:t>
+      </w:r>
+      <w:r>
+        <w:t xml:space="preserve">Anthropology</w:t>
+      </w:r>
+      <w:r>
+        <w:t xml:space="preserve">: Redefining</w:t>
+      </w:r>
+      <w:r>
+        <w:t xml:space="preserve"> </w:t>
+      </w:r>
+      <w:r>
+        <w:t xml:space="preserve">Fieldwork</w:t>
+      </w:r>
+      <w:r>
+        <w:t xml:space="preserve">,</w:t>
+      </w:r>
+      <w:r>
+        <w:t xml:space="preserve"> </w:t>
+      </w:r>
+      <w:r>
+        <w:t xml:space="preserve">Textualisation</w:t>
+      </w:r>
+      <w:r>
+        <w:t xml:space="preserve">, and</w:t>
+      </w:r>
+      <w:r>
+        <w:t xml:space="preserve"> </w:t>
+      </w:r>
+      <w:r>
+        <w:t xml:space="preserve">Collaborative</w:t>
+      </w:r>
+      <w:r>
+        <w:t xml:space="preserve"> </w:t>
+      </w:r>
+      <w:r>
+        <w:t xml:space="preserve">Knowledge</w:t>
+      </w:r>
+      <w:r>
+        <w:t xml:space="preserve"> </w:t>
+      </w:r>
+      <w:r>
+        <w:t xml:space="preserve">Production</w:t>
+      </w:r>
+      <w:r>
+        <w:t xml:space="preserve">.</w:t>
+      </w:r>
+      <w:r>
+        <w:t xml:space="preserve"> </w:t>
+      </w:r>
+      <w:r>
+        <w:rPr>
+          <w:iCs/>
+          <w:i/>
+        </w:rPr>
+        <w:t xml:space="preserve">Teaching Anthropology</w:t>
+      </w:r>
+      <w:r>
+        <w:t xml:space="preserve"> </w:t>
+      </w:r>
+      <w:r>
+        <w:t xml:space="preserve">14(2):118–130.</w:t>
+      </w:r>
+      <w:r>
+        <w:t xml:space="preserve"> </w:t>
+      </w:r>
+      <w:hyperlink r:id="rId136">
+        <w:r>
+          <w:rPr>
+            <w:rStyle w:val="Hyperlink"/>
+          </w:rPr>
+          <w:t xml:space="preserve">https://doi.org/10.22582/ta.v14i2.778</w:t>
+        </w:r>
+      </w:hyperlink>
+      <w:r>
+        <w:t xml:space="preserve">.</w:t>
+      </w:r>
+    </w:p>
+    <w:bookmarkEnd w:id="137"/>
+    <w:bookmarkStart w:id="139" w:name="ref-Lu2026"/>
+    <w:p>
+      <w:pPr>
+        <w:pStyle w:val="Bibliography"/>
+      </w:pPr>
+      <w:r>
+        <w:t xml:space="preserve">Lu, Chris, Cong Lu, Robert Tjarko Lange, et al. 2026. Towards End-to-End Automation of</w:t>
+      </w:r>
+      <w:r>
+        <w:t xml:space="preserve"> </w:t>
+      </w:r>
+      <w:r>
+        <w:t xml:space="preserve">AI</w:t>
+      </w:r>
+      <w:r>
+        <w:t xml:space="preserve"> </w:t>
+      </w:r>
+      <w:r>
+        <w:t xml:space="preserve">Research.</w:t>
+      </w:r>
+      <w:r>
+        <w:t xml:space="preserve"> </w:t>
+      </w:r>
+      <w:r>
+        <w:rPr>
+          <w:iCs/>
+          <w:i/>
+        </w:rPr>
+        <w:t xml:space="preserve">Nature</w:t>
+      </w:r>
+      <w:r>
+        <w:t xml:space="preserve"> </w:t>
+      </w:r>
+      <w:r>
+        <w:t xml:space="preserve">651:914–919.</w:t>
+      </w:r>
+      <w:r>
+        <w:t xml:space="preserve"> </w:t>
+      </w:r>
+      <w:hyperlink r:id="rId138">
+        <w:r>
+          <w:rPr>
+            <w:rStyle w:val="Hyperlink"/>
+          </w:rPr>
+          <w:t xml:space="preserve">https://doi.org/10.1038/s41586-026-10265-5</w:t>
+        </w:r>
+      </w:hyperlink>
+      <w:r>
+        <w:t xml:space="preserve">.</w:t>
+      </w:r>
+    </w:p>
+    <w:bookmarkEnd w:id="139"/>
+    <w:bookmarkStart w:id="141" w:name="ref-lyttelton2026agents"/>
+    <w:p>
+      <w:pPr>
+        <w:pStyle w:val="Bibliography"/>
+      </w:pPr>
+      <w:r>
+        <w:t xml:space="preserve">Lyttelton, Thomas, Maxim Massenkoff, and Nathan Wilmers. 2026. Coding Agents in the Social Sciences.</w:t>
+      </w:r>
+      <w:r>
+        <w:t xml:space="preserve"> </w:t>
+      </w:r>
+      <w:hyperlink r:id="rId140">
+        <w:r>
+          <w:rPr>
+            <w:rStyle w:val="Hyperlink"/>
+          </w:rPr>
+          <w:t xml:space="preserve">https://www.anthropic.com/research/coding-agents-social-sciences</w:t>
+        </w:r>
+      </w:hyperlink>
+      <w:r>
+        <w:t xml:space="preserve">, accessed September 29, 2026.</w:t>
+      </w:r>
+    </w:p>
+    <w:bookmarkEnd w:id="141"/>
+    <w:bookmarkStart w:id="143" w:name="ref-Marwick2017"/>
+    <w:p>
+      <w:pPr>
+        <w:pStyle w:val="Bibliography"/>
+      </w:pPr>
+      <w:r>
+        <w:t xml:space="preserve">Marwick, Ben. 2017. Computational Reproducibility in Archaeological Research: Basic Principles and a Case Study of Their Implementation.</w:t>
+      </w:r>
+      <w:r>
+        <w:t xml:space="preserve"> </w:t>
+      </w:r>
+      <w:r>
+        <w:rPr>
+          <w:iCs/>
+          <w:i/>
+        </w:rPr>
+        <w:t xml:space="preserve">Journal of Archaeological Method and Theory</w:t>
+      </w:r>
+      <w:r>
+        <w:t xml:space="preserve"> </w:t>
+      </w:r>
+      <w:r>
+        <w:t xml:space="preserve">24(2):424–450.</w:t>
+      </w:r>
+      <w:r>
+        <w:t xml:space="preserve"> </w:t>
+      </w:r>
+      <w:hyperlink r:id="rId142">
+        <w:r>
+          <w:rPr>
+            <w:rStyle w:val="Hyperlink"/>
+          </w:rPr>
+          <w:t xml:space="preserve">https://doi.org/10.1007/s10816-015-9272-9</w:t>
+        </w:r>
+      </w:hyperlink>
+      <w:r>
+        <w:t xml:space="preserve">.</w:t>
+      </w:r>
+    </w:p>
+    <w:bookmarkEnd w:id="143"/>
+    <w:bookmarkStart w:id="145" w:name="ref-Messeri2024"/>
+    <w:p>
+      <w:pPr>
+        <w:pStyle w:val="Bibliography"/>
+      </w:pPr>
+      <w:r>
+        <w:t xml:space="preserve">Messeri, Lisa, and M. J. Crockett. 2024. Artificial Intelligence and Illusions of Understanding in Scientific Research.</w:t>
+      </w:r>
+      <w:r>
+        <w:t xml:space="preserve"> </w:t>
+      </w:r>
+      <w:r>
+        <w:rPr>
+          <w:iCs/>
+          <w:i/>
+        </w:rPr>
+        <w:t xml:space="preserve">Nature</w:t>
+      </w:r>
+      <w:r>
+        <w:t xml:space="preserve"> </w:t>
+      </w:r>
+      <w:r>
+        <w:t xml:space="preserve">627(8002):49–58.</w:t>
+      </w:r>
+      <w:r>
+        <w:t xml:space="preserve"> </w:t>
+      </w:r>
+      <w:hyperlink r:id="rId144">
+        <w:r>
+          <w:rPr>
+            <w:rStyle w:val="Hyperlink"/>
+          </w:rPr>
+          <w:t xml:space="preserve">https://doi.org/10.1038/s41586-024-07146-0</w:t>
+        </w:r>
+      </w:hyperlink>
+      <w:r>
+        <w:t xml:space="preserve">.</w:t>
+      </w:r>
+    </w:p>
+    <w:bookmarkEnd w:id="145"/>
+    <w:bookmarkStart w:id="147" w:name="ref-Miao2026"/>
+    <w:p>
+      <w:pPr>
+        <w:pStyle w:val="Bibliography"/>
+      </w:pPr>
+      <w:r>
+        <w:t xml:space="preserve">Miao, Jiacheng, Jonathan K. Pritchard, and James Zou. 2026. The Agentic Garden of Forking Paths.</w:t>
+      </w:r>
+      <w:r>
+        <w:t xml:space="preserve"> </w:t>
+      </w:r>
+      <w:hyperlink r:id="rId146">
+        <w:r>
+          <w:rPr>
+            <w:rStyle w:val="Hyperlink"/>
+          </w:rPr>
+          <w:t xml:space="preserve">https://doi.org/10.48550/arXiv.2607.01507</w:t>
+        </w:r>
+      </w:hyperlink>
+      <w:r>
+        <w:t xml:space="preserve">.</w:t>
+      </w:r>
+    </w:p>
+    <w:bookmarkEnd w:id="147"/>
+    <w:bookmarkStart w:id="149" w:name="ref-Monakhov2026"/>
+    <w:p>
+      <w:pPr>
+        <w:pStyle w:val="Bibliography"/>
+      </w:pPr>
+      <w:r>
+        <w:t xml:space="preserve">Monakhov, Alexander Yu. 2026. Governance as Cybernetics: Feedback, Control, and the</w:t>
+      </w:r>
+      <w:r>
+        <w:t xml:space="preserve"> </w:t>
+      </w:r>
+      <w:r>
+        <w:t xml:space="preserve">Human at the Helm</w:t>
+      </w:r>
+      <w:r>
+        <w:t xml:space="preserve"> </w:t>
+      </w:r>
+      <w:r>
+        <w:t xml:space="preserve">in the Regulation of Artificial Intelligence.</w:t>
+      </w:r>
+      <w:r>
+        <w:t xml:space="preserve"> </w:t>
+      </w:r>
+      <w:hyperlink r:id="rId148">
+        <w:r>
+          <w:rPr>
+            <w:rStyle w:val="Hyperlink"/>
+          </w:rPr>
+          <w:t xml:space="preserve">https://doi.org/10.2139/ssrn.7011058</w:t>
+        </w:r>
+      </w:hyperlink>
+      <w:r>
+        <w:t xml:space="preserve">.</w:t>
+      </w:r>
+    </w:p>
+    <w:bookmarkEnd w:id="149"/>
+    <w:bookmarkStart w:id="151" w:name="ref-Moorthy2026"/>
+    <w:p>
+      <w:pPr>
+        <w:pStyle w:val="Bibliography"/>
+      </w:pPr>
+      <w:r>
+        <w:t xml:space="preserve">Moorthy, Sruthi M. Krishna, Man Qi, Alice Rosen, Yadvinder Malhi, and Roberto Salguero-Gómez. 2026.</w:t>
       </w:r>
       <w:r>
         <w:t xml:space="preserve"> </w:t>
@@ -7203,7 +7605,7 @@
       <w:r>
         <w:t xml:space="preserve"> </w:t>
       </w:r>
-      <w:hyperlink r:id="rId128">
+      <w:hyperlink r:id="rId150">
         <w:r>
           <w:rPr>
             <w:rStyle w:val="Hyperlink"/>
@@ -7215,26 +7617,14 @@
         <w:t xml:space="preserve">.</w:t>
       </w:r>
     </w:p>
-    <w:bookmarkEnd w:id="129"/>
-    <w:bookmarkStart w:id="131" w:name="ref-Laban2025"/>
+    <w:bookmarkEnd w:id="151"/>
+    <w:bookmarkStart w:id="153" w:name="ref-NationalAcademies2026"/>
     <w:p>
       <w:pPr>
         <w:pStyle w:val="Bibliography"/>
       </w:pPr>
       <w:r>
-        <w:t xml:space="preserve">Laban, Philippe, Hiroaki Hayashi, Yingbo Zhou, and Jennifer Neville. 2025.</w:t>
-      </w:r>
-      <w:r>
-        <w:t xml:space="preserve"> </w:t>
-      </w:r>
-      <w:r>
-        <w:t xml:space="preserve">LLMs</w:t>
-      </w:r>
-      <w:r>
-        <w:t xml:space="preserve"> </w:t>
-      </w:r>
-      <w:r>
-        <w:t xml:space="preserve">Get Lost in Multi-Turn Conversation.</w:t>
+        <w:t xml:space="preserve">National Academies of Sciences, Engineering, and Medicine. 2026.</w:t>
       </w:r>
       <w:r>
         <w:t xml:space="preserve"> </w:t>
@@ -7244,535 +7634,24 @@
           <w:iCs/>
           <w:i/>
         </w:rPr>
-        <w:t xml:space="preserve">arXiv.org</w:t>
-      </w:r>
-      <w:r>
-        <w:t xml:space="preserve">.</w:t>
-      </w:r>
-      <w:r>
-        <w:t xml:space="preserve"> </w:t>
-      </w:r>
-      <w:hyperlink r:id="rId130">
+        <w:t xml:space="preserve">On Being a Scientist: A Guide to the Responsible and Ethical Conduct of Research: Fourth Edition</w:t>
+      </w:r>
+      <w:r>
+        <w:t xml:space="preserve">. The National Academies Press, Washington, DC.</w:t>
+      </w:r>
+      <w:r>
+        <w:t xml:space="preserve"> </w:t>
+      </w:r>
+      <w:hyperlink r:id="rId152">
         <w:r>
           <w:rPr>
             <w:rStyle w:val="Hyperlink"/>
           </w:rPr>
-          <w:t xml:space="preserve">https://doi.org/10.48550/arXiv.2505.06120</w:t>
+          <w:t xml:space="preserve">https://doi.org/10.17226/29488</w:t>
         </w:r>
       </w:hyperlink>
       <w:r>
         <w:t xml:space="preserve">.</w:t>
-      </w:r>
-    </w:p>
-    <w:bookmarkEnd w:id="131"/>
-    <w:bookmarkStart w:id="133" w:name="ref-Leung2023"/>
-    <w:p>
-      <w:pPr>
-        <w:pStyle w:val="Bibliography"/>
-      </w:pPr>
-      <w:r>
-        <w:t xml:space="preserve">Leung, Tiffany I., Taiane de Azevedo Cardoso, Amaryllis Mavragani, and Gunther Eysenbach. 2023. Best Practices for Using AI Tools as an Author, Peer Reviewer, or Editor.</w:t>
-      </w:r>
-      <w:r>
-        <w:t xml:space="preserve"> </w:t>
-      </w:r>
-      <w:r>
-        <w:rPr>
-          <w:iCs/>
-          <w:i/>
-        </w:rPr>
-        <w:t xml:space="preserve">Journal of Medical Internet Research</w:t>
-      </w:r>
-      <w:r>
-        <w:t xml:space="preserve"> </w:t>
-      </w:r>
-      <w:r>
-        <w:t xml:space="preserve">25:e51584.</w:t>
-      </w:r>
-      <w:r>
-        <w:t xml:space="preserve"> </w:t>
-      </w:r>
-      <w:hyperlink r:id="rId132">
-        <w:r>
-          <w:rPr>
-            <w:rStyle w:val="Hyperlink"/>
-          </w:rPr>
-          <w:t xml:space="preserve">https://doi.org/10.2196/51584</w:t>
-        </w:r>
-      </w:hyperlink>
-      <w:r>
-        <w:t xml:space="preserve">.</w:t>
-      </w:r>
-    </w:p>
-    <w:bookmarkEnd w:id="133"/>
-    <w:bookmarkStart w:id="135" w:name="ref-Lin2026"/>
-    <w:p>
-      <w:pPr>
-        <w:pStyle w:val="Bibliography"/>
-      </w:pPr>
-      <w:r>
-        <w:t xml:space="preserve">Lin, Kevin Qinghong, Siyuan Hu, Pan Lu, Yu Chen, Yanzhe Chen, Owen Queen, Yupeng Chen, et al. 2026.</w:t>
-      </w:r>
-      <w:r>
-        <w:t xml:space="preserve"> </w:t>
-      </w:r>
-      <w:r>
-        <w:t xml:space="preserve">PaperDoctor</w:t>
-      </w:r>
-      <w:r>
-        <w:t xml:space="preserve">: Evidence-Grounded and Actionable Feedback for Scientific Papers in Progress.</w:t>
-      </w:r>
-      <w:r>
-        <w:t xml:space="preserve"> </w:t>
-      </w:r>
-      <w:r>
-        <w:rPr>
-          <w:iCs/>
-          <w:i/>
-        </w:rPr>
-        <w:t xml:space="preserve">arXiv Preprint arXiv:2609.16995</w:t>
-      </w:r>
-      <w:r>
-        <w:t xml:space="preserve">.</w:t>
-      </w:r>
-      <w:r>
-        <w:t xml:space="preserve"> </w:t>
-      </w:r>
-      <w:hyperlink r:id="rId134">
-        <w:r>
-          <w:rPr>
-            <w:rStyle w:val="Hyperlink"/>
-          </w:rPr>
-          <w:t xml:space="preserve">https://doi.org/10.48550/arXiv.2609.16995</w:t>
-        </w:r>
-      </w:hyperlink>
-      <w:r>
-        <w:t xml:space="preserve">.</w:t>
-      </w:r>
-    </w:p>
-    <w:bookmarkEnd w:id="135"/>
-    <w:bookmarkStart w:id="137" w:name="ref-Liu2026Dive"/>
-    <w:p>
-      <w:pPr>
-        <w:pStyle w:val="Bibliography"/>
-      </w:pPr>
-      <w:r>
-        <w:t xml:space="preserve">Liu, Jiacheng, Xiaohan Zhao, Xinyi Shang, and Zhiqiang Shen. 2026. Dive into</w:t>
-      </w:r>
-      <w:r>
-        <w:t xml:space="preserve"> </w:t>
-      </w:r>
-      <w:r>
-        <w:t xml:space="preserve">Claude Code</w:t>
-      </w:r>
-      <w:r>
-        <w:t xml:space="preserve">: The Design Space of Today’s and Future</w:t>
-      </w:r>
-      <w:r>
-        <w:t xml:space="preserve"> </w:t>
-      </w:r>
-      <w:r>
-        <w:t xml:space="preserve">AI</w:t>
-      </w:r>
-      <w:r>
-        <w:t xml:space="preserve"> </w:t>
-      </w:r>
-      <w:r>
-        <w:t xml:space="preserve">Agent Systems.</w:t>
-      </w:r>
-      <w:r>
-        <w:t xml:space="preserve"> </w:t>
-      </w:r>
-      <w:r>
-        <w:rPr>
-          <w:iCs/>
-          <w:i/>
-        </w:rPr>
-        <w:t xml:space="preserve">arXiv Preprint arXiv:2604.14228</w:t>
-      </w:r>
-      <w:r>
-        <w:t xml:space="preserve">.</w:t>
-      </w:r>
-      <w:r>
-        <w:t xml:space="preserve"> </w:t>
-      </w:r>
-      <w:hyperlink r:id="rId136">
-        <w:r>
-          <w:rPr>
-            <w:rStyle w:val="Hyperlink"/>
-          </w:rPr>
-          <w:t xml:space="preserve">https://doi.org/10.48550/arXiv.2604.14228</w:t>
-        </w:r>
-      </w:hyperlink>
-      <w:r>
-        <w:t xml:space="preserve">.</w:t>
-      </w:r>
-    </w:p>
-    <w:bookmarkEnd w:id="137"/>
-    <w:bookmarkStart w:id="139" w:name="ref-Longkumer2025Generative"/>
-    <w:p>
-      <w:pPr>
-        <w:pStyle w:val="Bibliography"/>
-      </w:pPr>
-      <w:r>
-        <w:t xml:space="preserve">Longkumer, Tiatemsu. 2025. Generative</w:t>
-      </w:r>
-      <w:r>
-        <w:t xml:space="preserve"> </w:t>
-      </w:r>
-      <w:r>
-        <w:t xml:space="preserve">AI</w:t>
-      </w:r>
-      <w:r>
-        <w:t xml:space="preserve"> </w:t>
-      </w:r>
-      <w:r>
-        <w:t xml:space="preserve">in</w:t>
-      </w:r>
-      <w:r>
-        <w:t xml:space="preserve"> </w:t>
-      </w:r>
-      <w:r>
-        <w:t xml:space="preserve">Anthropology</w:t>
-      </w:r>
-      <w:r>
-        <w:t xml:space="preserve">: Redefining</w:t>
-      </w:r>
-      <w:r>
-        <w:t xml:space="preserve"> </w:t>
-      </w:r>
-      <w:r>
-        <w:t xml:space="preserve">Fieldwork</w:t>
-      </w:r>
-      <w:r>
-        <w:t xml:space="preserve">,</w:t>
-      </w:r>
-      <w:r>
-        <w:t xml:space="preserve"> </w:t>
-      </w:r>
-      <w:r>
-        <w:t xml:space="preserve">Textualisation</w:t>
-      </w:r>
-      <w:r>
-        <w:t xml:space="preserve">, and</w:t>
-      </w:r>
-      <w:r>
-        <w:t xml:space="preserve"> </w:t>
-      </w:r>
-      <w:r>
-        <w:t xml:space="preserve">Collaborative</w:t>
-      </w:r>
-      <w:r>
-        <w:t xml:space="preserve"> </w:t>
-      </w:r>
-      <w:r>
-        <w:t xml:space="preserve">Knowledge</w:t>
-      </w:r>
-      <w:r>
-        <w:t xml:space="preserve"> </w:t>
-      </w:r>
-      <w:r>
-        <w:t xml:space="preserve">Production</w:t>
-      </w:r>
-      <w:r>
-        <w:t xml:space="preserve">.</w:t>
-      </w:r>
-      <w:r>
-        <w:t xml:space="preserve"> </w:t>
-      </w:r>
-      <w:r>
-        <w:rPr>
-          <w:iCs/>
-          <w:i/>
-        </w:rPr>
-        <w:t xml:space="preserve">Teaching Anthropology</w:t>
-      </w:r>
-      <w:r>
-        <w:t xml:space="preserve"> </w:t>
-      </w:r>
-      <w:r>
-        <w:t xml:space="preserve">14(2):118–130.</w:t>
-      </w:r>
-      <w:r>
-        <w:t xml:space="preserve"> </w:t>
-      </w:r>
-      <w:hyperlink r:id="rId138">
-        <w:r>
-          <w:rPr>
-            <w:rStyle w:val="Hyperlink"/>
-          </w:rPr>
-          <w:t xml:space="preserve">https://doi.org/10.22582/ta.v14i2.778</w:t>
-        </w:r>
-      </w:hyperlink>
-      <w:r>
-        <w:t xml:space="preserve">.</w:t>
-      </w:r>
-    </w:p>
-    <w:bookmarkEnd w:id="139"/>
-    <w:bookmarkStart w:id="141" w:name="ref-Lu2026"/>
-    <w:p>
-      <w:pPr>
-        <w:pStyle w:val="Bibliography"/>
-      </w:pPr>
-      <w:r>
-        <w:t xml:space="preserve">Lu, Chris, Cong Lu, Robert Tjarko Lange, Yutaro Yamada, Shengran Hu, Jakob Foerster, David Ha, et al. 2026. Towards End-to-End Automation of</w:t>
-      </w:r>
-      <w:r>
-        <w:t xml:space="preserve"> </w:t>
-      </w:r>
-      <w:r>
-        <w:t xml:space="preserve">AI</w:t>
-      </w:r>
-      <w:r>
-        <w:t xml:space="preserve"> </w:t>
-      </w:r>
-      <w:r>
-        <w:t xml:space="preserve">Research.</w:t>
-      </w:r>
-      <w:r>
-        <w:t xml:space="preserve"> </w:t>
-      </w:r>
-      <w:r>
-        <w:rPr>
-          <w:iCs/>
-          <w:i/>
-        </w:rPr>
-        <w:t xml:space="preserve">Nature</w:t>
-      </w:r>
-      <w:r>
-        <w:t xml:space="preserve"> </w:t>
-      </w:r>
-      <w:r>
-        <w:t xml:space="preserve">651:914–919.</w:t>
-      </w:r>
-      <w:r>
-        <w:t xml:space="preserve"> </w:t>
-      </w:r>
-      <w:hyperlink r:id="rId140">
-        <w:r>
-          <w:rPr>
-            <w:rStyle w:val="Hyperlink"/>
-          </w:rPr>
-          <w:t xml:space="preserve">https://doi.org/10.1038/s41586-026-10265-5</w:t>
-        </w:r>
-      </w:hyperlink>
-      <w:r>
-        <w:t xml:space="preserve">.</w:t>
-      </w:r>
-    </w:p>
-    <w:bookmarkEnd w:id="141"/>
-    <w:bookmarkStart w:id="143" w:name="ref-lyttelton2026agents"/>
-    <w:p>
-      <w:pPr>
-        <w:pStyle w:val="Bibliography"/>
-      </w:pPr>
-      <w:r>
-        <w:t xml:space="preserve">Lyttelton, Thomas, Maxim Massenkoff, and Nathan Wilmers. 2026. Coding Agents in the Social Sciences.</w:t>
-      </w:r>
-      <w:r>
-        <w:t xml:space="preserve"> </w:t>
-      </w:r>
-      <w:hyperlink r:id="rId142">
-        <w:r>
-          <w:rPr>
-            <w:rStyle w:val="Hyperlink"/>
-          </w:rPr>
-          <w:t xml:space="preserve">https://www.anthropic.com/research/coding-agents-social-sciences</w:t>
-        </w:r>
-      </w:hyperlink>
-      <w:r>
-        <w:t xml:space="preserve">.</w:t>
-      </w:r>
-    </w:p>
-    <w:bookmarkEnd w:id="143"/>
-    <w:bookmarkStart w:id="145" w:name="ref-Marwick2017"/>
-    <w:p>
-      <w:pPr>
-        <w:pStyle w:val="Bibliography"/>
-      </w:pPr>
-      <w:r>
-        <w:t xml:space="preserve">Marwick, Ben. 2017. Computational Reproducibility in Archaeological Research: Basic Principles and a Case Study of Their Implementation.</w:t>
-      </w:r>
-      <w:r>
-        <w:t xml:space="preserve"> </w:t>
-      </w:r>
-      <w:r>
-        <w:rPr>
-          <w:iCs/>
-          <w:i/>
-        </w:rPr>
-        <w:t xml:space="preserve">Journal of Archaeological Method and Theory</w:t>
-      </w:r>
-      <w:r>
-        <w:t xml:space="preserve"> </w:t>
-      </w:r>
-      <w:r>
-        <w:t xml:space="preserve">24(2):424–450.</w:t>
-      </w:r>
-      <w:r>
-        <w:t xml:space="preserve"> </w:t>
-      </w:r>
-      <w:hyperlink r:id="rId144">
-        <w:r>
-          <w:rPr>
-            <w:rStyle w:val="Hyperlink"/>
-          </w:rPr>
-          <w:t xml:space="preserve">https://doi.org/10.1007/s10816-015-9272-9</w:t>
-        </w:r>
-      </w:hyperlink>
-      <w:r>
-        <w:t xml:space="preserve">.</w:t>
-      </w:r>
-    </w:p>
-    <w:bookmarkEnd w:id="145"/>
-    <w:bookmarkStart w:id="147" w:name="ref-Messeri2024"/>
-    <w:p>
-      <w:pPr>
-        <w:pStyle w:val="Bibliography"/>
-      </w:pPr>
-      <w:r>
-        <w:t xml:space="preserve">Messeri, Lisa, and M. J. Crockett. 2024. Artificial Intelligence and Illusions of Understanding in Scientific Research.</w:t>
-      </w:r>
-      <w:r>
-        <w:t xml:space="preserve"> </w:t>
-      </w:r>
-      <w:r>
-        <w:rPr>
-          <w:iCs/>
-          <w:i/>
-        </w:rPr>
-        <w:t xml:space="preserve">Nature</w:t>
-      </w:r>
-      <w:r>
-        <w:t xml:space="preserve"> </w:t>
-      </w:r>
-      <w:r>
-        <w:t xml:space="preserve">627(8002):49–58.</w:t>
-      </w:r>
-      <w:r>
-        <w:t xml:space="preserve"> </w:t>
-      </w:r>
-      <w:hyperlink r:id="rId146">
-        <w:r>
-          <w:rPr>
-            <w:rStyle w:val="Hyperlink"/>
-          </w:rPr>
-          <w:t xml:space="preserve">https://doi.org/10.1038/s41586-024-07146-0</w:t>
-        </w:r>
-      </w:hyperlink>
-      <w:r>
-        <w:t xml:space="preserve">.</w:t>
-      </w:r>
-    </w:p>
-    <w:bookmarkEnd w:id="147"/>
-    <w:bookmarkStart w:id="149" w:name="ref-Miao2026"/>
-    <w:p>
-      <w:pPr>
-        <w:pStyle w:val="Bibliography"/>
-      </w:pPr>
-      <w:r>
-        <w:t xml:space="preserve">Miao, Jiacheng, Jonathan K. Pritchard, and James Zou. 2026. The Agentic Garden of Forking Paths.</w:t>
-      </w:r>
-      <w:r>
-        <w:t xml:space="preserve"> </w:t>
-      </w:r>
-      <w:r>
-        <w:rPr>
-          <w:iCs/>
-          <w:i/>
-        </w:rPr>
-        <w:t xml:space="preserve">arXiv Preprint arXiv:2607.01507</w:t>
-      </w:r>
-      <w:r>
-        <w:t xml:space="preserve">.</w:t>
-      </w:r>
-      <w:r>
-        <w:t xml:space="preserve"> </w:t>
-      </w:r>
-      <w:hyperlink r:id="rId148">
-        <w:r>
-          <w:rPr>
-            <w:rStyle w:val="Hyperlink"/>
-          </w:rPr>
-          <w:t xml:space="preserve">https://doi.org/10.48550/arXiv.2607.01507</w:t>
-        </w:r>
-      </w:hyperlink>
-      <w:r>
-        <w:t xml:space="preserve">.</w:t>
-      </w:r>
-    </w:p>
-    <w:bookmarkEnd w:id="149"/>
-    <w:bookmarkStart w:id="151" w:name="ref-Monakhov2026"/>
-    <w:p>
-      <w:pPr>
-        <w:pStyle w:val="Bibliography"/>
-      </w:pPr>
-      <w:r>
-        <w:t xml:space="preserve">Monakhov, Alexander Yu. 2026.</w:t>
-      </w:r>
-      <w:r>
-        <w:t xml:space="preserve"> </w:t>
-      </w:r>
-      <w:hyperlink r:id="rId150">
-        <w:r>
-          <w:rPr>
-            <w:rStyle w:val="Hyperlink"/>
-          </w:rPr>
-          <w:t xml:space="preserve">Governance as Cybernetics: Feedback, Control, and the</w:t>
-        </w:r>
-        <w:r>
-          <w:rPr>
-            <w:rStyle w:val="Hyperlink"/>
-          </w:rPr>
-          <w:t xml:space="preserve"> </w:t>
-        </w:r>
-        <w:r>
-          <w:rPr>
-            <w:rStyle w:val="Hyperlink"/>
-          </w:rPr>
-          <w:t xml:space="preserve">Human at the Helm</w:t>
-        </w:r>
-        <w:r>
-          <w:rPr>
-            <w:rStyle w:val="Hyperlink"/>
-          </w:rPr>
-          <w:t xml:space="preserve"> </w:t>
-        </w:r>
-        <w:r>
-          <w:rPr>
-            <w:rStyle w:val="Hyperlink"/>
-          </w:rPr>
-          <w:t xml:space="preserve">in the Regulation of Artificial Intelligence</w:t>
-        </w:r>
-      </w:hyperlink>
-      <w:r>
-        <w:t xml:space="preserve">. Elsevier BV.</w:t>
-      </w:r>
-    </w:p>
-    <w:bookmarkEnd w:id="151"/>
-    <w:bookmarkStart w:id="153" w:name="ref-NationalAcademies2026"/>
-    <w:p>
-      <w:pPr>
-        <w:pStyle w:val="Bibliography"/>
-      </w:pPr>
-      <w:r>
-        <w:t xml:space="preserve">National Academies of Sciences, Engineering, and Medicine. 2026.</w:t>
-      </w:r>
-      <w:r>
-        <w:t xml:space="preserve"> </w:t>
-      </w:r>
-      <w:hyperlink r:id="rId152">
-        <w:r>
-          <w:rPr>
-            <w:rStyle w:val="Hyperlink"/>
-            <w:iCs/>
-            <w:i/>
-          </w:rPr>
-          <w:t xml:space="preserve">On Being a Scientist: A Guide to the Responsible and Ethical Conduct of Research: Fourth Edition</w:t>
-        </w:r>
-      </w:hyperlink>
-      <w:r>
-        <w:t xml:space="preserve">. The National Academies Press, Washington, DC.</w:t>
       </w:r>
     </w:p>
     <w:bookmarkEnd w:id="153"/>
@@ -7825,31 +7704,7 @@
       </w:r>
     </w:p>
     <w:bookmarkEnd w:id="155"/>
-    <w:bookmarkStart w:id="157" w:name="ref-Park2023"/>
-    <w:p>
-      <w:pPr>
-        <w:pStyle w:val="Bibliography"/>
-      </w:pPr>
-      <w:r>
-        <w:t xml:space="preserve">Park, Joon Sung, Joseph O’Brien, Carrie Jun Cai, Meredith Ringel Morris, Percy Liang, and Michael S. Bernstein. 2023.</w:t>
-      </w:r>
-      <w:r>
-        <w:t xml:space="preserve"> </w:t>
-      </w:r>
-      <w:hyperlink r:id="rId156">
-        <w:r>
-          <w:rPr>
-            <w:rStyle w:val="Hyperlink"/>
-          </w:rPr>
-          <w:t xml:space="preserve">Generative Agents: Interactive Simulacra of Human Behavior</w:t>
-        </w:r>
-      </w:hyperlink>
-      <w:r>
-        <w:t xml:space="preserve">, pp. 1–22.</w:t>
-      </w:r>
-    </w:p>
-    <w:bookmarkEnd w:id="157"/>
-    <w:bookmarkStart w:id="159" w:name="ref-Piper2026"/>
+    <w:bookmarkStart w:id="157" w:name="ref-Piper2026"/>
     <w:p>
       <w:pPr>
         <w:pStyle w:val="Bibliography"/>
@@ -7876,7 +7731,7 @@
       <w:r>
         <w:t xml:space="preserve"> </w:t>
       </w:r>
-      <w:hyperlink r:id="rId158">
+      <w:hyperlink r:id="rId156">
         <w:r>
           <w:rPr>
             <w:rStyle w:val="Hyperlink"/>
@@ -7888,20 +7743,20 @@
         <w:t xml:space="preserve">.</w:t>
       </w:r>
     </w:p>
-    <w:bookmarkEnd w:id="159"/>
-    <w:bookmarkStart w:id="161" w:name="ref-QuartoDocs2026"/>
+    <w:bookmarkEnd w:id="157"/>
+    <w:bookmarkStart w:id="159" w:name="ref-Rafiee2025"/>
     <w:p>
       <w:pPr>
         <w:pStyle w:val="Bibliography"/>
       </w:pPr>
       <w:r>
-        <w:t xml:space="preserve">Quarto.</w:t>
-      </w:r>
-      <w:r>
-        <w:t xml:space="preserve"> </w:t>
-      </w:r>
-      <w:r>
-        <w:t xml:space="preserve">Tutorial: Hello, Quarto</w:t>
+        <w:t xml:space="preserve">Rafiee, Gholamreza, and Wai Lok Woo. 2025.</w:t>
+      </w:r>
+      <w:r>
+        <w:t xml:space="preserve"> </w:t>
+      </w:r>
+      <w:r>
+        <w:t xml:space="preserve">Agentic AI: A Review of Architecture, Governance, and Sustainable Goal-Directed Autonomy</w:t>
       </w:r>
       <w:r>
         <w:t xml:space="preserve">.</w:t>
@@ -7909,53 +7764,7 @@
       <w:r>
         <w:t xml:space="preserve"> </w:t>
       </w:r>
-      <w:hyperlink r:id="rId160">
-        <w:r>
-          <w:rPr>
-            <w:rStyle w:val="Hyperlink"/>
-          </w:rPr>
-          <w:t xml:space="preserve">https://quarto.org/docs/get-started/hello/rstudio.html</w:t>
-        </w:r>
-      </w:hyperlink>
-      <w:r>
-        <w:t xml:space="preserve">, accessed September 17, 2026.</w:t>
-      </w:r>
-    </w:p>
-    <w:bookmarkEnd w:id="161"/>
-    <w:bookmarkStart w:id="163" w:name="ref-Rafiee2025"/>
-    <w:p>
-      <w:pPr>
-        <w:pStyle w:val="Bibliography"/>
-      </w:pPr>
-      <w:r>
-        <w:t xml:space="preserve">Rafiee, Gholamreza, and Wai Lok Woo. 2025.</w:t>
-      </w:r>
-      <w:r>
-        <w:t xml:space="preserve"> </w:t>
-      </w:r>
-      <w:r>
-        <w:t xml:space="preserve">Agentic AI: A Review of Architecture, Governance, and Sustainable Goal-Directed Autonomy</w:t>
-      </w:r>
-      <w:r>
-        <w:t xml:space="preserve">.</w:t>
-      </w:r>
-      <w:r>
-        <w:t xml:space="preserve"> </w:t>
-      </w:r>
-      <w:r>
-        <w:rPr>
-          <w:iCs/>
-          <w:i/>
-        </w:rPr>
-        <w:t xml:space="preserve">TechRxiv Preprint</w:t>
-      </w:r>
-      <w:r>
-        <w:t xml:space="preserve">.</w:t>
-      </w:r>
-      <w:r>
-        <w:t xml:space="preserve"> </w:t>
-      </w:r>
-      <w:hyperlink r:id="rId162">
+      <w:hyperlink r:id="rId158">
         <w:r>
           <w:rPr>
             <w:rStyle w:val="Hyperlink"/>
@@ -7967,8 +7776,8 @@
         <w:t xml:space="preserve">.</w:t>
       </w:r>
     </w:p>
-    <w:bookmarkEnd w:id="163"/>
-    <w:bookmarkStart w:id="165" w:name="ref-Scheepens2024"/>
+    <w:bookmarkEnd w:id="159"/>
+    <w:bookmarkStart w:id="161" w:name="ref-Scheepens2024"/>
     <w:p>
       <w:pPr>
         <w:pStyle w:val="Bibliography"/>
@@ -8007,7 +7816,7 @@
       <w:r>
         <w:t xml:space="preserve"> </w:t>
       </w:r>
-      <w:hyperlink r:id="rId164">
+      <w:hyperlink r:id="rId160">
         <w:r>
           <w:rPr>
             <w:rStyle w:val="Hyperlink"/>
@@ -8019,74 +7828,50 @@
         <w:t xml:space="preserve">.</w:t>
       </w:r>
     </w:p>
-    <w:bookmarkEnd w:id="165"/>
-    <w:bookmarkStart w:id="167" w:name="ref-Schick2023"/>
+    <w:bookmarkEnd w:id="161"/>
+    <w:bookmarkStart w:id="163" w:name="ref-Schweinberger2026privacy"/>
     <w:p>
       <w:pPr>
         <w:pStyle w:val="Bibliography"/>
       </w:pPr>
       <w:r>
-        <w:t xml:space="preserve">Schick, Timo, Jane Dwivedi-Yu, Roberto Dessi, Roberta Raileanu, Maria Lomeli, Eric Hambro, Luke Zettlemoyer, et al. 2023.</w:t>
-      </w:r>
-      <w:r>
-        <w:t xml:space="preserve"> </w:t>
-      </w:r>
-      <w:hyperlink r:id="rId166">
+        <w:t xml:space="preserve">Schweinberger, Martin. 2026.</w:t>
+      </w:r>
+      <w:r>
+        <w:t xml:space="preserve"> </w:t>
+      </w:r>
+      <w:r>
+        <w:t xml:space="preserve">Privacy-Preserving Analysis with Local LLMs: Generating Synthetic Data Proxies</w:t>
+      </w:r>
+      <w:r>
+        <w:t xml:space="preserve">.</w:t>
+      </w:r>
+      <w:r>
+        <w:t xml:space="preserve"> </w:t>
+      </w:r>
+      <w:r>
+        <w:t xml:space="preserve">The Language Technology and Data Analysis Laboratory (LADAL), The University of Queensland, Australia</w:t>
+      </w:r>
+      <w:r>
+        <w:t xml:space="preserve">.</w:t>
+      </w:r>
+      <w:r>
+        <w:t xml:space="preserve"> </w:t>
+      </w:r>
+      <w:hyperlink r:id="rId162">
         <w:r>
           <w:rPr>
             <w:rStyle w:val="Hyperlink"/>
           </w:rPr>
-          <w:t xml:space="preserve">Toolformer: Language Models Can Teach Themselves to Use Tools</w:t>
+          <w:t xml:space="preserve">https://doi.org/10.5281/zenodo.19332911</w:t>
         </w:r>
       </w:hyperlink>
       <w:r>
-        <w:t xml:space="preserve">, pp. 68539–68551.</w:t>
-      </w:r>
-    </w:p>
-    <w:bookmarkEnd w:id="167"/>
-    <w:bookmarkStart w:id="169" w:name="ref-Schweinberger2026privacy"/>
-    <w:p>
-      <w:pPr>
-        <w:pStyle w:val="Bibliography"/>
-      </w:pPr>
-      <w:r>
-        <w:t xml:space="preserve">Schweinberger, Martin. 2026.</w:t>
-      </w:r>
-      <w:r>
-        <w:t xml:space="preserve"> </w:t>
-      </w:r>
-      <w:r>
-        <w:t xml:space="preserve">Privacy-Preserving Analysis with Local LLMs: Generating Synthetic Data Proxies</w:t>
-      </w:r>
-      <w:r>
-        <w:t xml:space="preserve">.</w:t>
-      </w:r>
-      <w:r>
-        <w:t xml:space="preserve"> </w:t>
-      </w:r>
-      <w:r>
-        <w:t xml:space="preserve">The Language Technology and Data Analysis Laboratory (LADAL), The University of Queensland, Australia</w:t>
-      </w:r>
-      <w:r>
-        <w:t xml:space="preserve">.</w:t>
-      </w:r>
-      <w:r>
-        <w:t xml:space="preserve"> </w:t>
-      </w:r>
-      <w:hyperlink r:id="rId168">
-        <w:r>
-          <w:rPr>
-            <w:rStyle w:val="Hyperlink"/>
-          </w:rPr>
-          <w:t xml:space="preserve">https://ladal.edu.au/tutorials/llm_privacy/llm_privacy.html</w:t>
-        </w:r>
-      </w:hyperlink>
-      <w:r>
         <w:t xml:space="preserve">, accessed September 18, 2026.</w:t>
       </w:r>
     </w:p>
-    <w:bookmarkEnd w:id="169"/>
-    <w:bookmarkStart w:id="171" w:name="ref-Shaikhon2025"/>
+    <w:bookmarkEnd w:id="163"/>
+    <w:bookmarkStart w:id="165" w:name="ref-Shaikhon2025"/>
     <w:p>
       <w:pPr>
         <w:pStyle w:val="Bibliography"/>
@@ -8113,7 +7898,7 @@
       <w:r>
         <w:t xml:space="preserve"> </w:t>
       </w:r>
-      <w:hyperlink r:id="rId170">
+      <w:hyperlink r:id="rId164">
         <w:r>
           <w:rPr>
             <w:rStyle w:val="Hyperlink"/>
@@ -8125,52 +7910,81 @@
         <w:t xml:space="preserve">.</w:t>
       </w:r>
     </w:p>
-    <w:bookmarkEnd w:id="171"/>
-    <w:bookmarkStart w:id="173" w:name="ref-Taylor2023"/>
+    <w:bookmarkEnd w:id="165"/>
+    <w:bookmarkStart w:id="167" w:name="ref-Sinha2026"/>
     <w:p>
       <w:pPr>
         <w:pStyle w:val="Bibliography"/>
       </w:pPr>
       <w:r>
-        <w:t xml:space="preserve">Taylor, Matthew E. 2023.</w:t>
-      </w:r>
-      <w:r>
-        <w:t xml:space="preserve"> </w:t>
-      </w:r>
-      <w:hyperlink r:id="rId172">
+        <w:t xml:space="preserve">Sinha, Akshit, Arvindh Arun, Shashwat Goel, Steffen Staab, and Jonas Geiping. 2026.</w:t>
+      </w:r>
+      <w:r>
+        <w:t xml:space="preserve"> </w:t>
+      </w:r>
+      <w:r>
+        <w:t xml:space="preserve">The Illusion of Diminishing Returns</w:t>
+      </w:r>
+      <w:r>
+        <w:t xml:space="preserve">: Measuring Long Horizon Execution in</w:t>
+      </w:r>
+      <w:r>
+        <w:t xml:space="preserve"> </w:t>
+      </w:r>
+      <w:r>
+        <w:t xml:space="preserve">LLM</w:t>
+      </w:r>
+      <w:r>
+        <w:t xml:space="preserve">s.</w:t>
+      </w:r>
+      <w:r>
+        <w:t xml:space="preserve"> </w:t>
+      </w:r>
+      <w:r>
+        <w:rPr>
+          <w:iCs/>
+          <w:i/>
+        </w:rPr>
+        <w:t xml:space="preserve">International Conference on Learning Representations (ICLR)</w:t>
+      </w:r>
+      <w:r>
+        <w:t xml:space="preserve">.</w:t>
+      </w:r>
+      <w:r>
+        <w:t xml:space="preserve"> </w:t>
+      </w:r>
+      <w:hyperlink r:id="rId166">
         <w:r>
           <w:rPr>
             <w:rStyle w:val="Hyperlink"/>
           </w:rPr>
-          <w:t xml:space="preserve">Reinforcement Learning Requires</w:t>
-        </w:r>
-        <w:r>
-          <w:rPr>
-            <w:rStyle w:val="Hyperlink"/>
-          </w:rPr>
-          <w:t xml:space="preserve"> </w:t>
-        </w:r>
-        <w:r>
-          <w:rPr>
-            <w:rStyle w:val="Hyperlink"/>
-          </w:rPr>
-          <w:t xml:space="preserve">Human-in-the-Loop</w:t>
-        </w:r>
-        <w:r>
-          <w:rPr>
-            <w:rStyle w:val="Hyperlink"/>
-          </w:rPr>
-          <w:t xml:space="preserve"> </w:t>
-        </w:r>
-        <w:r>
-          <w:rPr>
-            <w:rStyle w:val="Hyperlink"/>
-          </w:rPr>
-          <w:t xml:space="preserve">Framing and Approaches</w:t>
+          <w:t xml:space="preserve">https://doi.org/10.48550/arXiv.2509.09677</w:t>
         </w:r>
       </w:hyperlink>
       <w:r>
-        <w:t xml:space="preserve">. In</w:t>
+        <w:t xml:space="preserve">.</w:t>
+      </w:r>
+    </w:p>
+    <w:bookmarkEnd w:id="167"/>
+    <w:bookmarkStart w:id="169" w:name="ref-Taylor2023"/>
+    <w:p>
+      <w:pPr>
+        <w:pStyle w:val="Bibliography"/>
+      </w:pPr>
+      <w:r>
+        <w:t xml:space="preserve">Taylor, Matthew E. 2023. Reinforcement Learning Requires</w:t>
+      </w:r>
+      <w:r>
+        <w:t xml:space="preserve"> </w:t>
+      </w:r>
+      <w:r>
+        <w:t xml:space="preserve">Human-in-the-Loop</w:t>
+      </w:r>
+      <w:r>
+        <w:t xml:space="preserve"> </w:t>
+      </w:r>
+      <w:r>
+        <w:t xml:space="preserve">Framing and Approaches. In</w:t>
       </w:r>
       <w:r>
         <w:t xml:space="preserve"> </w:t>
@@ -8183,11 +7997,25 @@
         <w:t xml:space="preserve">HHAI 2023: Augmenting Human Intellect</w:t>
       </w:r>
       <w:r>
-        <w:t xml:space="preserve">. IOS Press.</w:t>
-      </w:r>
-    </w:p>
-    <w:bookmarkEnd w:id="173"/>
-    <w:bookmarkStart w:id="175" w:name="ref-Tenzer2024"/>
+        <w:t xml:space="preserve">, Vol. 368. Frontiers in Artificial Intelligence and Applications. IOS Press, Amsterdam.</w:t>
+      </w:r>
+      <w:r>
+        <w:t xml:space="preserve"> </w:t>
+      </w:r>
+      <w:hyperlink r:id="rId168">
+        <w:r>
+          <w:rPr>
+            <w:rStyle w:val="Hyperlink"/>
+          </w:rPr>
+          <w:t xml:space="preserve">https://doi.org/10.3233/faia230098</w:t>
+        </w:r>
+      </w:hyperlink>
+      <w:r>
+        <w:t xml:space="preserve">.</w:t>
+      </w:r>
+    </w:p>
+    <w:bookmarkEnd w:id="169"/>
+    <w:bookmarkStart w:id="171" w:name="ref-Tenzer2024"/>
     <w:p>
       <w:pPr>
         <w:pStyle w:val="Bibliography"/>
@@ -8218,12 +8046,15 @@
         <w:t xml:space="preserve">Internet Archaeology</w:t>
       </w:r>
       <w:r>
-        <w:t xml:space="preserve">(67).</w:t>
-      </w:r>
-      <w:r>
-        <w:t xml:space="preserve"> </w:t>
-      </w:r>
-      <w:hyperlink r:id="rId174">
+        <w:t xml:space="preserve"> </w:t>
+      </w:r>
+      <w:r>
+        <w:t xml:space="preserve">67.</w:t>
+      </w:r>
+      <w:r>
+        <w:t xml:space="preserve"> </w:t>
+      </w:r>
+      <w:hyperlink r:id="rId170">
         <w:r>
           <w:rPr>
             <w:rStyle w:val="Hyperlink"/>
@@ -8235,8 +8066,8 @@
         <w:t xml:space="preserve">.</w:t>
       </w:r>
     </w:p>
-    <w:bookmarkEnd w:id="175"/>
-    <w:bookmarkStart w:id="177" w:name="ref-RoyalSociety2024"/>
+    <w:bookmarkEnd w:id="171"/>
+    <w:bookmarkStart w:id="173" w:name="ref-RoyalSociety2024"/>
     <w:p>
       <w:pPr>
         <w:pStyle w:val="Bibliography"/>
@@ -8247,126 +8078,40 @@
       <w:r>
         <w:t xml:space="preserve"> </w:t>
       </w:r>
-      <w:hyperlink r:id="rId176">
+      <w:r>
+        <w:rPr>
+          <w:iCs/>
+          <w:i/>
+        </w:rPr>
+        <w:t xml:space="preserve">Science in the Age of AI</w:t>
+      </w:r>
+      <w:r>
+        <w:rPr>
+          <w:iCs/>
+          <w:i/>
+        </w:rPr>
+        <w:t xml:space="preserve">: How Artificial Intelligence Is Changing the Nature and Method of Scientific Research</w:t>
+      </w:r>
+      <w:r>
+        <w:t xml:space="preserve">. The Royal Society, London.</w:t>
+      </w:r>
+      <w:r>
+        <w:t xml:space="preserve"> </w:t>
+      </w:r>
+      <w:hyperlink r:id="rId172">
         <w:r>
           <w:rPr>
             <w:rStyle w:val="Hyperlink"/>
-            <w:iCs/>
-            <w:i/>
           </w:rPr>
-          <w:t xml:space="preserve">Science</w:t>
-        </w:r>
-        <w:r>
-          <w:rPr>
-            <w:rStyle w:val="Hyperlink"/>
-            <w:iCs/>
-            <w:i/>
-          </w:rPr>
-          <w:t xml:space="preserve"> </w:t>
-        </w:r>
-        <w:r>
-          <w:rPr>
-            <w:rStyle w:val="Hyperlink"/>
-            <w:iCs/>
-            <w:i/>
-          </w:rPr>
-          <w:t xml:space="preserve">in the</w:t>
-        </w:r>
-        <w:r>
-          <w:rPr>
-            <w:rStyle w:val="Hyperlink"/>
-            <w:iCs/>
-            <w:i/>
-          </w:rPr>
-          <w:t xml:space="preserve"> </w:t>
-        </w:r>
-        <w:r>
-          <w:rPr>
-            <w:rStyle w:val="Hyperlink"/>
-            <w:iCs/>
-            <w:i/>
-          </w:rPr>
-          <w:t xml:space="preserve">Age</w:t>
-        </w:r>
-        <w:r>
-          <w:rPr>
-            <w:rStyle w:val="Hyperlink"/>
-            <w:iCs/>
-            <w:i/>
-          </w:rPr>
-          <w:t xml:space="preserve"> </w:t>
-        </w:r>
-        <w:r>
-          <w:rPr>
-            <w:rStyle w:val="Hyperlink"/>
-            <w:iCs/>
-            <w:i/>
-          </w:rPr>
-          <w:t xml:space="preserve">of</w:t>
-        </w:r>
-        <w:r>
-          <w:rPr>
-            <w:rStyle w:val="Hyperlink"/>
-            <w:iCs/>
-            <w:i/>
-          </w:rPr>
-          <w:t xml:space="preserve"> </w:t>
-        </w:r>
-        <w:r>
-          <w:rPr>
-            <w:rStyle w:val="Hyperlink"/>
-            <w:iCs/>
-            <w:i/>
-          </w:rPr>
-          <w:t xml:space="preserve">AI</w:t>
-        </w:r>
-        <w:r>
-          <w:rPr>
-            <w:rStyle w:val="Hyperlink"/>
-            <w:iCs/>
-            <w:i/>
-          </w:rPr>
-          <w:t xml:space="preserve">:</w:t>
-        </w:r>
-        <w:r>
-          <w:rPr>
-            <w:rStyle w:val="Hyperlink"/>
-            <w:iCs/>
-            <w:i/>
-          </w:rPr>
-          <w:t xml:space="preserve"> </w:t>
-        </w:r>
-        <w:r>
-          <w:rPr>
-            <w:rStyle w:val="Hyperlink"/>
-            <w:iCs/>
-            <w:i/>
-          </w:rPr>
-          <w:t xml:space="preserve">How</w:t>
-        </w:r>
-        <w:r>
-          <w:rPr>
-            <w:rStyle w:val="Hyperlink"/>
-            <w:iCs/>
-            <w:i/>
-          </w:rPr>
-          <w:t xml:space="preserve"> </w:t>
-        </w:r>
-        <w:r>
-          <w:rPr>
-            <w:rStyle w:val="Hyperlink"/>
-            <w:iCs/>
-            <w:i/>
-          </w:rPr>
-          <w:t xml:space="preserve">Artificial Intelligence Is Changing the Nature and Method of Scientific Research</w:t>
+          <w:t xml:space="preserve">https://doi.org/10.1098/rs-policy.2026-31</w:t>
         </w:r>
       </w:hyperlink>
       <w:r>
-        <w:t xml:space="preserve">. The Royal Society, London.</w:t>
-      </w:r>
-    </w:p>
-    <w:bookmarkEnd w:id="177"/>
-    <w:bookmarkStart w:id="179" w:name="ref-Walters2023"/>
+        <w:t xml:space="preserve">.</w:t>
+      </w:r>
+    </w:p>
+    <w:bookmarkEnd w:id="173"/>
+    <w:bookmarkStart w:id="175" w:name="ref-Walters2023"/>
     <w:p>
       <w:pPr>
         <w:pStyle w:val="Bibliography"/>
@@ -8397,12 +8142,12 @@
         <w:t xml:space="preserve"> </w:t>
       </w:r>
       <w:r>
-        <w:t xml:space="preserve">13(1).</w:t>
-      </w:r>
-      <w:r>
-        <w:t xml:space="preserve"> </w:t>
-      </w:r>
-      <w:hyperlink r:id="rId178">
+        <w:t xml:space="preserve">13(1):14045.</w:t>
+      </w:r>
+      <w:r>
+        <w:t xml:space="preserve"> </w:t>
+      </w:r>
+      <w:hyperlink r:id="rId174">
         <w:r>
           <w:rPr>
             <w:rStyle w:val="Hyperlink"/>
@@ -8414,14 +8159,14 @@
         <w:t xml:space="preserve">.</w:t>
       </w:r>
     </w:p>
-    <w:bookmarkEnd w:id="179"/>
-    <w:bookmarkStart w:id="181" w:name="ref-Wang2024"/>
+    <w:bookmarkEnd w:id="175"/>
+    <w:bookmarkStart w:id="177" w:name="ref-Wang2024"/>
     <w:p>
       <w:pPr>
         <w:pStyle w:val="Bibliography"/>
       </w:pPr>
       <w:r>
-        <w:t xml:space="preserve">Wang, Lei, Chen Ma, Xueyang Feng, Zeyu Zhang, Hao Yang, Jingsen Zhang, Zhiyuan Chen, et al. 2024.</w:t>
+        <w:t xml:space="preserve">Wang, Lei, Chen Ma, Xueyang Feng, et al. 2024.</w:t>
       </w:r>
       <w:r>
         <w:t xml:space="preserve"> </w:t>
@@ -8446,12 +8191,12 @@
         <w:t xml:space="preserve"> </w:t>
       </w:r>
       <w:r>
-        <w:t xml:space="preserve">18(6).</w:t>
-      </w:r>
-      <w:r>
-        <w:t xml:space="preserve"> </w:t>
-      </w:r>
-      <w:hyperlink r:id="rId180">
+        <w:t xml:space="preserve">18(6):186345.</w:t>
+      </w:r>
+      <w:r>
+        <w:t xml:space="preserve"> </w:t>
+      </w:r>
+      <w:hyperlink r:id="rId176">
         <w:r>
           <w:rPr>
             <w:rStyle w:val="Hyperlink"/>
@@ -8463,14 +8208,14 @@
         <w:t xml:space="preserve">.</w:t>
       </w:r>
     </w:p>
-    <w:bookmarkEnd w:id="181"/>
-    <w:bookmarkStart w:id="183" w:name="ref-Wickham2019"/>
+    <w:bookmarkEnd w:id="177"/>
+    <w:bookmarkStart w:id="179" w:name="ref-Wickham2019"/>
     <w:p>
       <w:pPr>
         <w:pStyle w:val="Bibliography"/>
       </w:pPr>
       <w:r>
-        <w:t xml:space="preserve">Wickham, Hadley, Mara Averick, Jennifer Bryan, Winston Chang, Lucy D’Agostino McGowan, Romain François, Garrett Grolemund, et al. 2019. Welcome to the</w:t>
+        <w:t xml:space="preserve">Wickham, Hadley, Mara Averick, Jennifer Bryan, et al. 2019. Welcome to the</w:t>
       </w:r>
       <w:r>
         <w:t xml:space="preserve"> </w:t>
@@ -8500,7 +8245,7 @@
       <w:r>
         <w:t xml:space="preserve"> </w:t>
       </w:r>
-      <w:hyperlink r:id="rId182">
+      <w:hyperlink r:id="rId178">
         <w:r>
           <w:rPr>
             <w:rStyle w:val="Hyperlink"/>
@@ -8512,14 +8257,14 @@
         <w:t xml:space="preserve">.</w:t>
       </w:r>
     </w:p>
-    <w:bookmarkEnd w:id="183"/>
-    <w:bookmarkStart w:id="185" w:name="ref-Wiest2024"/>
+    <w:bookmarkEnd w:id="179"/>
+    <w:bookmarkStart w:id="181" w:name="ref-Wiest2024"/>
     <w:p>
       <w:pPr>
         <w:pStyle w:val="Bibliography"/>
       </w:pPr>
       <w:r>
-        <w:t xml:space="preserve">Wiest, Isabella Catharina, Dyke Ferber, Jiefu Zhu, Marko van Treeck, Sonja K. Meyer, Radhika Juglan, Zunamys I. Carrero, et al. 2024.</w:t>
+        <w:t xml:space="preserve">Wiest, Isabella Catharina, Dyke Ferber, Jiefu Zhu, et al. 2024.</w:t>
       </w:r>
       <w:r>
         <w:t xml:space="preserve"> </w:t>
@@ -8549,7 +8294,7 @@
       <w:r>
         <w:t xml:space="preserve"> </w:t>
       </w:r>
-      <w:hyperlink r:id="rId184">
+      <w:hyperlink r:id="rId180">
         <w:r>
           <w:rPr>
             <w:rStyle w:val="Hyperlink"/>
@@ -8561,8 +8306,8 @@
         <w:t xml:space="preserve">.</w:t>
       </w:r>
     </w:p>
-    <w:bookmarkEnd w:id="185"/>
-    <w:bookmarkStart w:id="187" w:name="ref-Xu2026"/>
+    <w:bookmarkEnd w:id="181"/>
+    <w:bookmarkStart w:id="183" w:name="ref-Xu2026"/>
     <w:p>
       <w:pPr>
         <w:pStyle w:val="Bibliography"/>
@@ -8594,20 +8339,7 @@
       <w:r>
         <w:t xml:space="preserve"> </w:t>
       </w:r>
-      <w:r>
-        <w:rPr>
-          <w:iCs/>
-          <w:i/>
-        </w:rPr>
-        <w:t xml:space="preserve">arXiv.org</w:t>
-      </w:r>
-      <w:r>
-        <w:t xml:space="preserve">.</w:t>
-      </w:r>
-      <w:r>
-        <w:t xml:space="preserve"> </w:t>
-      </w:r>
-      <w:hyperlink r:id="rId186">
+      <w:hyperlink r:id="rId182">
         <w:r>
           <w:rPr>
             <w:rStyle w:val="Hyperlink"/>
@@ -8619,23 +8351,14 @@
         <w:t xml:space="preserve">.</w:t>
       </w:r>
     </w:p>
-    <w:bookmarkEnd w:id="187"/>
-    <w:bookmarkStart w:id="189" w:name="ref-Xu2024"/>
+    <w:bookmarkEnd w:id="183"/>
+    <w:bookmarkStart w:id="185" w:name="ref-ZamfirescuPereira2023"/>
     <w:p>
       <w:pPr>
         <w:pStyle w:val="Bibliography"/>
       </w:pPr>
       <w:r>
-        <w:t xml:space="preserve">Xu, Xiaojun, Yixiao Chen, and Jing Miao. 2024.</w:t>
-      </w:r>
-      <w:r>
-        <w:t xml:space="preserve"> </w:t>
-      </w:r>
-      <w:r>
-        <w:t xml:space="preserve">Opportunities, Challenges, and Future Directions of Large Language Models, Including ChatGPT in Medical Education: A Systematic Scoping Review</w:t>
-      </w:r>
-      <w:r>
-        <w:t xml:space="preserve">.</w:t>
+        <w:t xml:space="preserve">Zamfirescu-Pereira, J. D., Richmond Y. Wong, Bjoern Hartmann, and Qian Yang. 2023. Why Johnny Can’t Prompt: How Non-AI Experts Try (and Fail) to Design LLM Prompts.</w:t>
       </w:r>
       <w:r>
         <w:t xml:space="preserve"> </w:t>
@@ -8645,153 +8368,28 @@
           <w:iCs/>
           <w:i/>
         </w:rPr>
-        <w:t xml:space="preserve">Journal of Educational Evaluation for Health Professions</w:t>
-      </w:r>
-      <w:r>
-        <w:t xml:space="preserve"> </w:t>
-      </w:r>
-      <w:r>
-        <w:t xml:space="preserve">21:6.</w:t>
-      </w:r>
-      <w:r>
-        <w:t xml:space="preserve"> </w:t>
-      </w:r>
-      <w:hyperlink r:id="rId188">
+        <w:t xml:space="preserve">Proceedings of the 2023 CHI Conference on Human Factors in Computing Systems</w:t>
+      </w:r>
+      <w:r>
+        <w:t xml:space="preserve">, New York, New York, USA.</w:t>
+      </w:r>
+      <w:r>
+        <w:t xml:space="preserve"> </w:t>
+      </w:r>
+      <w:hyperlink r:id="rId184">
         <w:r>
           <w:rPr>
             <w:rStyle w:val="Hyperlink"/>
           </w:rPr>
-          <w:t xml:space="preserve">https://doi.org/10.3352/jeehp.2024.21.6</w:t>
+          <w:t xml:space="preserve">https://doi.org/10.1145/3544548.3581388</w:t>
         </w:r>
       </w:hyperlink>
       <w:r>
         <w:t xml:space="preserve">.</w:t>
       </w:r>
     </w:p>
-    <w:bookmarkEnd w:id="189"/>
-    <w:bookmarkStart w:id="191" w:name="ref-ZamfirescuPereira2023"/>
-    <w:p>
-      <w:pPr>
-        <w:pStyle w:val="Bibliography"/>
-      </w:pPr>
-      <w:r>
-        <w:t xml:space="preserve">Zamfirescu-Pereira, J. D., Richmond Y. Wong, Bjoern Hartmann, and Qian Yang. 2023.</w:t>
-      </w:r>
-      <w:r>
-        <w:t xml:space="preserve"> </w:t>
-      </w:r>
-      <w:hyperlink r:id="rId190">
-        <w:r>
-          <w:rPr>
-            <w:rStyle w:val="Hyperlink"/>
-          </w:rPr>
-          <w:t xml:space="preserve">Why Johnny Can’t Prompt: How Non-AI Experts Try (and Fail) to Design LLM Prompts</w:t>
-        </w:r>
-      </w:hyperlink>
-      <w:r>
-        <w:t xml:space="preserve">, New York, NY, USA.</w:t>
-      </w:r>
-    </w:p>
-    <w:bookmarkEnd w:id="191"/>
-    <w:bookmarkStart w:id="193" w:name="ref-Zanzotto2019"/>
-    <w:p>
-      <w:pPr>
-        <w:pStyle w:val="Bibliography"/>
-      </w:pPr>
-      <w:r>
-        <w:t xml:space="preserve">Zanzotto, Fabio Massimo. 2019. Viewpoint:</w:t>
-      </w:r>
-      <w:r>
-        <w:t xml:space="preserve"> </w:t>
-      </w:r>
-      <w:r>
-        <w:t xml:space="preserve">Human-in-the-loop Artificial Intelligence</w:t>
-      </w:r>
-      <w:r>
-        <w:t xml:space="preserve">.</w:t>
-      </w:r>
-      <w:r>
-        <w:t xml:space="preserve"> </w:t>
-      </w:r>
-      <w:r>
-        <w:rPr>
-          <w:iCs/>
-          <w:i/>
-        </w:rPr>
-        <w:t xml:space="preserve">Journal of Artificial Intelligence Research</w:t>
-      </w:r>
-      <w:r>
-        <w:t xml:space="preserve"> </w:t>
-      </w:r>
-      <w:r>
-        <w:t xml:space="preserve">64:243–252.</w:t>
-      </w:r>
-      <w:r>
-        <w:t xml:space="preserve"> </w:t>
-      </w:r>
-      <w:hyperlink r:id="rId192">
-        <w:r>
-          <w:rPr>
-            <w:rStyle w:val="Hyperlink"/>
-          </w:rPr>
-          <w:t xml:space="preserve">https://doi.org/10.1613/jair.1.11345</w:t>
-        </w:r>
-      </w:hyperlink>
-      <w:r>
-        <w:t xml:space="preserve">.</w:t>
-      </w:r>
-    </w:p>
-    <w:bookmarkEnd w:id="193"/>
-    <w:bookmarkStart w:id="195" w:name="ref-Zhang2025"/>
-    <w:p>
-      <w:pPr>
-        <w:pStyle w:val="Bibliography"/>
-      </w:pPr>
-      <w:r>
-        <w:t xml:space="preserve">Zhang, Yanbo, Sumeer A. Khan, Adnan Mahmud, Huck Yang, Alexander Lavin, Michael Levin, Jeremy Frey, et al. 2025.</w:t>
-      </w:r>
-      <w:r>
-        <w:t xml:space="preserve"> </w:t>
-      </w:r>
-      <w:r>
-        <w:t xml:space="preserve">Exploring the Role of Large Language Models in the Scientific Method: From Hypothesis to Discovery</w:t>
-      </w:r>
-      <w:r>
-        <w:t xml:space="preserve">.</w:t>
-      </w:r>
-      <w:r>
-        <w:t xml:space="preserve"> </w:t>
-      </w:r>
-      <w:r>
-        <w:rPr>
-          <w:iCs/>
-          <w:i/>
-        </w:rPr>
-        <w:t xml:space="preserve">Npj Artificial Intelligence</w:t>
-      </w:r>
-      <w:r>
-        <w:t xml:space="preserve"> </w:t>
-      </w:r>
-      <w:r>
-        <w:t xml:space="preserve">1:14.</w:t>
-      </w:r>
-      <w:r>
-        <w:t xml:space="preserve"> </w:t>
-      </w:r>
-      <w:hyperlink r:id="rId194">
-        <w:r>
-          <w:rPr>
-            <w:rStyle w:val="Hyperlink"/>
-          </w:rPr>
-          <w:t xml:space="preserve">https://doi.org/10.1038/s44387-025-00019-5</w:t>
-        </w:r>
-      </w:hyperlink>
-      <w:r>
-        <w:t xml:space="preserve">.</w:t>
-      </w:r>
-    </w:p>
-    <w:bookmarkEnd w:id="195"/>
-    <w:bookmarkStart w:id="197" w:name="ref-Zhang2026Vibe"/>
+    <w:bookmarkEnd w:id="185"/>
+    <w:bookmarkStart w:id="187" w:name="ref-Zhang2026Vibe"/>
     <w:p>
       <w:pPr>
         <w:pStyle w:val="Bibliography"/>
@@ -8827,7 +8425,7 @@
       <w:r>
         <w:t xml:space="preserve"> </w:t>
       </w:r>
-      <w:hyperlink r:id="rId196">
+      <w:hyperlink r:id="rId186">
         <w:r>
           <w:rPr>
             <w:rStyle w:val="Hyperlink"/>
@@ -8839,32 +8437,19 @@
         <w:t xml:space="preserve">.</w:t>
       </w:r>
     </w:p>
-    <w:bookmarkEnd w:id="197"/>
-    <w:bookmarkStart w:id="199" w:name="ref-Zheng2024"/>
+    <w:bookmarkEnd w:id="187"/>
+    <w:bookmarkStart w:id="189" w:name="ref-Zheng2024"/>
     <w:p>
       <w:pPr>
         <w:pStyle w:val="Bibliography"/>
       </w:pPr>
       <w:r>
-        <w:t xml:space="preserve">Zheng, Zibin, Kaiwen Ning, Yanlin Wang, Jingwen Zhang, Dewu Zheng, Mingxi Ye, and Jiachi Chen. 2024. A Survey of Large Language Models for Code: Evolution, Benchmarking, and Future Trends.</w:t>
-      </w:r>
-      <w:r>
-        <w:t xml:space="preserve"> </w:t>
-      </w:r>
-      <w:r>
-        <w:rPr>
-          <w:iCs/>
-          <w:i/>
-        </w:rPr>
-        <w:t xml:space="preserve">arXiv Preprint arXiv:2311.10372</w:t>
-      </w:r>
-      <w:r>
-        <w:t xml:space="preserve">.</w:t>
-      </w:r>
-      <w:r>
-        <w:t xml:space="preserve"> </w:t>
-      </w:r>
-      <w:hyperlink r:id="rId198">
+        <w:t xml:space="preserve">Zheng, Zibin, Kaiwen Ning, Yanlin Wang, et al. 2024. A Survey of Large Language Models for Code: Evolution, Benchmarking, and Future Trends.</w:t>
+      </w:r>
+      <w:r>
+        <w:t xml:space="preserve"> </w:t>
+      </w:r>
+      <w:hyperlink r:id="rId188">
         <w:r>
           <w:rPr>
             <w:rStyle w:val="Hyperlink"/>
@@ -8876,14 +8461,14 @@
         <w:t xml:space="preserve">.</w:t>
       </w:r>
     </w:p>
-    <w:bookmarkEnd w:id="199"/>
-    <w:bookmarkStart w:id="201" w:name="ref-Ziems2024"/>
+    <w:bookmarkEnd w:id="189"/>
+    <w:bookmarkStart w:id="191" w:name="ref-Ziems2024"/>
     <w:p>
       <w:pPr>
         <w:pStyle w:val="Bibliography"/>
       </w:pPr>
       <w:r>
-        <w:t xml:space="preserve">Ziems, Caleb, William Held, Omar Shaikh, Jiaao Chen, Zhehao Zhang, and Diyi Yang. 2024. Can Large Language Models Transform Computational Social Science?</w:t>
+        <w:t xml:space="preserve">Ziems, Caleb, William Held, Omar Shaikh, et al. 2024. Can Large Language Models Transform Computational Social Science?</w:t>
       </w:r>
       <w:r>
         <w:t xml:space="preserve"> </w:t>
@@ -8904,7 +8489,7 @@
       <w:r>
         <w:t xml:space="preserve"> </w:t>
       </w:r>
-      <w:hyperlink r:id="rId200">
+      <w:hyperlink r:id="rId190">
         <w:r>
           <w:rPr>
             <w:rStyle w:val="Hyperlink"/>
@@ -8916,8 +8501,8 @@
         <w:t xml:space="preserve">.</w:t>
       </w:r>
     </w:p>
-    <w:bookmarkEnd w:id="201"/>
-    <w:bookmarkStart w:id="203" w:name="ref-Zimmer2026"/>
+    <w:bookmarkEnd w:id="191"/>
+    <w:bookmarkStart w:id="193" w:name="ref-Zimmer2026"/>
     <w:p>
       <w:pPr>
         <w:pStyle w:val="Bibliography"/>
@@ -8928,20 +8513,7 @@
       <w:r>
         <w:t xml:space="preserve"> </w:t>
       </w:r>
-      <w:r>
-        <w:rPr>
-          <w:iCs/>
-          <w:i/>
-        </w:rPr>
-        <w:t xml:space="preserve">arXiv Preprint arXiv:2603.15914</w:t>
-      </w:r>
-      <w:r>
-        <w:t xml:space="preserve">.</w:t>
-      </w:r>
-      <w:r>
-        <w:t xml:space="preserve"> </w:t>
-      </w:r>
-      <w:hyperlink r:id="rId202">
+      <w:hyperlink r:id="rId192">
         <w:r>
           <w:rPr>
             <w:rStyle w:val="Hyperlink"/>
@@ -8953,9 +8525,9 @@
         <w:t xml:space="preserve">.</w:t>
       </w:r>
     </w:p>
-    <w:bookmarkEnd w:id="203"/>
-    <w:bookmarkEnd w:id="204"/>
-    <w:bookmarkEnd w:id="205"/>
+    <w:bookmarkEnd w:id="193"/>
+    <w:bookmarkEnd w:id="194"/>
+    <w:bookmarkEnd w:id="195"/>
     <w:sectPr>
       <w:footnotePr>
         <w:numRestart w:val="eachSect"/>
@@ -9251,91 +8823,6 @@
       </w:pPr>
     </w:lvl>
   </w:abstractNum>
-  <w:abstractNum w:abstractNumId="99411">
-    <w:nsid w:val="A99411"/>
-    <w:multiLevelType w:val="multilevel"/>
-    <w:lvl w:ilvl="0">
-      <w:start w:val="1"/>
-      <w:numFmt w:val="decimal"/>
-      <w:lvlText w:val="%1."/>
-      <w:lvlJc w:val="left"/>
-      <w:pPr>
-        <w:ind w:left="720" w:hanging="480"/>
-      </w:pPr>
-    </w:lvl>
-    <w:lvl w:ilvl="1">
-      <w:start w:val="1"/>
-      <w:numFmt w:val="decimal"/>
-      <w:lvlText w:val="%2."/>
-      <w:lvlJc w:val="left"/>
-      <w:pPr>
-        <w:ind w:left="1440" w:hanging="480"/>
-      </w:pPr>
-    </w:lvl>
-    <w:lvl w:ilvl="2">
-      <w:start w:val="1"/>
-      <w:numFmt w:val="decimal"/>
-      <w:lvlText w:val="%3."/>
-      <w:lvlJc w:val="left"/>
-      <w:pPr>
-        <w:ind w:left="2160" w:hanging="480"/>
-      </w:pPr>
-    </w:lvl>
-    <w:lvl w:ilvl="3">
-      <w:start w:val="1"/>
-      <w:numFmt w:val="decimal"/>
-      <w:lvlText w:val="%4."/>
-      <w:lvlJc w:val="left"/>
-      <w:pPr>
-        <w:ind w:left="2880" w:hanging="480"/>
-      </w:pPr>
-    </w:lvl>
-    <w:lvl w:ilvl="4">
-      <w:start w:val="1"/>
-      <w:numFmt w:val="decimal"/>
-      <w:lvlText w:val="%5."/>
-      <w:lvlJc w:val="left"/>
-      <w:pPr>
-        <w:ind w:left="3600" w:hanging="480"/>
-      </w:pPr>
-    </w:lvl>
-    <w:lvl w:ilvl="5">
-      <w:start w:val="1"/>
-      <w:numFmt w:val="decimal"/>
-      <w:lvlText w:val="%6."/>
-      <w:lvlJc w:val="left"/>
-      <w:pPr>
-        <w:ind w:left="4320" w:hanging="480"/>
-      </w:pPr>
-    </w:lvl>
-    <w:lvl w:ilvl="6">
-      <w:start w:val="1"/>
-      <w:numFmt w:val="decimal"/>
-      <w:lvlText w:val="%7."/>
-      <w:lvlJc w:val="left"/>
-      <w:pPr>
-        <w:ind w:left="5040" w:hanging="480"/>
-      </w:pPr>
-    </w:lvl>
-    <w:lvl w:ilvl="7">
-      <w:start w:val="1"/>
-      <w:numFmt w:val="decimal"/>
-      <w:lvlText w:val="%8."/>
-      <w:lvlJc w:val="left"/>
-      <w:pPr>
-        <w:ind w:left="5760" w:hanging="480"/>
-      </w:pPr>
-    </w:lvl>
-    <w:lvl w:ilvl="8">
-      <w:start w:val="1"/>
-      <w:numFmt w:val="decimal"/>
-      <w:lvlText w:val="%9."/>
-      <w:lvlJc w:val="left"/>
-      <w:pPr>
-        <w:ind w:left="6480" w:hanging="480"/>
-      </w:pPr>
-    </w:lvl>
-  </w:abstractNum>
   <w:num w16cid:durableId="1357734625" w:numId="1">
     <w:abstractNumId w:val="0"/>
   </w:num>
@@ -9344,36 +8831,6 @@
   </w:num>
   <w:num w:numId="1000">
     <w:abstractNumId w:val="990"/>
-  </w:num>
-  <w:num w:numId="1001">
-    <w:abstractNumId w:val="99411"/>
-    <w:lvlOverride w:ilvl="0">
-      <w:startOverride w:val="1"/>
-    </w:lvlOverride>
-    <w:lvlOverride w:ilvl="1">
-      <w:startOverride w:val="1"/>
-    </w:lvlOverride>
-    <w:lvlOverride w:ilvl="2">
-      <w:startOverride w:val="1"/>
-    </w:lvlOverride>
-    <w:lvlOverride w:ilvl="3">
-      <w:startOverride w:val="1"/>
-    </w:lvlOverride>
-    <w:lvlOverride w:ilvl="4">
-      <w:startOverride w:val="1"/>
-    </w:lvlOverride>
-    <w:lvlOverride w:ilvl="5">
-      <w:startOverride w:val="1"/>
-    </w:lvlOverride>
-    <w:lvlOverride w:ilvl="6">
-      <w:startOverride w:val="1"/>
-    </w:lvlOverride>
-    <w:lvlOverride w:ilvl="7">
-      <w:startOverride w:val="1"/>
-    </w:lvlOverride>
-    <w:lvlOverride w:ilvl="8">
-      <w:startOverride w:val="1"/>
-    </w:lvlOverride>
   </w:num>
 </w:numbering>
 </file>

</xml_diff>

<commit_message>
minor edits and simplifications
</commit_message>
<xml_diff>
--- a/analysis/paper/paper.docx
+++ b/analysis/paper/paper.docx
@@ -997,7 +997,151 @@
         <w:t xml:space="preserve"> </w:t>
       </w:r>
       <w:r>
-        <w:t xml:space="preserve">reviewable,</w:t>
+        <w:t xml:space="preserve">reviewable;</w:t>
+      </w:r>
+      <w:r>
+        <w:t xml:space="preserve"> </w:t>
+      </w:r>
+      <w:r>
+        <w:t xml:space="preserve">restricted</w:t>
+      </w:r>
+      <w:r>
+        <w:t xml:space="preserve"> </w:t>
+      </w:r>
+      <w:r>
+        <w:t xml:space="preserve">data</w:t>
+      </w:r>
+      <w:r>
+        <w:t xml:space="preserve"> </w:t>
+      </w:r>
+      <w:r>
+        <w:t xml:space="preserve">stay</w:t>
+      </w:r>
+      <w:r>
+        <w:t xml:space="preserve"> </w:t>
+      </w:r>
+      <w:r>
+        <w:t xml:space="preserve">protected</w:t>
+      </w:r>
+      <w:r>
+        <w:t xml:space="preserve"> </w:t>
+      </w:r>
+      <w:r>
+        <w:t xml:space="preserve">through</w:t>
+      </w:r>
+      <w:r>
+        <w:t xml:space="preserve"> </w:t>
+      </w:r>
+      <w:r>
+        <w:t xml:space="preserve">retention</w:t>
+      </w:r>
+      <w:r>
+        <w:t xml:space="preserve"> </w:t>
+      </w:r>
+      <w:r>
+        <w:t xml:space="preserve">controls,</w:t>
+      </w:r>
+      <w:r>
+        <w:t xml:space="preserve"> </w:t>
+      </w:r>
+      <w:r>
+        <w:t xml:space="preserve">local</w:t>
+      </w:r>
+      <w:r>
+        <w:t xml:space="preserve"> </w:t>
+      </w:r>
+      <w:r>
+        <w:t xml:space="preserve">models,</w:t>
+      </w:r>
+      <w:r>
+        <w:t xml:space="preserve"> </w:t>
+      </w:r>
+      <w:r>
+        <w:t xml:space="preserve">or</w:t>
+      </w:r>
+      <w:r>
+        <w:t xml:space="preserve"> </w:t>
+      </w:r>
+      <w:r>
+        <w:t xml:space="preserve">synthetic</w:t>
+      </w:r>
+      <w:r>
+        <w:t xml:space="preserve"> </w:t>
+      </w:r>
+      <w:r>
+        <w:t xml:space="preserve">stand-ins.</w:t>
+      </w:r>
+      <w:r>
+        <w:t xml:space="preserve"> </w:t>
+      </w:r>
+      <w:r>
+        <w:t xml:space="preserve">Getting</w:t>
+      </w:r>
+      <w:r>
+        <w:t xml:space="preserve"> </w:t>
+      </w:r>
+      <w:r>
+        <w:t xml:space="preserve">reliable</w:t>
+      </w:r>
+      <w:r>
+        <w:t xml:space="preserve"> </w:t>
+      </w:r>
+      <w:r>
+        <w:t xml:space="preserve">help</w:t>
+      </w:r>
+      <w:r>
+        <w:t xml:space="preserve"> </w:t>
+      </w:r>
+      <w:r>
+        <w:t xml:space="preserve">from</w:t>
+      </w:r>
+      <w:r>
+        <w:t xml:space="preserve"> </w:t>
+      </w:r>
+      <w:r>
+        <w:t xml:space="preserve">agentic</w:t>
+      </w:r>
+      <w:r>
+        <w:t xml:space="preserve"> </w:t>
+      </w:r>
+      <w:r>
+        <w:t xml:space="preserve">AI</w:t>
+      </w:r>
+      <w:r>
+        <w:t xml:space="preserve"> </w:t>
+      </w:r>
+      <w:r>
+        <w:t xml:space="preserve">has</w:t>
+      </w:r>
+      <w:r>
+        <w:t xml:space="preserve"> </w:t>
+      </w:r>
+      <w:r>
+        <w:t xml:space="preserve">costs</w:t>
+      </w:r>
+      <w:r>
+        <w:t xml:space="preserve"> </w:t>
+      </w:r>
+      <w:r>
+        <w:t xml:space="preserve">that</w:t>
+      </w:r>
+      <w:r>
+        <w:t xml:space="preserve"> </w:t>
+      </w:r>
+      <w:r>
+        <w:t xml:space="preserve">include</w:t>
+      </w:r>
+      <w:r>
+        <w:t xml:space="preserve"> </w:t>
+      </w:r>
+      <w:r>
+        <w:t xml:space="preserve">setup</w:t>
+      </w:r>
+      <w:r>
+        <w:t xml:space="preserve"> </w:t>
+      </w:r>
+      <w:r>
+        <w:t xml:space="preserve">time</w:t>
       </w:r>
       <w:r>
         <w:t xml:space="preserve"> </w:t>
@@ -1009,145 +1153,67 @@
         <w:t xml:space="preserve"> </w:t>
       </w:r>
       <w:r>
-        <w:t xml:space="preserve">restricted</w:t>
-      </w:r>
-      <w:r>
-        <w:t xml:space="preserve"> </w:t>
-      </w:r>
-      <w:r>
-        <w:t xml:space="preserve">data</w:t>
-      </w:r>
-      <w:r>
-        <w:t xml:space="preserve"> </w:t>
-      </w:r>
-      <w:r>
-        <w:t xml:space="preserve">stay</w:t>
-      </w:r>
-      <w:r>
-        <w:t xml:space="preserve"> </w:t>
-      </w:r>
-      <w:r>
-        <w:t xml:space="preserve">protected</w:t>
-      </w:r>
-      <w:r>
-        <w:t xml:space="preserve"> </w:t>
-      </w:r>
-      <w:r>
-        <w:t xml:space="preserve">through</w:t>
-      </w:r>
-      <w:r>
-        <w:t xml:space="preserve"> </w:t>
-      </w:r>
-      <w:r>
-        <w:t xml:space="preserve">retention</w:t>
-      </w:r>
-      <w:r>
-        <w:t xml:space="preserve"> </w:t>
-      </w:r>
-      <w:r>
-        <w:t xml:space="preserve">controls,</w:t>
-      </w:r>
-      <w:r>
-        <w:t xml:space="preserve"> </w:t>
-      </w:r>
-      <w:r>
-        <w:t xml:space="preserve">local</w:t>
-      </w:r>
-      <w:r>
-        <w:t xml:space="preserve"> </w:t>
-      </w:r>
-      <w:r>
-        <w:t xml:space="preserve">models,</w:t>
-      </w:r>
-      <w:r>
-        <w:t xml:space="preserve"> </w:t>
-      </w:r>
-      <w:r>
-        <w:t xml:space="preserve">or</w:t>
-      </w:r>
-      <w:r>
-        <w:t xml:space="preserve"> </w:t>
-      </w:r>
-      <w:r>
-        <w:t xml:space="preserve">synthetic</w:t>
-      </w:r>
-      <w:r>
-        <w:t xml:space="preserve"> </w:t>
-      </w:r>
-      <w:r>
-        <w:t xml:space="preserve">stand-ins.</w:t>
-      </w:r>
-      <w:r>
-        <w:t xml:space="preserve"> </w:t>
-      </w:r>
-      <w:r>
-        <w:t xml:space="preserve">Getting</w:t>
-      </w:r>
-      <w:r>
-        <w:t xml:space="preserve"> </w:t>
-      </w:r>
-      <w:r>
-        <w:t xml:space="preserve">reliable</w:t>
-      </w:r>
-      <w:r>
-        <w:t xml:space="preserve"> </w:t>
-      </w:r>
-      <w:r>
-        <w:t xml:space="preserve">help</w:t>
-      </w:r>
-      <w:r>
-        <w:t xml:space="preserve"> </w:t>
-      </w:r>
-      <w:r>
-        <w:t xml:space="preserve">from</w:t>
-      </w:r>
-      <w:r>
-        <w:t xml:space="preserve"> </w:t>
-      </w:r>
-      <w:r>
-        <w:t xml:space="preserve">agentic</w:t>
-      </w:r>
-      <w:r>
-        <w:t xml:space="preserve"> </w:t>
-      </w:r>
-      <w:r>
-        <w:t xml:space="preserve">AI</w:t>
-      </w:r>
-      <w:r>
-        <w:t xml:space="preserve"> </w:t>
-      </w:r>
-      <w:r>
-        <w:t xml:space="preserve">has</w:t>
-      </w:r>
-      <w:r>
-        <w:t xml:space="preserve"> </w:t>
-      </w:r>
-      <w:r>
-        <w:t xml:space="preserve">costs</w:t>
-      </w:r>
-      <w:r>
-        <w:t xml:space="preserve"> </w:t>
-      </w:r>
-      <w:r>
-        <w:t xml:space="preserve">that</w:t>
-      </w:r>
-      <w:r>
-        <w:t xml:space="preserve"> </w:t>
-      </w:r>
-      <w:r>
-        <w:t xml:space="preserve">include</w:t>
-      </w:r>
-      <w:r>
-        <w:t xml:space="preserve"> </w:t>
-      </w:r>
-      <w:r>
-        <w:t xml:space="preserve">setup</w:t>
-      </w:r>
-      <w:r>
-        <w:t xml:space="preserve"> </w:t>
-      </w:r>
-      <w:r>
-        <w:t xml:space="preserve">time</w:t>
+        <w:t xml:space="preserve">expert</w:t>
+      </w:r>
+      <w:r>
+        <w:t xml:space="preserve"> </w:t>
+      </w:r>
+      <w:r>
+        <w:t xml:space="preserve">oversight,</w:t>
+      </w:r>
+      <w:r>
+        <w:t xml:space="preserve"> </w:t>
+      </w:r>
+      <w:r>
+        <w:t xml:space="preserve">but</w:t>
+      </w:r>
+      <w:r>
+        <w:t xml:space="preserve"> </w:t>
+      </w:r>
+      <w:r>
+        <w:t xml:space="preserve">the</w:t>
+      </w:r>
+      <w:r>
+        <w:t xml:space="preserve"> </w:t>
+      </w:r>
+      <w:r>
+        <w:t xml:space="preserve">result</w:t>
+      </w:r>
+      <w:r>
+        <w:t xml:space="preserve"> </w:t>
+      </w:r>
+      <w:r>
+        <w:t xml:space="preserve">is</w:t>
+      </w:r>
+      <w:r>
+        <w:t xml:space="preserve"> </w:t>
+      </w:r>
+      <w:r>
+        <w:t xml:space="preserve">analysis</w:t>
+      </w:r>
+      <w:r>
+        <w:t xml:space="preserve"> </w:t>
+      </w:r>
+      <w:r>
+        <w:t xml:space="preserve">others</w:t>
+      </w:r>
+      <w:r>
+        <w:t xml:space="preserve"> </w:t>
+      </w:r>
+      <w:r>
+        <w:t xml:space="preserve">can</w:t>
+      </w:r>
+      <w:r>
+        <w:t xml:space="preserve"> </w:t>
+      </w:r>
+      <w:r>
+        <w:t xml:space="preserve">inspect,</w:t>
+      </w:r>
+      <w:r>
+        <w:t xml:space="preserve"> </w:t>
+      </w:r>
+      <w:r>
+        <w:t xml:space="preserve">rerun,</w:t>
       </w:r>
       <w:r>
         <w:t xml:space="preserve"> </w:t>
@@ -1159,78 +1225,6 @@
         <w:t xml:space="preserve"> </w:t>
       </w:r>
       <w:r>
-        <w:t xml:space="preserve">expert</w:t>
-      </w:r>
-      <w:r>
-        <w:t xml:space="preserve"> </w:t>
-      </w:r>
-      <w:r>
-        <w:t xml:space="preserve">oversight,</w:t>
-      </w:r>
-      <w:r>
-        <w:t xml:space="preserve"> </w:t>
-      </w:r>
-      <w:r>
-        <w:t xml:space="preserve">but</w:t>
-      </w:r>
-      <w:r>
-        <w:t xml:space="preserve"> </w:t>
-      </w:r>
-      <w:r>
-        <w:t xml:space="preserve">the</w:t>
-      </w:r>
-      <w:r>
-        <w:t xml:space="preserve"> </w:t>
-      </w:r>
-      <w:r>
-        <w:t xml:space="preserve">result</w:t>
-      </w:r>
-      <w:r>
-        <w:t xml:space="preserve"> </w:t>
-      </w:r>
-      <w:r>
-        <w:t xml:space="preserve">is</w:t>
-      </w:r>
-      <w:r>
-        <w:t xml:space="preserve"> </w:t>
-      </w:r>
-      <w:r>
-        <w:t xml:space="preserve">analysis</w:t>
-      </w:r>
-      <w:r>
-        <w:t xml:space="preserve"> </w:t>
-      </w:r>
-      <w:r>
-        <w:t xml:space="preserve">others</w:t>
-      </w:r>
-      <w:r>
-        <w:t xml:space="preserve"> </w:t>
-      </w:r>
-      <w:r>
-        <w:t xml:space="preserve">can</w:t>
-      </w:r>
-      <w:r>
-        <w:t xml:space="preserve"> </w:t>
-      </w:r>
-      <w:r>
-        <w:t xml:space="preserve">inspect,</w:t>
-      </w:r>
-      <w:r>
-        <w:t xml:space="preserve"> </w:t>
-      </w:r>
-      <w:r>
-        <w:t xml:space="preserve">rerun,</w:t>
-      </w:r>
-      <w:r>
-        <w:t xml:space="preserve"> </w:t>
-      </w:r>
-      <w:r>
-        <w:t xml:space="preserve">and</w:t>
-      </w:r>
-      <w:r>
-        <w:t xml:space="preserve"> </w:t>
-      </w:r>
-      <w:r>
         <w:t xml:space="preserve">trust.</w:t>
       </w:r>
     </w:p>
@@ -1266,7 +1260,7 @@
         <w:t xml:space="preserve">(Feuerriegel et al. 2024)</w:t>
       </w:r>
       <w:r>
-        <w:t xml:space="preserve">. For the majority of archaeologists, the most commonly used generative AI tools are large language models (LLMs), such as ChatGPT and Claude, that we interact with via a web-based chat interface. While these models often generate useful content, outputs can also include hallucinations (content presented as factual without an adequate basis), invented citations</w:t>
+        <w:t xml:space="preserve">. For the majority of archaeologists the most commonly used generative AI tools are large language models (LLMs), such as ChatGPT and Claude, that we interact with via a web-based chat interface. While these models often generate useful content, outputs can also include hallucinations (content presented as factual without an adequate basis), invented citations</w:t>
       </w:r>
       <w:r>
         <w:t xml:space="preserve"> </w:t>
@@ -1372,7 +1366,7 @@
         <w:t xml:space="preserve"> </w:t>
       </w:r>
       <w:r>
-        <w:t xml:space="preserve">found only 20% use agents. The true figure is probably much lower as this sample was taken from researchers recruited in exchange for access to a commercial AI product. Our guide focuses on how archaeologists can use agentic AI so that the agent works only within a single project and you direct each stage. We are not describing end-to-end fully automated AI pipelines that generate ideas, run experiments and write manuscripts with limited human intervention</w:t>
+        <w:t xml:space="preserve">found only 20% use agents. The true figure is probably much lower as this sample was taken from researchers recruited in exchange for access to a commercial AI product. Our guide focuses on how archaeologists can use agentic AI so that the agent works only within a single project under your direction at every stage. We are not describing end-to-end fully automated AI pipelines that generate ideas, run experiments and write manuscripts with limited human intervention</w:t>
       </w:r>
       <w:r>
         <w:t xml:space="preserve"> </w:t>
@@ -1401,7 +1395,7 @@
           <w:bookmarkStart w:id="20" w:name="tbl-chat-vs-agentic"/>
           <w:p>
             <w:pPr>
-              <w:jc w:val="center"/>
+              <w:jc w:val="left"/>
             </w:pPr>
             <w:pPr>
               <w:jc w:val="start"/>
@@ -1427,9 +1421,9 @@
               <w:tblLayout w:type="fixed"/>
             </w:tblPr>
             <w:tblGrid>
-              <w:gridCol w:w="1403"/>
-              <w:gridCol w:w="2907"/>
-              <w:gridCol w:w="3609"/>
+              <w:gridCol w:w="1742"/>
+              <w:gridCol w:w="3088"/>
+              <w:gridCol w:w="3088"/>
             </w:tblGrid>
             <w:tr>
               <w:trPr>
@@ -1441,7 +1435,7 @@
                   <w:pPr>
                     <w:pStyle w:val="Compact"/>
                     <w:jc w:val="left"/>
-                    <w:jc w:val="center"/>
+                    <w:jc w:val="left"/>
                   </w:pPr>
                   <w:r>
                     <w:t xml:space="preserve">Dimension</w:t>
@@ -1454,7 +1448,7 @@
                   <w:pPr>
                     <w:pStyle w:val="Compact"/>
                     <w:jc w:val="left"/>
-                    <w:jc w:val="center"/>
+                    <w:jc w:val="left"/>
                   </w:pPr>
                   <w:r>
                     <w:t xml:space="preserve">Web-Based Chat</w:t>
@@ -1467,7 +1461,7 @@
                   <w:pPr>
                     <w:pStyle w:val="Compact"/>
                     <w:jc w:val="left"/>
-                    <w:jc w:val="center"/>
+                    <w:jc w:val="left"/>
                   </w:pPr>
                   <w:r>
                     <w:t xml:space="preserve">Agentic AI</w:t>
@@ -1482,7 +1476,7 @@
                   <w:pPr>
                     <w:pStyle w:val="Compact"/>
                     <w:jc w:val="left"/>
-                    <w:jc w:val="center"/>
+                    <w:jc w:val="left"/>
                   </w:pPr>
                   <w:r>
                     <w:t xml:space="preserve">Objective</w:t>
@@ -1495,7 +1489,7 @@
                   <w:pPr>
                     <w:pStyle w:val="Compact"/>
                     <w:jc w:val="left"/>
-                    <w:jc w:val="center"/>
+                    <w:jc w:val="left"/>
                   </w:pPr>
                   <w:r>
                     <w:t xml:space="preserve">Produces a relevant text response to the current prompt</w:t>
@@ -1508,7 +1502,7 @@
                   <w:pPr>
                     <w:pStyle w:val="Compact"/>
                     <w:jc w:val="left"/>
-                    <w:jc w:val="center"/>
+                    <w:jc w:val="left"/>
                   </w:pPr>
                   <w:r>
                     <w:t xml:space="preserve">Completes an external goal across many steps</w:t>
@@ -1523,7 +1517,7 @@
                   <w:pPr>
                     <w:pStyle w:val="Compact"/>
                     <w:jc w:val="left"/>
-                    <w:jc w:val="center"/>
+                    <w:jc w:val="left"/>
                   </w:pPr>
                   <w:r>
                     <w:t xml:space="preserve">Interaction pattern</w:t>
@@ -1536,7 +1530,7 @@
                   <w:pPr>
                     <w:pStyle w:val="Compact"/>
                     <w:jc w:val="left"/>
-                    <w:jc w:val="center"/>
+                    <w:jc w:val="left"/>
                   </w:pPr>
                   <w:r>
                     <w:t xml:space="preserve">Turn-based question and answer in a browser session</w:t>
@@ -1549,7 +1543,7 @@
                   <w:pPr>
                     <w:pStyle w:val="Compact"/>
                     <w:jc w:val="left"/>
-                    <w:jc w:val="center"/>
+                    <w:jc w:val="left"/>
                   </w:pPr>
                   <w:r>
                     <w:t xml:space="preserve">Perceive-plan-act-observe loop until a stopping condition</w:t>
@@ -1564,7 +1558,7 @@
                   <w:pPr>
                     <w:pStyle w:val="Compact"/>
                     <w:jc w:val="left"/>
-                    <w:jc w:val="center"/>
+                    <w:jc w:val="left"/>
                   </w:pPr>
                   <w:r>
                     <w:t xml:space="preserve">Initiative</w:t>
@@ -1577,7 +1571,7 @@
                   <w:pPr>
                     <w:pStyle w:val="Compact"/>
                     <w:jc w:val="left"/>
-                    <w:jc w:val="center"/>
+                    <w:jc w:val="left"/>
                   </w:pPr>
                   <w:r>
                     <w:t xml:space="preserve">Reactive; waits for the user</w:t>
@@ -1590,7 +1584,7 @@
                   <w:pPr>
                     <w:pStyle w:val="Compact"/>
                     <w:jc w:val="left"/>
-                    <w:jc w:val="center"/>
+                    <w:jc w:val="left"/>
                   </w:pPr>
                   <w:r>
                     <w:t xml:space="preserve">Proactive; decomposes goals and starts sub-tasks</w:t>
@@ -1605,7 +1599,7 @@
                   <w:pPr>
                     <w:pStyle w:val="Compact"/>
                     <w:jc w:val="left"/>
-                    <w:jc w:val="center"/>
+                    <w:jc w:val="left"/>
                   </w:pPr>
                   <w:r>
                     <w:t xml:space="preserve">Tool and environment action</w:t>
@@ -1618,7 +1612,7 @@
                   <w:pPr>
                     <w:pStyle w:val="Compact"/>
                     <w:jc w:val="left"/>
-                    <w:jc w:val="center"/>
+                    <w:jc w:val="left"/>
                   </w:pPr>
                   <w:r>
                     <w:t xml:space="preserve">Text only by default; browsing or files when added</w:t>
@@ -1631,7 +1625,7 @@
                   <w:pPr>
                     <w:pStyle w:val="Compact"/>
                     <w:jc w:val="left"/>
-                    <w:jc w:val="center"/>
+                    <w:jc w:val="left"/>
                   </w:pPr>
                   <w:r>
                     <w:t xml:space="preserve">Native tool calls plus APIs code execution and instrument control</w:t>
@@ -1646,7 +1640,7 @@
                   <w:pPr>
                     <w:pStyle w:val="Compact"/>
                     <w:jc w:val="left"/>
-                    <w:jc w:val="center"/>
+                    <w:jc w:val="left"/>
                   </w:pPr>
                   <w:r>
                     <w:t xml:space="preserve">Planning</w:t>
@@ -1659,7 +1653,7 @@
                   <w:pPr>
                     <w:pStyle w:val="Compact"/>
                     <w:jc w:val="left"/>
-                    <w:jc w:val="center"/>
+                    <w:jc w:val="left"/>
                   </w:pPr>
                   <w:r>
                     <w:t xml:space="preserve">Implicit single-response reasoning</w:t>
@@ -1672,7 +1666,7 @@
                   <w:pPr>
                     <w:pStyle w:val="Compact"/>
                     <w:jc w:val="left"/>
-                    <w:jc w:val="center"/>
+                    <w:jc w:val="left"/>
                   </w:pPr>
                   <w:r>
                     <w:t xml:space="preserve">Explicit task decomposition reflection and re-planning</w:t>
@@ -1687,7 +1681,7 @@
                   <w:pPr>
                     <w:pStyle w:val="Compact"/>
                     <w:jc w:val="left"/>
-                    <w:jc w:val="center"/>
+                    <w:jc w:val="left"/>
                   </w:pPr>
                   <w:r>
                     <w:t xml:space="preserve">Memory and state</w:t>
@@ -1700,7 +1694,7 @@
                   <w:pPr>
                     <w:pStyle w:val="Compact"/>
                     <w:jc w:val="left"/>
-                    <w:jc w:val="center"/>
+                    <w:jc w:val="left"/>
                   </w:pPr>
                   <w:r>
                     <w:t xml:space="preserve">Short dialogue context with limited persistence</w:t>
@@ -1713,7 +1707,7 @@
                   <w:pPr>
                     <w:pStyle w:val="Compact"/>
                     <w:jc w:val="left"/>
-                    <w:jc w:val="center"/>
+                    <w:jc w:val="left"/>
                   </w:pPr>
                   <w:r>
                     <w:t xml:space="preserve">Long-term memory stored plans and persistent agent state</w:t>
@@ -1728,7 +1722,7 @@
                   <w:pPr>
                     <w:pStyle w:val="Compact"/>
                     <w:jc w:val="left"/>
-                    <w:jc w:val="center"/>
+                    <w:jc w:val="left"/>
                   </w:pPr>
                   <w:r>
                     <w:t xml:space="preserve">Architecture</w:t>
@@ -1741,7 +1735,7 @@
                   <w:pPr>
                     <w:pStyle w:val="Compact"/>
                     <w:jc w:val="left"/>
-                    <w:jc w:val="center"/>
+                    <w:jc w:val="left"/>
                   </w:pPr>
                   <w:r>
                     <w:t xml:space="preserve">Language model plus dialogue interface and safety filters</w:t>
@@ -1754,7 +1748,7 @@
                   <w:pPr>
                     <w:pStyle w:val="Compact"/>
                     <w:jc w:val="left"/>
-                    <w:jc w:val="center"/>
+                    <w:jc w:val="left"/>
                   </w:pPr>
                   <w:r>
                     <w:t xml:space="preserve">Language model plus planner memory tool interfaces and orchestration</w:t>
@@ -1769,7 +1763,7 @@
                   <w:pPr>
                     <w:pStyle w:val="Compact"/>
                     <w:jc w:val="left"/>
-                    <w:jc w:val="center"/>
+                    <w:jc w:val="left"/>
                   </w:pPr>
                   <w:r>
                     <w:t xml:space="preserve">Task duration</w:t>
@@ -1782,7 +1776,7 @@
                   <w:pPr>
                     <w:pStyle w:val="Compact"/>
                     <w:jc w:val="left"/>
-                    <w:jc w:val="center"/>
+                    <w:jc w:val="left"/>
                   </w:pPr>
                   <w:r>
                     <w:t xml:space="preserve">Seconds to minutes per answer</w:t>
@@ -1795,7 +1789,7 @@
                   <w:pPr>
                     <w:pStyle w:val="Compact"/>
                     <w:jc w:val="left"/>
-                    <w:jc w:val="center"/>
+                    <w:jc w:val="left"/>
                   </w:pPr>
                   <w:r>
                     <w:t xml:space="preserve">Minutes to hours or days of autonomous operation</w:t>
@@ -1810,7 +1804,7 @@
                   <w:pPr>
                     <w:pStyle w:val="Compact"/>
                     <w:jc w:val="left"/>
-                    <w:jc w:val="center"/>
+                    <w:jc w:val="left"/>
                   </w:pPr>
                   <w:r>
                     <w:t xml:space="preserve">Evaluation</w:t>
@@ -1823,7 +1817,7 @@
                   <w:pPr>
                     <w:pStyle w:val="Compact"/>
                     <w:jc w:val="left"/>
-                    <w:jc w:val="center"/>
+                    <w:jc w:val="left"/>
                   </w:pPr>
                   <w:r>
                     <w:t xml:space="preserve">Response quality factuality and helpfulness</w:t>
@@ -1836,7 +1830,7 @@
                   <w:pPr>
                     <w:pStyle w:val="Compact"/>
                     <w:jc w:val="left"/>
-                    <w:jc w:val="center"/>
+                    <w:jc w:val="left"/>
                   </w:pPr>
                   <w:r>
                     <w:t xml:space="preserve">Task completion correct tool sequences and side effects</w:t>
@@ -1851,7 +1845,7 @@
                   <w:pPr>
                     <w:pStyle w:val="Compact"/>
                     <w:jc w:val="left"/>
-                    <w:jc w:val="center"/>
+                    <w:jc w:val="left"/>
                   </w:pPr>
                   <w:r>
                     <w:t xml:space="preserve">Risk profile</w:t>
@@ -1864,7 +1858,7 @@
                   <w:pPr>
                     <w:pStyle w:val="Compact"/>
                     <w:jc w:val="left"/>
-                    <w:jc w:val="center"/>
+                    <w:jc w:val="left"/>
                   </w:pPr>
                   <w:r>
                     <w:t xml:space="preserve">Misinformation bias and over-reliance on fluent text</w:t>
@@ -1877,7 +1871,7 @@
                   <w:pPr>
                     <w:pStyle w:val="Compact"/>
                     <w:jc w:val="left"/>
-                    <w:jc w:val="center"/>
+                    <w:jc w:val="left"/>
                   </w:pPr>
                   <w:r>
                     <w:t xml:space="preserve">All chat risks plus incorrect actions runaway loops and unsafe tool use</w:t>
@@ -1923,7 +1917,7 @@
         <w:t xml:space="preserve">(Jonker et al. 2024; Monakhov 2026)</w:t>
       </w:r>
       <w:r>
-        <w:t xml:space="preserve">. This can be contrasted with human-in-the-loop approaches where human intervention is mostly as a validator rather than decision-maker</w:t>
+        <w:t xml:space="preserve">. This can be contrasted with human-in-the-loop approaches where human intervention is mostly as validation rather than decision-maker</w:t>
       </w:r>
       <w:r>
         <w:t xml:space="preserve"> </w:t>
@@ -1957,7 +1951,7 @@
         <w:pStyle w:val="BodyText"/>
       </w:pPr>
       <w:r>
-        <w:t xml:space="preserve">The high level of researcher control associated with the human at the helm approach is necessary to honor our responsibilities toward the communities involved in our work and affected by it. AI-generated perspectives cannot replace community participation</w:t>
+        <w:t xml:space="preserve">The high-level researcher control associated with the human at the helm approach is necessary to honor our responsibilities toward the communities involved in our work and affected by it. AI-generated perspectives cannot replace community participation</w:t>
       </w:r>
       <w:r>
         <w:t xml:space="preserve"> </w:t>
@@ -2007,7 +2001,7 @@
           <w:bookmarkStart w:id="21" w:name="tbl-helm-vs-loop"/>
           <w:p>
             <w:pPr>
-              <w:jc w:val="center"/>
+              <w:jc w:val="left"/>
             </w:pPr>
             <w:pPr>
               <w:jc w:val="start"/>
@@ -2036,9 +2030,9 @@
               <w:tblLayout w:type="fixed"/>
             </w:tblPr>
             <w:tblGrid>
-              <w:gridCol w:w="1278"/>
-              <w:gridCol w:w="3258"/>
-              <w:gridCol w:w="3382"/>
+              <w:gridCol w:w="1742"/>
+              <w:gridCol w:w="3088"/>
+              <w:gridCol w:w="3088"/>
             </w:tblGrid>
             <w:tr>
               <w:trPr>
@@ -2050,7 +2044,7 @@
                   <w:pPr>
                     <w:pStyle w:val="Compact"/>
                     <w:jc w:val="left"/>
-                    <w:jc w:val="center"/>
+                    <w:jc w:val="left"/>
                   </w:pPr>
                   <w:r>
                     <w:t xml:space="preserve">Dimension</w:t>
@@ -2063,7 +2057,7 @@
                   <w:pPr>
                     <w:pStyle w:val="Compact"/>
                     <w:jc w:val="left"/>
-                    <w:jc w:val="center"/>
+                    <w:jc w:val="left"/>
                   </w:pPr>
                   <w:r>
                     <w:t xml:space="preserve">Human in the Loop</w:t>
@@ -2076,7 +2070,7 @@
                   <w:pPr>
                     <w:pStyle w:val="Compact"/>
                     <w:jc w:val="left"/>
-                    <w:jc w:val="center"/>
+                    <w:jc w:val="left"/>
                   </w:pPr>
                   <w:r>
                     <w:t xml:space="preserve">Human at the Helm</w:t>
@@ -2091,7 +2085,7 @@
                   <w:pPr>
                     <w:pStyle w:val="Compact"/>
                     <w:jc w:val="left"/>
-                    <w:jc w:val="center"/>
+                    <w:jc w:val="left"/>
                   </w:pPr>
                   <w:r>
                     <w:t xml:space="preserve">Locus of authority</w:t>
@@ -2104,7 +2098,7 @@
                   <w:pPr>
                     <w:pStyle w:val="Compact"/>
                     <w:jc w:val="left"/>
-                    <w:jc w:val="center"/>
+                    <w:jc w:val="left"/>
                   </w:pPr>
                   <w:r>
                     <w:t xml:space="preserve">AI drives the workflow; the human approves at checkpoints</w:t>
@@ -2117,7 +2111,7 @@
                   <w:pPr>
                     <w:pStyle w:val="Compact"/>
                     <w:jc w:val="left"/>
-                    <w:jc w:val="center"/>
+                    <w:jc w:val="left"/>
                   </w:pPr>
                   <w:r>
                     <w:t xml:space="preserve">Human directs the workflow; AI executes under direction</w:t>
@@ -2132,7 +2126,7 @@
                   <w:pPr>
                     <w:pStyle w:val="Compact"/>
                     <w:jc w:val="left"/>
-                    <w:jc w:val="center"/>
+                    <w:jc w:val="left"/>
                   </w:pPr>
                   <w:r>
                     <w:t xml:space="preserve">Human role</w:t>
@@ -2145,7 +2139,7 @@
                   <w:pPr>
                     <w:pStyle w:val="Compact"/>
                     <w:jc w:val="left"/>
-                    <w:jc w:val="center"/>
+                    <w:jc w:val="left"/>
                   </w:pPr>
                   <w:r>
                     <w:t xml:space="preserve">Intermittent reviewer, validator, or corrector</w:t>
@@ -2158,7 +2152,7 @@
                   <w:pPr>
                     <w:pStyle w:val="Compact"/>
                     <w:jc w:val="left"/>
-                    <w:jc w:val="center"/>
+                    <w:jc w:val="left"/>
                   </w:pPr>
                   <w:r>
                     <w:t xml:space="preserve">Continuous director and final decision-maker</w:t>
@@ -2173,7 +2167,7 @@
                   <w:pPr>
                     <w:pStyle w:val="Compact"/>
                     <w:jc w:val="left"/>
-                    <w:jc w:val="center"/>
+                    <w:jc w:val="left"/>
                   </w:pPr>
                   <w:r>
                     <w:t xml:space="preserve">When humans act</w:t>
@@ -2186,7 +2180,7 @@
                   <w:pPr>
                     <w:pStyle w:val="Compact"/>
                     <w:jc w:val="left"/>
-                    <w:jc w:val="center"/>
+                    <w:jc w:val="left"/>
                   </w:pPr>
                   <w:r>
                     <w:t xml:space="preserve">At predefined intervention points (approval gates, error correction)</w:t>
@@ -2199,7 +2193,7 @@
                   <w:pPr>
                     <w:pStyle w:val="Compact"/>
                     <w:jc w:val="left"/>
-                    <w:jc w:val="center"/>
+                    <w:jc w:val="left"/>
                   </w:pPr>
                   <w:r>
                     <w:t xml:space="preserve">Throughout the process, including goal definition and result interpretation</w:t>
@@ -2214,7 +2208,7 @@
                   <w:pPr>
                     <w:pStyle w:val="Compact"/>
                     <w:jc w:val="left"/>
-                    <w:jc w:val="center"/>
+                    <w:jc w:val="left"/>
                   </w:pPr>
                   <w:r>
                     <w:t xml:space="preserve">Control logic</w:t>
@@ -2227,7 +2221,7 @@
                   <w:pPr>
                     <w:pStyle w:val="Compact"/>
                     <w:jc w:val="left"/>
-                    <w:jc w:val="center"/>
+                    <w:jc w:val="left"/>
                   </w:pPr>
                   <w:r>
                     <w:t xml:space="preserve">Oversight of individual AI outputs (exception handling)</w:t>
@@ -2240,7 +2234,7 @@
                   <w:pPr>
                     <w:pStyle w:val="Compact"/>
                     <w:jc w:val="left"/>
-                    <w:jc w:val="center"/>
+                    <w:jc w:val="left"/>
                   </w:pPr>
                   <w:r>
                     <w:t xml:space="preserve">Steering the entire trajectory of the research task</w:t>
@@ -2255,7 +2249,7 @@
                   <w:pPr>
                     <w:pStyle w:val="Compact"/>
                     <w:jc w:val="left"/>
-                    <w:jc w:val="center"/>
+                    <w:jc w:val="left"/>
                   </w:pPr>
                   <w:r>
                     <w:t xml:space="preserve">Accountability</w:t>
@@ -2268,7 +2262,7 @@
                   <w:pPr>
                     <w:pStyle w:val="Compact"/>
                     <w:jc w:val="left"/>
-                    <w:jc w:val="center"/>
+                    <w:jc w:val="left"/>
                   </w:pPr>
                   <w:r>
                     <w:t xml:space="preserve">Distributed between system and operator; often ambiguous in practice</w:t>
@@ -2281,7 +2275,7 @@
                   <w:pPr>
                     <w:pStyle w:val="Compact"/>
                     <w:jc w:val="left"/>
-                    <w:jc w:val="center"/>
+                    <w:jc w:val="left"/>
                   </w:pPr>
                   <w:r>
                     <w:t xml:space="preserve">Retained by the researcher from start to finish</w:t>
@@ -2296,7 +2290,7 @@
                   <w:pPr>
                     <w:pStyle w:val="Compact"/>
                     <w:jc w:val="left"/>
-                    <w:jc w:val="center"/>
+                    <w:jc w:val="left"/>
                   </w:pPr>
                   <w:r>
                     <w:t xml:space="preserve">Epistemic stance</w:t>
@@ -2309,7 +2303,7 @@
                   <w:pPr>
                     <w:pStyle w:val="Compact"/>
                     <w:jc w:val="left"/>
-                    <w:jc w:val="center"/>
+                    <w:jc w:val="left"/>
                   </w:pPr>
                   <w:r>
                     <w:t xml:space="preserve">Machine output is assumed usable until flagged</w:t>
@@ -2322,7 +2316,7 @@
                   <w:pPr>
                     <w:pStyle w:val="Compact"/>
                     <w:jc w:val="left"/>
-                    <w:jc w:val="center"/>
+                    <w:jc w:val="left"/>
                   </w:pPr>
                   <w:r>
                     <w:t xml:space="preserve">Machine output is provisional until the researcher has understood and endorsed it</w:t>
@@ -2337,7 +2331,7 @@
                   <w:pPr>
                     <w:pStyle w:val="Compact"/>
                     <w:jc w:val="left"/>
-                    <w:jc w:val="center"/>
+                    <w:jc w:val="left"/>
                   </w:pPr>
                   <w:r>
                     <w:t xml:space="preserve">Relation to research integrity</w:t>
@@ -2350,7 +2344,7 @@
                   <w:pPr>
                     <w:pStyle w:val="Compact"/>
                     <w:jc w:val="left"/>
-                    <w:jc w:val="center"/>
+                    <w:jc w:val="left"/>
                   </w:pPr>
                   <w:r>
                     <w:t xml:space="preserve">Can automate reasoning while the human only reacts</w:t>
@@ -2363,7 +2357,7 @@
                   <w:pPr>
                     <w:pStyle w:val="Compact"/>
                     <w:jc w:val="left"/>
-                    <w:jc w:val="center"/>
+                    <w:jc w:val="left"/>
                   </w:pPr>
                   <w:r>
                     <w:t xml:space="preserve">Preserves human agency; the researcher owns the reasoning and the result</w:t>
@@ -2378,7 +2372,7 @@
                   <w:pPr>
                     <w:pStyle w:val="Compact"/>
                     <w:jc w:val="left"/>
-                    <w:jc w:val="center"/>
+                    <w:jc w:val="left"/>
                   </w:pPr>
                   <w:r>
                     <w:t xml:space="preserve">Scientific framing</w:t>
@@ -2391,7 +2385,7 @@
                   <w:pPr>
                     <w:pStyle w:val="Compact"/>
                     <w:jc w:val="left"/>
-                    <w:jc w:val="center"/>
+                    <w:jc w:val="left"/>
                   </w:pPr>
                   <w:r>
                     <w:t xml:space="preserve">HITL is a system-design pattern common in machine learning</w:t>
@@ -2404,7 +2398,7 @@
                   <w:pPr>
                     <w:pStyle w:val="Compact"/>
                     <w:jc w:val="left"/>
-                    <w:jc w:val="center"/>
+                    <w:jc w:val="left"/>
                   </w:pPr>
                   <w:r>
                     <w:t xml:space="preserve">Extends meaningful human control to research contexts</w:t>
@@ -2419,7 +2413,7 @@
                   <w:pPr>
                     <w:pStyle w:val="Compact"/>
                     <w:jc w:val="left"/>
-                    <w:jc w:val="center"/>
+                    <w:jc w:val="left"/>
                   </w:pPr>
                   <w:r>
                     <w:t xml:space="preserve">Regulatory echo</w:t>
@@ -2432,7 +2426,7 @@
                   <w:pPr>
                     <w:pStyle w:val="Compact"/>
                     <w:jc w:val="left"/>
-                    <w:jc w:val="center"/>
+                    <w:jc w:val="left"/>
                   </w:pPr>
                   <w:r>
                     <w:t xml:space="preserve">Absent in law; legal discourse requires oversight, not mere presence in a loop</w:t>
@@ -2445,7 +2439,7 @@
                   <w:pPr>
                     <w:pStyle w:val="Compact"/>
                     <w:jc w:val="left"/>
-                    <w:jc w:val="center"/>
+                    <w:jc w:val="left"/>
                   </w:pPr>
                   <w:r>
                     <w:t xml:space="preserve">Aligns with human oversight and control requirements in AI regulation</w:t>
@@ -2460,7 +2454,7 @@
                   <w:pPr>
                     <w:pStyle w:val="Compact"/>
                     <w:jc w:val="left"/>
-                    <w:jc w:val="center"/>
+                    <w:jc w:val="left"/>
                   </w:pPr>
                   <w:r>
                     <w:t xml:space="preserve">Risk profile</w:t>
@@ -2473,7 +2467,7 @@
                   <w:pPr>
                     <w:pStyle w:val="Compact"/>
                     <w:jc w:val="left"/>
-                    <w:jc w:val="center"/>
+                    <w:jc w:val="left"/>
                   </w:pPr>
                   <w:r>
                     <w:t xml:space="preserve">Risk of automation bias: the human rubber-stamps machine output</w:t>
@@ -2486,7 +2480,7 @@
                   <w:pPr>
                     <w:pStyle w:val="Compact"/>
                     <w:jc w:val="left"/>
-                    <w:jc w:val="center"/>
+                    <w:jc w:val="left"/>
                   </w:pPr>
                   <w:r>
                     <w:t xml:space="preserve">Risk reduced by continuous human direction, though the human must stay engaged</w:t>
@@ -2501,7 +2495,7 @@
                   <w:pPr>
                     <w:pStyle w:val="Compact"/>
                     <w:jc w:val="left"/>
-                    <w:jc w:val="center"/>
+                    <w:jc w:val="left"/>
                   </w:pPr>
                   <w:r>
                     <w:t xml:space="preserve">Definition of collaboration</w:t>
@@ -2514,7 +2508,7 @@
                   <w:pPr>
                     <w:pStyle w:val="Compact"/>
                     <w:jc w:val="left"/>
-                    <w:jc w:val="center"/>
+                    <w:jc w:val="left"/>
                   </w:pPr>
                   <w:r>
                     <w:t xml:space="preserve">Human and AI as separable stages in a pipeline</w:t>
@@ -2527,7 +2521,7 @@
                   <w:pPr>
                     <w:pStyle w:val="Compact"/>
                     <w:jc w:val="left"/>
-                    <w:jc w:val="center"/>
+                    <w:jc w:val="left"/>
                   </w:pPr>
                   <w:r>
                     <w:t xml:space="preserve">Human and AI as a joint sensemaking process; humans add value AI cannot</w:t>
@@ -2588,7 +2582,7 @@
         <w:t xml:space="preserve"> </w:t>
       </w:r>
       <w:r>
-        <w:t xml:space="preserve">(Abramson et al. 2026; Campbell et al. 2024; Dyck 2026; Nejjar et al. 2025)</w:t>
+        <w:t xml:space="preserve">(Abramson et al. 2026; Campbell et al. 2024; Nejjar et al. 2025)</w:t>
       </w:r>
       <w:r>
         <w:t xml:space="preserve">.</w:t>
@@ -2608,7 +2602,7 @@
         <w:t xml:space="preserve">(Marwick 2017)</w:t>
       </w:r>
       <w:r>
-        <w:t xml:space="preserve">, and learning how they work together, for example, for R users the tidyverse set of packages for data preparation and visualization</w:t>
+        <w:t xml:space="preserve">, and learning how they work together. For R users that set includes the tidyverse set of packages for data preparation and visualization</w:t>
       </w:r>
       <w:r>
         <w:t xml:space="preserve"> </w:t>
@@ -2625,7 +2619,7 @@
         <w:pStyle w:val="BodyText"/>
       </w:pPr>
       <w:r>
-        <w:t xml:space="preserve">Git is a free and open source software that specializes in collaboration and recording versions of project files (e.g. text, code, data) so you can inspect changes and retrieve earlier work</w:t>
+        <w:t xml:space="preserve">Git is free and open source software that records successive versions of a project’s text, code, and data files, so you can inspect every change and recover earlier work</w:t>
       </w:r>
       <w:r>
         <w:t xml:space="preserve"> </w:t>
@@ -2634,7 +2628,7 @@
         <w:t xml:space="preserve">(Blischak et al. 2016)</w:t>
       </w:r>
       <w:r>
-        <w:t xml:space="preserve">. Agents can handle routine Git operations efficiently to track changes over multiple files in a project. The toolkit we have sketched out here, centered on R, Markdown, and Git, is especially well-suited for working with AI agents because it gives the agent and the researcher a shared, inspectable medium using free and open source tools. Agents read Markdown instruction files, run the R code embedded in our Quarto documents, and their edits are traceable as Git commits (a commit is a saved snapshot of your project’s files at a specific point in time). This is a robust system for linking reported results back to the executable analyses that generated them; the agent transparently records every machine-generated change in plain text for you to review before accepting or rejecting it.</w:t>
+        <w:t xml:space="preserve">. Agents can handle routine Git operations efficiently to track changes over multiple files in a project. The toolkit we have sketched out here, centered on R, Markdown, and Git, is especially well-suited for working with AI agents because it gives the agent and the researcher a shared, inspectable medium using free and open source tools. Agents read Markdown instruction files, run the R code embedded in our Quarto documents, and their output and edits are traceable as Git commits (a saved snapshot of your project’s files at a specific point in time) and human-readable as Git diffs (plain text records of changes of your files from one commit to another). This is an efficient system for linking reported results back to the executable analyses that generated them; the agent transparently records every machine-generated change in plain text for you to review before accepting or rejecting it.</w:t>
       </w:r>
     </w:p>
     <w:bookmarkEnd w:id="23"/>
@@ -2652,7 +2646,7 @@
         <w:pStyle w:val="FirstParagraph"/>
       </w:pPr>
       <w:r>
-        <w:t xml:space="preserve">When we use the tools described above, it is relatively simple to configure an AI agent so that it can efficiently see all the files in our project and edit them directly. The key tool here is a local harness, this is software you install on your computer that turns a LLM into an agent. The LLM by itself can only generate text, and the harness connects that model to tools, such as reading and editing project files, running shell and R commands, calling MCP servers, and managing the exchange between the model, the tools, and you. The harness enforces permissions, and manages context, runs loops, and presents the interface (</w:t>
+        <w:t xml:space="preserve">When you use the tools described above, it is relatively simple to configure an AI agent so that it can efficiently see all the files in your project and edit them directly. The key tool here is a local harness. This is software you install on your computer that turns a LLM into an agent. The LLM by itself can only generate text, and the harness connects that model to tools, such as reading and editing project files, running shell and R commands, calling MCP servers, and managing the exchange between the model, the tools, and you. The harness enforces permissions, manages context, runs the model-tool loop, and presents the interface (</w:t>
       </w:r>
       <w:hyperlink w:anchor="tbl-harness">
         <w:r>
@@ -2703,7 +2697,7 @@
           <w:bookmarkStart w:id="24" w:name="tbl-harness"/>
           <w:p>
             <w:pPr>
-              <w:jc w:val="center"/>
+              <w:jc w:val="left"/>
             </w:pPr>
             <w:pPr>
               <w:jc w:val="start"/>
@@ -2723,9 +2717,9 @@
               <w:tblLayout w:type="fixed"/>
             </w:tblPr>
             <w:tblGrid>
-              <w:gridCol w:w="426"/>
-              <w:gridCol w:w="3942"/>
-              <w:gridCol w:w="3551"/>
+              <w:gridCol w:w="1742"/>
+              <w:gridCol w:w="2376"/>
+              <w:gridCol w:w="3801"/>
             </w:tblGrid>
             <w:tr>
               <w:trPr>
@@ -2737,7 +2731,7 @@
                   <w:pPr>
                     <w:pStyle w:val="Compact"/>
                     <w:jc w:val="left"/>
-                    <w:jc w:val="center"/>
+                    <w:jc w:val="left"/>
                   </w:pPr>
                   <w:r>
                     <w:t xml:space="preserve">Component</w:t>
@@ -2750,7 +2744,7 @@
                   <w:pPr>
                     <w:pStyle w:val="Compact"/>
                     <w:jc w:val="left"/>
-                    <w:jc w:val="center"/>
+                    <w:jc w:val="left"/>
                   </w:pPr>
                   <w:r>
                     <w:t xml:space="preserve">Job</w:t>
@@ -2763,7 +2757,7 @@
                   <w:pPr>
                     <w:pStyle w:val="Compact"/>
                     <w:jc w:val="left"/>
-                    <w:jc w:val="center"/>
+                    <w:jc w:val="left"/>
                   </w:pPr>
                   <w:r>
                     <w:t xml:space="preserve">Example</w:t>
@@ -2778,7 +2772,7 @@
                   <w:pPr>
                     <w:pStyle w:val="Compact"/>
                     <w:jc w:val="left"/>
-                    <w:jc w:val="center"/>
+                    <w:jc w:val="left"/>
                   </w:pPr>
                   <w:r>
                     <w:t xml:space="preserve">Permissions</w:t>
@@ -2791,7 +2785,7 @@
                   <w:pPr>
                     <w:pStyle w:val="Compact"/>
                     <w:jc w:val="left"/>
-                    <w:jc w:val="center"/>
+                    <w:jc w:val="left"/>
                   </w:pPr>
                   <w:r>
                     <w:t xml:space="preserve">Decide which actions run automatically and which need your approval</w:t>
@@ -2804,7 +2798,7 @@
                   <w:pPr>
                     <w:pStyle w:val="Compact"/>
                     <w:jc w:val="left"/>
-                    <w:jc w:val="center"/>
+                    <w:jc w:val="left"/>
                   </w:pPr>
                   <w:r>
                     <w:t xml:space="preserve">Block edits to restricted files</w:t>
@@ -2819,7 +2813,7 @@
                   <w:pPr>
                     <w:pStyle w:val="Compact"/>
                     <w:jc w:val="left"/>
-                    <w:jc w:val="center"/>
+                    <w:jc w:val="left"/>
                   </w:pPr>
                   <w:r>
                     <w:t xml:space="preserve">Context</w:t>
@@ -2832,7 +2826,7 @@
                   <w:pPr>
                     <w:pStyle w:val="Compact"/>
                     <w:jc w:val="left"/>
-                    <w:jc w:val="center"/>
+                    <w:jc w:val="left"/>
                   </w:pPr>
                   <w:r>
                     <w:t xml:space="preserve">Assemble the content your model sees each turn</w:t>
@@ -2845,7 +2839,7 @@
                   <w:pPr>
                     <w:pStyle w:val="Compact"/>
                     <w:jc w:val="left"/>
-                    <w:jc w:val="center"/>
+                    <w:jc w:val="left"/>
                   </w:pPr>
                   <w:r>
                     <w:t xml:space="preserve">AGENTS.md, conversation history, file contents, tool outputs</w:t>
@@ -2860,7 +2854,7 @@
                   <w:pPr>
                     <w:pStyle w:val="Compact"/>
                     <w:jc w:val="left"/>
-                    <w:jc w:val="center"/>
+                    <w:jc w:val="left"/>
                   </w:pPr>
                   <w:r>
                     <w:t xml:space="preserve">Loop</w:t>
@@ -2873,7 +2867,7 @@
                   <w:pPr>
                     <w:pStyle w:val="Compact"/>
                     <w:jc w:val="left"/>
-                    <w:jc w:val="center"/>
+                    <w:jc w:val="left"/>
                   </w:pPr>
                   <w:r>
                     <w:t xml:space="preserve">Send your prompt to the model, run its tool calls and feed results back until the task finishes or you stop it</w:t>
@@ -2886,7 +2880,7 @@
                   <w:pPr>
                     <w:pStyle w:val="Compact"/>
                     <w:jc w:val="left"/>
-                    <w:jc w:val="center"/>
+                    <w:jc w:val="left"/>
                   </w:pPr>
                   <w:r>
                     <w:t xml:space="preserve">Plan, then the model acts, then checks its work, then repeats or moves to the next step in the plan</w:t>
@@ -2901,7 +2895,7 @@
                   <w:pPr>
                     <w:pStyle w:val="Compact"/>
                     <w:jc w:val="left"/>
-                    <w:jc w:val="center"/>
+                    <w:jc w:val="left"/>
                   </w:pPr>
                   <w:r>
                     <w:t xml:space="preserve">Interface</w:t>
@@ -2914,7 +2908,7 @@
                   <w:pPr>
                     <w:pStyle w:val="Compact"/>
                     <w:jc w:val="left"/>
-                    <w:jc w:val="center"/>
+                    <w:jc w:val="left"/>
                   </w:pPr>
                   <w:r>
                     <w:t xml:space="preserve">Show where you type prompts, watch the agent work, and read its output</w:t>
@@ -2927,7 +2921,7 @@
                   <w:pPr>
                     <w:pStyle w:val="Compact"/>
                     <w:jc w:val="left"/>
-                    <w:jc w:val="center"/>
+                    <w:jc w:val="left"/>
                   </w:pPr>
                   <w:r>
                     <w:t xml:space="preserve">Terminal pane in RStudio or VS Code, so you can view the agent side-by-side with your documents</w:t>
@@ -3022,7 +3016,7 @@
               <w:pStyle w:val="ImageCaption"/>
             </w:pPr>
             <w:r>
-              <w:t xml:space="preserve">Figure 1: Schematic illustration of a typical human-at-the-helm data analysis enviroment that includes agentic AI. The entire frame incapsulated in an Integrated Development Environment, such as RStudio, Positron, or VS Code. On the left side is a Quarto document where we can see headings (</w:t>
+              <w:t xml:space="preserve">Figure 1: Schematic illustration of a typical human-at-the-helm data analysis environment that includes agentic AI. The entire frame is encapsulated in an Integrated Development Environment, such as RStudio, Positron, or VS Code. On the left side is a Quarto document where we can see headings (</w:t>
             </w:r>
             <w:r>
               <w:t xml:space="preserve">‘</w:t>
@@ -3049,7 +3043,7 @@
               <w:t xml:space="preserve">’</w:t>
             </w:r>
             <w:r>
-              <w:t xml:space="preserve">), lines of narrative text, an R code block, and a data visualisation. We can see the AI agent is active in the R code block. The human researcher is active in the narrative text. On the right side is the AI agent’s harness, for example, OpenCode. We can see there are three agents active, agent 1 is operating in plan mode (so it cannot modify any file). Its scope of activities is limited to the current project’s working directory (which includes a project-level AGENTS.md file and a git repository for tracking changes). The agent has replied with some text and is now presenting a set of options to the researcher to choose from. At the bottom of the harness is the box to type prompts to the model, and below that text that indicates what model is currently in use, and how much the model has been used in the current session.</w:t>
+              <w:t xml:space="preserve">), lines of narrative text, an R code block, and a data visualisation. The AI agent is active in the R code block. The human researcher is active in the narrative text. On the right side is the AI agent’s harness, for example, OpenCode. We can see there are three agents active, agent 1 is operating in plan mode (so it cannot modify any file). Its scope of activities is limited to the current project’s working directory (which includes a project-level AGENTS.md file and a git repository for tracking changes). The agent has replied with some text and is now presenting a set of options to the researcher to choose from. At the bottom of the harness is the box to type prompts to the model, and below that text that indicates what model is currently in use, and how much the model has been used in the current session.</w:t>
             </w:r>
           </w:p>
           <w:bookmarkEnd w:id="28"/>
@@ -3061,7 +3055,7 @@
         <w:pStyle w:val="BodyText"/>
       </w:pPr>
       <w:r>
-        <w:t xml:space="preserve">Store preferences and working habits you reuse across projects in a global AGENTS.md file. In OpenCode this file is located in a path similar to .config/opencode/AGENTS.md. Keep project-specific details in a second AGENTS.md file located at the top level of each project folder. This project-specific preferences file is the place to record contextual information specific to the project you are currently working on, and saves you having to manually send those details to the LLM in each session. This could include information about archaeological context, about prior decisions you have made about the analysis plan, about your target audience for your report or manuscript, etc. We provide examples of our AGENTS.md files in our research compendium.</w:t>
+        <w:t xml:space="preserve">Store preferences and working habits you reuse across projects in a global AGENTS.md file. Keep project-specific details in a second AGENTS.md file located at the top level of each project folder. This project-specific preferences file is the place to record contextual information specific to the project you are currently working on, and saves you having to manually send those details to the LLM in each session. This could include information about archaeological context, about prior decisions you have made about the analysis plan, about your target audience for your report or manuscript, etc. We provide examples of our AGENTS.md files in our research compendium.</w:t>
       </w:r>
     </w:p>
     <w:p>
@@ -3108,7 +3102,7 @@
         <w:t xml:space="preserve"> </w:t>
       </w:r>
       <w:r>
-        <w:t xml:space="preserve">(Bertran et al. 2026; Messeri and Crockett 2024)</w:t>
+        <w:t xml:space="preserve">(Bertran et al. 2026)</w:t>
       </w:r>
       <w:r>
         <w:t xml:space="preserve">, giving you a chance to steer and challenge the model, request justification for decisions it proposes, and invite the model to criticize your ideas, in preparation for human reviewers</w:t>
@@ -3179,7 +3173,7 @@
         <w:t xml:space="preserve"> </w:t>
       </w:r>
       <w:r>
-        <w:t xml:space="preserve">(Kwa et al. 2025; Sinha et al. 2026)</w:t>
+        <w:t xml:space="preserve">(Sinha et al. 2026)</w:t>
       </w:r>
       <w:r>
         <w:t xml:space="preserve">. Because larger models are slower, more expensive and more resource intensive, we recommend switching to a smaller model once the plan is fixed and the remaining steps are well-defined</w:t>
@@ -3197,7 +3191,7 @@
         <w:t xml:space="preserve"> </w:t>
       </w:r>
       <w:r>
-        <w:t xml:space="preserve">(Brown, Aitken, et al. 2026; Nejjar et al. 2025)</w:t>
+        <w:t xml:space="preserve">(Brown, Aitken, et al. 2026)</w:t>
       </w:r>
       <w:r>
         <w:t xml:space="preserve">, so it is essential to check the files and outputs yourself.</w:t>
@@ -3245,7 +3239,7 @@
           <w:bookmarkStart w:id="29" w:name="tbl-privacy"/>
           <w:p>
             <w:pPr>
-              <w:jc w:val="center"/>
+              <w:jc w:val="left"/>
             </w:pPr>
             <w:pPr>
               <w:jc w:val="start"/>
@@ -3265,9 +3259,9 @@
               <w:tblLayout w:type="fixed"/>
             </w:tblPr>
             <w:tblGrid>
-              <w:gridCol w:w="536"/>
-              <w:gridCol w:w="5115"/>
-              <w:gridCol w:w="2268"/>
+              <w:gridCol w:w="1584"/>
+              <w:gridCol w:w="3564"/>
+              <w:gridCol w:w="2772"/>
             </w:tblGrid>
             <w:tr>
               <w:trPr>
@@ -3279,7 +3273,7 @@
                   <w:pPr>
                     <w:pStyle w:val="Compact"/>
                     <w:jc w:val="left"/>
-                    <w:jc w:val="center"/>
+                    <w:jc w:val="left"/>
                   </w:pPr>
                   <w:r>
                     <w:t xml:space="preserve">Option</w:t>
@@ -3292,7 +3286,7 @@
                   <w:pPr>
                     <w:pStyle w:val="Compact"/>
                     <w:jc w:val="left"/>
-                    <w:jc w:val="center"/>
+                    <w:jc w:val="left"/>
                   </w:pPr>
                   <w:r>
                     <w:t xml:space="preserve">Action</w:t>
@@ -3305,7 +3299,7 @@
                   <w:pPr>
                     <w:pStyle w:val="Compact"/>
                     <w:jc w:val="left"/>
-                    <w:jc w:val="center"/>
+                    <w:jc w:val="left"/>
                   </w:pPr>
                   <w:r>
                     <w:t xml:space="preserve">Limitation</w:t>
@@ -3320,7 +3314,7 @@
                   <w:pPr>
                     <w:pStyle w:val="Compact"/>
                     <w:jc w:val="left"/>
-                    <w:jc w:val="center"/>
+                    <w:jc w:val="left"/>
                   </w:pPr>
                   <w:r>
                     <w:t xml:space="preserve">Zero Data Retention (ZDR)</w:t>
@@ -3333,7 +3327,7 @@
                   <w:pPr>
                     <w:pStyle w:val="Compact"/>
                     <w:jc w:val="left"/>
-                    <w:jc w:val="center"/>
+                    <w:jc w:val="left"/>
                   </w:pPr>
                   <w:r>
                     <w:t xml:space="preserve">Use a provider that deletes request data immediately after processing</w:t>
@@ -3346,7 +3340,7 @@
                   <w:pPr>
                     <w:pStyle w:val="Compact"/>
                     <w:jc w:val="left"/>
-                    <w:jc w:val="center"/>
+                    <w:jc w:val="left"/>
                   </w:pPr>
                   <w:r>
                     <w:t xml:space="preserve">Contractual promise only; check terms before sending sensitive data</w:t>
@@ -3361,7 +3355,7 @@
                   <w:pPr>
                     <w:pStyle w:val="Compact"/>
                     <w:jc w:val="left"/>
-                    <w:jc w:val="center"/>
+                    <w:jc w:val="left"/>
                   </w:pPr>
                   <w:r>
                     <w:t xml:space="preserve">Outside-folder storage</w:t>
@@ -3374,7 +3368,7 @@
                   <w:pPr>
                     <w:pStyle w:val="Compact"/>
                     <w:jc w:val="left"/>
-                    <w:jc w:val="center"/>
+                    <w:jc w:val="left"/>
                   </w:pPr>
                   <w:r>
                     <w:t xml:space="preserve">Keep restricted files in a directory outside the project folder so the agent cannot open them by accident</w:t>
@@ -3393,7 +3387,7 @@
                   <w:pPr>
                     <w:pStyle w:val="Compact"/>
                     <w:jc w:val="left"/>
-                    <w:jc w:val="center"/>
+                    <w:jc w:val="left"/>
                   </w:pPr>
                   <w:r>
                     <w:t xml:space="preserve">You must move files yourself and manage what the agent can see</w:t>
@@ -3408,7 +3402,7 @@
                   <w:pPr>
                     <w:pStyle w:val="Compact"/>
                     <w:jc w:val="left"/>
-                    <w:jc w:val="center"/>
+                    <w:jc w:val="left"/>
                   </w:pPr>
                   <w:r>
                     <w:t xml:space="preserve">Local LLM</w:t>
@@ -3421,7 +3415,7 @@
                   <w:pPr>
                     <w:pStyle w:val="Compact"/>
                     <w:jc w:val="left"/>
-                    <w:jc w:val="center"/>
+                    <w:jc w:val="left"/>
                   </w:pPr>
                   <w:r>
                     <w:t xml:space="preserve">Run the model on your computer so no data leave it</w:t>
@@ -3440,7 +3434,7 @@
                   <w:pPr>
                     <w:pStyle w:val="Compact"/>
                     <w:jc w:val="left"/>
-                    <w:jc w:val="center"/>
+                    <w:jc w:val="left"/>
                   </w:pPr>
                   <w:r>
                     <w:t xml:space="preserve">Matching hosted-model quality needs expensive high-performance hardware</w:t>
@@ -3461,7 +3455,7 @@
                   <w:pPr>
                     <w:pStyle w:val="Compact"/>
                     <w:jc w:val="left"/>
-                    <w:jc w:val="center"/>
+                    <w:jc w:val="left"/>
                   </w:pPr>
                   <w:r>
                     <w:t xml:space="preserve">Synthetic proxy data</w:t>
@@ -3474,7 +3468,7 @@
                   <w:pPr>
                     <w:pStyle w:val="Compact"/>
                     <w:jc w:val="left"/>
-                    <w:jc w:val="center"/>
+                    <w:jc w:val="left"/>
                   </w:pPr>
                   <w:r>
                     <w:t xml:space="preserve">Use a local model to build a synthetic dataset with the same structure and statistical properties but no real locations, measurements, or identifying information, then send the proxy to the remote model for code writing</w:t>
@@ -3493,10 +3487,10 @@
                   <w:pPr>
                     <w:pStyle w:val="Compact"/>
                     <w:jc w:val="left"/>
-                    <w:jc w:val="center"/>
-                  </w:pPr>
-                  <w:r>
-                    <w:t xml:space="preserve">The proxy must match the real columns variable types, distributions, and format or the code will not transfer</w:t>
+                    <w:jc w:val="left"/>
+                  </w:pPr>
+                  <w:r>
+                    <w:t xml:space="preserve">The proxy must match the variable types, distributions, and format of the real columns, or the code will not transfer</w:t>
                   </w:r>
                 </w:p>
               </w:tc>
@@ -3514,7 +3508,7 @@
         <w:pStyle w:val="Heading1"/>
       </w:pPr>
       <w:r>
-        <w:t xml:space="preserve">Step 3: Use Tools, Skills, and Model Context Protocols to Research, Plan, and Analyze</w:t>
+        <w:t xml:space="preserve">Step 3: Use Tools, Skills, and Model Context Protocols to Research, Plan, Execute, and Verify</w:t>
       </w:r>
     </w:p>
     <w:p>
@@ -3531,7 +3525,7 @@
         <w:t xml:space="preserve">(Xu and Yan 2026)</w:t>
       </w:r>
       <w:r>
-        <w:t xml:space="preserve">. The agent reads the full skill file when a task contains words that matches the metadata, and the skill file’s contents are sent to the model as part of the prompt. For example, we have a skill file for the tidyverse idiom of the R language. When we ask for R code, the harness loads that file into the context and sends it to the model along with the rest of the prompt, and the output follows those conventions. MCP is an open source standard for connecting an agent to external data sources and services; they can also provide specialist tools</w:t>
+        <w:t xml:space="preserve">. The agent reads the full skill file when a task contains words that matches the metadata, and the skill file’s contents are sent to the model as part of the prompt. For example, we have a skill file for tidyverse conventions in R. When we ask for R code, the harness loads that file into the context and sends it to the model along with the rest of the prompt, and the output follows those instructions MCP is an open source standard for connecting an agent to external data sources and services; they can also provide specialist tools</w:t>
       </w:r>
       <w:r>
         <w:t xml:space="preserve"> </w:t>
@@ -3577,7 +3571,7 @@
           <w:bookmarkStart w:id="31" w:name="tbl-stack"/>
           <w:p>
             <w:pPr>
-              <w:jc w:val="center"/>
+              <w:jc w:val="left"/>
             </w:pPr>
             <w:pPr>
               <w:jc w:val="start"/>
@@ -3585,7 +3579,7 @@
               <w:pStyle w:val="ImageCaption"/>
             </w:pPr>
             <w:r>
-              <w:t xml:space="preserve">Table 5: Instructions, MCP servers and skills installed in the our OpenCode configuration that we have found useful for assistence with routine research tasks. Readers can copy-paste this table into their AI agent and ask it to install the skills and MCP servers for global availability across their projects. This list is a snapshot of a fast-moving field: some of these projects may disappear, and better ones may soon replace them. Ask your AI agent to search for the current state-of-the-art skills and MCP servers for your specific purpose. The access date for all repositories was 1 Oct 2026.</w:t>
+              <w:t xml:space="preserve">Table 5: Instructions, MCP servers and skills installed in our OpenCode configuration that we have found useful for assistance with routine research tasks. The source column refers to repositories on github.com and publications. Readers can copy-paste this table into their AI agent and ask it to install the skills and MCP servers for global availability across their projects. This list is a snapshot of a fast-moving field: some of these projects may disappear, and better ones may soon replace them. Ask your AI agent to search for the current state-of-the-art skills and MCP servers for your specific purpose. The access date for all repositories in this table was 1 Oct 2026.</w:t>
             </w:r>
           </w:p>
           <w:tbl>
@@ -3597,10 +3591,11 @@
               <w:tblLayout w:type="fixed"/>
             </w:tblPr>
             <w:tblGrid>
-              <w:gridCol w:w="363"/>
-              <w:gridCol w:w="755"/>
-              <w:gridCol w:w="5037"/>
-              <w:gridCol w:w="1763"/>
+              <w:gridCol w:w="633"/>
+              <w:gridCol w:w="1584"/>
+              <w:gridCol w:w="3484"/>
+              <w:gridCol w:w="1267"/>
+              <w:gridCol w:w="950"/>
             </w:tblGrid>
             <w:tr>
               <w:trPr>
@@ -3612,7 +3607,7 @@
                   <w:pPr>
                     <w:pStyle w:val="Compact"/>
                     <w:jc w:val="left"/>
-                    <w:jc w:val="center"/>
+                    <w:jc w:val="left"/>
                   </w:pPr>
                   <w:r>
                     <w:t xml:space="preserve">Type</w:t>
@@ -3625,7 +3620,7 @@
                   <w:pPr>
                     <w:pStyle w:val="Compact"/>
                     <w:jc w:val="left"/>
-                    <w:jc w:val="center"/>
+                    <w:jc w:val="left"/>
                   </w:pPr>
                   <w:r>
                     <w:t xml:space="preserve">Name</w:t>
@@ -3638,7 +3633,7 @@
                   <w:pPr>
                     <w:pStyle w:val="Compact"/>
                     <w:jc w:val="left"/>
-                    <w:jc w:val="center"/>
+                    <w:jc w:val="left"/>
                   </w:pPr>
                   <w:r>
                     <w:t xml:space="preserve">Purpose</w:t>
@@ -3651,10 +3646,23 @@
                   <w:pPr>
                     <w:pStyle w:val="Compact"/>
                     <w:jc w:val="left"/>
-                    <w:jc w:val="center"/>
+                    <w:jc w:val="left"/>
                   </w:pPr>
                   <w:r>
                     <w:t xml:space="preserve">Source</w:t>
+                  </w:r>
+                </w:p>
+              </w:tc>
+              <w:tc>
+                <w:tcPr/>
+                <w:p>
+                  <w:pPr>
+                    <w:pStyle w:val="Compact"/>
+                    <w:jc w:val="left"/>
+                    <w:jc w:val="left"/>
+                  </w:pPr>
+                  <w:r>
+                    <w:t xml:space="preserve">Licence</w:t>
                   </w:r>
                 </w:p>
               </w:tc>
@@ -3666,7 +3674,7 @@
                   <w:pPr>
                     <w:pStyle w:val="Compact"/>
                     <w:jc w:val="left"/>
-                    <w:jc w:val="center"/>
+                    <w:jc w:val="left"/>
                   </w:pPr>
                   <w:r>
                     <w:t xml:space="preserve">Instructions</w:t>
@@ -3679,7 +3687,7 @@
                   <w:pPr>
                     <w:pStyle w:val="Compact"/>
                     <w:jc w:val="left"/>
-                    <w:jc w:val="center"/>
+                    <w:jc w:val="left"/>
                   </w:pPr>
                   <w:r>
                     <w:t xml:space="preserve">global AGENTS.md</w:t>
@@ -3692,7 +3700,7 @@
                   <w:pPr>
                     <w:pStyle w:val="Compact"/>
                     <w:jc w:val="left"/>
-                    <w:jc w:val="center"/>
+                    <w:jc w:val="left"/>
                   </w:pPr>
                   <w:r>
                     <w:t xml:space="preserve">Global preferences and working habits applied across all projects</w:t>
@@ -3705,10 +3713,23 @@
                   <w:pPr>
                     <w:pStyle w:val="Compact"/>
                     <w:jc w:val="left"/>
-                    <w:jc w:val="center"/>
+                    <w:jc w:val="left"/>
                   </w:pPr>
                   <w:r>
                     <w:t xml:space="preserve">local</w:t>
+                  </w:r>
+                </w:p>
+              </w:tc>
+              <w:tc>
+                <w:tcPr/>
+                <w:p>
+                  <w:pPr>
+                    <w:pStyle w:val="Compact"/>
+                    <w:jc w:val="left"/>
+                    <w:jc w:val="left"/>
+                  </w:pPr>
+                  <w:r>
+                    <w:t xml:space="preserve">MIT</w:t>
                   </w:r>
                 </w:p>
               </w:tc>
@@ -3720,7 +3741,7 @@
                   <w:pPr>
                     <w:pStyle w:val="Compact"/>
                     <w:jc w:val="left"/>
-                    <w:jc w:val="center"/>
+                    <w:jc w:val="left"/>
                   </w:pPr>
                   <w:r>
                     <w:t xml:space="preserve">Instructions</w:t>
@@ -3733,7 +3754,7 @@
                   <w:pPr>
                     <w:pStyle w:val="Compact"/>
                     <w:jc w:val="left"/>
-                    <w:jc w:val="center"/>
+                    <w:jc w:val="left"/>
                   </w:pPr>
                   <w:r>
                     <w:t xml:space="preserve">project-specific AGENTS.md</w:t>
@@ -3746,7 +3767,7 @@
                   <w:pPr>
                     <w:pStyle w:val="Compact"/>
                     <w:jc w:val="left"/>
-                    <w:jc w:val="center"/>
+                    <w:jc w:val="left"/>
                   </w:pPr>
                   <w:r>
                     <w:t xml:space="preserve">Specific custom project context and instructions auto-loaded at the start of each session</w:t>
@@ -3759,10 +3780,23 @@
                   <w:pPr>
                     <w:pStyle w:val="Compact"/>
                     <w:jc w:val="left"/>
-                    <w:jc w:val="center"/>
+                    <w:jc w:val="left"/>
                   </w:pPr>
                   <w:r>
                     <w:t xml:space="preserve">local</w:t>
+                  </w:r>
+                </w:p>
+              </w:tc>
+              <w:tc>
+                <w:tcPr/>
+                <w:p>
+                  <w:pPr>
+                    <w:pStyle w:val="Compact"/>
+                    <w:jc w:val="left"/>
+                    <w:jc w:val="left"/>
+                  </w:pPr>
+                  <w:r>
+                    <w:t xml:space="preserve">MIT</w:t>
                   </w:r>
                 </w:p>
               </w:tc>
@@ -3774,7 +3808,7 @@
                   <w:pPr>
                     <w:pStyle w:val="Compact"/>
                     <w:jc w:val="left"/>
-                    <w:jc w:val="center"/>
+                    <w:jc w:val="left"/>
                   </w:pPr>
                   <w:r>
                     <w:t xml:space="preserve">Skill</w:t>
@@ -3787,7 +3821,7 @@
                   <w:pPr>
                     <w:pStyle w:val="Compact"/>
                     <w:jc w:val="left"/>
-                    <w:jc w:val="center"/>
+                    <w:jc w:val="left"/>
                   </w:pPr>
                   <w:r>
                     <w:t xml:space="preserve">deep-research</w:t>
@@ -3800,7 +3834,7 @@
                   <w:pPr>
                     <w:pStyle w:val="Compact"/>
                     <w:jc w:val="left"/>
-                    <w:jc w:val="center"/>
+                    <w:jc w:val="left"/>
                   </w:pPr>
                   <w:r>
                     <w:t xml:space="preserve">Agent team for literature search verification synthesis and systematic review</w:t>
@@ -3813,10 +3847,23 @@
                   <w:pPr>
                     <w:pStyle w:val="Compact"/>
                     <w:jc w:val="left"/>
-                    <w:jc w:val="center"/>
-                  </w:pPr>
-                  <w:r>
-                    <w:t xml:space="preserve">https://github.com/pafozz/hermes-deep-research</w:t>
+                    <w:jc w:val="left"/>
+                  </w:pPr>
+                  <w:r>
+                    <w:t xml:space="preserve">pafozz/hermes-deep-research</w:t>
+                  </w:r>
+                </w:p>
+              </w:tc>
+              <w:tc>
+                <w:tcPr/>
+                <w:p>
+                  <w:pPr>
+                    <w:pStyle w:val="Compact"/>
+                    <w:jc w:val="left"/>
+                    <w:jc w:val="left"/>
+                  </w:pPr>
+                  <w:r>
+                    <w:t xml:space="preserve">MIT</w:t>
                   </w:r>
                 </w:p>
               </w:tc>
@@ -3828,7 +3875,7 @@
                   <w:pPr>
                     <w:pStyle w:val="Compact"/>
                     <w:jc w:val="left"/>
-                    <w:jc w:val="center"/>
+                    <w:jc w:val="left"/>
                   </w:pPr>
                   <w:r>
                     <w:t xml:space="preserve">Skill</w:t>
@@ -3841,7 +3888,7 @@
                   <w:pPr>
                     <w:pStyle w:val="Compact"/>
                     <w:jc w:val="left"/>
-                    <w:jc w:val="center"/>
+                    <w:jc w:val="left"/>
                   </w:pPr>
                   <w:r>
                     <w:t xml:space="preserve">r-style-guide</w:t>
@@ -3854,7 +3901,7 @@
                   <w:pPr>
                     <w:pStyle w:val="Compact"/>
                     <w:jc w:val="left"/>
-                    <w:jc w:val="center"/>
+                    <w:jc w:val="left"/>
                   </w:pPr>
                   <w:r>
                     <w:t xml:space="preserve">Conventions for writing R, e.g. naming, spacing, layout, function design</w:t>
@@ -3867,10 +3914,23 @@
                   <w:pPr>
                     <w:pStyle w:val="Compact"/>
                     <w:jc w:val="left"/>
-                    <w:jc w:val="center"/>
-                  </w:pPr>
-                  <w:r>
-                    <w:t xml:space="preserve">https://github.com/ab604/claude-code-r-skills</w:t>
+                    <w:jc w:val="left"/>
+                  </w:pPr>
+                  <w:r>
+                    <w:t xml:space="preserve">ab604/claude-code-r-skills</w:t>
+                  </w:r>
+                </w:p>
+              </w:tc>
+              <w:tc>
+                <w:tcPr/>
+                <w:p>
+                  <w:pPr>
+                    <w:pStyle w:val="Compact"/>
+                    <w:jc w:val="left"/>
+                    <w:jc w:val="left"/>
+                  </w:pPr>
+                  <w:r>
+                    <w:t xml:space="preserve">MIT</w:t>
                   </w:r>
                 </w:p>
               </w:tc>
@@ -3882,7 +3942,7 @@
                   <w:pPr>
                     <w:pStyle w:val="Compact"/>
                     <w:jc w:val="left"/>
-                    <w:jc w:val="center"/>
+                    <w:jc w:val="left"/>
                   </w:pPr>
                   <w:r>
                     <w:t xml:space="preserve">Skill</w:t>
@@ -3895,7 +3955,7 @@
                   <w:pPr>
                     <w:pStyle w:val="Compact"/>
                     <w:jc w:val="left"/>
-                    <w:jc w:val="center"/>
+                    <w:jc w:val="left"/>
                   </w:pPr>
                   <w:r>
                     <w:t xml:space="preserve">tidyverse-patterns</w:t>
@@ -3908,7 +3968,7 @@
                   <w:pPr>
                     <w:pStyle w:val="Compact"/>
                     <w:jc w:val="left"/>
-                    <w:jc w:val="center"/>
+                    <w:jc w:val="left"/>
                   </w:pPr>
                   <w:r>
                     <w:t xml:space="preserve">Conventions for using tidyverse packages, e.g. modern pipes, joins, grouping, string handling</w:t>
@@ -3921,10 +3981,23 @@
                   <w:pPr>
                     <w:pStyle w:val="Compact"/>
                     <w:jc w:val="left"/>
-                    <w:jc w:val="center"/>
-                  </w:pPr>
-                  <w:r>
-                    <w:t xml:space="preserve">https://github.com/ab604/claude-code-r-skills</w:t>
+                    <w:jc w:val="left"/>
+                  </w:pPr>
+                  <w:r>
+                    <w:t xml:space="preserve">ab604/claude-code-r-skills</w:t>
+                  </w:r>
+                </w:p>
+              </w:tc>
+              <w:tc>
+                <w:tcPr/>
+                <w:p>
+                  <w:pPr>
+                    <w:pStyle w:val="Compact"/>
+                    <w:jc w:val="left"/>
+                    <w:jc w:val="left"/>
+                  </w:pPr>
+                  <w:r>
+                    <w:t xml:space="preserve">MIT</w:t>
                   </w:r>
                 </w:p>
               </w:tc>
@@ -3936,7 +4009,7 @@
                   <w:pPr>
                     <w:pStyle w:val="Compact"/>
                     <w:jc w:val="left"/>
-                    <w:jc w:val="center"/>
+                    <w:jc w:val="left"/>
                   </w:pPr>
                   <w:r>
                     <w:t xml:space="preserve">Skill</w:t>
@@ -3949,7 +4022,7 @@
                   <w:pPr>
                     <w:pStyle w:val="Compact"/>
                     <w:jc w:val="left"/>
-                    <w:jc w:val="center"/>
+                    <w:jc w:val="left"/>
                   </w:pPr>
                   <w:r>
                     <w:t xml:space="preserve">quarto-authoring</w:t>
@@ -3962,7 +4035,7 @@
                   <w:pPr>
                     <w:pStyle w:val="Compact"/>
                     <w:jc w:val="left"/>
-                    <w:jc w:val="center"/>
+                    <w:jc w:val="left"/>
                   </w:pPr>
                   <w:r>
                     <w:t xml:space="preserve">Authoring with Quarto documents, e.g. cross-references, citations, and extensions</w:t>
@@ -3975,10 +4048,23 @@
                   <w:pPr>
                     <w:pStyle w:val="Compact"/>
                     <w:jc w:val="left"/>
-                    <w:jc w:val="center"/>
-                  </w:pPr>
-                  <w:r>
-                    <w:t xml:space="preserve">https://github.com/posit-dev/skills</w:t>
+                    <w:jc w:val="left"/>
+                  </w:pPr>
+                  <w:r>
+                    <w:t xml:space="preserve">posit-dev/skills</w:t>
+                  </w:r>
+                </w:p>
+              </w:tc>
+              <w:tc>
+                <w:tcPr/>
+                <w:p>
+                  <w:pPr>
+                    <w:pStyle w:val="Compact"/>
+                    <w:jc w:val="left"/>
+                    <w:jc w:val="left"/>
+                  </w:pPr>
+                  <w:r>
+                    <w:t xml:space="preserve">MIT</w:t>
                   </w:r>
                 </w:p>
               </w:tc>
@@ -3990,7 +4076,7 @@
                   <w:pPr>
                     <w:pStyle w:val="Compact"/>
                     <w:jc w:val="left"/>
-                    <w:jc w:val="center"/>
+                    <w:jc w:val="left"/>
                   </w:pPr>
                   <w:r>
                     <w:t xml:space="preserve">Skill</w:t>
@@ -4003,7 +4089,7 @@
                   <w:pPr>
                     <w:pStyle w:val="Compact"/>
                     <w:jc w:val="left"/>
-                    <w:jc w:val="center"/>
+                    <w:jc w:val="left"/>
                   </w:pPr>
                   <w:r>
                     <w:t xml:space="preserve">zotero-cli</w:t>
@@ -4016,7 +4102,7 @@
                   <w:pPr>
                     <w:pStyle w:val="Compact"/>
                     <w:jc w:val="left"/>
-                    <w:jc w:val="center"/>
+                    <w:jc w:val="left"/>
                   </w:pPr>
                   <w:r>
                     <w:t xml:space="preserve">Searches, reads, and annotates the author’s Zotero library from the shell</w:t>
@@ -4029,10 +4115,23 @@
                   <w:pPr>
                     <w:pStyle w:val="Compact"/>
                     <w:jc w:val="left"/>
-                    <w:jc w:val="center"/>
-                  </w:pPr>
-                  <w:r>
-                    <w:t xml:space="preserve">https://github.com/Agents365-ai/zotero-cli-ai</w:t>
+                    <w:jc w:val="left"/>
+                  </w:pPr>
+                  <w:r>
+                    <w:t xml:space="preserve">Agents365-ai/zotero-cli-ai</w:t>
+                  </w:r>
+                </w:p>
+              </w:tc>
+              <w:tc>
+                <w:tcPr/>
+                <w:p>
+                  <w:pPr>
+                    <w:pStyle w:val="Compact"/>
+                    <w:jc w:val="left"/>
+                    <w:jc w:val="left"/>
+                  </w:pPr>
+                  <w:r>
+                    <w:t xml:space="preserve">AGPL-3.0</w:t>
                   </w:r>
                 </w:p>
               </w:tc>
@@ -4044,7 +4143,7 @@
                   <w:pPr>
                     <w:pStyle w:val="Compact"/>
                     <w:jc w:val="left"/>
-                    <w:jc w:val="center"/>
+                    <w:jc w:val="left"/>
                   </w:pPr>
                   <w:r>
                     <w:t xml:space="preserve">Skill</w:t>
@@ -4057,7 +4156,7 @@
                   <w:pPr>
                     <w:pStyle w:val="Compact"/>
                     <w:jc w:val="left"/>
-                    <w:jc w:val="center"/>
+                    <w:jc w:val="left"/>
                   </w:pPr>
                   <w:r>
                     <w:t xml:space="preserve">paperdoctor</w:t>
@@ -4070,7 +4169,7 @@
                   <w:pPr>
                     <w:pStyle w:val="Compact"/>
                     <w:jc w:val="left"/>
-                    <w:jc w:val="center"/>
+                    <w:jc w:val="left"/>
                   </w:pPr>
                   <w:r>
                     <w:t xml:space="preserve">Suite of skills that reviews a manuscript in progress by checking its claims, code, math, references and visual layout, then renders every finding into one interactive HTML report</w:t>
@@ -4083,16 +4182,29 @@
                   <w:pPr>
                     <w:pStyle w:val="Compact"/>
                     <w:jc w:val="left"/>
-                    <w:jc w:val="center"/>
-                  </w:pPr>
-                  <w:r>
-                    <w:t xml:space="preserve">https://github.com/QinghongLin/paperdoctor,</w:t>
+                    <w:jc w:val="left"/>
+                  </w:pPr>
+                  <w:r>
+                    <w:t xml:space="preserve">QinghongLin/paperdoctor,</w:t>
                   </w:r>
                   <w:r>
                     <w:t xml:space="preserve"> </w:t>
                   </w:r>
                   <w:r>
                     <w:t xml:space="preserve">Lin et al. (2026)</w:t>
+                  </w:r>
+                </w:p>
+              </w:tc>
+              <w:tc>
+                <w:tcPr/>
+                <w:p>
+                  <w:pPr>
+                    <w:pStyle w:val="Compact"/>
+                    <w:jc w:val="left"/>
+                    <w:jc w:val="left"/>
+                  </w:pPr>
+                  <w:r>
+                    <w:t xml:space="preserve">MIT</w:t>
                   </w:r>
                 </w:p>
               </w:tc>
@@ -4104,7 +4216,7 @@
                   <w:pPr>
                     <w:pStyle w:val="Compact"/>
                     <w:jc w:val="left"/>
-                    <w:jc w:val="center"/>
+                    <w:jc w:val="left"/>
                   </w:pPr>
                   <w:r>
                     <w:t xml:space="preserve">Skill</w:t>
@@ -4117,7 +4229,7 @@
                   <w:pPr>
                     <w:pStyle w:val="Compact"/>
                     <w:jc w:val="left"/>
-                    <w:jc w:val="center"/>
+                    <w:jc w:val="left"/>
                   </w:pPr>
                   <w:r>
                     <w:t xml:space="preserve">open-scholar-skill</w:t>
@@ -4130,7 +4242,7 @@
                   <w:pPr>
                     <w:pStyle w:val="Compact"/>
                     <w:jc w:val="left"/>
-                    <w:jc w:val="center"/>
+                    <w:jc w:val="left"/>
                   </w:pPr>
                   <w:r>
                     <w:t xml:space="preserve">Suite of skills for assisting with social science research through a pipeline of verification gates, e.g. idea generation, theory exploration, study design, analysis, ethics, etc</w:t>
@@ -4143,16 +4255,29 @@
                   <w:pPr>
                     <w:pStyle w:val="Compact"/>
                     <w:jc w:val="left"/>
-                    <w:jc w:val="center"/>
-                  </w:pPr>
-                  <w:r>
-                    <w:t xml:space="preserve">https://github.com/joshzyj/open-scholar-skill,</w:t>
+                    <w:jc w:val="left"/>
+                  </w:pPr>
+                  <w:r>
+                    <w:t xml:space="preserve">joshzyj/open-scholar-skill,</w:t>
                   </w:r>
                   <w:r>
                     <w:t xml:space="preserve"> </w:t>
                   </w:r>
                   <w:r>
                     <w:t xml:space="preserve">Zhang (2026)</w:t>
+                  </w:r>
+                </w:p>
+              </w:tc>
+              <w:tc>
+                <w:tcPr/>
+                <w:p>
+                  <w:pPr>
+                    <w:pStyle w:val="Compact"/>
+                    <w:jc w:val="left"/>
+                    <w:jc w:val="left"/>
+                  </w:pPr>
+                  <w:r>
+                    <w:t xml:space="preserve">Custom License for non-commercial, academic use,</w:t>
                   </w:r>
                 </w:p>
               </w:tc>
@@ -4164,7 +4289,7 @@
                   <w:pPr>
                     <w:pStyle w:val="Compact"/>
                     <w:jc w:val="left"/>
-                    <w:jc w:val="center"/>
+                    <w:jc w:val="left"/>
                   </w:pPr>
                   <w:r>
                     <w:t xml:space="preserve">Skill</w:t>
@@ -4177,7 +4302,7 @@
                   <w:pPr>
                     <w:pStyle w:val="Compact"/>
                     <w:jc w:val="left"/>
-                    <w:jc w:val="center"/>
+                    <w:jc w:val="left"/>
                   </w:pPr>
                   <w:r>
                     <w:t xml:space="preserve">manuscript-writing-review</w:t>
@@ -4190,7 +4315,7 @@
                   <w:pPr>
                     <w:pStyle w:val="Compact"/>
                     <w:jc w:val="left"/>
-                    <w:jc w:val="center"/>
+                    <w:jc w:val="left"/>
                   </w:pPr>
                   <w:r>
                     <w:t xml:space="preserve">Reviews a scientific or engineering manuscript for writing quality, e.g. clutter, passive voice, sentence architecture, keyword consistency, and numerical or citation errors</w:t>
@@ -4203,10 +4328,23 @@
                   <w:pPr>
                     <w:pStyle w:val="Compact"/>
                     <w:jc w:val="left"/>
-                    <w:jc w:val="center"/>
-                  </w:pPr>
-                  <w:r>
-                    <w:t xml:space="preserve">https://github.com/labarba/sciwrite</w:t>
+                    <w:jc w:val="left"/>
+                  </w:pPr>
+                  <w:r>
+                    <w:t xml:space="preserve">labarba/sciwrite</w:t>
+                  </w:r>
+                </w:p>
+              </w:tc>
+              <w:tc>
+                <w:tcPr/>
+                <w:p>
+                  <w:pPr>
+                    <w:pStyle w:val="Compact"/>
+                    <w:jc w:val="left"/>
+                    <w:jc w:val="left"/>
+                  </w:pPr>
+                  <w:r>
+                    <w:t xml:space="preserve">CC-BY-4.0</w:t>
                   </w:r>
                 </w:p>
               </w:tc>
@@ -4218,7 +4356,7 @@
                   <w:pPr>
                     <w:pStyle w:val="Compact"/>
                     <w:jc w:val="left"/>
-                    <w:jc w:val="center"/>
+                    <w:jc w:val="left"/>
                   </w:pPr>
                   <w:r>
                     <w:t xml:space="preserve">MCP</w:t>
@@ -4231,7 +4369,7 @@
                   <w:pPr>
                     <w:pStyle w:val="Compact"/>
                     <w:jc w:val="left"/>
-                    <w:jc w:val="center"/>
+                    <w:jc w:val="left"/>
                   </w:pPr>
                   <w:r>
                     <w:t xml:space="preserve">r-mcptools</w:t>
@@ -4244,7 +4382,7 @@
                   <w:pPr>
                     <w:pStyle w:val="Compact"/>
                     <w:jc w:val="left"/>
-                    <w:jc w:val="center"/>
+                    <w:jc w:val="left"/>
                   </w:pPr>
                   <w:r>
                     <w:t xml:space="preserve">Exposes a running R session so the agent can execute code and read results</w:t>
@@ -4257,10 +4395,23 @@
                   <w:pPr>
                     <w:pStyle w:val="Compact"/>
                     <w:jc w:val="left"/>
-                    <w:jc w:val="center"/>
-                  </w:pPr>
-                  <w:r>
-                    <w:t xml:space="preserve">https://github.com/posit-dev/mcptools</w:t>
+                    <w:jc w:val="left"/>
+                  </w:pPr>
+                  <w:r>
+                    <w:t xml:space="preserve">posit-dev/mcptools</w:t>
+                  </w:r>
+                </w:p>
+              </w:tc>
+              <w:tc>
+                <w:tcPr/>
+                <w:p>
+                  <w:pPr>
+                    <w:pStyle w:val="Compact"/>
+                    <w:jc w:val="left"/>
+                    <w:jc w:val="left"/>
+                  </w:pPr>
+                  <w:r>
+                    <w:t xml:space="preserve">MIT</w:t>
                   </w:r>
                 </w:p>
               </w:tc>
@@ -4272,7 +4423,7 @@
                   <w:pPr>
                     <w:pStyle w:val="Compact"/>
                     <w:jc w:val="left"/>
-                    <w:jc w:val="center"/>
+                    <w:jc w:val="left"/>
                   </w:pPr>
                   <w:r>
                     <w:t xml:space="preserve">MCP</w:t>
@@ -4285,7 +4436,7 @@
                   <w:pPr>
                     <w:pStyle w:val="Compact"/>
                     <w:jc w:val="left"/>
-                    <w:jc w:val="center"/>
+                    <w:jc w:val="left"/>
                   </w:pPr>
                   <w:r>
                     <w:t xml:space="preserve">refcheck</w:t>
@@ -4298,7 +4449,7 @@
                   <w:pPr>
                     <w:pStyle w:val="Compact"/>
                     <w:jc w:val="left"/>
-                    <w:jc w:val="center"/>
+                    <w:jc w:val="left"/>
                   </w:pPr>
                   <w:r>
                     <w:t xml:space="preserve">Searches publication databases and returns verified references with BibTeX</w:t>
@@ -4311,10 +4462,23 @@
                   <w:pPr>
                     <w:pStyle w:val="Compact"/>
                     <w:jc w:val="left"/>
-                    <w:jc w:val="center"/>
-                  </w:pPr>
-                  <w:r>
-                    <w:t xml:space="preserve">https://github.com/benchoi93/refcheck</w:t>
+                    <w:jc w:val="left"/>
+                  </w:pPr>
+                  <w:r>
+                    <w:t xml:space="preserve">benchoi93/refcheck</w:t>
+                  </w:r>
+                </w:p>
+              </w:tc>
+              <w:tc>
+                <w:tcPr/>
+                <w:p>
+                  <w:pPr>
+                    <w:pStyle w:val="Compact"/>
+                    <w:jc w:val="left"/>
+                    <w:jc w:val="left"/>
+                  </w:pPr>
+                  <w:r>
+                    <w:t xml:space="preserve">MIT</w:t>
                   </w:r>
                 </w:p>
               </w:tc>
@@ -4326,7 +4490,7 @@
                   <w:pPr>
                     <w:pStyle w:val="Compact"/>
                     <w:jc w:val="left"/>
-                    <w:jc w:val="center"/>
+                    <w:jc w:val="left"/>
                   </w:pPr>
                   <w:r>
                     <w:t xml:space="preserve">MCP</w:t>
@@ -4339,7 +4503,7 @@
                   <w:pPr>
                     <w:pStyle w:val="Compact"/>
                     <w:jc w:val="left"/>
-                    <w:jc w:val="center"/>
+                    <w:jc w:val="left"/>
                   </w:pPr>
                   <w:r>
                     <w:t xml:space="preserve">scholar_mcp</w:t>
@@ -4352,7 +4516,7 @@
                   <w:pPr>
                     <w:pStyle w:val="Compact"/>
                     <w:jc w:val="left"/>
-                    <w:jc w:val="center"/>
+                    <w:jc w:val="left"/>
                   </w:pPr>
                   <w:r>
                     <w:t xml:space="preserve">Searches Google Scholar and other sources by keywords and then reads inside papers</w:t>
@@ -4365,10 +4529,23 @@
                   <w:pPr>
                     <w:pStyle w:val="Compact"/>
                     <w:jc w:val="left"/>
-                    <w:jc w:val="center"/>
-                  </w:pPr>
-                  <w:r>
-                    <w:t xml:space="preserve">https://github.com/Liyux3/scholar-mcp</w:t>
+                    <w:jc w:val="left"/>
+                  </w:pPr>
+                  <w:r>
+                    <w:t xml:space="preserve">Liyux3/scholar-mcp</w:t>
+                  </w:r>
+                </w:p>
+              </w:tc>
+              <w:tc>
+                <w:tcPr/>
+                <w:p>
+                  <w:pPr>
+                    <w:pStyle w:val="Compact"/>
+                    <w:jc w:val="left"/>
+                    <w:jc w:val="left"/>
+                  </w:pPr>
+                  <w:r>
+                    <w:t xml:space="preserve">Apache-2.0</w:t>
                   </w:r>
                 </w:p>
               </w:tc>
@@ -4380,7 +4557,7 @@
                   <w:pPr>
                     <w:pStyle w:val="Compact"/>
                     <w:jc w:val="left"/>
-                    <w:jc w:val="center"/>
+                    <w:jc w:val="left"/>
                   </w:pPr>
                   <w:r>
                     <w:t xml:space="preserve">MCP</w:t>
@@ -4393,7 +4570,7 @@
                   <w:pPr>
                     <w:pStyle w:val="Compact"/>
                     <w:jc w:val="left"/>
-                    <w:jc w:val="center"/>
+                    <w:jc w:val="left"/>
                   </w:pPr>
                   <w:r>
                     <w:t xml:space="preserve">markitdown</w:t>
@@ -4406,7 +4583,7 @@
                   <w:pPr>
                     <w:pStyle w:val="Compact"/>
                     <w:jc w:val="left"/>
-                    <w:jc w:val="center"/>
+                    <w:jc w:val="left"/>
                   </w:pPr>
                   <w:r>
                     <w:t xml:space="preserve">Converts DOCX files, PDFs and web pages to markdown the agent can read</w:t>
@@ -4419,10 +4596,23 @@
                   <w:pPr>
                     <w:pStyle w:val="Compact"/>
                     <w:jc w:val="left"/>
-                    <w:jc w:val="center"/>
-                  </w:pPr>
-                  <w:r>
-                    <w:t xml:space="preserve">https://github.com/microsoft/markitdown</w:t>
+                    <w:jc w:val="left"/>
+                  </w:pPr>
+                  <w:r>
+                    <w:t xml:space="preserve">microsoft/markitdown</w:t>
+                  </w:r>
+                </w:p>
+              </w:tc>
+              <w:tc>
+                <w:tcPr/>
+                <w:p>
+                  <w:pPr>
+                    <w:pStyle w:val="Compact"/>
+                    <w:jc w:val="left"/>
+                    <w:jc w:val="left"/>
+                  </w:pPr>
+                  <w:r>
+                    <w:t xml:space="preserve">MIT</w:t>
                   </w:r>
                 </w:p>
               </w:tc>
@@ -4434,7 +4624,7 @@
                   <w:pPr>
                     <w:pStyle w:val="Compact"/>
                     <w:jc w:val="left"/>
-                    <w:jc w:val="center"/>
+                    <w:jc w:val="left"/>
                   </w:pPr>
                   <w:r>
                     <w:t xml:space="preserve">MCP</w:t>
@@ -4447,7 +4637,7 @@
                   <w:pPr>
                     <w:pStyle w:val="Compact"/>
                     <w:jc w:val="left"/>
-                    <w:jc w:val="center"/>
+                    <w:jc w:val="left"/>
                   </w:pPr>
                   <w:r>
                     <w:t xml:space="preserve">open-scholar-peer</w:t>
@@ -4460,7 +4650,7 @@
                   <w:pPr>
                     <w:pStyle w:val="Compact"/>
                     <w:jc w:val="left"/>
-                    <w:jc w:val="center"/>
+                    <w:jc w:val="left"/>
                   </w:pPr>
                   <w:r>
                     <w:t xml:space="preserve">An open source implementation of ScholarPeer: A Context-Aware Multi-Agent Framework for Automated Peer Review</w:t>
@@ -4473,16 +4663,29 @@
                   <w:pPr>
                     <w:pStyle w:val="Compact"/>
                     <w:jc w:val="left"/>
-                    <w:jc w:val="center"/>
-                  </w:pPr>
-                  <w:r>
-                    <w:t xml:space="preserve">https://github.com/amirkiarafiei/open-scholar-peer,</w:t>
+                    <w:jc w:val="left"/>
+                  </w:pPr>
+                  <w:r>
+                    <w:t xml:space="preserve">amirkiarafiei/open-scholar-peer,</w:t>
                   </w:r>
                   <w:r>
                     <w:t xml:space="preserve"> </w:t>
                   </w:r>
                   <w:r>
                     <w:t xml:space="preserve">Goyal et al. (2026)</w:t>
+                  </w:r>
+                </w:p>
+              </w:tc>
+              <w:tc>
+                <w:tcPr/>
+                <w:p>
+                  <w:pPr>
+                    <w:pStyle w:val="Compact"/>
+                    <w:jc w:val="left"/>
+                    <w:jc w:val="left"/>
+                  </w:pPr>
+                  <w:r>
+                    <w:t xml:space="preserve">MIT</w:t>
                   </w:r>
                 </w:p>
               </w:tc>
@@ -4494,7 +4697,7 @@
                   <w:pPr>
                     <w:pStyle w:val="Compact"/>
                     <w:jc w:val="left"/>
-                    <w:jc w:val="center"/>
+                    <w:jc w:val="left"/>
                   </w:pPr>
                   <w:r>
                     <w:t xml:space="preserve">MCP</w:t>
@@ -4507,7 +4710,7 @@
                   <w:pPr>
                     <w:pStyle w:val="Compact"/>
                     <w:jc w:val="left"/>
-                    <w:jc w:val="center"/>
+                    <w:jc w:val="left"/>
                   </w:pPr>
                   <w:r>
                     <w:t xml:space="preserve">playwright</w:t>
@@ -4520,7 +4723,7 @@
                   <w:pPr>
                     <w:pStyle w:val="Compact"/>
                     <w:jc w:val="left"/>
-                    <w:jc w:val="center"/>
+                    <w:jc w:val="left"/>
                   </w:pPr>
                   <w:r>
                     <w:t xml:space="preserve">Provides browser automation capabilities for LLMs, allowing AI agents to interact with web pages</w:t>
@@ -4533,10 +4736,23 @@
                   <w:pPr>
                     <w:pStyle w:val="Compact"/>
                     <w:jc w:val="left"/>
-                    <w:jc w:val="center"/>
-                  </w:pPr>
-                  <w:r>
-                    <w:t xml:space="preserve">https://github.com/microsoft/playwright-mcp</w:t>
+                    <w:jc w:val="left"/>
+                  </w:pPr>
+                  <w:r>
+                    <w:t xml:space="preserve">microsoft/playwright-mcp</w:t>
+                  </w:r>
+                </w:p>
+              </w:tc>
+              <w:tc>
+                <w:tcPr/>
+                <w:p>
+                  <w:pPr>
+                    <w:pStyle w:val="Compact"/>
+                    <w:jc w:val="left"/>
+                    <w:jc w:val="left"/>
+                  </w:pPr>
+                  <w:r>
+                    <w:t xml:space="preserve">Apache-2.0</w:t>
                   </w:r>
                 </w:p>
               </w:tc>
@@ -4596,7 +4812,15 @@
         <w:t xml:space="preserve"> </w:t>
       </w:r>
       <w:r>
-        <w:t xml:space="preserve">fetch scholarly papers while verification tools check each citation against publication databases through a reference-verification server. The literature search and verification tools are provided by the refcheck MCP server; they query Crossref and Semantic Scholar. The agent can then write the results of the literature search into your project-level bibtex file or to your Zotero library for reuse across multiple projects. Skills guides the agent but cannot force compliance, so you need to review the completeness and accuracy of results before incorporating them into your work. Skill files can assist with automated manuscript review to prepare your work for human review. For example,</w:t>
+        <w:t xml:space="preserve">fetch scholarly papers while verification tools check each citation against publication databases through a reference-verification server. The literature search and verification tools are provided by the refcheck MCP server; they query Crossref and Semantic Scholar. The agent can then write the results of the literature search into your project-level bibtex file or to your Zotero library for reuse across multiple projects. Skills guide the agent but cannot force compliance, so you need to review the completeness and accuracy of results before incorporating them into your work.</w:t>
+      </w:r>
+    </w:p>
+    <w:p>
+      <w:pPr>
+        <w:pStyle w:val="BodyText"/>
+      </w:pPr>
+      <w:r>
+        <w:t xml:space="preserve">Skill files can assist with automated manuscript review to prepare your work for human review. For example,</w:t>
       </w:r>
       <w:r>
         <w:t xml:space="preserve"> </w:t>
@@ -4608,7 +4832,57 @@
         <w:t xml:space="preserve"> </w:t>
       </w:r>
       <w:r>
-        <w:t xml:space="preserve">describe PaperDoctor, an agent framework that checks a draft’s claims against its code, prior work, references and visual layout, returns each finding with a pointer to the supporting evidence and a suggested revision. In their evaluation it reached 71% agreement with human advisers across 30 in-progress papers, so you should expect to disagree with some findings and check each one before revising. We recommend multiple iterations with literature search, verification, and manuscript review skills and MCP servers, adjusting the prompt each time to steer the model to focus on different areas of your project</w:t>
+        <w:t xml:space="preserve">describe PaperDoctor, an agent framework that checks a draft’s claims against its code, prior work, references and visual layout, returns each finding with a pointer to the supporting evidence and a suggested revision. In their evaluation it reached 71% agreement with human advisers across 30 in-progress papers, so you should expect to disagree with some findings and check each one before revising. We recommend multiple iterations with literature search, verification, and manuscript review skills and MCP servers, adjusting the prompt each time to steer the model to focus on different areas of your project.</w:t>
+      </w:r>
+    </w:p>
+    <w:p>
+      <w:pPr>
+        <w:pStyle w:val="BodyText"/>
+      </w:pPr>
+      <w:r>
+        <w:t xml:space="preserve">Aided by tools, skills and MCP servers, you can direct AI agents to very efficiently and accurately extract data from the full text of publications and archival records</w:t>
+      </w:r>
+      <w:r>
+        <w:t xml:space="preserve"> </w:t>
+      </w:r>
+      <w:r>
+        <w:t xml:space="preserve">(Cootsona et al. 2026; Hariri et al. 2025; Scheepens et al. 2024)</w:t>
+      </w:r>
+      <w:r>
+        <w:t xml:space="preserve">. One LLM extracted ecological data from literature 50 times faster than a human reviewer, with accuracy above 90% on discrete and categorical data</w:t>
+      </w:r>
+      <w:r>
+        <w:t xml:space="preserve"> </w:t>
+      </w:r>
+      <w:r>
+        <w:t xml:space="preserve">(Gougherty and Clipp 2024)</w:t>
+      </w:r>
+      <w:r>
+        <w:t xml:space="preserve">. Human validation is necessary:</w:t>
+      </w:r>
+      <w:r>
+        <w:t xml:space="preserve"> </w:t>
+      </w:r>
+      <w:r>
+        <w:t xml:space="preserve">Ziems et al. (2024)</w:t>
+      </w:r>
+      <w:r>
+        <w:t xml:space="preserve"> </w:t>
+      </w:r>
+      <w:r>
+        <w:t xml:space="preserve">recorded uneven validity across social concepts, and</w:t>
+      </w:r>
+      <w:r>
+        <w:t xml:space="preserve"> </w:t>
+      </w:r>
+      <w:r>
+        <w:t xml:space="preserve">Gougherty and Clipp (2024)</w:t>
+      </w:r>
+      <w:r>
+        <w:t xml:space="preserve"> </w:t>
+      </w:r>
+      <w:r>
+        <w:t xml:space="preserve">observed that AI performed poorly on certain quantitative data. Context-rich prompting improves data extraction results</w:t>
       </w:r>
       <w:r>
         <w:t xml:space="preserve"> </w:t>
@@ -4617,7 +4891,7 @@
         <w:t xml:space="preserve">(Moorthy et al. 2026)</w:t>
       </w:r>
       <w:r>
-        <w:t xml:space="preserve">.</w:t>
+        <w:t xml:space="preserve">, though no single model dominates all extraction tasks, so you should test several model-prompt pairings. Before using machine-coded variables, you should define them in detail, compare an AI-collected sample against human coding, and document errors.</w:t>
       </w:r>
     </w:p>
     <w:p>
@@ -4625,65 +4899,6 @@
         <w:pStyle w:val="BodyText"/>
       </w:pPr>
       <w:r>
-        <w:t xml:space="preserve">Aided by tools, skills and MCP servers, you can direct AI agents to very efficiently and accurately extract data from the full text of publications and archival records</w:t>
-      </w:r>
-      <w:r>
-        <w:t xml:space="preserve"> </w:t>
-      </w:r>
-      <w:r>
-        <w:t xml:space="preserve">(Cootsona et al. 2026; Hariri et al. 2025; Scheepens et al. 2024)</w:t>
-      </w:r>
-      <w:r>
-        <w:t xml:space="preserve">. One LLM extracted ecological data from literature 50 times faster than a human reviewer, with accuracy above 90% on discrete and categorical data</w:t>
-      </w:r>
-      <w:r>
-        <w:t xml:space="preserve"> </w:t>
-      </w:r>
-      <w:r>
-        <w:t xml:space="preserve">(Gougherty and Clipp 2024)</w:t>
-      </w:r>
-      <w:r>
-        <w:t xml:space="preserve">. Human validation is necessary:</w:t>
-      </w:r>
-      <w:r>
-        <w:t xml:space="preserve"> </w:t>
-      </w:r>
-      <w:r>
-        <w:t xml:space="preserve">Ziems et al. (2024)</w:t>
-      </w:r>
-      <w:r>
-        <w:t xml:space="preserve"> </w:t>
-      </w:r>
-      <w:r>
-        <w:t xml:space="preserve">recorded uneven validity across social concepts, and</w:t>
-      </w:r>
-      <w:r>
-        <w:t xml:space="preserve"> </w:t>
-      </w:r>
-      <w:r>
-        <w:t xml:space="preserve">Gougherty and Clipp (2024)</w:t>
-      </w:r>
-      <w:r>
-        <w:t xml:space="preserve"> </w:t>
-      </w:r>
-      <w:r>
-        <w:t xml:space="preserve">observed that AI performed poorly on certain quantitative data. Context-rich prompting improves data extraction results</w:t>
-      </w:r>
-      <w:r>
-        <w:t xml:space="preserve"> </w:t>
-      </w:r>
-      <w:r>
-        <w:t xml:space="preserve">(Moorthy et al. 2026)</w:t>
-      </w:r>
-      <w:r>
-        <w:t xml:space="preserve">, though no single model dominates all extraction tasks, so you should test several model-prompt pairings. Before using machine-coded variables, you should define them in detail, compare an AI-collected sample against human coding, and document errors.</w:t>
-      </w:r>
-    </w:p>
-    <w:p>
-      <w:pPr>
-        <w:pStyle w:val="BodyText"/>
-      </w:pPr>
-      <w:r>
         <w:t xml:space="preserve">Although writing code from plain English prompts is perhaps the single greatest strength of most LLMs</w:t>
       </w:r>
       <w:r>
@@ -4693,13 +4908,19 @@
         <w:t xml:space="preserve">(Zheng et al. 2024)</w:t>
       </w:r>
       <w:r>
-        <w:t xml:space="preserve">, generating high-quality, real-world code for research still requires your understanding of your project’s context, debugging skills, and integration with the overall goals of your research project. For example, when using an AI agent to plan and write code for data analysis, such as a stone artefact assemblage, we recommend you:</w:t>
-      </w:r>
-      <w:r>
-        <w:t xml:space="preserve"> </w:t>
-      </w:r>
-      <w:r>
-        <w:t xml:space="preserve">1. Write a prompt that is detailed and specific about the study’s context, research question, types of variables and data collection methods</w:t>
+        <w:t xml:space="preserve">, generating high-quality, real-world code for research still requires your understanding of your project’s context, debugging skills, and integration with the overall goals of your research project. For example, to plan and write code for a stone artefact analysis with an AI agent, we recommend the following:</w:t>
+      </w:r>
+    </w:p>
+    <w:p>
+      <w:pPr>
+        <w:numPr>
+          <w:ilvl w:val="0"/>
+          <w:numId w:val="1001"/>
+        </w:numPr>
+        <w:pStyle w:val="Compact"/>
+      </w:pPr>
+      <w:r>
+        <w:t xml:space="preserve">Write a prompt that is detailed and specific about the study’s context, research question, types of variables and data collection methods</w:t>
       </w:r>
       <w:r>
         <w:t xml:space="preserve"> </w:t>
@@ -4719,11 +4940,17 @@
       <w:r>
         <w:t xml:space="preserve">. Rich context minimizes ambiguity and helps to align the model with your goals.</w:t>
       </w:r>
-      <w:r>
-        <w:t xml:space="preserve"> </w:t>
-      </w:r>
-      <w:r>
-        <w:t xml:space="preserve">2. Include with the prompt the dataset, or a narrative summary of the data or a synthetic version of the data generated by a local LLM. For a stone artefact assemblage this could simply be mentioning the raw data file in your prompt, e.g. </w:t>
+    </w:p>
+    <w:p>
+      <w:pPr>
+        <w:numPr>
+          <w:ilvl w:val="0"/>
+          <w:numId w:val="1001"/>
+        </w:numPr>
+        <w:pStyle w:val="Compact"/>
+      </w:pPr>
+      <w:r>
+        <w:t xml:space="preserve">Include the dataset in the prompt, or a narrative summary of the data, or a synthetic version generated by a local LLM. For a stone artefact assemblage this could simply be mentioning the raw data file in your prompt, e.g. </w:t>
       </w:r>
       <w:r>
         <w:t xml:space="preserve">‘</w:t>
@@ -4744,7 +4971,7 @@
         <w:t xml:space="preserve">’</w:t>
       </w:r>
       <w:r>
-        <w:t xml:space="preserve">, that will direct the agent to read the data file. Include a data dictionary that defines the variables, for example, maximum length, technological length, maximum dimension, etc. Including your data is another form of context and will improve the quality of the model’s output</w:t>
+        <w:t xml:space="preserve">, that directs the agent to read the data file. Include a data dictionary that defines the variables, for example, maximum length, technological length, maximum dimension, etc. Including your data is another form of context and will improve the quality of the model’s output</w:t>
       </w:r>
       <w:r>
         <w:t xml:space="preserve"> </w:t>
@@ -4755,11 +4982,17 @@
       <w:r>
         <w:t xml:space="preserve">.</w:t>
       </w:r>
-      <w:r>
-        <w:t xml:space="preserve"> </w:t>
-      </w:r>
-      <w:r>
-        <w:t xml:space="preserve">3. Include high-quality trustworthy reference materials, such as the names of widely used R packages relevant to your work, DOIs to exemplary studies similar to what you want to do, or technical methodological literature that describes relevant methods and best practices in detail</w:t>
+    </w:p>
+    <w:p>
+      <w:pPr>
+        <w:numPr>
+          <w:ilvl w:val="0"/>
+          <w:numId w:val="1001"/>
+        </w:numPr>
+        <w:pStyle w:val="Compact"/>
+      </w:pPr>
+      <w:r>
+        <w:t xml:space="preserve">Include high-quality trustworthy reference materials, such as the names of widely used R packages relevant to your work, DOIs to exemplary studies similar to what you want to do, or technical methodological literature that describes relevant methods and best practices in detail</w:t>
       </w:r>
       <w:r>
         <w:t xml:space="preserve"> </w:t>
@@ -4768,7 +5001,7 @@
         <w:t xml:space="preserve">(Brown and Spillias 2026)</w:t>
       </w:r>
       <w:r>
-        <w:t xml:space="preserve">. For a stone artefact analysis we would request the agent use the FactoMineR and factoextra R packages for the multivariate analyses, and follow the guidance in</w:t>
+        <w:t xml:space="preserve">. For a stone artefact analysis we would request the agent use to the FactoMineR and factoextra R packages for the multivariate analyses and follow the guidance in</w:t>
       </w:r>
       <w:r>
         <w:t xml:space="preserve"> </w:t>
@@ -4777,13 +5010,19 @@
         <w:t xml:space="preserve">Greenacre et al. (2022)</w:t>
       </w:r>
       <w:r>
-        <w:t xml:space="preserve">. Use the agent’s tools to help you get the literature specific to your analysis.</w:t>
-      </w:r>
-      <w:r>
-        <w:t xml:space="preserve"> </w:t>
-      </w:r>
-      <w:r>
-        <w:t xml:space="preserve">4. Include instructions for the model to evaluate its code for correctness and completeness before stopping. This sets the agent to work in a loop: generate code -&gt; run it -&gt; test it -&gt; fix any errors -&gt; repeat until your evaluation criteria have been satisfied. Specifying evaluation criteria and instructing the model to debug itself improves the accuracy of output</w:t>
+        <w:t xml:space="preserve">. Use the agent’s tools to retrieve the literature specific to your analysis.</w:t>
+      </w:r>
+    </w:p>
+    <w:p>
+      <w:pPr>
+        <w:numPr>
+          <w:ilvl w:val="0"/>
+          <w:numId w:val="1001"/>
+        </w:numPr>
+        <w:pStyle w:val="Compact"/>
+      </w:pPr>
+      <w:r>
+        <w:t xml:space="preserve">Include instructions for the model to evaluate its code for correctness and completeness before stopping. This sets the agent to work in a loop: generate code -&gt; run it -&gt; test it -&gt; fix any errors -&gt; repeat until your evaluation criteria have been satisfied. Specifying evaluation criteria and instructing the model to debug itself improves the accuracy of output</w:t>
       </w:r>
       <w:r>
         <w:t xml:space="preserve"> </w:t>
@@ -4797,7 +5036,7 @@
     </w:p>
     <w:p>
       <w:pPr>
-        <w:pStyle w:val="BodyText"/>
+        <w:pStyle w:val="FirstParagraph"/>
       </w:pPr>
       <w:r>
         <w:t xml:space="preserve">Tools that execute code can expose errors for inspection, but even automated correction still needs expert review.</w:t>
@@ -4900,7 +5139,7 @@
               <w:pStyle w:val="ImageCaption"/>
             </w:pPr>
             <w:r>
-              <w:t xml:space="preserve">Figure 2: The researcher-directed agentic workflow. Research, plan, execute, and verify proceed left to right, with the researcher directing at every stage and the agent acting underneath, invoking tools, skills and MCP servers in multi-step, long-running tasks to achieve the goals set by the researchers. The research and planning steps may involve several rounds of interation and refinment, as indicated by the bi-directional arrows between the researcher and agent for those steps. Execution and verification are critical decision points for the researcher. Rejecting the agent’s work includes looping back to update the plan to steer the agent into alignment with you. Each stage writes to a record that is inspectable by you and others: Git commits, updates to plan.md, the Quarto report, and the verified bibliography.”</w:t>
+              <w:t xml:space="preserve">Figure 2: The researcher-directed agentic workflow. Research, plan, execute, and verify proceed left to right, with the researcher directing at every stage and the agent acting underneath, invoking tools, skills and MCP servers in multi-step, long-running tasks to achieve the goals set by the researchers. The research and planning steps may involve several rounds of iteration and refinement, as indicated by the bi-directional arrows between the researcher and the agent for those steps. Execution and verification are critical decision points for the researcher. Rejecting the agent’s work includes looping back to update the plan to steer the agent into alignment with you. Each stage writes to a record that is inspectable by you and others: Git commits, updates to plan.md, the Quarto report, and the verified bibliography.</w:t>
             </w:r>
           </w:p>
           <w:bookmarkEnd w:id="35"/>
@@ -4991,7 +5230,7 @@
         <w:t xml:space="preserve"> </w:t>
       </w:r>
       <w:r>
-        <w:t xml:space="preserve">(Brown, Aitken, et al. 2026; Campbell et al. 2024)</w:t>
+        <w:t xml:space="preserve">(Campbell et al. 2024)</w:t>
       </w:r>
       <w:r>
         <w:t xml:space="preserve">. A key implication here is that we need to teach basic AI literacy in undergraduate curricula in archaeology, alongside statistical literacy and research design</w:t>
@@ -5017,7 +5256,7 @@
         <w:t xml:space="preserve"> </w:t>
       </w:r>
       <w:r>
-        <w:t xml:space="preserve">(Abramson et al. 2026; Bail 2024; Grossmann et al. 2023; Longkumer 2025)</w:t>
+        <w:t xml:space="preserve">(Abramson et al. 2026; Grossmann et al. 2023; Longkumer 2025)</w:t>
       </w:r>
       <w:r>
         <w:t xml:space="preserve">.</w:t>
@@ -5062,7 +5301,7 @@
         <w:t xml:space="preserve"> </w:t>
       </w:r>
       <w:r>
-        <w:t xml:space="preserve">proposes that we</w:t>
+        <w:t xml:space="preserve">propose that we</w:t>
       </w:r>
       <w:r>
         <w:t xml:space="preserve"> </w:t>
@@ -5077,7 +5316,7 @@
         <w:t xml:space="preserve">”</w:t>
       </w:r>
       <w:r>
-        <w:t xml:space="preserve">. This potentially expansive role for AI raises the urgency of the need to prepare our students to manage the epistemic risks of heightened vulnerability to illusions of explanatory depth, exploratory breadth, and objectivity that come with using AI</w:t>
+        <w:t xml:space="preserve">. This potentially expansive role for AI makes it more urgent to prepare our students to manage the epistemic risks of heightened vulnerability to illusions of explanatory depth, exploratory breadth, and objectivity that come with using AI</w:t>
       </w:r>
       <w:r>
         <w:t xml:space="preserve"> </w:t>
@@ -5197,7 +5436,7 @@
       </w:r>
     </w:p>
     <w:bookmarkEnd w:id="41"/>
-    <w:bookmarkStart w:id="195" w:name="references-cited"/>
+    <w:bookmarkStart w:id="191" w:name="references-cited"/>
     <w:p>
       <w:pPr>
         <w:pStyle w:val="Heading1"/>
@@ -5206,7 +5445,7 @@
         <w:t xml:space="preserve">References Cited</w:t>
       </w:r>
     </w:p>
-    <w:bookmarkStart w:id="194" w:name="refs"/>
+    <w:bookmarkStart w:id="190" w:name="refs"/>
     <w:bookmarkStart w:id="43" w:name="ref-Abramson2026"/>
     <w:p>
       <w:pPr>
@@ -5293,103 +5532,30 @@
       </w:r>
     </w:p>
     <w:bookmarkEnd w:id="45"/>
-    <w:bookmarkStart w:id="47" w:name="ref-Bail2024Generative"/>
+    <w:bookmarkStart w:id="47" w:name="ref-barbaste2026"/>
     <w:p>
       <w:pPr>
         <w:pStyle w:val="Bibliography"/>
       </w:pPr>
       <w:r>
-        <w:t xml:space="preserve">Bail, Christopher A. 2024. Can</w:t>
-      </w:r>
-      <w:r>
-        <w:t xml:space="preserve"> </w:t>
-      </w:r>
-      <w:r>
-        <w:t xml:space="preserve">Generative</w:t>
-      </w:r>
-      <w:r>
-        <w:t xml:space="preserve"> </w:t>
-      </w:r>
-      <w:r>
-        <w:t xml:space="preserve">AI</w:t>
-      </w:r>
-      <w:r>
-        <w:t xml:space="preserve"> </w:t>
-      </w:r>
-      <w:r>
-        <w:t xml:space="preserve">Improve</w:t>
-      </w:r>
-      <w:r>
-        <w:t xml:space="preserve"> </w:t>
-      </w:r>
-      <w:r>
-        <w:t xml:space="preserve">Social</w:t>
-      </w:r>
-      <w:r>
-        <w:t xml:space="preserve"> </w:t>
-      </w:r>
-      <w:r>
-        <w:t xml:space="preserve">Science</w:t>
-      </w:r>
-      <w:r>
-        <w:t xml:space="preserve">?</w:t>
-      </w:r>
-      <w:r>
-        <w:t xml:space="preserve"> </w:t>
-      </w:r>
-      <w:r>
-        <w:rPr>
-          <w:iCs/>
-          <w:i/>
-        </w:rPr>
-        <w:t xml:space="preserve">Proceedings of the National Academy of Sciences</w:t>
-      </w:r>
-      <w:r>
-        <w:t xml:space="preserve"> </w:t>
-      </w:r>
-      <w:r>
-        <w:t xml:space="preserve">121(21):e2314021121.</w:t>
+        <w:t xml:space="preserve">Barbaste, Paul, Tristan Darrigol, Germain Vu, and Tom Wiltberger. 2026. Harness Engineering: Anatomy, Architecture, and Evolution of Coding Agents –</w:t>
+      </w:r>
+      <w:r>
+        <w:t xml:space="preserve"> </w:t>
+      </w:r>
+      <w:r>
+        <w:t xml:space="preserve">A</w:t>
+      </w:r>
+      <w:r>
+        <w:t xml:space="preserve"> </w:t>
+      </w:r>
+      <w:r>
+        <w:t xml:space="preserve">Source-Code Study of Eleven Systems.</w:t>
       </w:r>
       <w:r>
         <w:t xml:space="preserve"> </w:t>
       </w:r>
       <w:hyperlink r:id="rId46">
-        <w:r>
-          <w:rPr>
-            <w:rStyle w:val="Hyperlink"/>
-          </w:rPr>
-          <w:t xml:space="preserve">https://doi.org/10.1073/pnas.2314021121</w:t>
-        </w:r>
-      </w:hyperlink>
-      <w:r>
-        <w:t xml:space="preserve">.</w:t>
-      </w:r>
-    </w:p>
-    <w:bookmarkEnd w:id="47"/>
-    <w:bookmarkStart w:id="49" w:name="ref-barbaste2026"/>
-    <w:p>
-      <w:pPr>
-        <w:pStyle w:val="Bibliography"/>
-      </w:pPr>
-      <w:r>
-        <w:t xml:space="preserve">Barbaste, Paul, Tristan Darrigol, Germain Vu, and Tom Wiltberger. 2026. Harness Engineering: Anatomy, Architecture, and Evolution of Coding Agents –</w:t>
-      </w:r>
-      <w:r>
-        <w:t xml:space="preserve"> </w:t>
-      </w:r>
-      <w:r>
-        <w:t xml:space="preserve">A</w:t>
-      </w:r>
-      <w:r>
-        <w:t xml:space="preserve"> </w:t>
-      </w:r>
-      <w:r>
-        <w:t xml:space="preserve">Source-Code Study of Eleven Systems.</w:t>
-      </w:r>
-      <w:r>
-        <w:t xml:space="preserve"> </w:t>
-      </w:r>
-      <w:hyperlink r:id="rId48">
         <w:r>
           <w:rPr>
             <w:rStyle w:val="Hyperlink"/>
@@ -5401,8 +5567,8 @@
         <w:t xml:space="preserve">.</w:t>
       </w:r>
     </w:p>
-    <w:bookmarkEnd w:id="49"/>
-    <w:bookmarkStart w:id="51" w:name="ref-BeckBurri2024"/>
+    <w:bookmarkEnd w:id="47"/>
+    <w:bookmarkStart w:id="49" w:name="ref-BeckBurri2024"/>
     <w:p>
       <w:pPr>
         <w:pStyle w:val="Bibliography"/>
@@ -5462,7 +5628,7 @@
       <w:r>
         <w:t xml:space="preserve"> </w:t>
       </w:r>
-      <w:hyperlink r:id="rId50">
+      <w:hyperlink r:id="rId48">
         <w:r>
           <w:rPr>
             <w:rStyle w:val="Hyperlink"/>
@@ -5474,8 +5640,8 @@
         <w:t xml:space="preserve">.</w:t>
       </w:r>
     </w:p>
-    <w:bookmarkEnd w:id="51"/>
-    <w:bookmarkStart w:id="53" w:name="ref-Bertran2026"/>
+    <w:bookmarkEnd w:id="49"/>
+    <w:bookmarkStart w:id="51" w:name="ref-Bertran2026"/>
     <w:p>
       <w:pPr>
         <w:pStyle w:val="Bibliography"/>
@@ -5502,7 +5668,7 @@
       <w:r>
         <w:t xml:space="preserve"> </w:t>
       </w:r>
-      <w:hyperlink r:id="rId52">
+      <w:hyperlink r:id="rId50">
         <w:r>
           <w:rPr>
             <w:rStyle w:val="Hyperlink"/>
@@ -5514,8 +5680,8 @@
         <w:t xml:space="preserve">.</w:t>
       </w:r>
     </w:p>
-    <w:bookmarkEnd w:id="53"/>
-    <w:bookmarkStart w:id="55" w:name="ref-Bischoff2026LargeLanguageModels"/>
+    <w:bookmarkEnd w:id="51"/>
+    <w:bookmarkStart w:id="53" w:name="ref-Bischoff2026LargeLanguageModels"/>
     <w:p>
       <w:pPr>
         <w:pStyle w:val="Bibliography"/>
@@ -5526,7 +5692,7 @@
       <w:r>
         <w:t xml:space="preserve"> </w:t>
       </w:r>
-      <w:hyperlink r:id="rId54">
+      <w:hyperlink r:id="rId52">
         <w:r>
           <w:rPr>
             <w:rStyle w:val="Hyperlink"/>
@@ -5538,14 +5704,35 @@
         <w:t xml:space="preserve">.</w:t>
       </w:r>
     </w:p>
-    <w:bookmarkEnd w:id="55"/>
-    <w:bookmarkStart w:id="57" w:name="ref-BlischakDavenportWilson2016"/>
+    <w:bookmarkEnd w:id="53"/>
+    <w:bookmarkStart w:id="55" w:name="ref-BlischakDavenportWilson2016"/>
     <w:p>
       <w:pPr>
         <w:pStyle w:val="Bibliography"/>
       </w:pPr>
       <w:r>
-        <w:t xml:space="preserve">Blischak, John D., Emily R. Davenport, and Greg Wilson. 2016. A Quick Introduction to Version Control with Git and GitHub.</w:t>
+        <w:t xml:space="preserve">Blischak, John D., Emily R. Davenport, and Greg Wilson. 2016. A Quick Introduction to Version Control with</w:t>
+      </w:r>
+      <w:r>
+        <w:t xml:space="preserve"> </w:t>
+      </w:r>
+      <w:r>
+        <w:t xml:space="preserve">Git</w:t>
+      </w:r>
+      <w:r>
+        <w:t xml:space="preserve"> </w:t>
+      </w:r>
+      <w:r>
+        <w:t xml:space="preserve">and</w:t>
+      </w:r>
+      <w:r>
+        <w:t xml:space="preserve"> </w:t>
+      </w:r>
+      <w:r>
+        <w:t xml:space="preserve">GitHub</w:t>
+      </w:r>
+      <w:r>
+        <w:t xml:space="preserve">.</w:t>
       </w:r>
       <w:r>
         <w:t xml:space="preserve"> </w:t>
@@ -5561,12 +5748,12 @@
         <w:t xml:space="preserve"> </w:t>
       </w:r>
       <w:r>
-        <w:t xml:space="preserve">12(1):1–18.</w:t>
-      </w:r>
-      <w:r>
-        <w:t xml:space="preserve"> </w:t>
-      </w:r>
-      <w:hyperlink r:id="rId56">
+        <w:t xml:space="preserve">12(1):e1004668.</w:t>
+      </w:r>
+      <w:r>
+        <w:t xml:space="preserve"> </w:t>
+      </w:r>
+      <w:hyperlink r:id="rId54">
         <w:r>
           <w:rPr>
             <w:rStyle w:val="Hyperlink"/>
@@ -5578,8 +5765,8 @@
         <w:t xml:space="preserve">.</w:t>
       </w:r>
     </w:p>
-    <w:bookmarkEnd w:id="57"/>
-    <w:bookmarkStart w:id="59" w:name="ref-Boiko2023"/>
+    <w:bookmarkEnd w:id="55"/>
+    <w:bookmarkStart w:id="57" w:name="ref-Boiko2023"/>
     <w:p>
       <w:pPr>
         <w:pStyle w:val="Bibliography"/>
@@ -5615,7 +5802,7 @@
       <w:r>
         <w:t xml:space="preserve"> </w:t>
       </w:r>
-      <w:hyperlink r:id="rId58">
+      <w:hyperlink r:id="rId56">
         <w:r>
           <w:rPr>
             <w:rStyle w:val="Hyperlink"/>
@@ -5627,8 +5814,8 @@
         <w:t xml:space="preserve">.</w:t>
       </w:r>
     </w:p>
-    <w:bookmarkEnd w:id="59"/>
-    <w:bookmarkStart w:id="61" w:name="ref-MBran2024"/>
+    <w:bookmarkEnd w:id="57"/>
+    <w:bookmarkStart w:id="59" w:name="ref-MBran2024"/>
     <w:p>
       <w:pPr>
         <w:pStyle w:val="Bibliography"/>
@@ -5664,7 +5851,7 @@
       <w:r>
         <w:t xml:space="preserve"> </w:t>
       </w:r>
-      <w:hyperlink r:id="rId60">
+      <w:hyperlink r:id="rId58">
         <w:r>
           <w:rPr>
             <w:rStyle w:val="Hyperlink"/>
@@ -5676,8 +5863,8 @@
         <w:t xml:space="preserve">.</w:t>
       </w:r>
     </w:p>
-    <w:bookmarkEnd w:id="61"/>
-    <w:bookmarkStart w:id="63" w:name="ref-Bridgeford2026"/>
+    <w:bookmarkEnd w:id="59"/>
+    <w:bookmarkStart w:id="61" w:name="ref-Bridgeford2026"/>
     <w:p>
       <w:pPr>
         <w:pStyle w:val="Bibliography"/>
@@ -5704,7 +5891,7 @@
       <w:r>
         <w:t xml:space="preserve"> </w:t>
       </w:r>
-      <w:hyperlink r:id="rId62">
+      <w:hyperlink r:id="rId60">
         <w:r>
           <w:rPr>
             <w:rStyle w:val="Hyperlink"/>
@@ -5716,8 +5903,8 @@
         <w:t xml:space="preserve">.</w:t>
       </w:r>
     </w:p>
-    <w:bookmarkEnd w:id="63"/>
-    <w:bookmarkStart w:id="65" w:name="ref-Brown2026book"/>
+    <w:bookmarkEnd w:id="61"/>
+    <w:bookmarkStart w:id="63" w:name="ref-Brown2026book"/>
     <w:p>
       <w:pPr>
         <w:pStyle w:val="Bibliography"/>
@@ -5740,7 +5927,7 @@
       <w:r>
         <w:t xml:space="preserve"> </w:t>
       </w:r>
-      <w:hyperlink r:id="rId64">
+      <w:hyperlink r:id="rId62">
         <w:r>
           <w:rPr>
             <w:rStyle w:val="Hyperlink"/>
@@ -5752,8 +5939,8 @@
         <w:t xml:space="preserve">, accessed September 18, 2026.</w:t>
       </w:r>
     </w:p>
-    <w:bookmarkEnd w:id="65"/>
-    <w:bookmarkStart w:id="67" w:name="ref-Brown2026a"/>
+    <w:bookmarkEnd w:id="63"/>
+    <w:bookmarkStart w:id="65" w:name="ref-Brown2026a"/>
     <w:p>
       <w:pPr>
         <w:pStyle w:val="Bibliography"/>
@@ -5780,7 +5967,7 @@
       <w:r>
         <w:t xml:space="preserve"> </w:t>
       </w:r>
-      <w:hyperlink r:id="rId66">
+      <w:hyperlink r:id="rId64">
         <w:r>
           <w:rPr>
             <w:rStyle w:val="Hyperlink"/>
@@ -5792,8 +5979,8 @@
         <w:t xml:space="preserve">.</w:t>
       </w:r>
     </w:p>
-    <w:bookmarkEnd w:id="67"/>
-    <w:bookmarkStart w:id="69" w:name="ref-Brown2026b"/>
+    <w:bookmarkEnd w:id="65"/>
+    <w:bookmarkStart w:id="67" w:name="ref-Brown2026b"/>
     <w:p>
       <w:pPr>
         <w:pStyle w:val="Bibliography"/>
@@ -5820,7 +6007,7 @@
       <w:r>
         <w:t xml:space="preserve"> </w:t>
       </w:r>
-      <w:hyperlink r:id="rId68">
+      <w:hyperlink r:id="rId66">
         <w:r>
           <w:rPr>
             <w:rStyle w:val="Hyperlink"/>
@@ -5832,8 +6019,8 @@
         <w:t xml:space="preserve">.</w:t>
       </w:r>
     </w:p>
-    <w:bookmarkEnd w:id="69"/>
-    <w:bookmarkStart w:id="71" w:name="ref-Brown2026local"/>
+    <w:bookmarkEnd w:id="67"/>
+    <w:bookmarkStart w:id="69" w:name="ref-Brown2026local"/>
     <w:p>
       <w:pPr>
         <w:pStyle w:val="Bibliography"/>
@@ -5853,7 +6040,7 @@
       <w:r>
         <w:t xml:space="preserve"> </w:t>
       </w:r>
-      <w:hyperlink r:id="rId70">
+      <w:hyperlink r:id="rId68">
         <w:r>
           <w:rPr>
             <w:rStyle w:val="Hyperlink"/>
@@ -5865,8 +6052,8 @@
         <w:t xml:space="preserve">, accessed September 18, 2026.</w:t>
       </w:r>
     </w:p>
-    <w:bookmarkEnd w:id="71"/>
-    <w:bookmarkStart w:id="73" w:name="ref-Campbell2024"/>
+    <w:bookmarkEnd w:id="69"/>
+    <w:bookmarkStart w:id="71" w:name="ref-Campbell2024"/>
     <w:p>
       <w:pPr>
         <w:pStyle w:val="Bibliography"/>
@@ -5893,7 +6080,7 @@
       <w:r>
         <w:t xml:space="preserve"> </w:t>
       </w:r>
-      <w:hyperlink r:id="rId72">
+      <w:hyperlink r:id="rId70">
         <w:r>
           <w:rPr>
             <w:rStyle w:val="Hyperlink"/>
@@ -5905,8 +6092,8 @@
         <w:t xml:space="preserve">.</w:t>
       </w:r>
     </w:p>
-    <w:bookmarkEnd w:id="73"/>
-    <w:bookmarkStart w:id="75" w:name="ref-CardarelliRagno2026"/>
+    <w:bookmarkEnd w:id="71"/>
+    <w:bookmarkStart w:id="73" w:name="ref-CardarelliRagno2026"/>
     <w:p>
       <w:pPr>
         <w:pStyle w:val="Bibliography"/>
@@ -5917,7 +6104,7 @@
       <w:r>
         <w:t xml:space="preserve"> </w:t>
       </w:r>
-      <w:hyperlink r:id="rId74">
+      <w:hyperlink r:id="rId72">
         <w:r>
           <w:rPr>
             <w:rStyle w:val="Hyperlink"/>
@@ -5929,8 +6116,8 @@
         <w:t xml:space="preserve">.</w:t>
       </w:r>
     </w:p>
-    <w:bookmarkEnd w:id="75"/>
-    <w:bookmarkStart w:id="77" w:name="ref-ChenVaroquaux2026"/>
+    <w:bookmarkEnd w:id="73"/>
+    <w:bookmarkStart w:id="75" w:name="ref-ChenVaroquaux2026"/>
     <w:p>
       <w:pPr>
         <w:pStyle w:val="Bibliography"/>
@@ -5966,7 +6153,7 @@
       <w:r>
         <w:t xml:space="preserve"> </w:t>
       </w:r>
-      <w:hyperlink r:id="rId76">
+      <w:hyperlink r:id="rId74">
         <w:r>
           <w:rPr>
             <w:rStyle w:val="Hyperlink"/>
@@ -5978,8 +6165,8 @@
         <w:t xml:space="preserve">.</w:t>
       </w:r>
     </w:p>
-    <w:bookmarkEnd w:id="77"/>
-    <w:bookmarkStart w:id="79" w:name="ref-Chen2023"/>
+    <w:bookmarkEnd w:id="75"/>
+    <w:bookmarkStart w:id="77" w:name="ref-Chen2023"/>
     <w:p>
       <w:pPr>
         <w:pStyle w:val="Bibliography"/>
@@ -6003,7 +6190,7 @@
       <w:r>
         <w:t xml:space="preserve"> </w:t>
       </w:r>
-      <w:hyperlink r:id="rId78">
+      <w:hyperlink r:id="rId76">
         <w:r>
           <w:rPr>
             <w:rStyle w:val="Hyperlink"/>
@@ -6015,8 +6202,8 @@
         <w:t xml:space="preserve">.</w:t>
       </w:r>
     </w:p>
-    <w:bookmarkEnd w:id="79"/>
-    <w:bookmarkStart w:id="81" w:name="ref-Codreanu2026"/>
+    <w:bookmarkEnd w:id="77"/>
+    <w:bookmarkStart w:id="79" w:name="ref-Codreanu2026"/>
     <w:p>
       <w:pPr>
         <w:pStyle w:val="Bibliography"/>
@@ -6060,7 +6247,7 @@
       <w:r>
         <w:t xml:space="preserve"> </w:t>
       </w:r>
-      <w:hyperlink r:id="rId80">
+      <w:hyperlink r:id="rId78">
         <w:r>
           <w:rPr>
             <w:rStyle w:val="Hyperlink"/>
@@ -6072,8 +6259,8 @@
         <w:t xml:space="preserve">, accessed September 16, 2026.</w:t>
       </w:r>
     </w:p>
-    <w:bookmarkEnd w:id="81"/>
-    <w:bookmarkStart w:id="83" w:name="ref-Cooper2024"/>
+    <w:bookmarkEnd w:id="79"/>
+    <w:bookmarkStart w:id="81" w:name="ref-Cooper2024"/>
     <w:p>
       <w:pPr>
         <w:pStyle w:val="Bibliography"/>
@@ -6100,7 +6287,7 @@
       <w:r>
         <w:t xml:space="preserve"> </w:t>
       </w:r>
-      <w:hyperlink r:id="rId82">
+      <w:hyperlink r:id="rId80">
         <w:r>
           <w:rPr>
             <w:rStyle w:val="Hyperlink"/>
@@ -6112,8 +6299,8 @@
         <w:t xml:space="preserve">.</w:t>
       </w:r>
     </w:p>
-    <w:bookmarkEnd w:id="83"/>
-    <w:bookmarkStart w:id="85" w:name="ref-CootsonaCastilloSunseri2026"/>
+    <w:bookmarkEnd w:id="81"/>
+    <w:bookmarkStart w:id="83" w:name="ref-CootsonaCastilloSunseri2026"/>
     <w:p>
       <w:pPr>
         <w:pStyle w:val="Bibliography"/>
@@ -6137,7 +6324,7 @@
       <w:r>
         <w:t xml:space="preserve"> </w:t>
       </w:r>
-      <w:hyperlink r:id="rId84">
+      <w:hyperlink r:id="rId82">
         <w:r>
           <w:rPr>
             <w:rStyle w:val="Hyperlink"/>
@@ -6149,8 +6336,8 @@
         <w:t xml:space="preserve">.</w:t>
       </w:r>
     </w:p>
-    <w:bookmarkEnd w:id="85"/>
-    <w:bookmarkStart w:id="87" w:name="ref-DellAcqua2026"/>
+    <w:bookmarkEnd w:id="83"/>
+    <w:bookmarkStart w:id="85" w:name="ref-DellAcqua2026"/>
     <w:p>
       <w:pPr>
         <w:pStyle w:val="Bibliography"/>
@@ -6177,7 +6364,7 @@
       <w:r>
         <w:t xml:space="preserve"> </w:t>
       </w:r>
-      <w:hyperlink r:id="rId86">
+      <w:hyperlink r:id="rId84">
         <w:r>
           <w:rPr>
             <w:rStyle w:val="Hyperlink"/>
@@ -6189,8 +6376,8 @@
         <w:t xml:space="preserve">.</w:t>
       </w:r>
     </w:p>
-    <w:bookmarkEnd w:id="87"/>
-    <w:bookmarkStart w:id="89" w:name="ref-Dyck2026"/>
+    <w:bookmarkEnd w:id="85"/>
+    <w:bookmarkStart w:id="87" w:name="ref-Dyck2026"/>
     <w:p>
       <w:pPr>
         <w:pStyle w:val="Bibliography"/>
@@ -6217,7 +6404,7 @@
       <w:r>
         <w:t xml:space="preserve"> </w:t>
       </w:r>
-      <w:hyperlink r:id="rId88">
+      <w:hyperlink r:id="rId86">
         <w:r>
           <w:rPr>
             <w:rStyle w:val="Hyperlink"/>
@@ -6229,8 +6416,8 @@
         <w:t xml:space="preserve">.</w:t>
       </w:r>
     </w:p>
-    <w:bookmarkEnd w:id="89"/>
-    <w:bookmarkStart w:id="91" w:name="ref-Feuerriegel2024"/>
+    <w:bookmarkEnd w:id="87"/>
+    <w:bookmarkStart w:id="89" w:name="ref-Feuerriegel2024"/>
     <w:p>
       <w:pPr>
         <w:pStyle w:val="Bibliography"/>
@@ -6266,7 +6453,7 @@
       <w:r>
         <w:t xml:space="preserve"> </w:t>
       </w:r>
-      <w:hyperlink r:id="rId90">
+      <w:hyperlink r:id="rId88">
         <w:r>
           <w:rPr>
             <w:rStyle w:val="Hyperlink"/>
@@ -6278,8 +6465,8 @@
         <w:t xml:space="preserve">.</w:t>
       </w:r>
     </w:p>
-    <w:bookmarkEnd w:id="91"/>
-    <w:bookmarkStart w:id="93" w:name="ref-Gattiglia2025"/>
+    <w:bookmarkEnd w:id="89"/>
+    <w:bookmarkStart w:id="91" w:name="ref-Gattiglia2025"/>
     <w:p>
       <w:pPr>
         <w:pStyle w:val="Bibliography"/>
@@ -6306,7 +6493,7 @@
       <w:r>
         <w:t xml:space="preserve"> </w:t>
       </w:r>
-      <w:hyperlink r:id="rId92">
+      <w:hyperlink r:id="rId90">
         <w:r>
           <w:rPr>
             <w:rStyle w:val="Hyperlink"/>
@@ -6318,8 +6505,8 @@
         <w:t xml:space="preserve">.</w:t>
       </w:r>
     </w:p>
-    <w:bookmarkEnd w:id="93"/>
-    <w:bookmarkStart w:id="95" w:name="ref-GildeZuniga2024"/>
+    <w:bookmarkEnd w:id="91"/>
+    <w:bookmarkStart w:id="93" w:name="ref-GildeZuniga2024"/>
     <w:p>
       <w:pPr>
         <w:pStyle w:val="Bibliography"/>
@@ -6355,7 +6542,7 @@
       <w:r>
         <w:t xml:space="preserve"> </w:t>
       </w:r>
-      <w:hyperlink r:id="rId94">
+      <w:hyperlink r:id="rId92">
         <w:r>
           <w:rPr>
             <w:rStyle w:val="Hyperlink"/>
@@ -6367,8 +6554,8 @@
         <w:t xml:space="preserve">.</w:t>
       </w:r>
     </w:p>
-    <w:bookmarkEnd w:id="95"/>
-    <w:bookmarkStart w:id="97" w:name="ref-Gougherty2024"/>
+    <w:bookmarkEnd w:id="93"/>
+    <w:bookmarkStart w:id="95" w:name="ref-Gougherty2024"/>
     <w:p>
       <w:pPr>
         <w:pStyle w:val="Bibliography"/>
@@ -6416,7 +6603,7 @@
       <w:r>
         <w:t xml:space="preserve"> </w:t>
       </w:r>
-      <w:hyperlink r:id="rId96">
+      <w:hyperlink r:id="rId94">
         <w:r>
           <w:rPr>
             <w:rStyle w:val="Hyperlink"/>
@@ -6428,8 +6615,8 @@
         <w:t xml:space="preserve">.</w:t>
       </w:r>
     </w:p>
-    <w:bookmarkEnd w:id="97"/>
-    <w:bookmarkStart w:id="99" w:name="ref-Goyal2026"/>
+    <w:bookmarkEnd w:id="95"/>
+    <w:bookmarkStart w:id="97" w:name="ref-Goyal2026"/>
     <w:p>
       <w:pPr>
         <w:pStyle w:val="Bibliography"/>
@@ -6449,7 +6636,7 @@
       <w:r>
         <w:t xml:space="preserve"> </w:t>
       </w:r>
-      <w:hyperlink r:id="rId98">
+      <w:hyperlink r:id="rId96">
         <w:r>
           <w:rPr>
             <w:rStyle w:val="Hyperlink"/>
@@ -6461,8 +6648,8 @@
         <w:t xml:space="preserve">.</w:t>
       </w:r>
     </w:p>
-    <w:bookmarkEnd w:id="99"/>
-    <w:bookmarkStart w:id="101" w:name="ref-Greenacre2022Principal"/>
+    <w:bookmarkEnd w:id="97"/>
+    <w:bookmarkStart w:id="99" w:name="ref-Greenacre2022Principal"/>
     <w:p>
       <w:pPr>
         <w:pStyle w:val="Bibliography"/>
@@ -6489,7 +6676,7 @@
       <w:r>
         <w:t xml:space="preserve"> </w:t>
       </w:r>
-      <w:hyperlink r:id="rId100">
+      <w:hyperlink r:id="rId98">
         <w:r>
           <w:rPr>
             <w:rStyle w:val="Hyperlink"/>
@@ -6501,8 +6688,8 @@
         <w:t xml:space="preserve">.</w:t>
       </w:r>
     </w:p>
-    <w:bookmarkEnd w:id="101"/>
-    <w:bookmarkStart w:id="103" w:name="ref-Grossmann2023Transformation"/>
+    <w:bookmarkEnd w:id="99"/>
+    <w:bookmarkStart w:id="101" w:name="ref-Grossmann2023Transformation"/>
     <w:p>
       <w:pPr>
         <w:pStyle w:val="Bibliography"/>
@@ -6541,7 +6728,7 @@
       <w:r>
         <w:t xml:space="preserve"> </w:t>
       </w:r>
-      <w:hyperlink r:id="rId102">
+      <w:hyperlink r:id="rId100">
         <w:r>
           <w:rPr>
             <w:rStyle w:val="Hyperlink"/>
@@ -6553,8 +6740,8 @@
         <w:t xml:space="preserve">.</w:t>
       </w:r>
     </w:p>
-    <w:bookmarkEnd w:id="103"/>
-    <w:bookmarkStart w:id="105" w:name="ref-Haase2026"/>
+    <w:bookmarkEnd w:id="101"/>
+    <w:bookmarkStart w:id="103" w:name="ref-Haase2026"/>
     <w:p>
       <w:pPr>
         <w:pStyle w:val="Bibliography"/>
@@ -6581,7 +6768,7 @@
       <w:r>
         <w:t xml:space="preserve"> </w:t>
       </w:r>
-      <w:hyperlink r:id="rId104">
+      <w:hyperlink r:id="rId102">
         <w:r>
           <w:rPr>
             <w:rStyle w:val="Hyperlink"/>
@@ -6593,8 +6780,8 @@
         <w:t xml:space="preserve">.</w:t>
       </w:r>
     </w:p>
-    <w:bookmarkEnd w:id="105"/>
-    <w:bookmarkStart w:id="107" w:name="ref-Hao2025"/>
+    <w:bookmarkEnd w:id="103"/>
+    <w:bookmarkStart w:id="105" w:name="ref-Hao2025"/>
     <w:p>
       <w:pPr>
         <w:pStyle w:val="Bibliography"/>
@@ -6630,7 +6817,7 @@
       <w:r>
         <w:t xml:space="preserve"> </w:t>
       </w:r>
-      <w:hyperlink r:id="rId106">
+      <w:hyperlink r:id="rId104">
         <w:r>
           <w:rPr>
             <w:rStyle w:val="Hyperlink"/>
@@ -6642,8 +6829,8 @@
         <w:t xml:space="preserve">.</w:t>
       </w:r>
     </w:p>
-    <w:bookmarkEnd w:id="107"/>
-    <w:bookmarkStart w:id="109" w:name="ref-Hariri2025"/>
+    <w:bookmarkEnd w:id="105"/>
+    <w:bookmarkStart w:id="107" w:name="ref-Hariri2025"/>
     <w:p>
       <w:pPr>
         <w:pStyle w:val="Bibliography"/>
@@ -6667,7 +6854,7 @@
       <w:r>
         <w:t xml:space="preserve"> </w:t>
       </w:r>
-      <w:hyperlink r:id="rId108">
+      <w:hyperlink r:id="rId106">
         <w:r>
           <w:rPr>
             <w:rStyle w:val="Hyperlink"/>
@@ -6679,8 +6866,8 @@
         <w:t xml:space="preserve">.</w:t>
       </w:r>
     </w:p>
-    <w:bookmarkEnd w:id="109"/>
-    <w:bookmarkStart w:id="111" w:name="ref-Hou2025"/>
+    <w:bookmarkEnd w:id="107"/>
+    <w:bookmarkStart w:id="109" w:name="ref-Hou2025"/>
     <w:p>
       <w:pPr>
         <w:pStyle w:val="Bibliography"/>
@@ -6716,7 +6903,7 @@
       <w:r>
         <w:t xml:space="preserve"> </w:t>
       </w:r>
-      <w:hyperlink r:id="rId110">
+      <w:hyperlink r:id="rId108">
         <w:r>
           <w:rPr>
             <w:rStyle w:val="Hyperlink"/>
@@ -6728,8 +6915,8 @@
         <w:t xml:space="preserve">.</w:t>
       </w:r>
     </w:p>
-    <w:bookmarkEnd w:id="111"/>
-    <w:bookmarkStart w:id="113" w:name="ref-Jansen2025"/>
+    <w:bookmarkEnd w:id="109"/>
+    <w:bookmarkStart w:id="111" w:name="ref-Jansen2025"/>
     <w:p>
       <w:pPr>
         <w:pStyle w:val="Bibliography"/>
@@ -6756,7 +6943,7 @@
       <w:r>
         <w:t xml:space="preserve"> </w:t>
       </w:r>
-      <w:hyperlink r:id="rId112">
+      <w:hyperlink r:id="rId110">
         <w:r>
           <w:rPr>
             <w:rStyle w:val="Hyperlink"/>
@@ -6768,8 +6955,8 @@
         <w:t xml:space="preserve">.</w:t>
       </w:r>
     </w:p>
-    <w:bookmarkEnd w:id="113"/>
-    <w:bookmarkStart w:id="115" w:name="ref-JohnsonEberl2026"/>
+    <w:bookmarkEnd w:id="111"/>
+    <w:bookmarkStart w:id="113" w:name="ref-JohnsonEberl2026"/>
     <w:p>
       <w:pPr>
         <w:pStyle w:val="Bibliography"/>
@@ -6796,7 +6983,7 @@
       <w:r>
         <w:t xml:space="preserve"> </w:t>
       </w:r>
-      <w:hyperlink r:id="rId114">
+      <w:hyperlink r:id="rId112">
         <w:r>
           <w:rPr>
             <w:rStyle w:val="Hyperlink"/>
@@ -6808,8 +6995,8 @@
         <w:t xml:space="preserve">.</w:t>
       </w:r>
     </w:p>
-    <w:bookmarkEnd w:id="115"/>
-    <w:bookmarkStart w:id="117" w:name="ref-Jonker2024"/>
+    <w:bookmarkEnd w:id="113"/>
+    <w:bookmarkStart w:id="115" w:name="ref-Jonker2024"/>
     <w:p>
       <w:pPr>
         <w:pStyle w:val="Bibliography"/>
@@ -6845,7 +7032,7 @@
       <w:r>
         <w:t xml:space="preserve"> </w:t>
       </w:r>
-      <w:hyperlink r:id="rId116">
+      <w:hyperlink r:id="rId114">
         <w:r>
           <w:rPr>
             <w:rStyle w:val="Hyperlink"/>
@@ -6857,8 +7044,8 @@
         <w:t xml:space="preserve">.</w:t>
       </w:r>
     </w:p>
-    <w:bookmarkEnd w:id="117"/>
-    <w:bookmarkStart w:id="119" w:name="ref-Kansa2026"/>
+    <w:bookmarkEnd w:id="115"/>
+    <w:bookmarkStart w:id="117" w:name="ref-Kansa2026"/>
     <w:p>
       <w:pPr>
         <w:pStyle w:val="Bibliography"/>
@@ -6897,7 +7084,7 @@
       <w:r>
         <w:t xml:space="preserve"> </w:t>
       </w:r>
-      <w:hyperlink r:id="rId118">
+      <w:hyperlink r:id="rId116">
         <w:r>
           <w:rPr>
             <w:rStyle w:val="Hyperlink"/>
@@ -6909,8 +7096,8 @@
         <w:t xml:space="preserve">.</w:t>
       </w:r>
     </w:p>
-    <w:bookmarkEnd w:id="119"/>
-    <w:bookmarkStart w:id="121" w:name="ref-Kim2026Power"/>
+    <w:bookmarkEnd w:id="117"/>
+    <w:bookmarkStart w:id="119" w:name="ref-Kim2026Power"/>
     <w:p>
       <w:pPr>
         <w:pStyle w:val="Bibliography"/>
@@ -6943,7 +7130,7 @@
       <w:r>
         <w:t xml:space="preserve"> </w:t>
       </w:r>
-      <w:hyperlink r:id="rId120">
+      <w:hyperlink r:id="rId118">
         <w:r>
           <w:rPr>
             <w:rStyle w:val="Hyperlink"/>
@@ -6955,8 +7142,8 @@
         <w:t xml:space="preserve">.</w:t>
       </w:r>
     </w:p>
-    <w:bookmarkEnd w:id="121"/>
-    <w:bookmarkStart w:id="123" w:name="ref-Korinek2023"/>
+    <w:bookmarkEnd w:id="119"/>
+    <w:bookmarkStart w:id="121" w:name="ref-Korinek2023"/>
     <w:p>
       <w:pPr>
         <w:pStyle w:val="Bibliography"/>
@@ -6983,7 +7170,7 @@
       <w:r>
         <w:t xml:space="preserve"> </w:t>
       </w:r>
-      <w:hyperlink r:id="rId122">
+      <w:hyperlink r:id="rId120">
         <w:r>
           <w:rPr>
             <w:rStyle w:val="Hyperlink"/>
@@ -6995,8 +7182,8 @@
         <w:t xml:space="preserve">.</w:t>
       </w:r>
     </w:p>
-    <w:bookmarkEnd w:id="123"/>
-    <w:bookmarkStart w:id="125" w:name="ref-Korinek2025"/>
+    <w:bookmarkEnd w:id="121"/>
+    <w:bookmarkStart w:id="123" w:name="ref-Korinek2025"/>
     <w:p>
       <w:pPr>
         <w:pStyle w:val="Bibliography"/>
@@ -7019,7 +7206,7 @@
       <w:r>
         <w:t xml:space="preserve"> </w:t>
       </w:r>
-      <w:hyperlink r:id="rId124">
+      <w:hyperlink r:id="rId122">
         <w:r>
           <w:rPr>
             <w:rStyle w:val="Hyperlink"/>
@@ -7031,71 +7218,13 @@
         <w:t xml:space="preserve">, accessed September 29, 2026.</w:t>
       </w:r>
     </w:p>
-    <w:bookmarkEnd w:id="125"/>
-    <w:bookmarkStart w:id="127" w:name="ref-Kwa2025"/>
+    <w:bookmarkEnd w:id="123"/>
+    <w:bookmarkStart w:id="125" w:name="ref-Laban2025"/>
     <w:p>
       <w:pPr>
         <w:pStyle w:val="Bibliography"/>
       </w:pPr>
       <w:r>
-        <w:t xml:space="preserve">Kwa, Thomas, Ben West, Joel Becker, et al. 2025.</w:t>
-      </w:r>
-      <w:r>
-        <w:t xml:space="preserve"> </w:t>
-      </w:r>
-      <w:r>
-        <w:t xml:space="preserve">Measuring</w:t>
-      </w:r>
-      <w:r>
-        <w:t xml:space="preserve"> </w:t>
-      </w:r>
-      <w:r>
-        <w:t xml:space="preserve">AI</w:t>
-      </w:r>
-      <w:r>
-        <w:t xml:space="preserve"> </w:t>
-      </w:r>
-      <w:r>
-        <w:t xml:space="preserve">Ability to Complete Long Software Tasks</w:t>
-      </w:r>
-      <w:r>
-        <w:t xml:space="preserve">.</w:t>
-      </w:r>
-      <w:r>
-        <w:t xml:space="preserve"> </w:t>
-      </w:r>
-      <w:r>
-        <w:rPr>
-          <w:iCs/>
-          <w:i/>
-        </w:rPr>
-        <w:t xml:space="preserve">Advances in Neural Information Processing Systems</w:t>
-      </w:r>
-      <w:r>
-        <w:t xml:space="preserve">, pp. 102382–102435.</w:t>
-      </w:r>
-      <w:r>
-        <w:t xml:space="preserve"> </w:t>
-      </w:r>
-      <w:hyperlink r:id="rId126">
-        <w:r>
-          <w:rPr>
-            <w:rStyle w:val="Hyperlink"/>
-          </w:rPr>
-          <w:t xml:space="preserve">https://doi.org/10.52202/085713-3086</w:t>
-        </w:r>
-      </w:hyperlink>
-      <w:r>
-        <w:t xml:space="preserve">.</w:t>
-      </w:r>
-    </w:p>
-    <w:bookmarkEnd w:id="127"/>
-    <w:bookmarkStart w:id="129" w:name="ref-Laban2025"/>
-    <w:p>
-      <w:pPr>
-        <w:pStyle w:val="Bibliography"/>
-      </w:pPr>
-      <w:r>
         <w:t xml:space="preserve">Laban, Philippe, Hiroaki Hayashi, Yingbo Zhou, and Jennifer Neville. 2025.</w:t>
       </w:r>
       <w:r>
@@ -7113,7 +7242,7 @@
       <w:r>
         <w:t xml:space="preserve"> </w:t>
       </w:r>
-      <w:hyperlink r:id="rId128">
+      <w:hyperlink r:id="rId124">
         <w:r>
           <w:rPr>
             <w:rStyle w:val="Hyperlink"/>
@@ -7125,8 +7254,8 @@
         <w:t xml:space="preserve">.</w:t>
       </w:r>
     </w:p>
-    <w:bookmarkEnd w:id="129"/>
-    <w:bookmarkStart w:id="131" w:name="ref-Leung2023"/>
+    <w:bookmarkEnd w:id="125"/>
+    <w:bookmarkStart w:id="127" w:name="ref-Leung2023"/>
     <w:p>
       <w:pPr>
         <w:pStyle w:val="Bibliography"/>
@@ -7153,7 +7282,7 @@
       <w:r>
         <w:t xml:space="preserve"> </w:t>
       </w:r>
-      <w:hyperlink r:id="rId130">
+      <w:hyperlink r:id="rId126">
         <w:r>
           <w:rPr>
             <w:rStyle w:val="Hyperlink"/>
@@ -7165,8 +7294,8 @@
         <w:t xml:space="preserve">.</w:t>
       </w:r>
     </w:p>
-    <w:bookmarkEnd w:id="131"/>
-    <w:bookmarkStart w:id="133" w:name="ref-Lin2026"/>
+    <w:bookmarkEnd w:id="127"/>
+    <w:bookmarkStart w:id="129" w:name="ref-Lin2026"/>
     <w:p>
       <w:pPr>
         <w:pStyle w:val="Bibliography"/>
@@ -7186,7 +7315,7 @@
       <w:r>
         <w:t xml:space="preserve"> </w:t>
       </w:r>
-      <w:hyperlink r:id="rId132">
+      <w:hyperlink r:id="rId128">
         <w:r>
           <w:rPr>
             <w:rStyle w:val="Hyperlink"/>
@@ -7198,8 +7327,8 @@
         <w:t xml:space="preserve">.</w:t>
       </w:r>
     </w:p>
-    <w:bookmarkEnd w:id="133"/>
-    <w:bookmarkStart w:id="135" w:name="ref-Liu2026Dive"/>
+    <w:bookmarkEnd w:id="129"/>
+    <w:bookmarkStart w:id="131" w:name="ref-Liu2026Dive"/>
     <w:p>
       <w:pPr>
         <w:pStyle w:val="Bibliography"/>
@@ -7231,7 +7360,7 @@
       <w:r>
         <w:t xml:space="preserve"> </w:t>
       </w:r>
-      <w:hyperlink r:id="rId134">
+      <w:hyperlink r:id="rId130">
         <w:r>
           <w:rPr>
             <w:rStyle w:val="Hyperlink"/>
@@ -7243,8 +7372,8 @@
         <w:t xml:space="preserve">.</w:t>
       </w:r>
     </w:p>
-    <w:bookmarkEnd w:id="135"/>
-    <w:bookmarkStart w:id="137" w:name="ref-Longkumer2025Generative"/>
+    <w:bookmarkEnd w:id="131"/>
+    <w:bookmarkStart w:id="133" w:name="ref-Longkumer2025Generative"/>
     <w:p>
       <w:pPr>
         <w:pStyle w:val="Bibliography"/>
@@ -7331,7 +7460,7 @@
       <w:r>
         <w:t xml:space="preserve"> </w:t>
       </w:r>
-      <w:hyperlink r:id="rId136">
+      <w:hyperlink r:id="rId132">
         <w:r>
           <w:rPr>
             <w:rStyle w:val="Hyperlink"/>
@@ -7343,8 +7472,8 @@
         <w:t xml:space="preserve">.</w:t>
       </w:r>
     </w:p>
-    <w:bookmarkEnd w:id="137"/>
-    <w:bookmarkStart w:id="139" w:name="ref-Lu2026"/>
+    <w:bookmarkEnd w:id="133"/>
+    <w:bookmarkStart w:id="135" w:name="ref-Lu2026"/>
     <w:p>
       <w:pPr>
         <w:pStyle w:val="Bibliography"/>
@@ -7383,7 +7512,7 @@
       <w:r>
         <w:t xml:space="preserve"> </w:t>
       </w:r>
-      <w:hyperlink r:id="rId138">
+      <w:hyperlink r:id="rId134">
         <w:r>
           <w:rPr>
             <w:rStyle w:val="Hyperlink"/>
@@ -7395,8 +7524,8 @@
         <w:t xml:space="preserve">.</w:t>
       </w:r>
     </w:p>
-    <w:bookmarkEnd w:id="139"/>
-    <w:bookmarkStart w:id="141" w:name="ref-lyttelton2026agents"/>
+    <w:bookmarkEnd w:id="135"/>
+    <w:bookmarkStart w:id="137" w:name="ref-lyttelton2026agents"/>
     <w:p>
       <w:pPr>
         <w:pStyle w:val="Bibliography"/>
@@ -7407,7 +7536,7 @@
       <w:r>
         <w:t xml:space="preserve"> </w:t>
       </w:r>
-      <w:hyperlink r:id="rId140">
+      <w:hyperlink r:id="rId136">
         <w:r>
           <w:rPr>
             <w:rStyle w:val="Hyperlink"/>
@@ -7419,8 +7548,8 @@
         <w:t xml:space="preserve">, accessed September 29, 2026.</w:t>
       </w:r>
     </w:p>
-    <w:bookmarkEnd w:id="141"/>
-    <w:bookmarkStart w:id="143" w:name="ref-Marwick2017"/>
+    <w:bookmarkEnd w:id="137"/>
+    <w:bookmarkStart w:id="139" w:name="ref-Marwick2017"/>
     <w:p>
       <w:pPr>
         <w:pStyle w:val="Bibliography"/>
@@ -7447,7 +7576,7 @@
       <w:r>
         <w:t xml:space="preserve"> </w:t>
       </w:r>
-      <w:hyperlink r:id="rId142">
+      <w:hyperlink r:id="rId138">
         <w:r>
           <w:rPr>
             <w:rStyle w:val="Hyperlink"/>
@@ -7459,8 +7588,8 @@
         <w:t xml:space="preserve">.</w:t>
       </w:r>
     </w:p>
-    <w:bookmarkEnd w:id="143"/>
-    <w:bookmarkStart w:id="145" w:name="ref-Messeri2024"/>
+    <w:bookmarkEnd w:id="139"/>
+    <w:bookmarkStart w:id="141" w:name="ref-Messeri2024"/>
     <w:p>
       <w:pPr>
         <w:pStyle w:val="Bibliography"/>
@@ -7487,7 +7616,7 @@
       <w:r>
         <w:t xml:space="preserve"> </w:t>
       </w:r>
-      <w:hyperlink r:id="rId144">
+      <w:hyperlink r:id="rId140">
         <w:r>
           <w:rPr>
             <w:rStyle w:val="Hyperlink"/>
@@ -7499,8 +7628,8 @@
         <w:t xml:space="preserve">.</w:t>
       </w:r>
     </w:p>
-    <w:bookmarkEnd w:id="145"/>
-    <w:bookmarkStart w:id="147" w:name="ref-Miao2026"/>
+    <w:bookmarkEnd w:id="141"/>
+    <w:bookmarkStart w:id="143" w:name="ref-Miao2026"/>
     <w:p>
       <w:pPr>
         <w:pStyle w:val="Bibliography"/>
@@ -7511,7 +7640,7 @@
       <w:r>
         <w:t xml:space="preserve"> </w:t>
       </w:r>
-      <w:hyperlink r:id="rId146">
+      <w:hyperlink r:id="rId142">
         <w:r>
           <w:rPr>
             <w:rStyle w:val="Hyperlink"/>
@@ -7523,8 +7652,8 @@
         <w:t xml:space="preserve">.</w:t>
       </w:r>
     </w:p>
-    <w:bookmarkEnd w:id="147"/>
-    <w:bookmarkStart w:id="149" w:name="ref-Monakhov2026"/>
+    <w:bookmarkEnd w:id="143"/>
+    <w:bookmarkStart w:id="145" w:name="ref-Monakhov2026"/>
     <w:p>
       <w:pPr>
         <w:pStyle w:val="Bibliography"/>
@@ -7547,7 +7676,7 @@
       <w:r>
         <w:t xml:space="preserve"> </w:t>
       </w:r>
-      <w:hyperlink r:id="rId148">
+      <w:hyperlink r:id="rId144">
         <w:r>
           <w:rPr>
             <w:rStyle w:val="Hyperlink"/>
@@ -7559,8 +7688,8 @@
         <w:t xml:space="preserve">.</w:t>
       </w:r>
     </w:p>
-    <w:bookmarkEnd w:id="149"/>
-    <w:bookmarkStart w:id="151" w:name="ref-Moorthy2026"/>
+    <w:bookmarkEnd w:id="145"/>
+    <w:bookmarkStart w:id="147" w:name="ref-Moorthy2026"/>
     <w:p>
       <w:pPr>
         <w:pStyle w:val="Bibliography"/>
@@ -7605,7 +7734,7 @@
       <w:r>
         <w:t xml:space="preserve"> </w:t>
       </w:r>
-      <w:hyperlink r:id="rId150">
+      <w:hyperlink r:id="rId146">
         <w:r>
           <w:rPr>
             <w:rStyle w:val="Hyperlink"/>
@@ -7617,8 +7746,8 @@
         <w:t xml:space="preserve">.</w:t>
       </w:r>
     </w:p>
-    <w:bookmarkEnd w:id="151"/>
-    <w:bookmarkStart w:id="153" w:name="ref-NationalAcademies2026"/>
+    <w:bookmarkEnd w:id="147"/>
+    <w:bookmarkStart w:id="149" w:name="ref-NationalAcademies2026"/>
     <w:p>
       <w:pPr>
         <w:pStyle w:val="Bibliography"/>
@@ -7642,7 +7771,7 @@
       <w:r>
         <w:t xml:space="preserve"> </w:t>
       </w:r>
-      <w:hyperlink r:id="rId152">
+      <w:hyperlink r:id="rId148">
         <w:r>
           <w:rPr>
             <w:rStyle w:val="Hyperlink"/>
@@ -7654,8 +7783,8 @@
         <w:t xml:space="preserve">.</w:t>
       </w:r>
     </w:p>
-    <w:bookmarkEnd w:id="153"/>
-    <w:bookmarkStart w:id="155" w:name="ref-Nejjar2025"/>
+    <w:bookmarkEnd w:id="149"/>
+    <w:bookmarkStart w:id="151" w:name="ref-Nejjar2025"/>
     <w:p>
       <w:pPr>
         <w:pStyle w:val="Bibliography"/>
@@ -7691,7 +7820,7 @@
       <w:r>
         <w:t xml:space="preserve"> </w:t>
       </w:r>
-      <w:hyperlink r:id="rId154">
+      <w:hyperlink r:id="rId150">
         <w:r>
           <w:rPr>
             <w:rStyle w:val="Hyperlink"/>
@@ -7703,8 +7832,8 @@
         <w:t xml:space="preserve">.</w:t>
       </w:r>
     </w:p>
-    <w:bookmarkEnd w:id="155"/>
-    <w:bookmarkStart w:id="157" w:name="ref-Piper2026"/>
+    <w:bookmarkEnd w:id="151"/>
+    <w:bookmarkStart w:id="153" w:name="ref-Piper2026"/>
     <w:p>
       <w:pPr>
         <w:pStyle w:val="Bibliography"/>
@@ -7731,7 +7860,7 @@
       <w:r>
         <w:t xml:space="preserve"> </w:t>
       </w:r>
-      <w:hyperlink r:id="rId156">
+      <w:hyperlink r:id="rId152">
         <w:r>
           <w:rPr>
             <w:rStyle w:val="Hyperlink"/>
@@ -7743,8 +7872,8 @@
         <w:t xml:space="preserve">.</w:t>
       </w:r>
     </w:p>
-    <w:bookmarkEnd w:id="157"/>
-    <w:bookmarkStart w:id="159" w:name="ref-Rafiee2025"/>
+    <w:bookmarkEnd w:id="153"/>
+    <w:bookmarkStart w:id="155" w:name="ref-Rafiee2025"/>
     <w:p>
       <w:pPr>
         <w:pStyle w:val="Bibliography"/>
@@ -7764,7 +7893,7 @@
       <w:r>
         <w:t xml:space="preserve"> </w:t>
       </w:r>
-      <w:hyperlink r:id="rId158">
+      <w:hyperlink r:id="rId154">
         <w:r>
           <w:rPr>
             <w:rStyle w:val="Hyperlink"/>
@@ -7776,8 +7905,8 @@
         <w:t xml:space="preserve">.</w:t>
       </w:r>
     </w:p>
-    <w:bookmarkEnd w:id="159"/>
-    <w:bookmarkStart w:id="161" w:name="ref-Scheepens2024"/>
+    <w:bookmarkEnd w:id="155"/>
+    <w:bookmarkStart w:id="157" w:name="ref-Scheepens2024"/>
     <w:p>
       <w:pPr>
         <w:pStyle w:val="Bibliography"/>
@@ -7816,7 +7945,7 @@
       <w:r>
         <w:t xml:space="preserve"> </w:t>
       </w:r>
-      <w:hyperlink r:id="rId160">
+      <w:hyperlink r:id="rId156">
         <w:r>
           <w:rPr>
             <w:rStyle w:val="Hyperlink"/>
@@ -7828,8 +7957,8 @@
         <w:t xml:space="preserve">.</w:t>
       </w:r>
     </w:p>
-    <w:bookmarkEnd w:id="161"/>
-    <w:bookmarkStart w:id="163" w:name="ref-Schweinberger2026privacy"/>
+    <w:bookmarkEnd w:id="157"/>
+    <w:bookmarkStart w:id="159" w:name="ref-Schweinberger2026privacy"/>
     <w:p>
       <w:pPr>
         <w:pStyle w:val="Bibliography"/>
@@ -7858,7 +7987,7 @@
       <w:r>
         <w:t xml:space="preserve"> </w:t>
       </w:r>
-      <w:hyperlink r:id="rId162">
+      <w:hyperlink r:id="rId158">
         <w:r>
           <w:rPr>
             <w:rStyle w:val="Hyperlink"/>
@@ -7870,8 +7999,8 @@
         <w:t xml:space="preserve">, accessed September 18, 2026.</w:t>
       </w:r>
     </w:p>
-    <w:bookmarkEnd w:id="163"/>
-    <w:bookmarkStart w:id="165" w:name="ref-Shaikhon2025"/>
+    <w:bookmarkEnd w:id="159"/>
+    <w:bookmarkStart w:id="161" w:name="ref-Shaikhon2025"/>
     <w:p>
       <w:pPr>
         <w:pStyle w:val="Bibliography"/>
@@ -7898,7 +8027,7 @@
       <w:r>
         <w:t xml:space="preserve"> </w:t>
       </w:r>
-      <w:hyperlink r:id="rId164">
+      <w:hyperlink r:id="rId160">
         <w:r>
           <w:rPr>
             <w:rStyle w:val="Hyperlink"/>
@@ -7910,8 +8039,8 @@
         <w:t xml:space="preserve">.</w:t>
       </w:r>
     </w:p>
-    <w:bookmarkEnd w:id="165"/>
-    <w:bookmarkStart w:id="167" w:name="ref-Sinha2026"/>
+    <w:bookmarkEnd w:id="161"/>
+    <w:bookmarkStart w:id="163" w:name="ref-Sinha2026"/>
     <w:p>
       <w:pPr>
         <w:pStyle w:val="Bibliography"/>
@@ -7953,7 +8082,7 @@
       <w:r>
         <w:t xml:space="preserve"> </w:t>
       </w:r>
-      <w:hyperlink r:id="rId166">
+      <w:hyperlink r:id="rId162">
         <w:r>
           <w:rPr>
             <w:rStyle w:val="Hyperlink"/>
@@ -7965,8 +8094,8 @@
         <w:t xml:space="preserve">.</w:t>
       </w:r>
     </w:p>
-    <w:bookmarkEnd w:id="167"/>
-    <w:bookmarkStart w:id="169" w:name="ref-Taylor2023"/>
+    <w:bookmarkEnd w:id="163"/>
+    <w:bookmarkStart w:id="165" w:name="ref-Taylor2023"/>
     <w:p>
       <w:pPr>
         <w:pStyle w:val="Bibliography"/>
@@ -8002,7 +8131,7 @@
       <w:r>
         <w:t xml:space="preserve"> </w:t>
       </w:r>
-      <w:hyperlink r:id="rId168">
+      <w:hyperlink r:id="rId164">
         <w:r>
           <w:rPr>
             <w:rStyle w:val="Hyperlink"/>
@@ -8014,8 +8143,8 @@
         <w:t xml:space="preserve">.</w:t>
       </w:r>
     </w:p>
-    <w:bookmarkEnd w:id="169"/>
-    <w:bookmarkStart w:id="171" w:name="ref-Tenzer2024"/>
+    <w:bookmarkEnd w:id="165"/>
+    <w:bookmarkStart w:id="167" w:name="ref-Tenzer2024"/>
     <w:p>
       <w:pPr>
         <w:pStyle w:val="Bibliography"/>
@@ -8054,7 +8183,7 @@
       <w:r>
         <w:t xml:space="preserve"> </w:t>
       </w:r>
-      <w:hyperlink r:id="rId170">
+      <w:hyperlink r:id="rId166">
         <w:r>
           <w:rPr>
             <w:rStyle w:val="Hyperlink"/>
@@ -8066,8 +8195,8 @@
         <w:t xml:space="preserve">.</w:t>
       </w:r>
     </w:p>
-    <w:bookmarkEnd w:id="171"/>
-    <w:bookmarkStart w:id="173" w:name="ref-RoyalSociety2024"/>
+    <w:bookmarkEnd w:id="167"/>
+    <w:bookmarkStart w:id="169" w:name="ref-RoyalSociety2024"/>
     <w:p>
       <w:pPr>
         <w:pStyle w:val="Bibliography"/>
@@ -8098,7 +8227,7 @@
       <w:r>
         <w:t xml:space="preserve"> </w:t>
       </w:r>
-      <w:hyperlink r:id="rId172">
+      <w:hyperlink r:id="rId168">
         <w:r>
           <w:rPr>
             <w:rStyle w:val="Hyperlink"/>
@@ -8110,8 +8239,8 @@
         <w:t xml:space="preserve">.</w:t>
       </w:r>
     </w:p>
-    <w:bookmarkEnd w:id="173"/>
-    <w:bookmarkStart w:id="175" w:name="ref-Walters2023"/>
+    <w:bookmarkEnd w:id="169"/>
+    <w:bookmarkStart w:id="171" w:name="ref-Walters2023"/>
     <w:p>
       <w:pPr>
         <w:pStyle w:val="Bibliography"/>
@@ -8147,7 +8276,7 @@
       <w:r>
         <w:t xml:space="preserve"> </w:t>
       </w:r>
-      <w:hyperlink r:id="rId174">
+      <w:hyperlink r:id="rId170">
         <w:r>
           <w:rPr>
             <w:rStyle w:val="Hyperlink"/>
@@ -8159,8 +8288,8 @@
         <w:t xml:space="preserve">.</w:t>
       </w:r>
     </w:p>
-    <w:bookmarkEnd w:id="175"/>
-    <w:bookmarkStart w:id="177" w:name="ref-Wang2024"/>
+    <w:bookmarkEnd w:id="171"/>
+    <w:bookmarkStart w:id="173" w:name="ref-Wang2024"/>
     <w:p>
       <w:pPr>
         <w:pStyle w:val="Bibliography"/>
@@ -8196,7 +8325,7 @@
       <w:r>
         <w:t xml:space="preserve"> </w:t>
       </w:r>
-      <w:hyperlink r:id="rId176">
+      <w:hyperlink r:id="rId172">
         <w:r>
           <w:rPr>
             <w:rStyle w:val="Hyperlink"/>
@@ -8208,8 +8337,8 @@
         <w:t xml:space="preserve">.</w:t>
       </w:r>
     </w:p>
-    <w:bookmarkEnd w:id="177"/>
-    <w:bookmarkStart w:id="179" w:name="ref-Wickham2019"/>
+    <w:bookmarkEnd w:id="173"/>
+    <w:bookmarkStart w:id="175" w:name="ref-Wickham2019"/>
     <w:p>
       <w:pPr>
         <w:pStyle w:val="Bibliography"/>
@@ -8245,7 +8374,7 @@
       <w:r>
         <w:t xml:space="preserve"> </w:t>
       </w:r>
-      <w:hyperlink r:id="rId178">
+      <w:hyperlink r:id="rId174">
         <w:r>
           <w:rPr>
             <w:rStyle w:val="Hyperlink"/>
@@ -8257,8 +8386,8 @@
         <w:t xml:space="preserve">.</w:t>
       </w:r>
     </w:p>
-    <w:bookmarkEnd w:id="179"/>
-    <w:bookmarkStart w:id="181" w:name="ref-Wiest2024"/>
+    <w:bookmarkEnd w:id="175"/>
+    <w:bookmarkStart w:id="177" w:name="ref-Wiest2024"/>
     <w:p>
       <w:pPr>
         <w:pStyle w:val="Bibliography"/>
@@ -8294,7 +8423,7 @@
       <w:r>
         <w:t xml:space="preserve"> </w:t>
       </w:r>
-      <w:hyperlink r:id="rId180">
+      <w:hyperlink r:id="rId176">
         <w:r>
           <w:rPr>
             <w:rStyle w:val="Hyperlink"/>
@@ -8306,8 +8435,8 @@
         <w:t xml:space="preserve">.</w:t>
       </w:r>
     </w:p>
-    <w:bookmarkEnd w:id="181"/>
-    <w:bookmarkStart w:id="183" w:name="ref-Xu2026"/>
+    <w:bookmarkEnd w:id="177"/>
+    <w:bookmarkStart w:id="179" w:name="ref-Xu2026"/>
     <w:p>
       <w:pPr>
         <w:pStyle w:val="Bibliography"/>
@@ -8339,7 +8468,7 @@
       <w:r>
         <w:t xml:space="preserve"> </w:t>
       </w:r>
-      <w:hyperlink r:id="rId182">
+      <w:hyperlink r:id="rId178">
         <w:r>
           <w:rPr>
             <w:rStyle w:val="Hyperlink"/>
@@ -8351,8 +8480,8 @@
         <w:t xml:space="preserve">.</w:t>
       </w:r>
     </w:p>
-    <w:bookmarkEnd w:id="183"/>
-    <w:bookmarkStart w:id="185" w:name="ref-ZamfirescuPereira2023"/>
+    <w:bookmarkEnd w:id="179"/>
+    <w:bookmarkStart w:id="181" w:name="ref-ZamfirescuPereira2023"/>
     <w:p>
       <w:pPr>
         <w:pStyle w:val="Bibliography"/>
@@ -8376,7 +8505,7 @@
       <w:r>
         <w:t xml:space="preserve"> </w:t>
       </w:r>
-      <w:hyperlink r:id="rId184">
+      <w:hyperlink r:id="rId180">
         <w:r>
           <w:rPr>
             <w:rStyle w:val="Hyperlink"/>
@@ -8388,8 +8517,8 @@
         <w:t xml:space="preserve">.</w:t>
       </w:r>
     </w:p>
-    <w:bookmarkEnd w:id="185"/>
-    <w:bookmarkStart w:id="187" w:name="ref-Zhang2026Vibe"/>
+    <w:bookmarkEnd w:id="181"/>
+    <w:bookmarkStart w:id="183" w:name="ref-Zhang2026Vibe"/>
     <w:p>
       <w:pPr>
         <w:pStyle w:val="Bibliography"/>
@@ -8425,7 +8554,7 @@
       <w:r>
         <w:t xml:space="preserve"> </w:t>
       </w:r>
-      <w:hyperlink r:id="rId186">
+      <w:hyperlink r:id="rId182">
         <w:r>
           <w:rPr>
             <w:rStyle w:val="Hyperlink"/>
@@ -8437,8 +8566,8 @@
         <w:t xml:space="preserve">.</w:t>
       </w:r>
     </w:p>
-    <w:bookmarkEnd w:id="187"/>
-    <w:bookmarkStart w:id="189" w:name="ref-Zheng2024"/>
+    <w:bookmarkEnd w:id="183"/>
+    <w:bookmarkStart w:id="185" w:name="ref-Zheng2024"/>
     <w:p>
       <w:pPr>
         <w:pStyle w:val="Bibliography"/>
@@ -8449,7 +8578,7 @@
       <w:r>
         <w:t xml:space="preserve"> </w:t>
       </w:r>
-      <w:hyperlink r:id="rId188">
+      <w:hyperlink r:id="rId184">
         <w:r>
           <w:rPr>
             <w:rStyle w:val="Hyperlink"/>
@@ -8461,8 +8590,8 @@
         <w:t xml:space="preserve">.</w:t>
       </w:r>
     </w:p>
-    <w:bookmarkEnd w:id="189"/>
-    <w:bookmarkStart w:id="191" w:name="ref-Ziems2024"/>
+    <w:bookmarkEnd w:id="185"/>
+    <w:bookmarkStart w:id="187" w:name="ref-Ziems2024"/>
     <w:p>
       <w:pPr>
         <w:pStyle w:val="Bibliography"/>
@@ -8489,7 +8618,7 @@
       <w:r>
         <w:t xml:space="preserve"> </w:t>
       </w:r>
-      <w:hyperlink r:id="rId190">
+      <w:hyperlink r:id="rId186">
         <w:r>
           <w:rPr>
             <w:rStyle w:val="Hyperlink"/>
@@ -8501,8 +8630,8 @@
         <w:t xml:space="preserve">.</w:t>
       </w:r>
     </w:p>
-    <w:bookmarkEnd w:id="191"/>
-    <w:bookmarkStart w:id="193" w:name="ref-Zimmer2026"/>
+    <w:bookmarkEnd w:id="187"/>
+    <w:bookmarkStart w:id="189" w:name="ref-Zimmer2026"/>
     <w:p>
       <w:pPr>
         <w:pStyle w:val="Bibliography"/>
@@ -8513,7 +8642,7 @@
       <w:r>
         <w:t xml:space="preserve"> </w:t>
       </w:r>
-      <w:hyperlink r:id="rId192">
+      <w:hyperlink r:id="rId188">
         <w:r>
           <w:rPr>
             <w:rStyle w:val="Hyperlink"/>
@@ -8525,9 +8654,9 @@
         <w:t xml:space="preserve">.</w:t>
       </w:r>
     </w:p>
-    <w:bookmarkEnd w:id="193"/>
-    <w:bookmarkEnd w:id="194"/>
-    <w:bookmarkEnd w:id="195"/>
+    <w:bookmarkEnd w:id="189"/>
+    <w:bookmarkEnd w:id="190"/>
+    <w:bookmarkEnd w:id="191"/>
     <w:sectPr>
       <w:footnotePr>
         <w:numRestart w:val="eachSect"/>
@@ -8823,6 +8952,91 @@
       </w:pPr>
     </w:lvl>
   </w:abstractNum>
+  <w:abstractNum w:abstractNumId="99411">
+    <w:nsid w:val="A99411"/>
+    <w:multiLevelType w:val="multilevel"/>
+    <w:lvl w:ilvl="0">
+      <w:start w:val="1"/>
+      <w:numFmt w:val="decimal"/>
+      <w:lvlText w:val="%1."/>
+      <w:lvlJc w:val="left"/>
+      <w:pPr>
+        <w:ind w:left="720" w:hanging="480"/>
+      </w:pPr>
+    </w:lvl>
+    <w:lvl w:ilvl="1">
+      <w:start w:val="1"/>
+      <w:numFmt w:val="decimal"/>
+      <w:lvlText w:val="%2."/>
+      <w:lvlJc w:val="left"/>
+      <w:pPr>
+        <w:ind w:left="1440" w:hanging="480"/>
+      </w:pPr>
+    </w:lvl>
+    <w:lvl w:ilvl="2">
+      <w:start w:val="1"/>
+      <w:numFmt w:val="decimal"/>
+      <w:lvlText w:val="%3."/>
+      <w:lvlJc w:val="left"/>
+      <w:pPr>
+        <w:ind w:left="2160" w:hanging="480"/>
+      </w:pPr>
+    </w:lvl>
+    <w:lvl w:ilvl="3">
+      <w:start w:val="1"/>
+      <w:numFmt w:val="decimal"/>
+      <w:lvlText w:val="%4."/>
+      <w:lvlJc w:val="left"/>
+      <w:pPr>
+        <w:ind w:left="2880" w:hanging="480"/>
+      </w:pPr>
+    </w:lvl>
+    <w:lvl w:ilvl="4">
+      <w:start w:val="1"/>
+      <w:numFmt w:val="decimal"/>
+      <w:lvlText w:val="%5."/>
+      <w:lvlJc w:val="left"/>
+      <w:pPr>
+        <w:ind w:left="3600" w:hanging="480"/>
+      </w:pPr>
+    </w:lvl>
+    <w:lvl w:ilvl="5">
+      <w:start w:val="1"/>
+      <w:numFmt w:val="decimal"/>
+      <w:lvlText w:val="%6."/>
+      <w:lvlJc w:val="left"/>
+      <w:pPr>
+        <w:ind w:left="4320" w:hanging="480"/>
+      </w:pPr>
+    </w:lvl>
+    <w:lvl w:ilvl="6">
+      <w:start w:val="1"/>
+      <w:numFmt w:val="decimal"/>
+      <w:lvlText w:val="%7."/>
+      <w:lvlJc w:val="left"/>
+      <w:pPr>
+        <w:ind w:left="5040" w:hanging="480"/>
+      </w:pPr>
+    </w:lvl>
+    <w:lvl w:ilvl="7">
+      <w:start w:val="1"/>
+      <w:numFmt w:val="decimal"/>
+      <w:lvlText w:val="%8."/>
+      <w:lvlJc w:val="left"/>
+      <w:pPr>
+        <w:ind w:left="5760" w:hanging="480"/>
+      </w:pPr>
+    </w:lvl>
+    <w:lvl w:ilvl="8">
+      <w:start w:val="1"/>
+      <w:numFmt w:val="decimal"/>
+      <w:lvlText w:val="%9."/>
+      <w:lvlJc w:val="left"/>
+      <w:pPr>
+        <w:ind w:left="6480" w:hanging="480"/>
+      </w:pPr>
+    </w:lvl>
+  </w:abstractNum>
   <w:num w16cid:durableId="1357734625" w:numId="1">
     <w:abstractNumId w:val="0"/>
   </w:num>
@@ -8831,6 +9045,36 @@
   </w:num>
   <w:num w:numId="1000">
     <w:abstractNumId w:val="990"/>
+  </w:num>
+  <w:num w:numId="1001">
+    <w:abstractNumId w:val="99411"/>
+    <w:lvlOverride w:ilvl="0">
+      <w:startOverride w:val="1"/>
+    </w:lvlOverride>
+    <w:lvlOverride w:ilvl="1">
+      <w:startOverride w:val="1"/>
+    </w:lvlOverride>
+    <w:lvlOverride w:ilvl="2">
+      <w:startOverride w:val="1"/>
+    </w:lvlOverride>
+    <w:lvlOverride w:ilvl="3">
+      <w:startOverride w:val="1"/>
+    </w:lvlOverride>
+    <w:lvlOverride w:ilvl="4">
+      <w:startOverride w:val="1"/>
+    </w:lvlOverride>
+    <w:lvlOverride w:ilvl="5">
+      <w:startOverride w:val="1"/>
+    </w:lvlOverride>
+    <w:lvlOverride w:ilvl="6">
+      <w:startOverride w:val="1"/>
+    </w:lvlOverride>
+    <w:lvlOverride w:ilvl="7">
+      <w:startOverride w:val="1"/>
+    </w:lvlOverride>
+    <w:lvlOverride w:ilvl="8">
+      <w:startOverride w:val="1"/>
+    </w:lvlOverride>
   </w:num>
 </w:numbering>
 </file>

</xml_diff>

<commit_message>
fix some typos, make spelling consistent
</commit_message>
<xml_diff>
--- a/analysis/paper/paper.docx
+++ b/analysis/paper/paper.docx
@@ -2611,7 +2611,7 @@
         <w:t xml:space="preserve">(Wickham et al. 2019)</w:t>
       </w:r>
       <w:r>
-        <w:t xml:space="preserve">. The Quarto document format is ideal for writing your report, this combines prose and executable code in a document written as a plain-text file. Quarto is an extension of the Markdown document format, which LLMs read and write very efficiently and accurately, much more so than Word documents and PDFs. We recommend using converters, such as Markitdown or Docling, to turn DOCX and PDF files into markdown so agents can more efficiently read them. Documents that you want your agent to read and edit should be in Markdown format to improve the agent’s efficiency and minimize their resource consumption.</w:t>
+        <w:t xml:space="preserve">. The Quarto document format is ideal for writing your report, this combines prose and executable code in a document written as a plain-text file. Quarto is an extension of the Markdown document format, which LLMs read and write text and tables from very quickly and accurately, more so than Word documents and PDFs. We recommend using converters, such as Markitdown or Docling, to turn DOCX and PDF files into markdown so agents can more efficiently read them. Documents that you want your agent to read and edit should be in Markdown format to improve the agent’s efficiency and minimize their resource consumption.</w:t>
       </w:r>
     </w:p>
     <w:p>
@@ -5271,7 +5271,7 @@
         <w:t xml:space="preserve"> </w:t>
       </w:r>
       <w:r>
-        <w:t xml:space="preserve">argues that AI is</w:t>
+        <w:t xml:space="preserve">argues that AI in the humanities is</w:t>
       </w:r>
       <w:r>
         <w:t xml:space="preserve"> </w:t>

</xml_diff>